<commit_message>
fix(runtime): finalize iteration 66 with safe collector commits and full gap recovery
- isolate runtime-lock heartbeat from collector write transactions to prevent partial cycle commits
- replace false whole-cycle atomicity with explicit stage-boundary commits in collector flow
- fix OHLCV catch-up after long downtime so incremental recovery closes deep history gaps
- add open-interest cursor pagination for gaps larger than a single API page
- harden rollback paths in background collector threads to avoid partially persisted state on unexpected failures
- extend tests for long-gap OHLCV recovery, OI cursor pagination, lock-loss stage behavior and rollback safety
- refresh README, audit notes and operator documentation to match the finalized runtime and recovery model
</commit_message>
<xml_diff>
--- a/docs/instrukciya_operatora_bybit_recommender.docx
+++ b/docs/instrukciya_operatora_bybit_recommender.docx
@@ -1014,6 +1014,244 @@
         </w:tc>
       </w:tr>
     </w:tbl>
+    <w:p/>
+    <w:p>
+      <w:pPr>
+        <w:pStyle w:val="Heading1"/>
+      </w:pPr>
+      <w:r>
+        <w:t>4. Контроль состояния сервиса</w:t>
+      </w:r>
+    </w:p>
+    <w:p>
+      <w:pPr/>
+      <w:r>
+        <w:t>Перед началом смены и после любого нестандартного поведения желательно быстро проверить техническое состояние сервиса, а не только список рекомендаций.</w:t>
+      </w:r>
+    </w:p>
+    <w:tbl>
+      <w:tblPr>
+        <w:tblStyle w:val="TableGrid"/>
+        <w:tblW w:type="auto" w:w="0"/>
+        <w:tblLook w:firstColumn="1" w:firstRow="1" w:lastColumn="0" w:lastRow="0" w:noHBand="0" w:noVBand="1" w:val="04A0"/>
+      </w:tblPr>
+      <w:tblGrid>
+        <w:gridCol w:w="3494"/>
+        <w:gridCol w:w="3494"/>
+        <w:gridCol w:w="3494"/>
+      </w:tblGrid>
+      <w:tr>
+        <w:tc>
+          <w:tcPr>
+            <w:tcW w:type="dxa" w:w="3494"/>
+          </w:tcPr>
+          <w:p>
+            <w:r>
+              <w:rPr>
+                <w:sz w:val="20"/>
+              </w:rPr>
+              <w:t>Что проверить</w:t>
+            </w:r>
+          </w:p>
+        </w:tc>
+        <w:tc>
+          <w:tcPr>
+            <w:tcW w:type="dxa" w:w="3494"/>
+          </w:tcPr>
+          <w:p>
+            <w:r>
+              <w:rPr>
+                <w:sz w:val="20"/>
+              </w:rPr>
+              <w:t>Где смотреть</w:t>
+            </w:r>
+          </w:p>
+        </w:tc>
+        <w:tc>
+          <w:tcPr>
+            <w:tcW w:type="dxa" w:w="3494"/>
+          </w:tcPr>
+          <w:p>
+            <w:r>
+              <w:rPr>
+                <w:sz w:val="20"/>
+              </w:rPr>
+              <w:t>Как трактовать</w:t>
+            </w:r>
+          </w:p>
+        </w:tc>
+      </w:tr>
+      <w:tr>
+        <w:tc>
+          <w:tcPr>
+            <w:tcW w:type="dxa" w:w="3494"/>
+          </w:tcPr>
+          <w:p>
+            <w:r>
+              <w:rPr>
+                <w:sz w:val="20"/>
+              </w:rPr>
+              <w:t>Свежесть market data</w:t>
+            </w:r>
+          </w:p>
+        </w:tc>
+        <w:tc>
+          <w:tcPr>
+            <w:tcW w:type="dxa" w:w="3494"/>
+          </w:tcPr>
+          <w:p>
+            <w:r>
+              <w:rPr>
+                <w:sz w:val="20"/>
+              </w:rPr>
+              <w:t>/api/v1/health/symbols</w:t>
+            </w:r>
+          </w:p>
+        </w:tc>
+        <w:tc>
+          <w:tcPr>
+            <w:tcW w:type="dxa" w:w="3494"/>
+          </w:tcPr>
+          <w:p>
+            <w:r>
+              <w:rPr>
+                <w:sz w:val="20"/>
+              </w:rPr>
+              <w:t>Нежелательны массовые stale/missing. Если stale становится много, сначала разбираться со сбором данных, а не с качеством сигналов.</w:t>
+            </w:r>
+          </w:p>
+        </w:tc>
+      </w:tr>
+      <w:tr>
+        <w:tc>
+          <w:tcPr>
+            <w:tcW w:type="dxa" w:w="3494"/>
+          </w:tcPr>
+          <w:p>
+            <w:r>
+              <w:rPr>
+                <w:sz w:val="20"/>
+              </w:rPr>
+              <w:t>Недавние ошибки сбора</w:t>
+            </w:r>
+          </w:p>
+        </w:tc>
+        <w:tc>
+          <w:tcPr>
+            <w:tcW w:type="dxa" w:w="3494"/>
+          </w:tcPr>
+          <w:p>
+            <w:r>
+              <w:rPr>
+                <w:sz w:val="20"/>
+              </w:rPr>
+              <w:t>/metrics и /api/v1/decisions</w:t>
+            </w:r>
+          </w:p>
+        </w:tc>
+        <w:tc>
+          <w:tcPr>
+            <w:tcW w:type="dxa" w:w="3494"/>
+          </w:tcPr>
+          <w:p>
+            <w:r>
+              <w:rPr>
+                <w:sz w:val="20"/>
+              </w:rPr>
+              <w:t>Рост COLLECT_ERROR, SYMBOL_DISABLED, runtime_lock ошибок или повторяющихся API-сбоев — повод не доверять части рекомендаций до выяснения причины.</w:t>
+            </w:r>
+          </w:p>
+        </w:tc>
+      </w:tr>
+      <w:tr>
+        <w:tc>
+          <w:tcPr>
+            <w:tcW w:type="dxa" w:w="3494"/>
+          </w:tcPr>
+          <w:p>
+            <w:r>
+              <w:rPr>
+                <w:sz w:val="20"/>
+              </w:rPr>
+              <w:t>Последний цикл collector</w:t>
+            </w:r>
+          </w:p>
+        </w:tc>
+        <w:tc>
+          <w:tcPr>
+            <w:tcW w:type="dxa" w:w="3494"/>
+          </w:tcPr>
+          <w:p>
+            <w:r>
+              <w:rPr>
+                <w:sz w:val="20"/>
+              </w:rPr>
+              <w:t>/api/v1/status и /metrics</w:t>
+            </w:r>
+          </w:p>
+        </w:tc>
+        <w:tc>
+          <w:tcPr>
+            <w:tcW w:type="dxa" w:w="3494"/>
+          </w:tcPr>
+          <w:p>
+            <w:r>
+              <w:rPr>
+                <w:sz w:val="20"/>
+              </w:rPr>
+              <w:t>Смотрите duration_ms, lock_lost и служебные поля collector. Потеря lock или резко выросшая длительность цикла означают, что контур сбора требует внимания.</w:t>
+            </w:r>
+          </w:p>
+        </w:tc>
+      </w:tr>
+      <w:tr>
+        <w:tc>
+          <w:tcPr>
+            <w:tcW w:type="dxa" w:w="3494"/>
+          </w:tcPr>
+          <w:p>
+            <w:r>
+              <w:rPr>
+                <w:sz w:val="20"/>
+              </w:rPr>
+              <w:t>Активные рекомендации и риск-статус</w:t>
+            </w:r>
+          </w:p>
+        </w:tc>
+        <w:tc>
+          <w:tcPr>
+            <w:tcW w:type="dxa" w:w="3494"/>
+          </w:tcPr>
+          <w:p>
+            <w:r>
+              <w:rPr>
+                <w:sz w:val="20"/>
+              </w:rPr>
+              <w:t>/api/v1/recommendations и /api/v1/risk/status</w:t>
+            </w:r>
+          </w:p>
+        </w:tc>
+        <w:tc>
+          <w:tcPr>
+            <w:tcW w:type="dxa" w:w="3494"/>
+          </w:tcPr>
+          <w:p>
+            <w:r>
+              <w:rPr>
+                <w:sz w:val="20"/>
+              </w:rPr>
+              <w:t>Если рекомендации пропали массово или risk-status неожиданно блокирует входы, сперва проверяйте контур риска и последние trade rows.</w:t>
+            </w:r>
+          </w:p>
+        </w:tc>
+      </w:tr>
+    </w:tbl>
+    <w:p>
+      <w:pPr/>
+      <w:r>
+        <w:t>Практическое правило: если технический контур выглядит нестабильно, не увеличивать размер и не трактовать единичный красивый сигнал как достаточное основание для запуска.</w:t>
+      </w:r>
+    </w:p>
     <w:sectPr>
       <w:pgSz w:w="12240" w:h="15840"/>
       <w:pgMar w:top="879" w:right="879" w:bottom="822" w:left="879" w:header="720" w:footer="720" w:gutter="0"/>

</xml_diff>

<commit_message>
fix: harden trade execution flow, health checks, tests and docs
- fix unsafe silent-false branch in execute recommendation flow:
  rollback transaction if recommendation status is not actually updated to executed
- fix unsafe trade finalization path with stop_bot=true:
  rollback trade if bot is not actually switched to stopped
- add write serialization via BEGIN IMMEDIATE for mutating SQLite API paths
  to avoid stale read-check-write decisions under concurrent access
- fix health/symbols boot-grace logic:
  do not treat inherited stale pre-restart data as healthy
- add regression tests for:
  - rollback on failed update_recommendation_status(...)
  - rollback on failed stop_bot during trade finalization
  - honest boot-grace behavior for old pre-restart symbol data
- refresh project documentation:
  README, operator guide (.docx, .pdf)

Result:
- 195 tests passed
- app coverage: 78%
</commit_message>
<xml_diff>
--- a/docs/instrukciya_operatora_bybit_recommender.docx
+++ b/docs/instrukciya_operatora_bybit_recommender.docx
@@ -1252,6 +1252,77 @@
         <w:t>Практическое правило: если технический контур выглядит нестабильно, не увеличивать размер и не трактовать единичный красивый сигнал как достаточное основание для запуска.</w:t>
       </w:r>
     </w:p>
+    <w:p/>
+    <w:p>
+      <w:pPr>
+        <w:pStyle w:val="Heading1"/>
+        <w:spacing w:before="240" w:after="120"/>
+      </w:pPr>
+      <w:r>
+        <w:t>5. Что изменилось в апрельской ревизии</w:t>
+      </w:r>
+    </w:p>
+    <w:p>
+      <w:pPr>
+        <w:spacing w:after="120"/>
+      </w:pPr>
+      <w:r>
+        <w:t>Для оператора важны не только качество сигнала, но и честная целостность действия: одно и то же решение не должно оставлять систему в состоянии, где UI, audit trail и фактический bot lifecycle расходятся между собой.</w:t>
+      </w:r>
+    </w:p>
+    <w:p>
+      <w:pPr>
+        <w:pStyle w:val="ListBullet"/>
+        <w:spacing w:after="60"/>
+      </w:pPr>
+      <w:r>
+        <w:t>Исполнение рекомендации теперь сериализуется под write-lock SQLite. Это уменьшает риск редких гонок, когда два действия читают один и тот же старый state и расходятся только в момент записи.</w:t>
+      </w:r>
+    </w:p>
+    <w:p>
+      <w:pPr>
+        <w:pStyle w:val="ListBullet"/>
+        <w:spacing w:after="60"/>
+      </w:pPr>
+      <w:r>
+        <w:t>Если перевод рекомендации в статус executed не подтвердился, запуск бота откатывается целиком. Оператор больше не получает скрытый running-бот при несостоявшемся статусном переходе.</w:t>
+      </w:r>
+    </w:p>
+    <w:p>
+      <w:pPr>
+        <w:pStyle w:val="ListBullet"/>
+        <w:spacing w:after="60"/>
+      </w:pPr>
+      <w:r>
+        <w:t>Trade с флагом stop_bot=true теперь считается успешным только если бот реально переведён в stopped. Если финальная остановка не состоялась, trade не фиксируется и не искажает журнал событий.</w:t>
+      </w:r>
+    </w:p>
+    <w:p>
+      <w:pPr>
+        <w:pStyle w:val="ListBullet"/>
+        <w:spacing w:after="60"/>
+      </w:pPr>
+      <w:r>
+        <w:t>Льготный boot-grace в блоке «Здоровье символов» больше не красит в зелёный очень старые данные от предыдущего процесса. Если унаследованные свечи и тикеры уже слишком стары, символ останется stale и потребует реального обновления.</w:t>
+      </w:r>
+    </w:p>
+    <w:p>
+      <w:pPr>
+        <w:pStyle w:val="ListBullet"/>
+        <w:spacing w:after="60"/>
+      </w:pPr>
+      <w:r>
+        <w:t>Практическое следствие: при рестарте сервиса и при повторных операторских действиях можно больше доверять тому, что API-ответ, audit trail и фактическое состояние бота не противоречат друг другу.</w:t>
+      </w:r>
+    </w:p>
+    <w:p>
+      <w:pPr>
+        <w:spacing w:before="120" w:after="0"/>
+      </w:pPr>
+      <w:r>
+        <w:t>Рекомендуемый быстрый контроль после рестарта: открыть «Здоровье символов», убедиться, что stale-статусы не скрываются boot-grace для явно старых данных, затем проверить /api/v1/status и только после этого выполнять сигнал.</w:t>
+      </w:r>
+    </w:p>
     <w:sectPr>
       <w:pgSz w:w="12240" w:h="15840"/>
       <w:pgMar w:top="879" w:right="879" w:bottom="822" w:left="879" w:header="720" w:footer="720" w:gutter="0"/>

</xml_diff>

<commit_message>
chore: restrict project to Bybit USDT linear futures grid only
- Removed support and references for non-futures grid bot types
- Replaced spot_grid with futures_grid across config, docs, UI, and tests
- Restricted venues to linear only
- Removed spot-related env/config options and examples
- Updated operator documentation for futures USDT grid workflow
- Verified no remaining references to unsupported bot types or spot trading
</commit_message>
<xml_diff>
--- a/docs/instrukciya_operatora_bybit_recommender.docx
+++ b/docs/instrukciya_operatora_bybit_recommender.docx
@@ -4,21 +4,39 @@
   <w:body>
     <w:p>
       <w:pPr>
-        <w:pStyle w:val="Title"/>
+        <w:jc w:val="center"/>
       </w:pPr>
       <w:r>
-        <w:t>Инструкция оператора</w:t>
-        <w:br/>
-        <w:t>Bybit Recommender</w:t>
+        <w:rPr>
+          <w:b/>
+          <w:sz w:val="34"/>
+        </w:rPr>
+        <w:t>Инструкция оператора Bybit Recommender</w:t>
+      </w:r>
+    </w:p>
+    <w:p>
+      <w:pPr>
+        <w:jc w:val="center"/>
+      </w:pPr>
+      <w:r>
+        <w:rPr>
+          <w:b/>
+          <w:sz w:val="22"/>
+        </w:rPr>
+        <w:t>Только USDT linear futures grid / bot_type=futures_grid</w:t>
       </w:r>
     </w:p>
     <w:p>
       <w:r>
-        <w:rPr>
-          <w:color w:val="4D6082"/>
-          <w:sz w:val="22"/>
-        </w:rPr>
-        <w:t>Как читать рекомендации и когда запускать бота на Bybit</w:t>
+        <w:t>Ключевая граница: проект обслуживает только рекомендации для USDT linear futures grid. В конфигурации, UI, API и документации не должно быть режимов за пределами этого профиля.</w:t>
+      </w:r>
+    </w:p>
+    <w:p>
+      <w:pPr>
+        <w:pStyle w:val="Heading1"/>
+      </w:pPr>
+      <w:r>
+        <w:t>1. Что разрешено к обслуживанию</w:t>
       </w:r>
     </w:p>
     <w:tbl>
@@ -29,27 +47,261 @@
         <w:tblLook w:firstColumn="1" w:firstRow="1" w:lastColumn="0" w:lastRow="0" w:noHBand="0" w:noVBand="1" w:val="04A0"/>
       </w:tblPr>
       <w:tblGrid>
-        <w:gridCol w:w="10482"/>
+        <w:gridCol w:w="5184"/>
+        <w:gridCol w:w="5184"/>
       </w:tblGrid>
       <w:tr>
         <w:tc>
           <w:tcPr>
-            <w:tcW w:type="dxa" w:w="9865"/>
-            <w:tcMar>
-              <w:top w:w="70" w:type="dxa"/>
-              <w:start w:w="90" w:type="dxa"/>
-              <w:bottom w:w="70" w:type="dxa"/>
-              <w:end w:w="90" w:type="dxa"/>
-            </w:tcMar>
-            <w:vAlign w:val="center"/>
-            <w:shd w:fill="EEF3F8"/>
+            <w:tcW w:type="dxa" w:w="5184"/>
+            <w:shd w:fill="D9EAF7"/>
           </w:tcPr>
           <w:p>
+            <w:r/>
             <w:r>
               <w:rPr>
                 <w:b/>
               </w:rPr>
-              <w:t>Ключевая идея: бота открывают только когда одновременно соблюдены допуск сигнала, подходящий режим, достаточный Скор UI, приемлемый Ож. RR и нет красных флагов по рынку, ликвидности и издержкам.</w:t>
+              <w:t>Поле</w:t>
+            </w:r>
+          </w:p>
+        </w:tc>
+        <w:tc>
+          <w:tcPr>
+            <w:tcW w:type="dxa" w:w="5184"/>
+            <w:shd w:fill="D9EAF7"/>
+          </w:tcPr>
+          <w:p>
+            <w:r/>
+            <w:r>
+              <w:rPr>
+                <w:b/>
+              </w:rPr>
+              <w:t>Разрешённое значение</w:t>
+            </w:r>
+          </w:p>
+        </w:tc>
+      </w:tr>
+      <w:tr>
+        <w:tc>
+          <w:tcPr>
+            <w:tcW w:type="dxa" w:w="5184"/>
+            <w:vAlign w:val="top"/>
+          </w:tcPr>
+          <w:p>
+            <w:r/>
+            <w:r>
+              <w:rPr>
+                <w:b w:val="0"/>
+              </w:rPr>
+              <w:t>venue/category</w:t>
+            </w:r>
+          </w:p>
+        </w:tc>
+        <w:tc>
+          <w:tcPr>
+            <w:tcW w:type="dxa" w:w="5184"/>
+            <w:vAlign w:val="top"/>
+          </w:tcPr>
+          <w:p>
+            <w:r/>
+            <w:r>
+              <w:rPr>
+                <w:b w:val="0"/>
+              </w:rPr>
+              <w:t>linear</w:t>
+            </w:r>
+          </w:p>
+        </w:tc>
+      </w:tr>
+      <w:tr>
+        <w:tc>
+          <w:tcPr>
+            <w:tcW w:type="dxa" w:w="5184"/>
+            <w:vAlign w:val="top"/>
+          </w:tcPr>
+          <w:p>
+            <w:r/>
+            <w:r>
+              <w:rPr>
+                <w:b w:val="0"/>
+              </w:rPr>
+              <w:t>market</w:t>
+            </w:r>
+          </w:p>
+        </w:tc>
+        <w:tc>
+          <w:tcPr>
+            <w:tcW w:type="dxa" w:w="5184"/>
+            <w:vAlign w:val="top"/>
+          </w:tcPr>
+          <w:p>
+            <w:r/>
+            <w:r>
+              <w:rPr>
+                <w:b w:val="0"/>
+              </w:rPr>
+              <w:t>USDT perpetual futures</w:t>
+            </w:r>
+          </w:p>
+        </w:tc>
+      </w:tr>
+      <w:tr>
+        <w:tc>
+          <w:tcPr>
+            <w:tcW w:type="dxa" w:w="5184"/>
+            <w:vAlign w:val="top"/>
+          </w:tcPr>
+          <w:p>
+            <w:r/>
+            <w:r>
+              <w:rPr>
+                <w:b w:val="0"/>
+              </w:rPr>
+              <w:t>bot_type</w:t>
+            </w:r>
+          </w:p>
+        </w:tc>
+        <w:tc>
+          <w:tcPr>
+            <w:tcW w:type="dxa" w:w="5184"/>
+            <w:vAlign w:val="top"/>
+          </w:tcPr>
+          <w:p>
+            <w:r/>
+            <w:r>
+              <w:rPr>
+                <w:b w:val="0"/>
+              </w:rPr>
+              <w:t>futures_grid</w:t>
+            </w:r>
+          </w:p>
+        </w:tc>
+      </w:tr>
+      <w:tr>
+        <w:tc>
+          <w:tcPr>
+            <w:tcW w:type="dxa" w:w="5184"/>
+            <w:vAlign w:val="top"/>
+          </w:tcPr>
+          <w:p>
+            <w:r/>
+            <w:r>
+              <w:rPr>
+                <w:b w:val="0"/>
+              </w:rPr>
+              <w:t>account_mode</w:t>
+            </w:r>
+          </w:p>
+        </w:tc>
+        <w:tc>
+          <w:tcPr>
+            <w:tcW w:type="dxa" w:w="5184"/>
+            <w:vAlign w:val="top"/>
+          </w:tcPr>
+          <w:p>
+            <w:r/>
+            <w:r>
+              <w:rPr>
+                <w:b w:val="0"/>
+              </w:rPr>
+              <w:t>unified</w:t>
+            </w:r>
+          </w:p>
+        </w:tc>
+      </w:tr>
+      <w:tr>
+        <w:tc>
+          <w:tcPr>
+            <w:tcW w:type="dxa" w:w="5184"/>
+            <w:vAlign w:val="top"/>
+          </w:tcPr>
+          <w:p>
+            <w:r/>
+            <w:r>
+              <w:rPr>
+                <w:b w:val="0"/>
+              </w:rPr>
+              <w:t>margin_mode</w:t>
+            </w:r>
+          </w:p>
+        </w:tc>
+        <w:tc>
+          <w:tcPr>
+            <w:tcW w:type="dxa" w:w="5184"/>
+            <w:vAlign w:val="top"/>
+          </w:tcPr>
+          <w:p>
+            <w:r/>
+            <w:r>
+              <w:rPr>
+                <w:b w:val="0"/>
+              </w:rPr>
+              <w:t>isolated</w:t>
+            </w:r>
+          </w:p>
+        </w:tc>
+      </w:tr>
+      <w:tr>
+        <w:tc>
+          <w:tcPr>
+            <w:tcW w:type="dxa" w:w="5184"/>
+            <w:vAlign w:val="top"/>
+          </w:tcPr>
+          <w:p>
+            <w:r/>
+            <w:r>
+              <w:rPr>
+                <w:b w:val="0"/>
+              </w:rPr>
+              <w:t>direction</w:t>
+            </w:r>
+          </w:p>
+        </w:tc>
+        <w:tc>
+          <w:tcPr>
+            <w:tcW w:type="dxa" w:w="5184"/>
+            <w:vAlign w:val="top"/>
+          </w:tcPr>
+          <w:p>
+            <w:r/>
+            <w:r>
+              <w:rPr>
+                <w:b w:val="0"/>
+              </w:rPr>
+              <w:t>neutral, long или short</w:t>
+            </w:r>
+          </w:p>
+        </w:tc>
+      </w:tr>
+      <w:tr>
+        <w:tc>
+          <w:tcPr>
+            <w:tcW w:type="dxa" w:w="5184"/>
+            <w:vAlign w:val="top"/>
+          </w:tcPr>
+          <w:p>
+            <w:r/>
+            <w:r>
+              <w:rPr>
+                <w:b w:val="0"/>
+              </w:rPr>
+              <w:t>symbols</w:t>
+            </w:r>
+          </w:p>
+        </w:tc>
+        <w:tc>
+          <w:tcPr>
+            <w:tcW w:type="dxa" w:w="5184"/>
+            <w:vAlign w:val="top"/>
+          </w:tcPr>
+          <w:p>
+            <w:r/>
+            <w:r>
+              <w:rPr>
+                <w:b w:val="0"/>
+              </w:rPr>
+              <w:t>только инструменты из SYMBOLS_LINEAR</w:t>
             </w:r>
           </w:p>
         </w:tc>
@@ -60,91 +312,78 @@
         <w:pStyle w:val="Heading1"/>
       </w:pPr>
       <w:r>
-        <w:t>1. Порядок принятия решения</w:t>
+        <w:t>2. Порядок принятия решения</w:t>
       </w:r>
     </w:p>
     <w:tbl>
       <w:tblPr>
         <w:tblStyle w:val="TableGrid"/>
         <w:tblW w:type="auto" w:w="0"/>
-        <w:jc w:val="center"/>
         <w:tblLook w:firstColumn="1" w:firstRow="1" w:lastColumn="0" w:lastRow="0" w:noHBand="0" w:noVBand="1" w:val="04A0"/>
       </w:tblPr>
       <w:tblGrid>
-        <w:gridCol w:w="2620"/>
-        <w:gridCol w:w="2620"/>
-        <w:gridCol w:w="2620"/>
-        <w:gridCol w:w="2620"/>
+        <w:gridCol w:w="2592"/>
+        <w:gridCol w:w="2592"/>
+        <w:gridCol w:w="2592"/>
+        <w:gridCol w:w="2592"/>
       </w:tblGrid>
       <w:tr>
         <w:tc>
           <w:tcPr>
-            <w:tcW w:type="dxa" w:w="624"/>
-            <w:tcMar>
-              <w:top w:w="70" w:type="dxa"/>
-              <w:start w:w="90" w:type="dxa"/>
-              <w:bottom w:w="70" w:type="dxa"/>
-              <w:end w:w="90" w:type="dxa"/>
-            </w:tcMar>
-            <w:vAlign w:val="center"/>
-            <w:shd w:fill="DCE6F1"/>
+            <w:tcW w:type="dxa" w:w="2592"/>
+            <w:shd w:fill="D9EAF7"/>
           </w:tcPr>
           <w:p>
+            <w:r/>
             <w:r>
+              <w:rPr>
+                <w:b/>
+              </w:rPr>
               <w:t>Шаг</w:t>
             </w:r>
           </w:p>
         </w:tc>
         <w:tc>
           <w:tcPr>
-            <w:tcW w:type="dxa" w:w="2324"/>
-            <w:tcMar>
-              <w:top w:w="70" w:type="dxa"/>
-              <w:start w:w="90" w:type="dxa"/>
-              <w:bottom w:w="70" w:type="dxa"/>
-              <w:end w:w="90" w:type="dxa"/>
-            </w:tcMar>
-            <w:vAlign w:val="center"/>
-            <w:shd w:fill="DCE6F1"/>
+            <w:tcW w:type="dxa" w:w="2592"/>
+            <w:shd w:fill="D9EAF7"/>
           </w:tcPr>
           <w:p>
+            <w:r/>
             <w:r>
+              <w:rPr>
+                <w:b/>
+              </w:rPr>
               <w:t>Что смотреть</w:t>
             </w:r>
           </w:p>
         </w:tc>
         <w:tc>
           <w:tcPr>
-            <w:tcW w:type="dxa" w:w="3628"/>
-            <w:tcMar>
-              <w:top w:w="70" w:type="dxa"/>
-              <w:start w:w="90" w:type="dxa"/>
-              <w:bottom w:w="70" w:type="dxa"/>
-              <w:end w:w="90" w:type="dxa"/>
-            </w:tcMar>
-            <w:vAlign w:val="center"/>
-            <w:shd w:fill="DCE6F1"/>
+            <w:tcW w:type="dxa" w:w="2592"/>
+            <w:shd w:fill="D9EAF7"/>
           </w:tcPr>
           <w:p>
+            <w:r/>
             <w:r>
-              <w:t>Как трактовать</w:t>
+              <w:rPr>
+                <w:b/>
+              </w:rPr>
+              <w:t>Норма</w:t>
             </w:r>
           </w:p>
         </w:tc>
         <w:tc>
           <w:tcPr>
-            <w:tcW w:type="dxa" w:w="2948"/>
-            <w:tcMar>
-              <w:top w:w="70" w:type="dxa"/>
-              <w:start w:w="90" w:type="dxa"/>
-              <w:bottom w:w="70" w:type="dxa"/>
-              <w:end w:w="90" w:type="dxa"/>
-            </w:tcMar>
-            <w:vAlign w:val="center"/>
-            <w:shd w:fill="DCE6F1"/>
+            <w:tcW w:type="dxa" w:w="2592"/>
+            <w:shd w:fill="D9EAF7"/>
           </w:tcPr>
           <w:p>
+            <w:r/>
             <w:r>
+              <w:rPr>
+                <w:b/>
+              </w:rPr>
               <w:t>Действие</w:t>
             </w:r>
           </w:p>
@@ -153,41 +392,57 @@
       <w:tr>
         <w:tc>
           <w:tcPr>
-            <w:tcW w:type="dxa" w:w="2620"/>
+            <w:tcW w:type="dxa" w:w="2592"/>
           </w:tcPr>
           <w:p>
+            <w:r/>
             <w:r>
+              <w:rPr>
+                <w:b w:val="0"/>
+              </w:rPr>
               <w:t>1</w:t>
             </w:r>
           </w:p>
         </w:tc>
         <w:tc>
           <w:tcPr>
-            <w:tcW w:type="dxa" w:w="2620"/>
+            <w:tcW w:type="dxa" w:w="2592"/>
           </w:tcPr>
           <w:p>
+            <w:r/>
             <w:r>
-              <w:t>Общий режим рынка</w:t>
+              <w:rPr>
+                <w:b w:val="0"/>
+              </w:rPr>
+              <w:t>Статус</w:t>
             </w:r>
           </w:p>
         </w:tc>
         <w:tc>
           <w:tcPr>
-            <w:tcW w:type="dxa" w:w="2620"/>
+            <w:tcW w:type="dxa" w:w="2592"/>
           </w:tcPr>
           <w:p>
+            <w:r/>
             <w:r>
-              <w:t>Risk-on / risk-off, волатильность, trend, shock/chaos.</w:t>
+              <w:rPr>
+                <w:b w:val="0"/>
+              </w:rPr>
+              <w:t>recommended или active</w:t>
             </w:r>
           </w:p>
         </w:tc>
         <w:tc>
           <w:tcPr>
-            <w:tcW w:type="dxa" w:w="2620"/>
+            <w:tcW w:type="dxa" w:w="2592"/>
           </w:tcPr>
           <w:p>
+            <w:r/>
             <w:r>
-              <w:t>Режим против идеи — порог для входа повышается или сигнал пропускается.</w:t>
+              <w:rPr>
+                <w:b w:val="0"/>
+              </w:rPr>
+              <w:t>Только такие идеи рассматривать к запуску.</w:t>
             </w:r>
           </w:p>
         </w:tc>
@@ -195,41 +450,57 @@
       <w:tr>
         <w:tc>
           <w:tcPr>
-            <w:tcW w:type="dxa" w:w="2620"/>
+            <w:tcW w:type="dxa" w:w="2592"/>
           </w:tcPr>
           <w:p>
+            <w:r/>
             <w:r>
+              <w:rPr>
+                <w:b w:val="0"/>
+              </w:rPr>
               <w:t>2</w:t>
             </w:r>
           </w:p>
         </w:tc>
         <w:tc>
           <w:tcPr>
-            <w:tcW w:type="dxa" w:w="2620"/>
+            <w:tcW w:type="dxa" w:w="2592"/>
           </w:tcPr>
           <w:p>
+            <w:r/>
             <w:r>
-              <w:t>Статус</w:t>
+              <w:rPr>
+                <w:b w:val="0"/>
+              </w:rPr>
+              <w:t>Тип и рынок</w:t>
             </w:r>
           </w:p>
         </w:tc>
         <w:tc>
           <w:tcPr>
-            <w:tcW w:type="dxa" w:w="2620"/>
+            <w:tcW w:type="dxa" w:w="2592"/>
           </w:tcPr>
           <w:p>
+            <w:r/>
             <w:r>
-              <w:t>Главный допуск. Сначала смотрят только строки со статусом recommended.</w:t>
+              <w:rPr>
+                <w:b w:val="0"/>
+              </w:rPr>
+              <w:t>futures_grid + linear</w:t>
             </w:r>
           </w:p>
         </w:tc>
         <w:tc>
           <w:tcPr>
-            <w:tcW w:type="dxa" w:w="2620"/>
+            <w:tcW w:type="dxa" w:w="2592"/>
           </w:tcPr>
           <w:p>
+            <w:r/>
             <w:r>
-              <w:t>Не recommended — обычно пропуск.</w:t>
+              <w:rPr>
+                <w:b w:val="0"/>
+              </w:rPr>
+              <w:t>Несовпадение блокирует запуск.</w:t>
             </w:r>
           </w:p>
         </w:tc>
@@ -237,41 +508,57 @@
       <w:tr>
         <w:tc>
           <w:tcPr>
-            <w:tcW w:type="dxa" w:w="2620"/>
+            <w:tcW w:type="dxa" w:w="2592"/>
           </w:tcPr>
           <w:p>
+            <w:r/>
             <w:r>
+              <w:rPr>
+                <w:b w:val="0"/>
+              </w:rPr>
               <w:t>3</w:t>
             </w:r>
           </w:p>
         </w:tc>
         <w:tc>
           <w:tcPr>
-            <w:tcW w:type="dxa" w:w="2620"/>
+            <w:tcW w:type="dxa" w:w="2592"/>
           </w:tcPr>
           <w:p>
+            <w:r/>
             <w:r>
-              <w:t>Тип бота + направление</w:t>
+              <w:rPr>
+                <w:b w:val="0"/>
+              </w:rPr>
+              <w:t>Margin и mode</w:t>
             </w:r>
           </w:p>
         </w:tc>
         <w:tc>
           <w:tcPr>
-            <w:tcW w:type="dxa" w:w="2620"/>
+            <w:tcW w:type="dxa" w:w="2592"/>
           </w:tcPr>
           <w:p>
+            <w:r/>
             <w:r>
-              <w:t>Сценарий сделки: spot/futures и long/short/neutral.</w:t>
+              <w:rPr>
+                <w:b w:val="0"/>
+              </w:rPr>
+              <w:t>unified + isolated</w:t>
             </w:r>
           </w:p>
         </w:tc>
         <w:tc>
           <w:tcPr>
-            <w:tcW w:type="dxa" w:w="2620"/>
+            <w:tcW w:type="dxa" w:w="2592"/>
           </w:tcPr>
           <w:p>
+            <w:r/>
             <w:r>
-              <w:t>Если сам тип идеи не нужен — не запускать.</w:t>
+              <w:rPr>
+                <w:b w:val="0"/>
+              </w:rPr>
+              <w:t>Пустой или иной режим не принимать к исполнению.</w:t>
             </w:r>
           </w:p>
         </w:tc>
@@ -279,41 +566,57 @@
       <w:tr>
         <w:tc>
           <w:tcPr>
-            <w:tcW w:type="dxa" w:w="2620"/>
+            <w:tcW w:type="dxa" w:w="2592"/>
           </w:tcPr>
           <w:p>
+            <w:r/>
             <w:r>
+              <w:rPr>
+                <w:b w:val="0"/>
+              </w:rPr>
               <w:t>4</w:t>
             </w:r>
           </w:p>
         </w:tc>
         <w:tc>
           <w:tcPr>
-            <w:tcW w:type="dxa" w:w="2620"/>
+            <w:tcW w:type="dxa" w:w="2592"/>
           </w:tcPr>
           <w:p>
+            <w:r/>
             <w:r>
-              <w:t>Ув. напр.</w:t>
+              <w:rPr>
+                <w:b w:val="0"/>
+              </w:rPr>
+              <w:t>Сигнал</w:t>
             </w:r>
           </w:p>
         </w:tc>
         <w:tc>
           <w:tcPr>
-            <w:tcW w:type="dxa" w:w="2620"/>
+            <w:tcW w:type="dxa" w:w="2592"/>
           </w:tcPr>
           <w:p>
+            <w:r/>
             <w:r>
-              <w:t>Уверенность модели в выбранном режиме. Для neutral высокое значение — плюс.</w:t>
+              <w:rPr>
+                <w:b w:val="0"/>
+              </w:rPr>
+              <w:t>score, confidence, expected RR выше рабочих порогов</w:t>
             </w:r>
           </w:p>
         </w:tc>
         <w:tc>
           <w:tcPr>
-            <w:tcW w:type="dxa" w:w="2620"/>
+            <w:tcW w:type="dxa" w:w="2592"/>
           </w:tcPr>
           <w:p>
+            <w:r/>
             <w:r>
-              <w:t>Чем выше, тем надёжнее сценарий.</w:t>
+              <w:rPr>
+                <w:b w:val="0"/>
+              </w:rPr>
+              <w:t>Слабые идеи пропускать.</w:t>
             </w:r>
           </w:p>
         </w:tc>
@@ -321,41 +624,57 @@
       <w:tr>
         <w:tc>
           <w:tcPr>
-            <w:tcW w:type="dxa" w:w="2620"/>
+            <w:tcW w:type="dxa" w:w="2592"/>
           </w:tcPr>
           <w:p>
+            <w:r/>
             <w:r>
+              <w:rPr>
+                <w:b w:val="0"/>
+              </w:rPr>
               <w:t>5</w:t>
             </w:r>
           </w:p>
         </w:tc>
         <w:tc>
           <w:tcPr>
-            <w:tcW w:type="dxa" w:w="2620"/>
+            <w:tcW w:type="dxa" w:w="2592"/>
           </w:tcPr>
           <w:p>
+            <w:r/>
             <w:r>
-              <w:t>Скор UI</w:t>
+              <w:rPr>
+                <w:b w:val="0"/>
+              </w:rPr>
+              <w:t>Риски</w:t>
             </w:r>
           </w:p>
         </w:tc>
         <w:tc>
           <w:tcPr>
-            <w:tcW w:type="dxa" w:w="2620"/>
+            <w:tcW w:type="dxa" w:w="2592"/>
           </w:tcPr>
           <w:p>
+            <w:r/>
             <w:r>
-              <w:t>Percentile 0–100 среди текущих кандидатов. Это удобная шкала, а не вероятность.</w:t>
+              <w:rPr>
+                <w:b w:val="0"/>
+              </w:rPr>
+              <w:t>market shock, fast veto, freshness, liquidity</w:t>
             </w:r>
           </w:p>
         </w:tc>
         <w:tc>
           <w:tcPr>
-            <w:tcW w:type="dxa" w:w="2620"/>
+            <w:tcW w:type="dxa" w:w="2592"/>
           </w:tcPr>
           <w:p>
+            <w:r/>
             <w:r>
-              <w:t>Высокий Скор UI повышает приоритет идеи.</w:t>
+              <w:rPr>
+                <w:b w:val="0"/>
+              </w:rPr>
+              <w:t>Красные флаги блокируют запуск.</w:t>
             </w:r>
           </w:p>
         </w:tc>
@@ -363,41 +682,57 @@
       <w:tr>
         <w:tc>
           <w:tcPr>
-            <w:tcW w:type="dxa" w:w="2620"/>
+            <w:tcW w:type="dxa" w:w="2592"/>
           </w:tcPr>
           <w:p>
+            <w:r/>
             <w:r>
+              <w:rPr>
+                <w:b w:val="0"/>
+              </w:rPr>
               <w:t>6</w:t>
             </w:r>
           </w:p>
         </w:tc>
         <w:tc>
           <w:tcPr>
-            <w:tcW w:type="dxa" w:w="2620"/>
+            <w:tcW w:type="dxa" w:w="2592"/>
           </w:tcPr>
           <w:p>
+            <w:r/>
             <w:r>
-              <w:t>Ож. RR, Увер., BTC-завис., детали</w:t>
+              <w:rPr>
+                <w:b w:val="0"/>
+              </w:rPr>
+              <w:t>План сетки</w:t>
             </w:r>
           </w:p>
         </w:tc>
         <w:tc>
           <w:tcPr>
-            <w:tcW w:type="dxa" w:w="2620"/>
+            <w:tcW w:type="dxa" w:w="2592"/>
           </w:tcPr>
           <w:p>
+            <w:r/>
             <w:r>
-              <w:t>Проверка экономики идеи, confidence, зависимости от BTC, ликвидности, спреда и факторов.</w:t>
+              <w:rPr>
+                <w:b w:val="0"/>
+              </w:rPr>
+              <w:t>range, step, levels, kill-switch, sizing</w:t>
             </w:r>
           </w:p>
         </w:tc>
         <w:tc>
           <w:tcPr>
-            <w:tcW w:type="dxa" w:w="2620"/>
+            <w:tcW w:type="dxa" w:w="2592"/>
           </w:tcPr>
           <w:p>
+            <w:r/>
             <w:r>
-              <w:t>После этого переносить параметры в форму Bybit.</w:t>
+              <w:rPr>
+                <w:b w:val="0"/>
+              </w:rPr>
+              <w:t>Переносить в Bybit только после preflight без critical errors.</w:t>
             </w:r>
           </w:p>
         </w:tc>
@@ -408,437 +743,55 @@
         <w:pStyle w:val="Heading1"/>
       </w:pPr>
       <w:r>
-        <w:t>2. Шкалы стимулов и дестимулов</w:t>
+        <w:t>3. Правила запуска</w:t>
       </w:r>
     </w:p>
-    <w:tbl>
-      <w:tblPr>
-        <w:tblStyle w:val="TableGrid"/>
-        <w:tblW w:type="auto" w:w="0"/>
-        <w:jc w:val="center"/>
-        <w:tblLook w:firstColumn="1" w:firstRow="1" w:lastColumn="0" w:lastRow="0" w:noHBand="0" w:noVBand="1" w:val="04A0"/>
-      </w:tblPr>
-      <w:tblGrid>
-        <w:gridCol w:w="2096"/>
-        <w:gridCol w:w="2096"/>
-        <w:gridCol w:w="2096"/>
-        <w:gridCol w:w="2096"/>
-        <w:gridCol w:w="2096"/>
-      </w:tblGrid>
-      <w:tr>
-        <w:tc>
-          <w:tcPr>
-            <w:tcW w:type="dxa" w:w="1644"/>
-            <w:tcMar>
-              <w:top w:w="70" w:type="dxa"/>
-              <w:start w:w="90" w:type="dxa"/>
-              <w:bottom w:w="70" w:type="dxa"/>
-              <w:end w:w="90" w:type="dxa"/>
-            </w:tcMar>
-            <w:vAlign w:val="center"/>
-            <w:shd w:fill="DCE6F1"/>
-          </w:tcPr>
-          <w:p>
-            <w:r>
-              <w:t>Показатель</w:t>
-            </w:r>
-          </w:p>
-        </w:tc>
-        <w:tc>
-          <w:tcPr>
-            <w:tcW w:type="dxa" w:w="1871"/>
-            <w:tcMar>
-              <w:top w:w="70" w:type="dxa"/>
-              <w:start w:w="90" w:type="dxa"/>
-              <w:bottom w:w="70" w:type="dxa"/>
-              <w:end w:w="90" w:type="dxa"/>
-            </w:tcMar>
-            <w:vAlign w:val="center"/>
-            <w:shd w:fill="DCE6F1"/>
-          </w:tcPr>
-          <w:p>
-            <w:r>
-              <w:t>Стимул</w:t>
-            </w:r>
-          </w:p>
-        </w:tc>
-        <w:tc>
-          <w:tcPr>
-            <w:tcW w:type="dxa" w:w="1871"/>
-            <w:tcMar>
-              <w:top w:w="70" w:type="dxa"/>
-              <w:start w:w="90" w:type="dxa"/>
-              <w:bottom w:w="70" w:type="dxa"/>
-              <w:end w:w="90" w:type="dxa"/>
-            </w:tcMar>
-            <w:vAlign w:val="center"/>
-            <w:shd w:fill="DCE6F1"/>
-          </w:tcPr>
-          <w:p>
-            <w:r>
-              <w:t>Нормально</w:t>
-            </w:r>
-          </w:p>
-        </w:tc>
-        <w:tc>
-          <w:tcPr>
-            <w:tcW w:type="dxa" w:w="1871"/>
-            <w:tcMar>
-              <w:top w:w="70" w:type="dxa"/>
-              <w:start w:w="90" w:type="dxa"/>
-              <w:bottom w:w="70" w:type="dxa"/>
-              <w:end w:w="90" w:type="dxa"/>
-            </w:tcMar>
-            <w:vAlign w:val="center"/>
-            <w:shd w:fill="DCE6F1"/>
-          </w:tcPr>
-          <w:p>
-            <w:r>
-              <w:t>Дестимул</w:t>
-            </w:r>
-          </w:p>
-        </w:tc>
-        <w:tc>
-          <w:tcPr>
-            <w:tcW w:type="dxa" w:w="2494"/>
-            <w:tcMar>
-              <w:top w:w="70" w:type="dxa"/>
-              <w:start w:w="90" w:type="dxa"/>
-              <w:bottom w:w="70" w:type="dxa"/>
-              <w:end w:w="90" w:type="dxa"/>
-            </w:tcMar>
-            <w:vAlign w:val="center"/>
-            <w:shd w:fill="DCE6F1"/>
-          </w:tcPr>
-          <w:p>
-            <w:r>
-              <w:t>Как использовать</w:t>
-            </w:r>
-          </w:p>
-        </w:tc>
-      </w:tr>
-      <w:tr>
-        <w:tc>
-          <w:tcPr>
-            <w:tcW w:type="dxa" w:w="2096"/>
-          </w:tcPr>
-          <w:p>
-            <w:r>
-              <w:t>Статус</w:t>
-            </w:r>
-          </w:p>
-        </w:tc>
-        <w:tc>
-          <w:tcPr>
-            <w:tcW w:type="dxa" w:w="2096"/>
-          </w:tcPr>
-          <w:p>
-            <w:r>
-              <w:t>recommended</w:t>
-            </w:r>
-          </w:p>
-        </w:tc>
-        <w:tc>
-          <w:tcPr>
-            <w:tcW w:type="dxa" w:w="2096"/>
-          </w:tcPr>
-          <w:p>
-            <w:r>
-              <w:t>-</w:t>
-            </w:r>
-          </w:p>
-        </w:tc>
-        <w:tc>
-          <w:tcPr>
-            <w:tcW w:type="dxa" w:w="2096"/>
-          </w:tcPr>
-          <w:p>
-            <w:r>
-              <w:t>blocked / no_trade / suppressed</w:t>
-            </w:r>
-          </w:p>
-        </w:tc>
-        <w:tc>
-          <w:tcPr>
-            <w:tcW w:type="dxa" w:w="2096"/>
-          </w:tcPr>
-          <w:p>
-            <w:r>
-              <w:t>Без допуска сигнал обычно не исполняют.</w:t>
-            </w:r>
-          </w:p>
-        </w:tc>
-      </w:tr>
-      <w:tr>
-        <w:tc>
-          <w:tcPr>
-            <w:tcW w:type="dxa" w:w="2096"/>
-          </w:tcPr>
-          <w:p>
-            <w:r>
-              <w:t>Ув. напр.</w:t>
-            </w:r>
-          </w:p>
-        </w:tc>
-        <w:tc>
-          <w:tcPr>
-            <w:tcW w:type="dxa" w:w="2096"/>
-          </w:tcPr>
-          <w:p>
-            <w:r>
-              <w:t>&gt;= 0.70</w:t>
-            </w:r>
-          </w:p>
-        </w:tc>
-        <w:tc>
-          <w:tcPr>
-            <w:tcW w:type="dxa" w:w="2096"/>
-          </w:tcPr>
-          <w:p>
-            <w:r>
-              <w:t>0.55–0.69</w:t>
-            </w:r>
-          </w:p>
-        </w:tc>
-        <w:tc>
-          <w:tcPr>
-            <w:tcW w:type="dxa" w:w="2096"/>
-          </w:tcPr>
-          <w:p>
-            <w:r>
-              <w:t>&lt; 0.55</w:t>
-            </w:r>
-          </w:p>
-        </w:tc>
-        <w:tc>
-          <w:tcPr>
-            <w:tcW w:type="dxa" w:w="2096"/>
-          </w:tcPr>
-          <w:p>
-            <w:r>
-              <w:t>Это confidence режима. Для neutral высокое значение хорошо: модель уверенно видит диапазон.</w:t>
-            </w:r>
-          </w:p>
-        </w:tc>
-      </w:tr>
-      <w:tr>
-        <w:tc>
-          <w:tcPr>
-            <w:tcW w:type="dxa" w:w="2096"/>
-          </w:tcPr>
-          <w:p>
-            <w:r>
-              <w:t>Скор UI</w:t>
-            </w:r>
-          </w:p>
-        </w:tc>
-        <w:tc>
-          <w:tcPr>
-            <w:tcW w:type="dxa" w:w="2096"/>
-          </w:tcPr>
-          <w:p>
-            <w:r>
-              <w:t>80–100 (A)</w:t>
-            </w:r>
-          </w:p>
-        </w:tc>
-        <w:tc>
-          <w:tcPr>
-            <w:tcW w:type="dxa" w:w="2096"/>
-          </w:tcPr>
-          <w:p>
-            <w:r>
-              <w:t>60–79 (B) / 40–59 (C)</w:t>
-            </w:r>
-          </w:p>
-        </w:tc>
-        <w:tc>
-          <w:tcPr>
-            <w:tcW w:type="dxa" w:w="2096"/>
-          </w:tcPr>
-          <w:p>
-            <w:r>
-              <w:t>&lt; 40 (D/E)</w:t>
-            </w:r>
-          </w:p>
-        </w:tc>
-        <w:tc>
-          <w:tcPr>
-            <w:tcW w:type="dxa" w:w="2096"/>
-          </w:tcPr>
-          <w:p>
-            <w:r>
-              <w:t>Главный ранжирующий показатель между текущими кандидатами.</w:t>
-            </w:r>
-          </w:p>
-        </w:tc>
-      </w:tr>
-      <w:tr>
-        <w:tc>
-          <w:tcPr>
-            <w:tcW w:type="dxa" w:w="2096"/>
-          </w:tcPr>
-          <w:p>
-            <w:r>
-              <w:t>Ож. RR</w:t>
-            </w:r>
-          </w:p>
-        </w:tc>
-        <w:tc>
-          <w:tcPr>
-            <w:tcW w:type="dxa" w:w="2096"/>
-          </w:tcPr>
-          <w:p>
-            <w:r>
-              <w:t>&gt;= 0.30</w:t>
-            </w:r>
-          </w:p>
-        </w:tc>
-        <w:tc>
-          <w:tcPr>
-            <w:tcW w:type="dxa" w:w="2096"/>
-          </w:tcPr>
-          <w:p>
-            <w:r>
-              <w:t>0.25–0.29</w:t>
-            </w:r>
-          </w:p>
-        </w:tc>
-        <w:tc>
-          <w:tcPr>
-            <w:tcW w:type="dxa" w:w="2096"/>
-          </w:tcPr>
-          <w:p>
-            <w:r>
-              <w:t>&lt; 0.25</w:t>
-            </w:r>
-          </w:p>
-        </w:tc>
-        <w:tc>
-          <w:tcPr>
-            <w:tcW w:type="dxa" w:w="2096"/>
-          </w:tcPr>
-          <w:p>
-            <w:r>
-              <w:t>Экономический смысл идеи. Низкий RR часто перевешивает красивый сигнал.</w:t>
-            </w:r>
-          </w:p>
-        </w:tc>
-      </w:tr>
-      <w:tr>
-        <w:tc>
-          <w:tcPr>
-            <w:tcW w:type="dxa" w:w="2096"/>
-          </w:tcPr>
-          <w:p>
-            <w:r>
-              <w:t>Увер.</w:t>
-            </w:r>
-          </w:p>
-        </w:tc>
-        <w:tc>
-          <w:tcPr>
-            <w:tcW w:type="dxa" w:w="2096"/>
-          </w:tcPr>
-          <w:p>
-            <w:r>
-              <w:t>&gt;= 0.72</w:t>
-            </w:r>
-          </w:p>
-        </w:tc>
-        <w:tc>
-          <w:tcPr>
-            <w:tcW w:type="dxa" w:w="2096"/>
-          </w:tcPr>
-          <w:p>
-            <w:r>
-              <w:t>0.68–0.71</w:t>
-            </w:r>
-          </w:p>
-        </w:tc>
-        <w:tc>
-          <w:tcPr>
-            <w:tcW w:type="dxa" w:w="2096"/>
-          </w:tcPr>
-          <w:p>
-            <w:r>
-              <w:t>&lt; 0.68</w:t>
-            </w:r>
-          </w:p>
-        </w:tc>
-        <w:tc>
-          <w:tcPr>
-            <w:tcW w:type="dxa" w:w="2096"/>
-          </w:tcPr>
-          <w:p>
-            <w:r>
-              <w:t>Не заменяет RR и Скор UI; усиливает или ослабляет доверие к рекомендации.</w:t>
-            </w:r>
-          </w:p>
-        </w:tc>
-      </w:tr>
-      <w:tr>
-        <w:tc>
-          <w:tcPr>
-            <w:tcW w:type="dxa" w:w="2096"/>
-          </w:tcPr>
-          <w:p>
-            <w:r>
-              <w:t>BTC-завис.</w:t>
-            </w:r>
-          </w:p>
-        </w:tc>
-        <w:tc>
-          <w:tcPr>
-            <w:tcW w:type="dxa" w:w="2096"/>
-          </w:tcPr>
-          <w:p>
-            <w:r>
-              <w:t>r &lt; 0.35</w:t>
-            </w:r>
-          </w:p>
-        </w:tc>
-        <w:tc>
-          <w:tcPr>
-            <w:tcW w:type="dxa" w:w="2096"/>
-          </w:tcPr>
-          <w:p>
-            <w:r>
-              <w:t>0.35–0.65</w:t>
-            </w:r>
-          </w:p>
-        </w:tc>
-        <w:tc>
-          <w:tcPr>
-            <w:tcW w:type="dxa" w:w="2096"/>
-          </w:tcPr>
-          <w:p>
-            <w:r>
-              <w:t>&gt; 0.65</w:t>
-            </w:r>
-          </w:p>
-        </w:tc>
-        <w:tc>
-          <w:tcPr>
-            <w:tcW w:type="dxa" w:w="2096"/>
-          </w:tcPr>
-          <w:p>
-            <w:r>
-              <w:t>Высокое r не запрещает вход, но означает, что идея в основном повторяет BTC.</w:t>
-            </w:r>
-          </w:p>
-        </w:tc>
-      </w:tr>
-    </w:tbl>
     <w:p>
+      <w:pPr>
+        <w:pStyle w:val="ListBullet"/>
+      </w:pPr>
       <w:r>
-        <w:rPr>
-          <w:b/>
-        </w:rPr>
-        <w:t xml:space="preserve">Примечание. </w:t>
+        <w:t>Не запускать идею без свежих 1m candles и ticker.</w:t>
       </w:r>
+    </w:p>
+    <w:p>
+      <w:pPr>
+        <w:pStyle w:val="ListBullet"/>
+      </w:pPr>
       <w:r>
-        <w:t>Скор UI — визуальное представление. Внутренняя математика отбора не меняется; raw score остаётся в техподробностях.</w:t>
+        <w:t>Не запускать идею, если цена вышла за основной range или kill-switch.</w:t>
+      </w:r>
+    </w:p>
+    <w:p>
+      <w:pPr>
+        <w:pStyle w:val="ListBullet"/>
+      </w:pPr>
+      <w:r>
+        <w:t>Не запускать идею при critical validation errors в bybit_plan_validation.</w:t>
+      </w:r>
+    </w:p>
+    <w:p>
+      <w:pPr>
+        <w:pStyle w:val="ListBullet"/>
+      </w:pPr>
+      <w:r>
+        <w:t>Не держать более одного running bot_instance на один publication_chain.</w:t>
+      </w:r>
+    </w:p>
+    <w:p>
+      <w:pPr>
+        <w:pStyle w:val="ListBullet"/>
+      </w:pPr>
+      <w:r>
+        <w:t>Не использовать весь депозит как маржу: оставить резерв вне позиции.</w:t>
+      </w:r>
+    </w:p>
+    <w:p>
+      <w:pPr>
+        <w:pStyle w:val="ListBullet"/>
+      </w:pPr>
+      <w:r>
+        <w:t>Для 10x использовать только сильные направленные сигналы и небольшой размер.</w:t>
       </w:r>
     </w:p>
     <w:p>
@@ -846,187 +799,68 @@
         <w:pStyle w:val="Heading1"/>
       </w:pPr>
       <w:r>
-        <w:t>3. Практическая схема эксплуатации</w:t>
+        <w:t>4. Конфигурация, которую нужно проверять</w:t>
       </w:r>
     </w:p>
-    <w:tbl>
-      <w:tblPr>
-        <w:tblStyle w:val="TableGrid"/>
-        <w:tblW w:type="auto" w:w="0"/>
-        <w:jc w:val="center"/>
-        <w:tblLook w:firstColumn="1" w:firstRow="1" w:lastColumn="0" w:lastRow="0" w:noHBand="0" w:noVBand="1" w:val="04A0"/>
-      </w:tblPr>
-      <w:tblGrid>
-        <w:gridCol w:w="3494"/>
-        <w:gridCol w:w="3494"/>
-        <w:gridCol w:w="3494"/>
-      </w:tblGrid>
-      <w:tr>
-        <w:tc>
-          <w:tcPr>
-            <w:tcW w:type="dxa" w:w="2154"/>
-            <w:tcMar>
-              <w:top w:w="70" w:type="dxa"/>
-              <w:start w:w="90" w:type="dxa"/>
-              <w:bottom w:w="70" w:type="dxa"/>
-              <w:end w:w="90" w:type="dxa"/>
-            </w:tcMar>
-            <w:vAlign w:val="center"/>
-            <w:shd w:fill="DCE6F1"/>
-          </w:tcPr>
-          <w:p>
-            <w:r>
-              <w:t>Решение</w:t>
-            </w:r>
-          </w:p>
-        </w:tc>
-        <w:tc>
-          <w:tcPr>
-            <w:tcW w:type="dxa" w:w="3458"/>
-            <w:tcMar>
-              <w:top w:w="70" w:type="dxa"/>
-              <w:start w:w="90" w:type="dxa"/>
-              <w:bottom w:w="70" w:type="dxa"/>
-              <w:end w:w="90" w:type="dxa"/>
-            </w:tcMar>
-            <w:vAlign w:val="center"/>
-            <w:shd w:fill="DCE6F1"/>
-          </w:tcPr>
-          <w:p>
-            <w:r>
-              <w:t>Когда принимать</w:t>
-            </w:r>
-          </w:p>
-        </w:tc>
-        <w:tc>
-          <w:tcPr>
-            <w:tcW w:type="dxa" w:w="4139"/>
-            <w:tcMar>
-              <w:top w:w="70" w:type="dxa"/>
-              <w:start w:w="90" w:type="dxa"/>
-              <w:bottom w:w="70" w:type="dxa"/>
-              <w:end w:w="90" w:type="dxa"/>
-            </w:tcMar>
-            <w:vAlign w:val="center"/>
-            <w:shd w:fill="DCE6F1"/>
-          </w:tcPr>
-          <w:p>
-            <w:r>
-              <w:t>Как действовать</w:t>
-            </w:r>
-          </w:p>
-        </w:tc>
-      </w:tr>
-      <w:tr>
-        <w:tc>
-          <w:tcPr>
-            <w:tcW w:type="dxa" w:w="3494"/>
-          </w:tcPr>
-          <w:p>
-            <w:r>
-              <w:t>Запускать</w:t>
-            </w:r>
-          </w:p>
-        </w:tc>
-        <w:tc>
-          <w:tcPr>
-            <w:tcW w:type="dxa" w:w="3494"/>
-          </w:tcPr>
-          <w:p>
-            <w:r>
-              <w:t>Статус recommended; режим рынка не против идеи; Ув. напр. хорошая; Скор UI не ниже B/C; Ож. RR &gt;= 0.25, лучше &gt;= 0.30; в деталях нет явных минусов по ликвидности и издержкам.</w:t>
-            </w:r>
-          </w:p>
-        </w:tc>
-        <w:tc>
-          <w:tcPr>
-            <w:tcW w:type="dxa" w:w="3494"/>
-          </w:tcPr>
-          <w:p>
-            <w:r>
-              <w:t>Открывать бота на Bybit штатным размером и переносить поля запуска из панели деталей.</w:t>
-            </w:r>
-          </w:p>
-        </w:tc>
-      </w:tr>
-      <w:tr>
-        <w:tc>
-          <w:tcPr>
-            <w:tcW w:type="dxa" w:w="3494"/>
-          </w:tcPr>
-          <w:p>
-            <w:r>
-              <w:t>Запускать уменьшенным размером</w:t>
-            </w:r>
-          </w:p>
-        </w:tc>
-        <w:tc>
-          <w:tcPr>
-            <w:tcW w:type="dxa" w:w="3494"/>
-          </w:tcPr>
-          <w:p>
-            <w:r>
-              <w:t>Идея рабочая, но один показатель пограничный: Скор UI около C/D, RR ближе к 0.25, высокая BTC-зависимость или рынок неидеален.</w:t>
-            </w:r>
-          </w:p>
-        </w:tc>
-        <w:tc>
-          <w:tcPr>
-            <w:tcW w:type="dxa" w:w="3494"/>
-          </w:tcPr>
-          <w:p>
-            <w:r>
-              <w:t>Снижать размер/плечо, не усреднять агрессивно, внимательнее следить за фоном рынка.</w:t>
-            </w:r>
-          </w:p>
-        </w:tc>
-      </w:tr>
-      <w:tr>
-        <w:tc>
-          <w:tcPr>
-            <w:tcW w:type="dxa" w:w="3494"/>
-          </w:tcPr>
-          <w:p>
-            <w:r>
-              <w:t>Пропускать</w:t>
-            </w:r>
-          </w:p>
-        </w:tc>
-        <w:tc>
-          <w:tcPr>
-            <w:tcW w:type="dxa" w:w="3494"/>
-          </w:tcPr>
-          <w:p>
-            <w:r>
-              <w:t>Статус не recommended; режим рынка против идеи; Ув. напр. слабая; Скор UI низкий; Ож. RR &lt; 0.25; плохая ликвидность/широкий спред/издержки; для neutral виден риск скорого пробоя диапазона.</w:t>
-            </w:r>
-          </w:p>
-        </w:tc>
-        <w:tc>
-          <w:tcPr>
-            <w:tcW w:type="dxa" w:w="3494"/>
-          </w:tcPr>
-          <w:p>
-            <w:r>
-              <w:t>Бота не открывать; перейти к следующему кандидату.</w:t>
-            </w:r>
-          </w:p>
-        </w:tc>
-      </w:tr>
-    </w:tbl>
-    <w:p/>
+    <w:p>
+      <w:pPr>
+        <w:pStyle w:val="ListBullet"/>
+      </w:pPr>
+      <w:r>
+        <w:t>VENUES=linear</w:t>
+      </w:r>
+    </w:p>
+    <w:p>
+      <w:pPr>
+        <w:pStyle w:val="ListBullet"/>
+      </w:pPr>
+      <w:r>
+        <w:t>SYMBOLS_LINEAR содержит только USDT perpetual futures symbols.</w:t>
+      </w:r>
+    </w:p>
+    <w:p>
+      <w:pPr>
+        <w:pStyle w:val="ListBullet"/>
+      </w:pPr>
+      <w:r>
+        <w:t>TAKER_FEE_BPS_LINEAR соответствует текущим комиссиям.</w:t>
+      </w:r>
+    </w:p>
+    <w:p>
+      <w:pPr>
+        <w:pStyle w:val="ListBullet"/>
+      </w:pPr>
+      <w:r>
+        <w:t>RISK_LIMITS_JSON ограничивает max_concurrent_bots и max_symbol_bots.</w:t>
+      </w:r>
+    </w:p>
+    <w:p>
+      <w:pPr>
+        <w:pStyle w:val="ListBullet"/>
+      </w:pPr>
+      <w:r>
+        <w:t>ADMIN_API_KEY задан для любого удалённо доступного стенда.</w:t>
+      </w:r>
+    </w:p>
+    <w:p>
+      <w:pPr>
+        <w:pStyle w:val="ListBullet"/>
+      </w:pPr>
+      <w:r>
+        <w:t>LLM_REVIEWER_ENABLED включается только как дополнительный reviewer; он не заменяет risk gate.</w:t>
+      </w:r>
+    </w:p>
+    <w:p>
+      <w:r>
+        <w:br w:type="page"/>
+      </w:r>
+    </w:p>
     <w:p>
       <w:pPr>
         <w:pStyle w:val="Heading1"/>
       </w:pPr>
       <w:r>
-        <w:t>4. Контроль состояния сервиса</w:t>
-      </w:r>
-    </w:p>
-    <w:p>
-      <w:pPr/>
-      <w:r>
-        <w:t>Перед началом смены и после любого нестандартного поведения желательно быстро проверить техническое состояние сервиса, а не только список рекомендаций.</w:t>
+        <w:t>5. Минимальный preflight перед подтверждением executed</w:t>
       </w:r>
     </w:p>
     <w:tbl>
@@ -1036,47 +870,53 @@
         <w:tblLook w:firstColumn="1" w:firstRow="1" w:lastColumn="0" w:lastRow="0" w:noHBand="0" w:noVBand="1" w:val="04A0"/>
       </w:tblPr>
       <w:tblGrid>
-        <w:gridCol w:w="3494"/>
-        <w:gridCol w:w="3494"/>
-        <w:gridCol w:w="3494"/>
+        <w:gridCol w:w="3456"/>
+        <w:gridCol w:w="3456"/>
+        <w:gridCol w:w="3456"/>
       </w:tblGrid>
       <w:tr>
         <w:tc>
           <w:tcPr>
-            <w:tcW w:type="dxa" w:w="3494"/>
+            <w:tcW w:type="dxa" w:w="3456"/>
+            <w:shd w:fill="D9EAF7"/>
           </w:tcPr>
           <w:p>
+            <w:r/>
             <w:r>
               <w:rPr>
-                <w:sz w:val="20"/>
+                <w:b/>
               </w:rPr>
-              <w:t>Что проверить</w:t>
+              <w:t>Проверка</w:t>
             </w:r>
           </w:p>
         </w:tc>
         <w:tc>
           <w:tcPr>
-            <w:tcW w:type="dxa" w:w="3494"/>
+            <w:tcW w:type="dxa" w:w="3456"/>
+            <w:shd w:fill="D9EAF7"/>
           </w:tcPr>
           <w:p>
+            <w:r/>
             <w:r>
               <w:rPr>
-                <w:sz w:val="20"/>
+                <w:b/>
               </w:rPr>
-              <w:t>Где смотреть</w:t>
+              <w:t>Ожидание</w:t>
             </w:r>
           </w:p>
         </w:tc>
         <w:tc>
           <w:tcPr>
-            <w:tcW w:type="dxa" w:w="3494"/>
+            <w:tcW w:type="dxa" w:w="3456"/>
+            <w:shd w:fill="D9EAF7"/>
           </w:tcPr>
           <w:p>
+            <w:r/>
             <w:r>
               <w:rPr>
-                <w:sz w:val="20"/>
+                <w:b/>
               </w:rPr>
-              <w:t>Как трактовать</w:t>
+              <w:t>Что делать при проблеме</w:t>
             </w:r>
           </w:p>
         </w:tc>
@@ -1084,40 +924,43 @@
       <w:tr>
         <w:tc>
           <w:tcPr>
-            <w:tcW w:type="dxa" w:w="3494"/>
+            <w:tcW w:type="dxa" w:w="3456"/>
           </w:tcPr>
           <w:p>
+            <w:r/>
             <w:r>
               <w:rPr>
-                <w:sz w:val="20"/>
+                <w:b w:val="0"/>
               </w:rPr>
-              <w:t>Свежесть market data</w:t>
+              <w:t>Bybit metadata</w:t>
             </w:r>
           </w:p>
         </w:tc>
         <w:tc>
           <w:tcPr>
-            <w:tcW w:type="dxa" w:w="3494"/>
+            <w:tcW w:type="dxa" w:w="3456"/>
           </w:tcPr>
           <w:p>
+            <w:r/>
             <w:r>
               <w:rPr>
-                <w:sz w:val="20"/>
+                <w:b w:val="0"/>
               </w:rPr>
-              <w:t>/api/v1/health/symbols</w:t>
+              <w:t>category=linear, symbol совпадает, status=Trading</w:t>
             </w:r>
           </w:p>
         </w:tc>
         <w:tc>
           <w:tcPr>
-            <w:tcW w:type="dxa" w:w="3494"/>
+            <w:tcW w:type="dxa" w:w="3456"/>
           </w:tcPr>
           <w:p>
+            <w:r/>
             <w:r>
               <w:rPr>
-                <w:sz w:val="20"/>
+                <w:b w:val="0"/>
               </w:rPr>
-              <w:t>Нежелательны массовые stale/missing. Если stale становится много, сначала разбираться со сбором данных, а не с качеством сигналов.</w:t>
+              <w:t>Не запускать до пересчёта/исправления symbol.</w:t>
             </w:r>
           </w:p>
         </w:tc>
@@ -1125,40 +968,43 @@
       <w:tr>
         <w:tc>
           <w:tcPr>
-            <w:tcW w:type="dxa" w:w="3494"/>
+            <w:tcW w:type="dxa" w:w="3456"/>
           </w:tcPr>
           <w:p>
+            <w:r/>
             <w:r>
               <w:rPr>
-                <w:sz w:val="20"/>
+                <w:b w:val="0"/>
               </w:rPr>
-              <w:t>Недавние ошибки сбора</w:t>
+              <w:t>Tick/lot limits</w:t>
             </w:r>
           </w:p>
         </w:tc>
         <w:tc>
           <w:tcPr>
-            <w:tcW w:type="dxa" w:w="3494"/>
+            <w:tcW w:type="dxa" w:w="3456"/>
           </w:tcPr>
           <w:p>
+            <w:r/>
             <w:r>
               <w:rPr>
-                <w:sz w:val="20"/>
+                <w:b w:val="0"/>
               </w:rPr>
-              <w:t>/metrics и /api/v1/decisions</w:t>
+              <w:t>range и step выровнены по tick_size, qty по qty_step</w:t>
             </w:r>
           </w:p>
         </w:tc>
         <w:tc>
           <w:tcPr>
-            <w:tcW w:type="dxa" w:w="3494"/>
+            <w:tcW w:type="dxa" w:w="3456"/>
           </w:tcPr>
           <w:p>
+            <w:r/>
             <w:r>
               <w:rPr>
-                <w:sz w:val="20"/>
+                <w:b w:val="0"/>
               </w:rPr>
-              <w:t>Рост COLLECT_ERROR, SYMBOL_DISABLED, runtime_lock ошибок или повторяющихся API-сбоев — повод не доверять части рекомендаций до выяснения причины.</w:t>
+              <w:t>Скорректировать параметры или пропустить.</w:t>
             </w:r>
           </w:p>
         </w:tc>
@@ -1166,40 +1012,43 @@
       <w:tr>
         <w:tc>
           <w:tcPr>
-            <w:tcW w:type="dxa" w:w="3494"/>
+            <w:tcW w:type="dxa" w:w="3456"/>
           </w:tcPr>
           <w:p>
+            <w:r/>
             <w:r>
               <w:rPr>
-                <w:sz w:val="20"/>
+                <w:b w:val="0"/>
               </w:rPr>
-              <w:t>Последний цикл collector</w:t>
+              <w:t>Leverage</w:t>
             </w:r>
           </w:p>
         </w:tc>
         <w:tc>
           <w:tcPr>
-            <w:tcW w:type="dxa" w:w="3494"/>
+            <w:tcW w:type="dxa" w:w="3456"/>
           </w:tcPr>
           <w:p>
+            <w:r/>
             <w:r>
               <w:rPr>
-                <w:sz w:val="20"/>
+                <w:b w:val="0"/>
               </w:rPr>
-              <w:t>/api/v1/status и /metrics</w:t>
+              <w:t>значение в допустимом диапазоне и по step</w:t>
             </w:r>
           </w:p>
         </w:tc>
         <w:tc>
           <w:tcPr>
-            <w:tcW w:type="dxa" w:w="3494"/>
+            <w:tcW w:type="dxa" w:w="3456"/>
           </w:tcPr>
           <w:p>
+            <w:r/>
             <w:r>
               <w:rPr>
-                <w:sz w:val="20"/>
+                <w:b w:val="0"/>
               </w:rPr>
-              <w:t>Смотрите duration_ms, lock_lost и служебные поля collector. Потеря lock или резко выросшая длительность цикла означают, что контур сбора требует внимания.</w:t>
+              <w:t>Исправить leverage или пропустить.</w:t>
             </w:r>
           </w:p>
         </w:tc>
@@ -1207,209 +1056,43 @@
       <w:tr>
         <w:tc>
           <w:tcPr>
-            <w:tcW w:type="dxa" w:w="3494"/>
+            <w:tcW w:type="dxa" w:w="3456"/>
           </w:tcPr>
           <w:p>
+            <w:r/>
             <w:r>
               <w:rPr>
-                <w:sz w:val="20"/>
+                <w:b w:val="0"/>
               </w:rPr>
-              <w:t>Активные рекомендации и риск-статус</w:t>
+              <w:t>Notional</w:t>
             </w:r>
           </w:p>
         </w:tc>
         <w:tc>
           <w:tcPr>
-            <w:tcW w:type="dxa" w:w="3494"/>
+            <w:tcW w:type="dxa" w:w="3456"/>
           </w:tcPr>
           <w:p>
+            <w:r/>
             <w:r>
               <w:rPr>
-                <w:sz w:val="20"/>
+                <w:b w:val="0"/>
               </w:rPr>
-              <w:t>/api/v1/recommendations и /api/v1/risk/status</w:t>
+              <w:t>ордер не ниже min_notional</w:t>
             </w:r>
           </w:p>
         </w:tc>
         <w:tc>
           <w:tcPr>
-            <w:tcW w:type="dxa" w:w="3494"/>
+            <w:tcW w:type="dxa" w:w="3456"/>
           </w:tcPr>
           <w:p>
+            <w:r/>
             <w:r>
               <w:rPr>
-                <w:sz w:val="20"/>
+                <w:b w:val="0"/>
               </w:rPr>
-              <w:t>Если рекомендации пропали массово или risk-status неожиданно блокирует входы, сперва проверяйте контур риска и последние trade rows.</w:t>
-            </w:r>
-          </w:p>
-        </w:tc>
-      </w:tr>
-    </w:tbl>
-    <w:p>
-      <w:pPr/>
-      <w:r>
-        <w:t>Практическое правило: если технический контур выглядит нестабильно, не увеличивать размер и не трактовать единичный красивый сигнал как достаточное основание для запуска.</w:t>
-      </w:r>
-    </w:p>
-    <w:p/>
-    <w:p>
-      <w:pPr>
-        <w:pStyle w:val="Heading1"/>
-        <w:spacing w:before="240" w:after="120"/>
-      </w:pPr>
-      <w:r>
-        <w:t>5. Что изменилось в апрельской ревизии</w:t>
-      </w:r>
-    </w:p>
-    <w:p>
-      <w:pPr>
-        <w:spacing w:after="120"/>
-      </w:pPr>
-      <w:r>
-        <w:t>Для оператора важны не только качество сигнала, но и честная целостность действия: одно и то же решение не должно оставлять систему в состоянии, где UI, audit trail и фактический bot lifecycle расходятся между собой.</w:t>
-      </w:r>
-    </w:p>
-    <w:p>
-      <w:pPr>
-        <w:pStyle w:val="ListBullet"/>
-        <w:spacing w:after="60"/>
-      </w:pPr>
-      <w:r>
-        <w:t>Исполнение рекомендации теперь сериализуется под write-lock SQLite. Это уменьшает риск редких гонок, когда два действия читают один и тот же старый state и расходятся только в момент записи.</w:t>
-      </w:r>
-    </w:p>
-    <w:p>
-      <w:pPr>
-        <w:pStyle w:val="ListBullet"/>
-        <w:spacing w:after="60"/>
-      </w:pPr>
-      <w:r>
-        <w:t>Если перевод рекомендации в статус executed не подтвердился, запуск бота откатывается целиком. Оператор больше не получает скрытый running-бот при несостоявшемся статусном переходе.</w:t>
-      </w:r>
-    </w:p>
-    <w:p>
-      <w:pPr>
-        <w:pStyle w:val="ListBullet"/>
-        <w:spacing w:after="60"/>
-      </w:pPr>
-      <w:r>
-        <w:t>Trade с флагом stop_bot=true теперь считается успешным только если бот реально переведён в stopped. Если финальная остановка не состоялась, trade не фиксируется и не искажает журнал событий.</w:t>
-      </w:r>
-    </w:p>
-    <w:p>
-      <w:pPr>
-        <w:pStyle w:val="ListBullet"/>
-        <w:spacing w:after="60"/>
-      </w:pPr>
-      <w:r>
-        <w:t>Льготный boot-grace в блоке «Здоровье символов» больше не красит в зелёный очень старые данные от предыдущего процесса. Если унаследованные свечи и тикеры уже слишком стары, символ останется stale и потребует реального обновления.</w:t>
-      </w:r>
-    </w:p>
-    <w:p>
-      <w:pPr>
-        <w:pStyle w:val="ListBullet"/>
-        <w:spacing w:after="60"/>
-      </w:pPr>
-      <w:r>
-        <w:t>Практическое следствие: при рестарте сервиса и при повторных операторских действиях можно больше доверять тому, что API-ответ, audit trail и фактическое состояние бота не противоречат друг другу.</w:t>
-      </w:r>
-    </w:p>
-    <w:p>
-      <w:pPr>
-        <w:pStyle w:val="ListBullet"/>
-      </w:pPr>
-      <w:r>
-        <w:t>Исправлен ещё один редкий, но принципиальный дефект publication-chain: поздний active-сигнал той же цепочки больше не может считаться «уже исполненным» только потому, что в истории есть старый stopped-бот. Повторное исполнение допустимо лишь при наличии живой running-экспозиции; иначе создаётся новый bot instance.</w:t>
-      </w:r>
-    </w:p>
-    <w:p>
-      <w:pPr>
-        <w:pStyle w:val="ListBullet"/>
-      </w:pPr>
-      <w:r>
-        <w:t>Практическое правило: если предыдущий бот по этой же идее уже закрыт, новый execute по active-рекомендации должен дать новый running bot_id. Возврат старого stopped bot_id теперь считается дефектом и больше не является нормальной идемпотентностью.</w:t>
-      </w:r>
-    </w:p>
-    <w:p>
-      <w:pPr>
-        <w:spacing w:before="120" w:after="0"/>
-      </w:pPr>
-      <w:r>
-        <w:t>Рекомендуемый быстрый контроль после рестарта: открыть «Здоровье символов», убедиться, что stale-статусы не скрываются boot-grace для явно старых данных, затем проверить /api/v1/status и только после этого выполнять сигнал.</w:t>
-      </w:r>
-    </w:p>
-    <w:p>
-      <w:pPr>
-        <w:pStyle w:val="Heading1"/>
-        <w:spacing w:before="120" w:after="120"/>
-      </w:pPr>
-      <w:r>
-        <w:rPr>
-          <w:b/>
-        </w:rPr>
-        <w:t>6. Контроль поставки и обновления</w:t>
-      </w:r>
-    </w:p>
-    <w:p>
-      <w:pPr>
-        <w:spacing w:before="120" w:after="120"/>
-      </w:pPr>
-      <w:r>
-        <w:t>После обновления сервиса полезно проверять не только API и UI, но и целостность самой поставки. Релиз считается готовым к эксплуатации, только если совпадают инструкции, набор зависимостей и операторские документы.</w:t>
-      </w:r>
-    </w:p>
-    <w:tbl>
-      <w:tblPr>
-        <w:tblStyle w:val="TableGrid"/>
-        <w:tblW w:type="auto" w:w="0"/>
-        <w:tblLook w:firstColumn="1" w:firstRow="1" w:lastColumn="0" w:lastRow="0" w:noHBand="0" w:noVBand="1" w:val="04A0"/>
-      </w:tblPr>
-      <w:tblGrid>
-        <w:gridCol w:w="3494"/>
-        <w:gridCol w:w="3494"/>
-        <w:gridCol w:w="3494"/>
-      </w:tblGrid>
-      <w:tr>
-        <w:tc>
-          <w:tcPr>
-            <w:tcW w:type="dxa" w:w="3494"/>
-            <w:shd w:fill="D9EAF7"/>
-          </w:tcPr>
-          <w:p>
-            <w:r>
-              <w:rPr>
-                <w:b/>
-              </w:rPr>
-              <w:t>Что проверить</w:t>
-            </w:r>
-          </w:p>
-        </w:tc>
-        <w:tc>
-          <w:tcPr>
-            <w:tcW w:type="dxa" w:w="3494"/>
-            <w:shd w:fill="D9EAF7"/>
-          </w:tcPr>
-          <w:p>
-            <w:r>
-              <w:rPr>
-                <w:b/>
-              </w:rPr>
-              <w:t>Как проверить</w:t>
-            </w:r>
-          </w:p>
-        </w:tc>
-        <w:tc>
-          <w:tcPr>
-            <w:tcW w:type="dxa" w:w="3494"/>
-            <w:shd w:fill="D9EAF7"/>
-          </w:tcPr>
-          <w:p>
-            <w:r>
-              <w:rPr>
-                <w:b/>
-              </w:rPr>
-              <w:t>Зачем это нужно</w:t>
+              <w:t>Увеличить размер или пропустить.</w:t>
             </w:r>
           </w:p>
         </w:tc>
@@ -1417,95 +1100,43 @@
       <w:tr>
         <w:tc>
           <w:tcPr>
-            <w:tcW w:type="dxa" w:w="3494"/>
+            <w:tcW w:type="dxa" w:w="3456"/>
           </w:tcPr>
           <w:p>
+            <w:r/>
             <w:r>
-              <w:t>Release quality-gate</w:t>
+              <w:rPr>
+                <w:b w:val="0"/>
+              </w:rPr>
+              <w:t>Risk gate</w:t>
             </w:r>
           </w:p>
         </w:tc>
         <w:tc>
           <w:tcPr>
-            <w:tcW w:type="dxa" w:w="3494"/>
+            <w:tcW w:type="dxa" w:w="3456"/>
           </w:tcPr>
           <w:p>
+            <w:r/>
             <w:r>
-              <w:t>Установить requirements.txt и requirements-dev.txt, затем выполнить pytest, py_compile и ruff.</w:t>
+              <w:rPr>
+                <w:b w:val="0"/>
+              </w:rPr>
+              <w:t>нет превышения лимитов и cooldown</w:t>
             </w:r>
           </w:p>
         </w:tc>
         <w:tc>
           <w:tcPr>
-            <w:tcW w:type="dxa" w:w="3494"/>
+            <w:tcW w:type="dxa" w:w="3456"/>
           </w:tcPr>
           <w:p>
+            <w:r/>
             <w:r>
-              <w:t>Исключает ситуацию, когда README требует проверку, а часть инструментов отсутствует в самой поставке.</w:t>
-            </w:r>
-          </w:p>
-        </w:tc>
-      </w:tr>
-      <w:tr>
-        <w:tc>
-          <w:tcPr>
-            <w:tcW w:type="dxa" w:w="3494"/>
-          </w:tcPr>
-          <w:p>
-            <w:r>
-              <w:t>Операторские артефакты</w:t>
-            </w:r>
-          </w:p>
-        </w:tc>
-        <w:tc>
-          <w:tcPr>
-            <w:tcW w:type="dxa" w:w="3494"/>
-          </w:tcPr>
-          <w:p>
-            <w:r>
-              <w:t>Убедиться, что README, .env.example и операторские DOCX/PDF в папке docs/ относятся к одной ревизии.</w:t>
-            </w:r>
-          </w:p>
-        </w:tc>
-        <w:tc>
-          <w:tcPr>
-            <w:tcW w:type="dxa" w:w="3494"/>
-          </w:tcPr>
-          <w:p>
-            <w:r>
-              <w:t>Снижает риск запуска по устаревшей инструкции или по конфигу, не совпадающему с кодом.</w:t>
-            </w:r>
-          </w:p>
-        </w:tc>
-      </w:tr>
-      <w:tr>
-        <w:tc>
-          <w:tcPr>
-            <w:tcW w:type="dxa" w:w="3494"/>
-          </w:tcPr>
-          <w:p>
-            <w:r>
-              <w:t>Smoke после рестарта</w:t>
-            </w:r>
-          </w:p>
-        </w:tc>
-        <w:tc>
-          <w:tcPr>
-            <w:tcW w:type="dxa" w:w="3494"/>
-          </w:tcPr>
-          <w:p>
-            <w:r>
-              <w:t>Проверить /api/v1/status, /api/v1/health/symbols и только затем список рекомендаций.</w:t>
-            </w:r>
-          </w:p>
-        </w:tc>
-        <w:tc>
-          <w:tcPr>
-            <w:tcW w:type="dxa" w:w="3494"/>
-          </w:tcPr>
-          <w:p>
-            <w:r>
-              <w:t>Позволяет отделить красивый сигнал от сигнала, опубликованного на фоне stale data или деградировавшего runtime.</w:t>
+              <w:rPr>
+                <w:b w:val="0"/>
+              </w:rPr>
+              <w:t>Ждать сброса ограничений.</w:t>
             </w:r>
           </w:p>
         </w:tc>
@@ -1513,21 +1144,71 @@
     </w:tbl>
     <w:p>
       <w:pPr>
-        <w:spacing w:before="120" w:after="120"/>
+        <w:pStyle w:val="Heading1"/>
       </w:pPr>
       <w:r>
-        <w:rPr>
-          <w:b/>
-        </w:rPr>
-        <w:t xml:space="preserve">Практическое правило: </w:t>
+        <w:t>6. Итоговый чек-лист</w:t>
       </w:r>
+    </w:p>
+    <w:p>
+      <w:pPr>
+        <w:pStyle w:val="ListNumber"/>
+      </w:pPr>
       <w:r>
-        <w:t>если после обновления не проходит базовый quality-gate или документы расходятся с README, такую сборку не следует считать готовой к рабочему запуску даже при полностью зелёном UI.</w:t>
+        <w:t>В карточке указан bot_type=futures_grid.</w:t>
+      </w:r>
+    </w:p>
+    <w:p>
+      <w:pPr>
+        <w:pStyle w:val="ListNumber"/>
+      </w:pPr>
+      <w:r>
+        <w:t>Venue/category указан как linear.</w:t>
+      </w:r>
+    </w:p>
+    <w:p>
+      <w:pPr>
+        <w:pStyle w:val="ListNumber"/>
+      </w:pPr>
+      <w:r>
+        <w:t>Direction понятен оператору: neutral, long или short.</w:t>
+      </w:r>
+    </w:p>
+    <w:p>
+      <w:pPr>
+        <w:pStyle w:val="ListNumber"/>
+      </w:pPr>
+      <w:r>
+        <w:t>Margin mode указан как isolated.</w:t>
+      </w:r>
+    </w:p>
+    <w:p>
+      <w:pPr>
+        <w:pStyle w:val="ListNumber"/>
+      </w:pPr>
+      <w:r>
+        <w:t>Нет critical validation errors.</w:t>
+      </w:r>
+    </w:p>
+    <w:p>
+      <w:pPr>
+        <w:pStyle w:val="ListNumber"/>
+      </w:pPr>
+      <w:r>
+        <w:t>Размер позиции укладывается в дневной риск и лимит на символ.</w:t>
+      </w:r>
+    </w:p>
+    <w:p>
+      <w:pPr>
+        <w:pStyle w:val="ListNumber"/>
+      </w:pPr>
+      <w:r>
+        <w:t>После сомнения решение по умолчанию — пропустить сделку.</w:t>
       </w:r>
     </w:p>
     <w:sectPr>
       <w:pgSz w:w="12240" w:h="15840"/>
-      <w:pgMar w:top="879" w:right="879" w:bottom="822" w:left="879" w:header="720" w:footer="720" w:gutter="0"/>
+      <w:pgMar w:top="792" w:right="936" w:bottom="792" w:left="936" w:header="720" w:footer="720" w:gutter="0"/>
       <w:cols w:space="720"/>
       <w:docGrid w:linePitch="360"/>
     </w:sectPr>
@@ -1899,8 +1580,8 @@
     <w:qFormat/>
     <w:rsid w:val="00FC693F"/>
     <w:rPr>
-      <w:rFonts w:ascii="Arial" w:hAnsi="Arial" w:eastAsia="Arial"/>
-      <w:sz w:val="20"/>
+      <w:rFonts w:ascii="Arial" w:hAnsi="Arial"/>
+      <w:sz w:val="19"/>
     </w:rPr>
   </w:style>
   <w:style w:type="paragraph" w:styleId="Header">
@@ -1962,11 +1643,11 @@
       <w:outlineLvl w:val="0"/>
     </w:pPr>
     <w:rPr>
-      <w:rFonts w:asciiTheme="majorHAnsi" w:eastAsiaTheme="majorEastAsia" w:hAnsiTheme="majorHAnsi" w:cstheme="majorBidi" w:ascii="Arial" w:hAnsi="Arial" w:eastAsia="Arial"/>
+      <w:rFonts w:asciiTheme="majorHAnsi" w:eastAsiaTheme="majorEastAsia" w:hAnsiTheme="majorHAnsi" w:cstheme="majorBidi" w:ascii="Arial" w:hAnsi="Arial"/>
       <w:b/>
       <w:bCs/>
-      <w:color w:val="0A2450"/>
-      <w:sz w:val="25"/>
+      <w:color w:val="365F91" w:themeColor="accent1" w:themeShade="BF"/>
+      <w:sz w:val="28"/>
       <w:szCs w:val="28"/>
     </w:rPr>
   </w:style>
@@ -1986,11 +1667,11 @@
       <w:outlineLvl w:val="1"/>
     </w:pPr>
     <w:rPr>
-      <w:rFonts w:asciiTheme="majorHAnsi" w:eastAsiaTheme="majorEastAsia" w:hAnsiTheme="majorHAnsi" w:cstheme="majorBidi" w:ascii="Arial" w:hAnsi="Arial" w:eastAsia="Arial"/>
+      <w:rFonts w:asciiTheme="majorHAnsi" w:eastAsiaTheme="majorEastAsia" w:hAnsiTheme="majorHAnsi" w:cstheme="majorBidi" w:ascii="Arial" w:hAnsi="Arial"/>
       <w:b/>
       <w:bCs/>
-      <w:color w:val="1E3A5F"/>
-      <w:sz w:val="22"/>
+      <w:color w:val="4F81BD" w:themeColor="accent1"/>
+      <w:sz w:val="26"/>
       <w:szCs w:val="26"/>
     </w:rPr>
   </w:style>
@@ -2010,7 +1691,7 @@
       <w:outlineLvl w:val="2"/>
     </w:pPr>
     <w:rPr>
-      <w:rFonts w:asciiTheme="majorHAnsi" w:eastAsiaTheme="majorEastAsia" w:hAnsiTheme="majorHAnsi" w:cstheme="majorBidi"/>
+      <w:rFonts w:asciiTheme="majorHAnsi" w:eastAsiaTheme="majorEastAsia" w:hAnsiTheme="majorHAnsi" w:cstheme="majorBidi" w:ascii="Arial" w:hAnsi="Arial"/>
       <w:b/>
       <w:bCs/>
       <w:color w:val="4F81BD" w:themeColor="accent1"/>
@@ -2251,12 +1932,11 @@
       <w:contextualSpacing/>
     </w:pPr>
     <w:rPr>
-      <w:rFonts w:asciiTheme="majorHAnsi" w:eastAsiaTheme="majorEastAsia" w:hAnsiTheme="majorHAnsi" w:cstheme="majorBidi" w:ascii="Arial" w:hAnsi="Arial" w:eastAsia="Arial"/>
-      <w:b/>
-      <w:color w:val="0A2450"/>
+      <w:rFonts w:asciiTheme="majorHAnsi" w:eastAsiaTheme="majorEastAsia" w:hAnsiTheme="majorHAnsi" w:cstheme="majorBidi"/>
+      <w:color w:val="17365D" w:themeColor="text2" w:themeShade="BF"/>
       <w:spacing w:val="5"/>
       <w:kern w:val="28"/>
-      <w:sz w:val="34"/>
+      <w:sz w:val="52"/>
       <w:szCs w:val="52"/>
     </w:rPr>
   </w:style>

</xml_diff>

<commit_message>
fix: harden Bybit linear futures grid recommendation logic
- remove stale audit-report references from README and CHANGELOG
- update docs to reflect current grid-only Bybit Linear USDT Futures scope
- calculate liquidation buffer against adverse grid boundary instead of reference price only
- enforce exact symbol matching when reading Bybit funding ticker data
- validate neutral leveraged preflight against worst long/short liquidation side
- improve UI risk display with worst liquidation buffer and edge buffer
- clean env example wording around legacy unsupported bot records
- update regression tests for documentation, funding, liquidation, and execution preflight
- regenerate operator DOCX/PDF documentation
- verify project with compile, JS syntax check, and pytest

Tests:
- python -m compileall -q app tests
- node --check app/ui/static/app.js
- pytest -q
</commit_message>
<xml_diff>
--- a/docs/instrukciya_operatora_bybit_recommender.docx
+++ b/docs/instrukciya_operatora_bybit_recommender.docx
@@ -783,7 +783,7 @@
         <w:pStyle w:val="ListBullet"/>
       </w:pPr>
       <w:r>
-        <w:t>Не использовать весь депозит как маржу: оставить резерв вне позиции.</w:t>
+        <w:t>Не использовать весь депозит как маржу: оставить резерв вне позиции и учитывать комиссии/funding.</w:t>
       </w:r>
     </w:p>
     <w:p>
@@ -791,7 +791,7 @@
         <w:pStyle w:val="ListBullet"/>
       </w:pPr>
       <w:r>
-        <w:t>Для 10x использовать только сильные направленные сигналы и небольшой размер.</w:t>
+        <w:t>Не использовать высокое плечо: leverage &gt; 1 допустим только при достаточном worst-boundary liquidation buffer и малом размере позиции.</w:t>
       </w:r>
     </w:p>
     <w:p>

</xml_diff>

<commit_message>
docs: sync how-to-trade infographic with leverage policy
- Update how_to_trade.png to reflect current 5x-only guarded execution policy
- Add source-of-truth HOW_TO_TRADE_INFOGRAPHIC.md
- Sync README, TRADING_LOGIC, KNOWN_RISKS, CHANGELOG
- Update operator instruction DOCX/PDF
- Fix .env.example max_leverage drift from 10 to 5
- Add audit report for documentation and infographic sync
- Add regression tests for docs/infographic consistency

Checks:
- python3 -m compileall -q app tests
- node --check app/ui/static/app.js
- pytest -q tests/test_iteration162_docs_and_infographic_sync.py
- pytest -q --disable-warnings --maxfail=1
</commit_message>
<xml_diff>
--- a/docs/instrukciya_operatora_bybit_recommender.docx
+++ b/docs/instrukciya_operatora_bybit_recommender.docx
@@ -8,8 +8,9 @@
       </w:pPr>
       <w:r>
         <w:rPr>
+          <w:rFonts w:ascii="DejaVu Sans" w:hAnsi="DejaVu Sans"/>
           <w:b/>
-          <w:sz w:val="34"/>
+          <w:sz w:val="40"/>
         </w:rPr>
         <w:t>Инструкция оператора Bybit Recommender</w:t>
       </w:r>
@@ -20,15 +21,21 @@
       </w:pPr>
       <w:r>
         <w:rPr>
+          <w:rFonts w:ascii="DejaVu Sans" w:hAnsi="DejaVu Sans"/>
           <w:b/>
-          <w:sz w:val="22"/>
+          <w:color w:val="006666"/>
+          <w:sz w:val="20"/>
         </w:rPr>
-        <w:t>Только USDT linear futures grid / bot_type=futures_grid</w:t>
+        <w:t>Только Bybit Linear USDT Perpetual / bot_type=futures_grid / recommendation + audit service</w:t>
       </w:r>
     </w:p>
     <w:p>
       <w:r>
-        <w:t>Ключевая граница: проект обслуживает только рекомендации для USDT linear futures grid. В конфигурации, UI, API и документации не должно быть режимов за пределами этого профиля.</w:t>
+        <w:rPr>
+          <w:rFonts w:ascii="DejaVu Sans" w:hAnsi="DejaVu Sans"/>
+          <w:b/>
+        </w:rPr>
+        <w:t>Ключевая граница: проект не является OMS/EMS и не выставляет реальные ордера на Bybit. Он формирует рекомендацию, проводит fail-closed preflight и ведёт audit trail. Финальный запуск делает оператор или внешний execution-layer после отдельной проверки биржи.</w:t>
       </w:r>
     </w:p>
     <w:p>
@@ -36,7 +43,95 @@
         <w:pStyle w:val="Heading1"/>
       </w:pPr>
       <w:r>
-        <w:t>1. Что разрешено к обслуживанию</w:t>
+        <w:t>1. Разрешённый продуктовый профиль</w:t>
+      </w:r>
+    </w:p>
+    <w:p>
+      <w:pPr>
+        <w:pStyle w:val="ListBullet"/>
+      </w:pPr>
+      <w:r>
+        <w:t>venue/category: linear; market: USDT perpetual futures; exact symbol format, например BTCUSDT, не BTC/USDT.</w:t>
+      </w:r>
+    </w:p>
+    <w:p>
+      <w:pPr>
+        <w:pStyle w:val="ListBullet"/>
+      </w:pPr>
+      <w:r>
+        <w:t>bot_type: только futures_grid; grid_type: arithmetic.</w:t>
+      </w:r>
+    </w:p>
+    <w:p>
+      <w:pPr>
+        <w:pStyle w:val="ListBullet"/>
+      </w:pPr>
+      <w:r>
+        <w:t>account_mode: unified; margin_mode: isolated.</w:t>
+      </w:r>
+    </w:p>
+    <w:p>
+      <w:pPr>
+        <w:pStyle w:val="ListBullet"/>
+      </w:pPr>
+      <w:r>
+        <w:t>direction: neutral, long или short. Neutral grid не получает directional TP/SL.</w:t>
+      </w:r>
+    </w:p>
+    <w:p>
+      <w:pPr>
+        <w:pStyle w:val="ListBullet"/>
+      </w:pPr>
+      <w:r>
+        <w:t>Любой unsupported bot_type, non-linear venue, cross/hedge mode, wrong symbol/category или status != Trading блокируется fail-closed.</w:t>
+      </w:r>
+    </w:p>
+    <w:p>
+      <w:pPr>
+        <w:pStyle w:val="Heading1"/>
+      </w:pPr>
+      <w:r>
+        <w:t>2. Операторский профиль счёта 100-500 USDT</w:t>
+      </w:r>
+    </w:p>
+    <w:p>
+      <w:pPr>
+        <w:pStyle w:val="ListBullet"/>
+      </w:pPr>
+      <w:r>
+        <w:t>1 running bot на счёт и один bot на symbol/publication-chain.</w:t>
+      </w:r>
+    </w:p>
+    <w:p>
+      <w:pPr>
+        <w:pStyle w:val="ListBullet"/>
+      </w:pPr>
+      <w:r>
+        <w:t>Рабочая маржа на bot: 10-15% депозита как верхний ориентир; резерв вне позиции минимум 75-85%.</w:t>
+      </w:r>
+    </w:p>
+    <w:p>
+      <w:pPr>
+        <w:pStyle w:val="ListBullet"/>
+      </w:pPr>
+      <w:r>
+        <w:t>Текущий shipped risk profile: min_leverage=5 и max_leverage=5. Плечо 5x допустимо только после прохождения всех guards и liquidation-buffer проверки.</w:t>
+      </w:r>
+    </w:p>
+    <w:p>
+      <w:pPr>
+        <w:pStyle w:val="ListBullet"/>
+      </w:pPr>
+      <w:r>
+        <w:t>Профиль 1-3x больше не является базовым actionable-режимом этой ревизии. Если max_leverage ниже 5, это осознанный safety-cap, при котором часть идей останется no_trade/blocked.</w:t>
+      </w:r>
+    </w:p>
+    <w:p>
+      <w:pPr>
+        <w:pStyle w:val="ListBullet"/>
+      </w:pPr>
+      <w:r>
+        <w:t>10x не является default для малого счёта и должен задаваться только отдельным осознанным RISK_LIMITS_JSON профилем.</w:t>
       </w:r>
     </w:p>
     <w:tbl>
@@ -44,281 +139,6 @@
         <w:tblStyle w:val="TableGrid"/>
         <w:tblW w:type="auto" w:w="0"/>
         <w:jc w:val="center"/>
-        <w:tblLook w:firstColumn="1" w:firstRow="1" w:lastColumn="0" w:lastRow="0" w:noHBand="0" w:noVBand="1" w:val="04A0"/>
-      </w:tblPr>
-      <w:tblGrid>
-        <w:gridCol w:w="5184"/>
-        <w:gridCol w:w="5184"/>
-      </w:tblGrid>
-      <w:tr>
-        <w:tc>
-          <w:tcPr>
-            <w:tcW w:type="dxa" w:w="5184"/>
-            <w:shd w:fill="D9EAF7"/>
-          </w:tcPr>
-          <w:p>
-            <w:r/>
-            <w:r>
-              <w:rPr>
-                <w:b/>
-              </w:rPr>
-              <w:t>Поле</w:t>
-            </w:r>
-          </w:p>
-        </w:tc>
-        <w:tc>
-          <w:tcPr>
-            <w:tcW w:type="dxa" w:w="5184"/>
-            <w:shd w:fill="D9EAF7"/>
-          </w:tcPr>
-          <w:p>
-            <w:r/>
-            <w:r>
-              <w:rPr>
-                <w:b/>
-              </w:rPr>
-              <w:t>Разрешённое значение</w:t>
-            </w:r>
-          </w:p>
-        </w:tc>
-      </w:tr>
-      <w:tr>
-        <w:tc>
-          <w:tcPr>
-            <w:tcW w:type="dxa" w:w="5184"/>
-            <w:vAlign w:val="top"/>
-          </w:tcPr>
-          <w:p>
-            <w:r/>
-            <w:r>
-              <w:rPr>
-                <w:b w:val="0"/>
-              </w:rPr>
-              <w:t>venue/category</w:t>
-            </w:r>
-          </w:p>
-        </w:tc>
-        <w:tc>
-          <w:tcPr>
-            <w:tcW w:type="dxa" w:w="5184"/>
-            <w:vAlign w:val="top"/>
-          </w:tcPr>
-          <w:p>
-            <w:r/>
-            <w:r>
-              <w:rPr>
-                <w:b w:val="0"/>
-              </w:rPr>
-              <w:t>linear</w:t>
-            </w:r>
-          </w:p>
-        </w:tc>
-      </w:tr>
-      <w:tr>
-        <w:tc>
-          <w:tcPr>
-            <w:tcW w:type="dxa" w:w="5184"/>
-            <w:vAlign w:val="top"/>
-          </w:tcPr>
-          <w:p>
-            <w:r/>
-            <w:r>
-              <w:rPr>
-                <w:b w:val="0"/>
-              </w:rPr>
-              <w:t>market</w:t>
-            </w:r>
-          </w:p>
-        </w:tc>
-        <w:tc>
-          <w:tcPr>
-            <w:tcW w:type="dxa" w:w="5184"/>
-            <w:vAlign w:val="top"/>
-          </w:tcPr>
-          <w:p>
-            <w:r/>
-            <w:r>
-              <w:rPr>
-                <w:b w:val="0"/>
-              </w:rPr>
-              <w:t>USDT perpetual futures</w:t>
-            </w:r>
-          </w:p>
-        </w:tc>
-      </w:tr>
-      <w:tr>
-        <w:tc>
-          <w:tcPr>
-            <w:tcW w:type="dxa" w:w="5184"/>
-            <w:vAlign w:val="top"/>
-          </w:tcPr>
-          <w:p>
-            <w:r/>
-            <w:r>
-              <w:rPr>
-                <w:b w:val="0"/>
-              </w:rPr>
-              <w:t>bot_type</w:t>
-            </w:r>
-          </w:p>
-        </w:tc>
-        <w:tc>
-          <w:tcPr>
-            <w:tcW w:type="dxa" w:w="5184"/>
-            <w:vAlign w:val="top"/>
-          </w:tcPr>
-          <w:p>
-            <w:r/>
-            <w:r>
-              <w:rPr>
-                <w:b w:val="0"/>
-              </w:rPr>
-              <w:t>futures_grid</w:t>
-            </w:r>
-          </w:p>
-        </w:tc>
-      </w:tr>
-      <w:tr>
-        <w:tc>
-          <w:tcPr>
-            <w:tcW w:type="dxa" w:w="5184"/>
-            <w:vAlign w:val="top"/>
-          </w:tcPr>
-          <w:p>
-            <w:r/>
-            <w:r>
-              <w:rPr>
-                <w:b w:val="0"/>
-              </w:rPr>
-              <w:t>account_mode</w:t>
-            </w:r>
-          </w:p>
-        </w:tc>
-        <w:tc>
-          <w:tcPr>
-            <w:tcW w:type="dxa" w:w="5184"/>
-            <w:vAlign w:val="top"/>
-          </w:tcPr>
-          <w:p>
-            <w:r/>
-            <w:r>
-              <w:rPr>
-                <w:b w:val="0"/>
-              </w:rPr>
-              <w:t>unified</w:t>
-            </w:r>
-          </w:p>
-        </w:tc>
-      </w:tr>
-      <w:tr>
-        <w:tc>
-          <w:tcPr>
-            <w:tcW w:type="dxa" w:w="5184"/>
-            <w:vAlign w:val="top"/>
-          </w:tcPr>
-          <w:p>
-            <w:r/>
-            <w:r>
-              <w:rPr>
-                <w:b w:val="0"/>
-              </w:rPr>
-              <w:t>margin_mode</w:t>
-            </w:r>
-          </w:p>
-        </w:tc>
-        <w:tc>
-          <w:tcPr>
-            <w:tcW w:type="dxa" w:w="5184"/>
-            <w:vAlign w:val="top"/>
-          </w:tcPr>
-          <w:p>
-            <w:r/>
-            <w:r>
-              <w:rPr>
-                <w:b w:val="0"/>
-              </w:rPr>
-              <w:t>isolated</w:t>
-            </w:r>
-          </w:p>
-        </w:tc>
-      </w:tr>
-      <w:tr>
-        <w:tc>
-          <w:tcPr>
-            <w:tcW w:type="dxa" w:w="5184"/>
-            <w:vAlign w:val="top"/>
-          </w:tcPr>
-          <w:p>
-            <w:r/>
-            <w:r>
-              <w:rPr>
-                <w:b w:val="0"/>
-              </w:rPr>
-              <w:t>direction</w:t>
-            </w:r>
-          </w:p>
-        </w:tc>
-        <w:tc>
-          <w:tcPr>
-            <w:tcW w:type="dxa" w:w="5184"/>
-            <w:vAlign w:val="top"/>
-          </w:tcPr>
-          <w:p>
-            <w:r/>
-            <w:r>
-              <w:rPr>
-                <w:b w:val="0"/>
-              </w:rPr>
-              <w:t>neutral, long или short</w:t>
-            </w:r>
-          </w:p>
-        </w:tc>
-      </w:tr>
-      <w:tr>
-        <w:tc>
-          <w:tcPr>
-            <w:tcW w:type="dxa" w:w="5184"/>
-            <w:vAlign w:val="top"/>
-          </w:tcPr>
-          <w:p>
-            <w:r/>
-            <w:r>
-              <w:rPr>
-                <w:b w:val="0"/>
-              </w:rPr>
-              <w:t>symbols</w:t>
-            </w:r>
-          </w:p>
-        </w:tc>
-        <w:tc>
-          <w:tcPr>
-            <w:tcW w:type="dxa" w:w="5184"/>
-            <w:vAlign w:val="top"/>
-          </w:tcPr>
-          <w:p>
-            <w:r/>
-            <w:r>
-              <w:rPr>
-                <w:b w:val="0"/>
-              </w:rPr>
-              <w:t>только инструменты из SYMBOLS_LINEAR</w:t>
-            </w:r>
-          </w:p>
-        </w:tc>
-      </w:tr>
-    </w:tbl>
-    <w:p>
-      <w:pPr>
-        <w:pStyle w:val="Heading1"/>
-      </w:pPr>
-      <w:r>
-        <w:t>2. Порядок принятия решения</w:t>
-      </w:r>
-    </w:p>
-    <w:tbl>
-      <w:tblPr>
-        <w:tblStyle w:val="TableGrid"/>
-        <w:tblW w:type="auto" w:w="0"/>
         <w:tblLook w:firstColumn="1" w:firstRow="1" w:lastColumn="0" w:lastRow="0" w:noHBand="0" w:noVBand="1" w:val="04A0"/>
       </w:tblPr>
       <w:tblGrid>
@@ -331,60 +151,96 @@
         <w:tc>
           <w:tcPr>
             <w:tcW w:type="dxa" w:w="2592"/>
-            <w:shd w:fill="D9EAF7"/>
+            <w:vAlign w:val="center"/>
+            <w:shd w:fill="1F4E79"/>
           </w:tcPr>
           <w:p>
-            <w:r/>
             <w:r>
               <w:rPr>
+                <w:rFonts w:ascii="DejaVu Sans" w:hAnsi="DejaVu Sans"/>
+                <w:sz w:val="18"/>
+              </w:rPr>
+            </w:r>
+            <w:r>
+              <w:rPr>
+                <w:rFonts w:ascii="DejaVu Sans" w:hAnsi="DejaVu Sans"/>
                 <w:b/>
+                <w:color w:val="FFFFFF"/>
+                <w:sz w:val="18"/>
               </w:rPr>
-              <w:t>Шаг</w:t>
+              <w:t>Баланс</w:t>
             </w:r>
           </w:p>
         </w:tc>
         <w:tc>
           <w:tcPr>
             <w:tcW w:type="dxa" w:w="2592"/>
-            <w:shd w:fill="D9EAF7"/>
+            <w:vAlign w:val="center"/>
+            <w:shd w:fill="1F4E79"/>
           </w:tcPr>
           <w:p>
-            <w:r/>
             <w:r>
               <w:rPr>
+                <w:rFonts w:ascii="DejaVu Sans" w:hAnsi="DejaVu Sans"/>
+                <w:sz w:val="18"/>
+              </w:rPr>
+            </w:r>
+            <w:r>
+              <w:rPr>
+                <w:rFonts w:ascii="DejaVu Sans" w:hAnsi="DejaVu Sans"/>
                 <w:b/>
+                <w:color w:val="FFFFFF"/>
+                <w:sz w:val="18"/>
               </w:rPr>
-              <w:t>Что смотреть</w:t>
+              <w:t>Маржа/бот, ориентир</w:t>
             </w:r>
           </w:p>
         </w:tc>
         <w:tc>
           <w:tcPr>
             <w:tcW w:type="dxa" w:w="2592"/>
-            <w:shd w:fill="D9EAF7"/>
+            <w:vAlign w:val="center"/>
+            <w:shd w:fill="1F4E79"/>
           </w:tcPr>
           <w:p>
-            <w:r/>
             <w:r>
               <w:rPr>
+                <w:rFonts w:ascii="DejaVu Sans" w:hAnsi="DejaVu Sans"/>
+                <w:sz w:val="18"/>
+              </w:rPr>
+            </w:r>
+            <w:r>
+              <w:rPr>
+                <w:rFonts w:ascii="DejaVu Sans" w:hAnsi="DejaVu Sans"/>
                 <w:b/>
+                <w:color w:val="FFFFFF"/>
+                <w:sz w:val="18"/>
               </w:rPr>
-              <w:t>Норма</w:t>
+              <w:t>Дневной стоп</w:t>
             </w:r>
           </w:p>
         </w:tc>
         <w:tc>
           <w:tcPr>
             <w:tcW w:type="dxa" w:w="2592"/>
-            <w:shd w:fill="D9EAF7"/>
+            <w:vAlign w:val="center"/>
+            <w:shd w:fill="1F4E79"/>
           </w:tcPr>
           <w:p>
-            <w:r/>
             <w:r>
               <w:rPr>
+                <w:rFonts w:ascii="DejaVu Sans" w:hAnsi="DejaVu Sans"/>
+                <w:sz w:val="18"/>
+              </w:rPr>
+            </w:r>
+            <w:r>
+              <w:rPr>
+                <w:rFonts w:ascii="DejaVu Sans" w:hAnsi="DejaVu Sans"/>
                 <w:b/>
+                <w:color w:val="FFFFFF"/>
+                <w:sz w:val="18"/>
               </w:rPr>
-              <w:t>Действие</w:t>
+              <w:t>Runtime leverage</w:t>
             </w:r>
           </w:p>
         </w:tc>
@@ -393,56 +249,88 @@
         <w:tc>
           <w:tcPr>
             <w:tcW w:type="dxa" w:w="2592"/>
+            <w:vAlign w:val="center"/>
           </w:tcPr>
           <w:p>
-            <w:r/>
             <w:r>
               <w:rPr>
+                <w:rFonts w:ascii="DejaVu Sans" w:hAnsi="DejaVu Sans"/>
+                <w:sz w:val="18"/>
+              </w:rPr>
+            </w:r>
+            <w:r>
+              <w:rPr>
+                <w:rFonts w:ascii="DejaVu Sans" w:hAnsi="DejaVu Sans"/>
                 <w:b w:val="0"/>
+                <w:sz w:val="18"/>
               </w:rPr>
-              <w:t>1</w:t>
+              <w:t>100-199 USDT</w:t>
             </w:r>
           </w:p>
         </w:tc>
         <w:tc>
           <w:tcPr>
             <w:tcW w:type="dxa" w:w="2592"/>
+            <w:vAlign w:val="center"/>
           </w:tcPr>
           <w:p>
-            <w:r/>
             <w:r>
               <w:rPr>
+                <w:rFonts w:ascii="DejaVu Sans" w:hAnsi="DejaVu Sans"/>
+                <w:sz w:val="18"/>
+              </w:rPr>
+            </w:r>
+            <w:r>
+              <w:rPr>
+                <w:rFonts w:ascii="DejaVu Sans" w:hAnsi="DejaVu Sans"/>
                 <w:b w:val="0"/>
+                <w:sz w:val="18"/>
               </w:rPr>
-              <w:t>Статус</w:t>
+              <w:t>10-20 USDT</w:t>
             </w:r>
           </w:p>
         </w:tc>
         <w:tc>
           <w:tcPr>
             <w:tcW w:type="dxa" w:w="2592"/>
+            <w:vAlign w:val="center"/>
           </w:tcPr>
           <w:p>
-            <w:r/>
             <w:r>
               <w:rPr>
+                <w:rFonts w:ascii="DejaVu Sans" w:hAnsi="DejaVu Sans"/>
+                <w:sz w:val="18"/>
+              </w:rPr>
+            </w:r>
+            <w:r>
+              <w:rPr>
+                <w:rFonts w:ascii="DejaVu Sans" w:hAnsi="DejaVu Sans"/>
                 <w:b w:val="0"/>
+                <w:sz w:val="18"/>
               </w:rPr>
-              <w:t>recommended или active</w:t>
+              <w:t>3-5 USDT</w:t>
             </w:r>
           </w:p>
         </w:tc>
         <w:tc>
           <w:tcPr>
             <w:tcW w:type="dxa" w:w="2592"/>
+            <w:vAlign w:val="center"/>
           </w:tcPr>
           <w:p>
-            <w:r/>
             <w:r>
               <w:rPr>
+                <w:rFonts w:ascii="DejaVu Sans" w:hAnsi="DejaVu Sans"/>
+                <w:sz w:val="18"/>
+              </w:rPr>
+            </w:r>
+            <w:r>
+              <w:rPr>
+                <w:rFonts w:ascii="DejaVu Sans" w:hAnsi="DejaVu Sans"/>
                 <w:b w:val="0"/>
+                <w:sz w:val="18"/>
               </w:rPr>
-              <w:t>Только такие идеи рассматривать к запуску.</w:t>
+              <w:t>5x только после OK</w:t>
             </w:r>
           </w:p>
         </w:tc>
@@ -451,56 +339,88 @@
         <w:tc>
           <w:tcPr>
             <w:tcW w:type="dxa" w:w="2592"/>
+            <w:vAlign w:val="center"/>
           </w:tcPr>
           <w:p>
-            <w:r/>
             <w:r>
               <w:rPr>
+                <w:rFonts w:ascii="DejaVu Sans" w:hAnsi="DejaVu Sans"/>
+                <w:sz w:val="18"/>
+              </w:rPr>
+            </w:r>
+            <w:r>
+              <w:rPr>
+                <w:rFonts w:ascii="DejaVu Sans" w:hAnsi="DejaVu Sans"/>
                 <w:b w:val="0"/>
+                <w:sz w:val="18"/>
               </w:rPr>
-              <w:t>2</w:t>
+              <w:t>200-349 USDT</w:t>
             </w:r>
           </w:p>
         </w:tc>
         <w:tc>
           <w:tcPr>
             <w:tcW w:type="dxa" w:w="2592"/>
+            <w:vAlign w:val="center"/>
           </w:tcPr>
           <w:p>
-            <w:r/>
             <w:r>
               <w:rPr>
+                <w:rFonts w:ascii="DejaVu Sans" w:hAnsi="DejaVu Sans"/>
+                <w:sz w:val="18"/>
+              </w:rPr>
+            </w:r>
+            <w:r>
+              <w:rPr>
+                <w:rFonts w:ascii="DejaVu Sans" w:hAnsi="DejaVu Sans"/>
                 <w:b w:val="0"/>
+                <w:sz w:val="18"/>
               </w:rPr>
-              <w:t>Тип и рынок</w:t>
+              <w:t>20-35 USDT</w:t>
             </w:r>
           </w:p>
         </w:tc>
         <w:tc>
           <w:tcPr>
             <w:tcW w:type="dxa" w:w="2592"/>
+            <w:vAlign w:val="center"/>
           </w:tcPr>
           <w:p>
-            <w:r/>
             <w:r>
               <w:rPr>
+                <w:rFonts w:ascii="DejaVu Sans" w:hAnsi="DejaVu Sans"/>
+                <w:sz w:val="18"/>
+              </w:rPr>
+            </w:r>
+            <w:r>
+              <w:rPr>
+                <w:rFonts w:ascii="DejaVu Sans" w:hAnsi="DejaVu Sans"/>
                 <w:b w:val="0"/>
+                <w:sz w:val="18"/>
               </w:rPr>
-              <w:t>futures_grid + linear</w:t>
+              <w:t>5-10 USDT</w:t>
             </w:r>
           </w:p>
         </w:tc>
         <w:tc>
           <w:tcPr>
             <w:tcW w:type="dxa" w:w="2592"/>
+            <w:vAlign w:val="center"/>
           </w:tcPr>
           <w:p>
-            <w:r/>
             <w:r>
               <w:rPr>
+                <w:rFonts w:ascii="DejaVu Sans" w:hAnsi="DejaVu Sans"/>
+                <w:sz w:val="18"/>
+              </w:rPr>
+            </w:r>
+            <w:r>
+              <w:rPr>
+                <w:rFonts w:ascii="DejaVu Sans" w:hAnsi="DejaVu Sans"/>
                 <w:b w:val="0"/>
+                <w:sz w:val="18"/>
               </w:rPr>
-              <w:t>Несовпадение блокирует запуск.</w:t>
+              <w:t>5x только после OK</w:t>
             </w:r>
           </w:p>
         </w:tc>
@@ -509,347 +429,93 @@
         <w:tc>
           <w:tcPr>
             <w:tcW w:type="dxa" w:w="2592"/>
+            <w:vAlign w:val="center"/>
           </w:tcPr>
           <w:p>
-            <w:r/>
             <w:r>
               <w:rPr>
+                <w:rFonts w:ascii="DejaVu Sans" w:hAnsi="DejaVu Sans"/>
+                <w:sz w:val="18"/>
+              </w:rPr>
+            </w:r>
+            <w:r>
+              <w:rPr>
+                <w:rFonts w:ascii="DejaVu Sans" w:hAnsi="DejaVu Sans"/>
                 <w:b w:val="0"/>
+                <w:sz w:val="18"/>
               </w:rPr>
-              <w:t>3</w:t>
+              <w:t>350-500 USDT</w:t>
             </w:r>
           </w:p>
         </w:tc>
         <w:tc>
           <w:tcPr>
             <w:tcW w:type="dxa" w:w="2592"/>
+            <w:vAlign w:val="center"/>
           </w:tcPr>
           <w:p>
-            <w:r/>
             <w:r>
               <w:rPr>
+                <w:rFonts w:ascii="DejaVu Sans" w:hAnsi="DejaVu Sans"/>
+                <w:sz w:val="18"/>
+              </w:rPr>
+            </w:r>
+            <w:r>
+              <w:rPr>
+                <w:rFonts w:ascii="DejaVu Sans" w:hAnsi="DejaVu Sans"/>
                 <w:b w:val="0"/>
+                <w:sz w:val="18"/>
               </w:rPr>
-              <w:t>Margin и mode</w:t>
+              <w:t>35-60 USDT</w:t>
             </w:r>
           </w:p>
         </w:tc>
         <w:tc>
           <w:tcPr>
             <w:tcW w:type="dxa" w:w="2592"/>
+            <w:vAlign w:val="center"/>
           </w:tcPr>
           <w:p>
-            <w:r/>
             <w:r>
               <w:rPr>
+                <w:rFonts w:ascii="DejaVu Sans" w:hAnsi="DejaVu Sans"/>
+                <w:sz w:val="18"/>
+              </w:rPr>
+            </w:r>
+            <w:r>
+              <w:rPr>
+                <w:rFonts w:ascii="DejaVu Sans" w:hAnsi="DejaVu Sans"/>
                 <w:b w:val="0"/>
+                <w:sz w:val="18"/>
               </w:rPr>
-              <w:t>unified + isolated</w:t>
+              <w:t>10-15 USDT</w:t>
             </w:r>
           </w:p>
         </w:tc>
         <w:tc>
           <w:tcPr>
             <w:tcW w:type="dxa" w:w="2592"/>
+            <w:vAlign w:val="center"/>
           </w:tcPr>
           <w:p>
-            <w:r/>
             <w:r>
               <w:rPr>
-                <w:b w:val="0"/>
+                <w:rFonts w:ascii="DejaVu Sans" w:hAnsi="DejaVu Sans"/>
+                <w:sz w:val="18"/>
               </w:rPr>
-              <w:t>Пустой или иной режим не принимать к исполнению.</w:t>
             </w:r>
-          </w:p>
-        </w:tc>
-      </w:tr>
-      <w:tr>
-        <w:tc>
-          <w:tcPr>
-            <w:tcW w:type="dxa" w:w="2592"/>
-          </w:tcPr>
-          <w:p>
-            <w:r/>
             <w:r>
               <w:rPr>
+                <w:rFonts w:ascii="DejaVu Sans" w:hAnsi="DejaVu Sans"/>
                 <w:b w:val="0"/>
+                <w:sz w:val="18"/>
               </w:rPr>
-              <w:t>4</w:t>
-            </w:r>
-          </w:p>
-        </w:tc>
-        <w:tc>
-          <w:tcPr>
-            <w:tcW w:type="dxa" w:w="2592"/>
-          </w:tcPr>
-          <w:p>
-            <w:r/>
-            <w:r>
-              <w:rPr>
-                <w:b w:val="0"/>
-              </w:rPr>
-              <w:t>Сигнал</w:t>
-            </w:r>
-          </w:p>
-        </w:tc>
-        <w:tc>
-          <w:tcPr>
-            <w:tcW w:type="dxa" w:w="2592"/>
-          </w:tcPr>
-          <w:p>
-            <w:r/>
-            <w:r>
-              <w:rPr>
-                <w:b w:val="0"/>
-              </w:rPr>
-              <w:t>score, confidence, expected RR выше рабочих порогов</w:t>
-            </w:r>
-          </w:p>
-        </w:tc>
-        <w:tc>
-          <w:tcPr>
-            <w:tcW w:type="dxa" w:w="2592"/>
-          </w:tcPr>
-          <w:p>
-            <w:r/>
-            <w:r>
-              <w:rPr>
-                <w:b w:val="0"/>
-              </w:rPr>
-              <w:t>Слабые идеи пропускать.</w:t>
-            </w:r>
-          </w:p>
-        </w:tc>
-      </w:tr>
-      <w:tr>
-        <w:tc>
-          <w:tcPr>
-            <w:tcW w:type="dxa" w:w="2592"/>
-          </w:tcPr>
-          <w:p>
-            <w:r/>
-            <w:r>
-              <w:rPr>
-                <w:b w:val="0"/>
-              </w:rPr>
-              <w:t>5</w:t>
-            </w:r>
-          </w:p>
-        </w:tc>
-        <w:tc>
-          <w:tcPr>
-            <w:tcW w:type="dxa" w:w="2592"/>
-          </w:tcPr>
-          <w:p>
-            <w:r/>
-            <w:r>
-              <w:rPr>
-                <w:b w:val="0"/>
-              </w:rPr>
-              <w:t>Риски</w:t>
-            </w:r>
-          </w:p>
-        </w:tc>
-        <w:tc>
-          <w:tcPr>
-            <w:tcW w:type="dxa" w:w="2592"/>
-          </w:tcPr>
-          <w:p>
-            <w:r/>
-            <w:r>
-              <w:rPr>
-                <w:b w:val="0"/>
-              </w:rPr>
-              <w:t>market shock, fast veto, freshness, liquidity</w:t>
-            </w:r>
-          </w:p>
-        </w:tc>
-        <w:tc>
-          <w:tcPr>
-            <w:tcW w:type="dxa" w:w="2592"/>
-          </w:tcPr>
-          <w:p>
-            <w:r/>
-            <w:r>
-              <w:rPr>
-                <w:b w:val="0"/>
-              </w:rPr>
-              <w:t>Красные флаги блокируют запуск.</w:t>
-            </w:r>
-          </w:p>
-        </w:tc>
-      </w:tr>
-      <w:tr>
-        <w:tc>
-          <w:tcPr>
-            <w:tcW w:type="dxa" w:w="2592"/>
-          </w:tcPr>
-          <w:p>
-            <w:r/>
-            <w:r>
-              <w:rPr>
-                <w:b w:val="0"/>
-              </w:rPr>
-              <w:t>6</w:t>
-            </w:r>
-          </w:p>
-        </w:tc>
-        <w:tc>
-          <w:tcPr>
-            <w:tcW w:type="dxa" w:w="2592"/>
-          </w:tcPr>
-          <w:p>
-            <w:r/>
-            <w:r>
-              <w:rPr>
-                <w:b w:val="0"/>
-              </w:rPr>
-              <w:t>План сетки</w:t>
-            </w:r>
-          </w:p>
-        </w:tc>
-        <w:tc>
-          <w:tcPr>
-            <w:tcW w:type="dxa" w:w="2592"/>
-          </w:tcPr>
-          <w:p>
-            <w:r/>
-            <w:r>
-              <w:rPr>
-                <w:b w:val="0"/>
-              </w:rPr>
-              <w:t>range, step, levels, kill-switch, sizing</w:t>
-            </w:r>
-          </w:p>
-        </w:tc>
-        <w:tc>
-          <w:tcPr>
-            <w:tcW w:type="dxa" w:w="2592"/>
-          </w:tcPr>
-          <w:p>
-            <w:r/>
-            <w:r>
-              <w:rPr>
-                <w:b w:val="0"/>
-              </w:rPr>
-              <w:t>Переносить в Bybit только после preflight без critical errors.</w:t>
+              <w:t>5x только после OK</w:t>
             </w:r>
           </w:p>
         </w:tc>
       </w:tr>
     </w:tbl>
-    <w:p>
-      <w:pPr>
-        <w:pStyle w:val="Heading1"/>
-      </w:pPr>
-      <w:r>
-        <w:t>3. Правила запуска</w:t>
-      </w:r>
-    </w:p>
-    <w:p>
-      <w:pPr>
-        <w:pStyle w:val="ListBullet"/>
-      </w:pPr>
-      <w:r>
-        <w:t>Не запускать идею без свежих 1m candles и ticker.</w:t>
-      </w:r>
-    </w:p>
-    <w:p>
-      <w:pPr>
-        <w:pStyle w:val="ListBullet"/>
-      </w:pPr>
-      <w:r>
-        <w:t>Не запускать идею, если цена вышла за основной range или kill-switch.</w:t>
-      </w:r>
-    </w:p>
-    <w:p>
-      <w:pPr>
-        <w:pStyle w:val="ListBullet"/>
-      </w:pPr>
-      <w:r>
-        <w:t>Не запускать идею при critical validation errors в bybit_plan_validation.</w:t>
-      </w:r>
-    </w:p>
-    <w:p>
-      <w:pPr>
-        <w:pStyle w:val="ListBullet"/>
-      </w:pPr>
-      <w:r>
-        <w:t>Не держать более одного running bot_instance на один publication_chain.</w:t>
-      </w:r>
-    </w:p>
-    <w:p>
-      <w:pPr>
-        <w:pStyle w:val="ListBullet"/>
-      </w:pPr>
-      <w:r>
-        <w:t>Не использовать весь депозит как маржу: оставить резерв вне позиции и учитывать комиссии/funding.</w:t>
-      </w:r>
-    </w:p>
-    <w:p>
-      <w:pPr>
-        <w:pStyle w:val="ListBullet"/>
-      </w:pPr>
-      <w:r>
-        <w:t>Не использовать высокое плечо: leverage &gt; 1 допустим только при достаточном worst-boundary liquidation buffer и малом размере позиции.</w:t>
-      </w:r>
-    </w:p>
-    <w:p>
-      <w:pPr>
-        <w:pStyle w:val="Heading1"/>
-      </w:pPr>
-      <w:r>
-        <w:t>4. Конфигурация, которую нужно проверять</w:t>
-      </w:r>
-    </w:p>
-    <w:p>
-      <w:pPr>
-        <w:pStyle w:val="ListBullet"/>
-      </w:pPr>
-      <w:r>
-        <w:t>VENUES=linear</w:t>
-      </w:r>
-    </w:p>
-    <w:p>
-      <w:pPr>
-        <w:pStyle w:val="ListBullet"/>
-      </w:pPr>
-      <w:r>
-        <w:t>SYMBOLS_LINEAR содержит только USDT perpetual futures symbols.</w:t>
-      </w:r>
-    </w:p>
-    <w:p>
-      <w:pPr>
-        <w:pStyle w:val="ListBullet"/>
-      </w:pPr>
-      <w:r>
-        <w:t>TAKER_FEE_BPS_LINEAR соответствует текущим комиссиям.</w:t>
-      </w:r>
-    </w:p>
-    <w:p>
-      <w:pPr>
-        <w:pStyle w:val="ListBullet"/>
-      </w:pPr>
-      <w:r>
-        <w:t>RISK_LIMITS_JSON ограничивает max_concurrent_bots и max_symbol_bots.</w:t>
-      </w:r>
-    </w:p>
-    <w:p>
-      <w:pPr>
-        <w:pStyle w:val="ListBullet"/>
-      </w:pPr>
-      <w:r>
-        <w:t>ADMIN_API_KEY задан для любого удалённо доступного стенда.</w:t>
-      </w:r>
-    </w:p>
-    <w:p>
-      <w:pPr>
-        <w:pStyle w:val="ListBullet"/>
-      </w:pPr>
-      <w:r>
-        <w:t>LLM_REVIEWER_ENABLED включается только как дополнительный reviewer; он не заменяет risk gate.</w:t>
-      </w:r>
-    </w:p>
     <w:p>
       <w:r>
         <w:br w:type="page"/>
@@ -860,13 +526,14 @@
         <w:pStyle w:val="Heading1"/>
       </w:pPr>
       <w:r>
-        <w:t>5. Минимальный preflight перед подтверждением executed</w:t>
+        <w:t>3. Минимальный порядок принятия решения</w:t>
       </w:r>
     </w:p>
     <w:tbl>
       <w:tblPr>
         <w:tblStyle w:val="TableGrid"/>
         <w:tblW w:type="auto" w:w="0"/>
+        <w:jc w:val="center"/>
         <w:tblLook w:firstColumn="1" w:firstRow="1" w:lastColumn="0" w:lastRow="0" w:noHBand="0" w:noVBand="1" w:val="04A0"/>
       </w:tblPr>
       <w:tblGrid>
@@ -878,45 +545,72 @@
         <w:tc>
           <w:tcPr>
             <w:tcW w:type="dxa" w:w="3456"/>
-            <w:shd w:fill="D9EAF7"/>
+            <w:vAlign w:val="center"/>
+            <w:shd w:fill="38761D"/>
           </w:tcPr>
           <w:p>
-            <w:r/>
             <w:r>
               <w:rPr>
+                <w:rFonts w:ascii="DejaVu Sans" w:hAnsi="DejaVu Sans"/>
+                <w:sz w:val="18"/>
+              </w:rPr>
+            </w:r>
+            <w:r>
+              <w:rPr>
+                <w:rFonts w:ascii="DejaVu Sans" w:hAnsi="DejaVu Sans"/>
                 <w:b/>
+                <w:color w:val="FFFFFF"/>
+                <w:sz w:val="18"/>
               </w:rPr>
-              <w:t>Проверка</w:t>
+              <w:t>Шаг</w:t>
             </w:r>
           </w:p>
         </w:tc>
         <w:tc>
           <w:tcPr>
             <w:tcW w:type="dxa" w:w="3456"/>
-            <w:shd w:fill="D9EAF7"/>
+            <w:vAlign w:val="center"/>
+            <w:shd w:fill="38761D"/>
           </w:tcPr>
           <w:p>
-            <w:r/>
             <w:r>
               <w:rPr>
+                <w:rFonts w:ascii="DejaVu Sans" w:hAnsi="DejaVu Sans"/>
+                <w:sz w:val="18"/>
+              </w:rPr>
+            </w:r>
+            <w:r>
+              <w:rPr>
+                <w:rFonts w:ascii="DejaVu Sans" w:hAnsi="DejaVu Sans"/>
                 <w:b/>
+                <w:color w:val="FFFFFF"/>
+                <w:sz w:val="18"/>
               </w:rPr>
-              <w:t>Ожидание</w:t>
+              <w:t>Что смотреть</w:t>
             </w:r>
           </w:p>
         </w:tc>
         <w:tc>
           <w:tcPr>
             <w:tcW w:type="dxa" w:w="3456"/>
-            <w:shd w:fill="D9EAF7"/>
+            <w:vAlign w:val="center"/>
+            <w:shd w:fill="38761D"/>
           </w:tcPr>
           <w:p>
-            <w:r/>
             <w:r>
               <w:rPr>
+                <w:rFonts w:ascii="DejaVu Sans" w:hAnsi="DejaVu Sans"/>
+                <w:sz w:val="18"/>
+              </w:rPr>
+            </w:r>
+            <w:r>
+              <w:rPr>
+                <w:rFonts w:ascii="DejaVu Sans" w:hAnsi="DejaVu Sans"/>
                 <w:b/>
+                <w:color w:val="FFFFFF"/>
+                <w:sz w:val="18"/>
               </w:rPr>
-              <w:t>Что делать при проблеме</w:t>
+              <w:t>Норма</w:t>
             </w:r>
           </w:p>
         </w:tc>
@@ -925,42 +619,66 @@
         <w:tc>
           <w:tcPr>
             <w:tcW w:type="dxa" w:w="3456"/>
+            <w:vAlign w:val="center"/>
           </w:tcPr>
           <w:p>
-            <w:r/>
             <w:r>
               <w:rPr>
+                <w:rFonts w:ascii="DejaVu Sans" w:hAnsi="DejaVu Sans"/>
+                <w:sz w:val="18"/>
+              </w:rPr>
+            </w:r>
+            <w:r>
+              <w:rPr>
+                <w:rFonts w:ascii="DejaVu Sans" w:hAnsi="DejaVu Sans"/>
                 <w:b w:val="0"/>
+                <w:sz w:val="18"/>
               </w:rPr>
-              <w:t>Bybit metadata</w:t>
+              <w:t>1</w:t>
             </w:r>
           </w:p>
         </w:tc>
         <w:tc>
           <w:tcPr>
             <w:tcW w:type="dxa" w:w="3456"/>
+            <w:vAlign w:val="center"/>
           </w:tcPr>
           <w:p>
-            <w:r/>
             <w:r>
               <w:rPr>
+                <w:rFonts w:ascii="DejaVu Sans" w:hAnsi="DejaVu Sans"/>
+                <w:sz w:val="18"/>
+              </w:rPr>
+            </w:r>
+            <w:r>
+              <w:rPr>
+                <w:rFonts w:ascii="DejaVu Sans" w:hAnsi="DejaVu Sans"/>
                 <w:b w:val="0"/>
+                <w:sz w:val="18"/>
               </w:rPr>
-              <w:t>category=linear, symbol совпадает, status=Trading</w:t>
+              <w:t>Проверить статус</w:t>
             </w:r>
           </w:p>
         </w:tc>
         <w:tc>
           <w:tcPr>
             <w:tcW w:type="dxa" w:w="3456"/>
+            <w:vAlign w:val="center"/>
           </w:tcPr>
           <w:p>
-            <w:r/>
             <w:r>
               <w:rPr>
+                <w:rFonts w:ascii="DejaVu Sans" w:hAnsi="DejaVu Sans"/>
+                <w:sz w:val="18"/>
+              </w:rPr>
+            </w:r>
+            <w:r>
+              <w:rPr>
+                <w:rFonts w:ascii="DejaVu Sans" w:hAnsi="DejaVu Sans"/>
                 <w:b w:val="0"/>
+                <w:sz w:val="18"/>
               </w:rPr>
-              <w:t>Не запускать до пересчёта/исправления symbol.</w:t>
+              <w:t>Только effective recommended/active без blocking/critical статусов.</w:t>
             </w:r>
           </w:p>
         </w:tc>
@@ -969,42 +687,66 @@
         <w:tc>
           <w:tcPr>
             <w:tcW w:type="dxa" w:w="3456"/>
+            <w:vAlign w:val="center"/>
           </w:tcPr>
           <w:p>
-            <w:r/>
             <w:r>
               <w:rPr>
+                <w:rFonts w:ascii="DejaVu Sans" w:hAnsi="DejaVu Sans"/>
+                <w:sz w:val="18"/>
+              </w:rPr>
+            </w:r>
+            <w:r>
+              <w:rPr>
+                <w:rFonts w:ascii="DejaVu Sans" w:hAnsi="DejaVu Sans"/>
                 <w:b w:val="0"/>
+                <w:sz w:val="18"/>
               </w:rPr>
-              <w:t>Tick/lot limits</w:t>
+              <w:t>2</w:t>
             </w:r>
           </w:p>
         </w:tc>
         <w:tc>
           <w:tcPr>
             <w:tcW w:type="dxa" w:w="3456"/>
+            <w:vAlign w:val="center"/>
           </w:tcPr>
           <w:p>
-            <w:r/>
             <w:r>
               <w:rPr>
+                <w:rFonts w:ascii="DejaVu Sans" w:hAnsi="DejaVu Sans"/>
+                <w:sz w:val="18"/>
+              </w:rPr>
+            </w:r>
+            <w:r>
+              <w:rPr>
+                <w:rFonts w:ascii="DejaVu Sans" w:hAnsi="DejaVu Sans"/>
                 <w:b w:val="0"/>
+                <w:sz w:val="18"/>
               </w:rPr>
-              <w:t>range и step выровнены по tick_size, qty по qty_step</w:t>
+              <w:t>Проверить продукт</w:t>
             </w:r>
           </w:p>
         </w:tc>
         <w:tc>
           <w:tcPr>
             <w:tcW w:type="dxa" w:w="3456"/>
+            <w:vAlign w:val="center"/>
           </w:tcPr>
           <w:p>
-            <w:r/>
             <w:r>
               <w:rPr>
+                <w:rFonts w:ascii="DejaVu Sans" w:hAnsi="DejaVu Sans"/>
+                <w:sz w:val="18"/>
+              </w:rPr>
+            </w:r>
+            <w:r>
+              <w:rPr>
+                <w:rFonts w:ascii="DejaVu Sans" w:hAnsi="DejaVu Sans"/>
                 <w:b w:val="0"/>
+                <w:sz w:val="18"/>
               </w:rPr>
-              <w:t>Скорректировать параметры или пропустить.</w:t>
+              <w:t>futures_grid + linear + USDT perpetual + unified + isolated + arithmetic.</w:t>
             </w:r>
           </w:p>
         </w:tc>
@@ -1013,42 +755,66 @@
         <w:tc>
           <w:tcPr>
             <w:tcW w:type="dxa" w:w="3456"/>
+            <w:vAlign w:val="center"/>
           </w:tcPr>
           <w:p>
-            <w:r/>
             <w:r>
               <w:rPr>
+                <w:rFonts w:ascii="DejaVu Sans" w:hAnsi="DejaVu Sans"/>
+                <w:sz w:val="18"/>
+              </w:rPr>
+            </w:r>
+            <w:r>
+              <w:rPr>
+                <w:rFonts w:ascii="DejaVu Sans" w:hAnsi="DejaVu Sans"/>
                 <w:b w:val="0"/>
+                <w:sz w:val="18"/>
               </w:rPr>
-              <w:t>Leverage</w:t>
+              <w:t>3</w:t>
             </w:r>
           </w:p>
         </w:tc>
         <w:tc>
           <w:tcPr>
             <w:tcW w:type="dxa" w:w="3456"/>
+            <w:vAlign w:val="center"/>
           </w:tcPr>
           <w:p>
-            <w:r/>
             <w:r>
               <w:rPr>
+                <w:rFonts w:ascii="DejaVu Sans" w:hAnsi="DejaVu Sans"/>
+                <w:sz w:val="18"/>
+              </w:rPr>
+            </w:r>
+            <w:r>
+              <w:rPr>
+                <w:rFonts w:ascii="DejaVu Sans" w:hAnsi="DejaVu Sans"/>
                 <w:b w:val="0"/>
+                <w:sz w:val="18"/>
               </w:rPr>
-              <w:t>значение в допустимом диапазоне и по step</w:t>
+              <w:t>Проверить свежесть идеи</w:t>
             </w:r>
           </w:p>
         </w:tc>
         <w:tc>
           <w:tcPr>
             <w:tcW w:type="dxa" w:w="3456"/>
+            <w:vAlign w:val="center"/>
           </w:tcPr>
           <w:p>
-            <w:r/>
             <w:r>
               <w:rPr>
+                <w:rFonts w:ascii="DejaVu Sans" w:hAnsi="DejaVu Sans"/>
+                <w:sz w:val="18"/>
+              </w:rPr>
+            </w:r>
+            <w:r>
+              <w:rPr>
+                <w:rFonts w:ascii="DejaVu Sans" w:hAnsi="DejaVu Sans"/>
                 <w:b w:val="0"/>
+                <w:sz w:val="18"/>
               </w:rPr>
-              <w:t>Исправить leverage или пропустить.</w:t>
+              <w:t>Свежие ticker/candles; publication-chain не истёк; уровни не устарели.</w:t>
             </w:r>
           </w:p>
         </w:tc>
@@ -1057,42 +823,66 @@
         <w:tc>
           <w:tcPr>
             <w:tcW w:type="dxa" w:w="3456"/>
+            <w:vAlign w:val="center"/>
           </w:tcPr>
           <w:p>
-            <w:r/>
             <w:r>
               <w:rPr>
+                <w:rFonts w:ascii="DejaVu Sans" w:hAnsi="DejaVu Sans"/>
+                <w:sz w:val="18"/>
+              </w:rPr>
+            </w:r>
+            <w:r>
+              <w:rPr>
+                <w:rFonts w:ascii="DejaVu Sans" w:hAnsi="DejaVu Sans"/>
                 <w:b w:val="0"/>
+                <w:sz w:val="18"/>
               </w:rPr>
-              <w:t>Notional</w:t>
+              <w:t>4</w:t>
             </w:r>
           </w:p>
         </w:tc>
         <w:tc>
           <w:tcPr>
             <w:tcW w:type="dxa" w:w="3456"/>
+            <w:vAlign w:val="center"/>
           </w:tcPr>
           <w:p>
-            <w:r/>
             <w:r>
               <w:rPr>
+                <w:rFonts w:ascii="DejaVu Sans" w:hAnsi="DejaVu Sans"/>
+                <w:sz w:val="18"/>
+              </w:rPr>
+            </w:r>
+            <w:r>
+              <w:rPr>
+                <w:rFonts w:ascii="DejaVu Sans" w:hAnsi="DejaVu Sans"/>
                 <w:b w:val="0"/>
+                <w:sz w:val="18"/>
               </w:rPr>
-              <w:t>ордер не ниже min_notional</w:t>
+              <w:t>Проверить цену</w:t>
             </w:r>
           </w:p>
         </w:tc>
         <w:tc>
           <w:tcPr>
             <w:tcW w:type="dxa" w:w="3456"/>
+            <w:vAlign w:val="center"/>
           </w:tcPr>
           <w:p>
-            <w:r/>
             <w:r>
               <w:rPr>
+                <w:rFonts w:ascii="DejaVu Sans" w:hAnsi="DejaVu Sans"/>
+                <w:sz w:val="18"/>
+              </w:rPr>
+            </w:r>
+            <w:r>
+              <w:rPr>
+                <w:rFonts w:ascii="DejaVu Sans" w:hAnsi="DejaVu Sans"/>
                 <w:b w:val="0"/>
+                <w:sz w:val="18"/>
               </w:rPr>
-              <w:t>Увеличить размер или пропустить.</w:t>
+              <w:t>Live price внутри grid range и вне kill-switch; price_input_valid=true.</w:t>
             </w:r>
           </w:p>
         </w:tc>
@@ -1101,42 +891,270 @@
         <w:tc>
           <w:tcPr>
             <w:tcW w:type="dxa" w:w="3456"/>
+            <w:vAlign w:val="center"/>
           </w:tcPr>
           <w:p>
-            <w:r/>
             <w:r>
               <w:rPr>
+                <w:rFonts w:ascii="DejaVu Sans" w:hAnsi="DejaVu Sans"/>
+                <w:sz w:val="18"/>
+              </w:rPr>
+            </w:r>
+            <w:r>
+              <w:rPr>
+                <w:rFonts w:ascii="DejaVu Sans" w:hAnsi="DejaVu Sans"/>
                 <w:b w:val="0"/>
+                <w:sz w:val="18"/>
               </w:rPr>
-              <w:t>Risk gate</w:t>
+              <w:t>5</w:t>
             </w:r>
           </w:p>
         </w:tc>
         <w:tc>
           <w:tcPr>
             <w:tcW w:type="dxa" w:w="3456"/>
+            <w:vAlign w:val="center"/>
           </w:tcPr>
           <w:p>
-            <w:r/>
             <w:r>
               <w:rPr>
+                <w:rFonts w:ascii="DejaVu Sans" w:hAnsi="DejaVu Sans"/>
+                <w:sz w:val="18"/>
+              </w:rPr>
+            </w:r>
+            <w:r>
+              <w:rPr>
+                <w:rFonts w:ascii="DejaVu Sans" w:hAnsi="DejaVu Sans"/>
                 <w:b w:val="0"/>
+                <w:sz w:val="18"/>
               </w:rPr>
-              <w:t>нет превышения лимитов и cooldown</w:t>
+              <w:t>Проверить экономику</w:t>
             </w:r>
           </w:p>
         </w:tc>
         <w:tc>
           <w:tcPr>
             <w:tcW w:type="dxa" w:w="3456"/>
+            <w:vAlign w:val="center"/>
           </w:tcPr>
           <w:p>
-            <w:r/>
             <w:r>
               <w:rPr>
+                <w:rFonts w:ascii="DejaVu Sans" w:hAnsi="DejaVu Sans"/>
+                <w:sz w:val="18"/>
+              </w:rPr>
+            </w:r>
+            <w:r>
+              <w:rPr>
+                <w:rFonts w:ascii="DejaVu Sans" w:hAnsi="DejaVu Sans"/>
                 <w:b w:val="0"/>
+                <w:sz w:val="18"/>
               </w:rPr>
-              <w:t>Ждать сброса ограничений.</w:t>
+              <w:t>Net profit per grid выше fees + spread + slippage + adverse funding.</w:t>
+            </w:r>
+          </w:p>
+        </w:tc>
+      </w:tr>
+      <w:tr>
+        <w:tc>
+          <w:tcPr>
+            <w:tcW w:type="dxa" w:w="3456"/>
+            <w:vAlign w:val="center"/>
+          </w:tcPr>
+          <w:p>
+            <w:r>
+              <w:rPr>
+                <w:rFonts w:ascii="DejaVu Sans" w:hAnsi="DejaVu Sans"/>
+                <w:sz w:val="18"/>
+              </w:rPr>
+            </w:r>
+            <w:r>
+              <w:rPr>
+                <w:rFonts w:ascii="DejaVu Sans" w:hAnsi="DejaVu Sans"/>
+                <w:b w:val="0"/>
+                <w:sz w:val="18"/>
+              </w:rPr>
+              <w:t>6</w:t>
+            </w:r>
+          </w:p>
+        </w:tc>
+        <w:tc>
+          <w:tcPr>
+            <w:tcW w:type="dxa" w:w="3456"/>
+            <w:vAlign w:val="center"/>
+          </w:tcPr>
+          <w:p>
+            <w:r>
+              <w:rPr>
+                <w:rFonts w:ascii="DejaVu Sans" w:hAnsi="DejaVu Sans"/>
+                <w:sz w:val="18"/>
+              </w:rPr>
+            </w:r>
+            <w:r>
+              <w:rPr>
+                <w:rFonts w:ascii="DejaVu Sans" w:hAnsi="DejaVu Sans"/>
+                <w:b w:val="0"/>
+                <w:sz w:val="18"/>
+              </w:rPr>
+              <w:t>Проверить Bybit filters</w:t>
+            </w:r>
+          </w:p>
+        </w:tc>
+        <w:tc>
+          <w:tcPr>
+            <w:tcW w:type="dxa" w:w="3456"/>
+            <w:vAlign w:val="center"/>
+          </w:tcPr>
+          <w:p>
+            <w:r>
+              <w:rPr>
+                <w:rFonts w:ascii="DejaVu Sans" w:hAnsi="DejaVu Sans"/>
+                <w:sz w:val="18"/>
+              </w:rPr>
+            </w:r>
+            <w:r>
+              <w:rPr>
+                <w:rFonts w:ascii="DejaVu Sans" w:hAnsi="DejaVu Sans"/>
+                <w:b w:val="0"/>
+                <w:sz w:val="18"/>
+              </w:rPr>
+              <w:t>tickSize, qtyStep, minQty, maxQty, minNotional, leverageFilter и status=Trading.</w:t>
+            </w:r>
+          </w:p>
+        </w:tc>
+      </w:tr>
+      <w:tr>
+        <w:tc>
+          <w:tcPr>
+            <w:tcW w:type="dxa" w:w="3456"/>
+            <w:vAlign w:val="center"/>
+          </w:tcPr>
+          <w:p>
+            <w:r>
+              <w:rPr>
+                <w:rFonts w:ascii="DejaVu Sans" w:hAnsi="DejaVu Sans"/>
+                <w:sz w:val="18"/>
+              </w:rPr>
+            </w:r>
+            <w:r>
+              <w:rPr>
+                <w:rFonts w:ascii="DejaVu Sans" w:hAnsi="DejaVu Sans"/>
+                <w:b w:val="0"/>
+                <w:sz w:val="18"/>
+              </w:rPr>
+              <w:t>7</w:t>
+            </w:r>
+          </w:p>
+        </w:tc>
+        <w:tc>
+          <w:tcPr>
+            <w:tcW w:type="dxa" w:w="3456"/>
+            <w:vAlign w:val="center"/>
+          </w:tcPr>
+          <w:p>
+            <w:r>
+              <w:rPr>
+                <w:rFonts w:ascii="DejaVu Sans" w:hAnsi="DejaVu Sans"/>
+                <w:sz w:val="18"/>
+              </w:rPr>
+            </w:r>
+            <w:r>
+              <w:rPr>
+                <w:rFonts w:ascii="DejaVu Sans" w:hAnsi="DejaVu Sans"/>
+                <w:b w:val="0"/>
+                <w:sz w:val="18"/>
+              </w:rPr>
+              <w:t>Проверить риск</w:t>
+            </w:r>
+          </w:p>
+        </w:tc>
+        <w:tc>
+          <w:tcPr>
+            <w:tcW w:type="dxa" w:w="3456"/>
+            <w:vAlign w:val="center"/>
+          </w:tcPr>
+          <w:p>
+            <w:r>
+              <w:rPr>
+                <w:rFonts w:ascii="DejaVu Sans" w:hAnsi="DejaVu Sans"/>
+                <w:sz w:val="18"/>
+              </w:rPr>
+            </w:r>
+            <w:r>
+              <w:rPr>
+                <w:rFonts w:ascii="DejaVu Sans" w:hAnsi="DejaVu Sans"/>
+                <w:b w:val="0"/>
+                <w:sz w:val="18"/>
+              </w:rPr>
+              <w:t>Risk limits, daily stop, cooldown, liquidation buffer, max notional/margin.</w:t>
+            </w:r>
+          </w:p>
+        </w:tc>
+      </w:tr>
+      <w:tr>
+        <w:tc>
+          <w:tcPr>
+            <w:tcW w:type="dxa" w:w="3456"/>
+            <w:vAlign w:val="center"/>
+          </w:tcPr>
+          <w:p>
+            <w:r>
+              <w:rPr>
+                <w:rFonts w:ascii="DejaVu Sans" w:hAnsi="DejaVu Sans"/>
+                <w:sz w:val="18"/>
+              </w:rPr>
+            </w:r>
+            <w:r>
+              <w:rPr>
+                <w:rFonts w:ascii="DejaVu Sans" w:hAnsi="DejaVu Sans"/>
+                <w:b w:val="0"/>
+                <w:sz w:val="18"/>
+              </w:rPr>
+              <w:t>8</w:t>
+            </w:r>
+          </w:p>
+        </w:tc>
+        <w:tc>
+          <w:tcPr>
+            <w:tcW w:type="dxa" w:w="3456"/>
+            <w:vAlign w:val="center"/>
+          </w:tcPr>
+          <w:p>
+            <w:r>
+              <w:rPr>
+                <w:rFonts w:ascii="DejaVu Sans" w:hAnsi="DejaVu Sans"/>
+                <w:sz w:val="18"/>
+              </w:rPr>
+            </w:r>
+            <w:r>
+              <w:rPr>
+                <w:rFonts w:ascii="DejaVu Sans" w:hAnsi="DejaVu Sans"/>
+                <w:b w:val="0"/>
+                <w:sz w:val="18"/>
+              </w:rPr>
+              <w:t>Проверить LLM gate</w:t>
+            </w:r>
+          </w:p>
+        </w:tc>
+        <w:tc>
+          <w:tcPr>
+            <w:tcW w:type="dxa" w:w="3456"/>
+            <w:vAlign w:val="center"/>
+          </w:tcPr>
+          <w:p>
+            <w:r>
+              <w:rPr>
+                <w:rFonts w:ascii="DejaVu Sans" w:hAnsi="DejaVu Sans"/>
+                <w:sz w:val="18"/>
+              </w:rPr>
+            </w:r>
+            <w:r>
+              <w:rPr>
+                <w:rFonts w:ascii="DejaVu Sans" w:hAnsi="DejaVu Sans"/>
+                <w:b w:val="0"/>
+                <w:sz w:val="18"/>
+              </w:rPr>
+              <w:t>Если reviewer включён, нужен свежий ok verdict; pending/timeout = не запускать.</w:t>
             </w:r>
           </w:p>
         </w:tc>
@@ -1147,63 +1165,177 @@
         <w:pStyle w:val="Heading1"/>
       </w:pPr>
       <w:r>
-        <w:t>6. Итоговый чек-лист</w:t>
+        <w:t>4. Directional TP/SL — обязательная семантика</w:t>
       </w:r>
     </w:p>
     <w:p>
       <w:pPr>
-        <w:pStyle w:val="ListNumber"/>
+        <w:pStyle w:val="ListBullet"/>
       </w:pPr>
       <w:r>
-        <w:t>В карточке указан bot_type=futures_grid.</w:t>
+        <w:t>Long: TP выше entry/reference, SL ниже entry/reference; прибыль считается при росте цены.</w:t>
       </w:r>
     </w:p>
     <w:p>
       <w:pPr>
-        <w:pStyle w:val="ListNumber"/>
+        <w:pStyle w:val="ListBullet"/>
       </w:pPr>
       <w:r>
-        <w:t>Venue/category указан как linear.</w:t>
+        <w:t>Short: TP ниже entry/reference, SL выше entry/reference; прибыль считается при падении цены.</w:t>
       </w:r>
     </w:p>
     <w:p>
       <w:pPr>
-        <w:pStyle w:val="ListNumber"/>
+        <w:pStyle w:val="ListBullet"/>
       </w:pPr>
       <w:r>
-        <w:t>Direction понятен оператору: neutral, long или short.</w:t>
+        <w:t>Protective TP/SL intent должен быть reduce-only / close-only и не должен увеличивать или переворачивать экспозицию.</w:t>
       </w:r>
     </w:p>
     <w:p>
       <w:pPr>
-        <w:pStyle w:val="ListNumber"/>
+        <w:pStyle w:val="ListBullet"/>
       </w:pPr>
       <w:r>
-        <w:t>Margin mode указан как isolated.</w:t>
+        <w:t>Если backend и UI расходятся по геометрии TP/SL, сделку не запускать до исправления и пересчёта.</w:t>
       </w:r>
     </w:p>
     <w:p>
       <w:pPr>
-        <w:pStyle w:val="ListNumber"/>
+        <w:pStyle w:val="Heading1"/>
       </w:pPr>
       <w:r>
-        <w:t>Нет critical validation errors.</w:t>
+        <w:t>5. Немедленный NO TRADE / STOP</w:t>
       </w:r>
     </w:p>
     <w:p>
       <w:pPr>
-        <w:pStyle w:val="ListNumber"/>
+        <w:pStyle w:val="ListBullet"/>
       </w:pPr>
       <w:r>
-        <w:t>Размер позиции укладывается в дневной риск и лимит на символ.</w:t>
+        <w:t>INVALID_MARKET_REFERENCE_PRICE, missing/stale ticker/candles, expired publication-chain.</w:t>
       </w:r>
     </w:p>
     <w:p>
       <w:pPr>
-        <w:pStyle w:val="ListNumber"/>
+        <w:pStyle w:val="ListBullet"/>
       </w:pPr>
       <w:r>
-        <w:t>После сомнения решение по умолчанию — пропустить сделку.</w:t>
+        <w:t>Цена вышла за range или пересекла kill-switch.</w:t>
+      </w:r>
+    </w:p>
+    <w:p>
+      <w:pPr>
+        <w:pStyle w:val="ListBullet"/>
+      </w:pPr>
+      <w:r>
+        <w:t>Funding rate/interval неизвестны при material impact или funding ухудшает net edge до нуля.</w:t>
+      </w:r>
+    </w:p>
+    <w:p>
+      <w:pPr>
+        <w:pStyle w:val="ListBullet"/>
+      </w:pPr>
+      <w:r>
+        <w:t>Bybit metadata missing/wrong symbol/category/status; qtyStep/minQty/minNotional не проходят.</w:t>
+      </w:r>
+    </w:p>
+    <w:p>
+      <w:pPr>
+        <w:pStyle w:val="ListBullet"/>
+      </w:pPr>
+      <w:r>
+        <w:t>Market shock, flash-crash, squeeze, явный тренд против grid-range.</w:t>
+      </w:r>
+    </w:p>
+    <w:p>
+      <w:pPr>
+        <w:pStyle w:val="ListBullet"/>
+      </w:pPr>
+      <w:r>
+        <w:t>Daily stop, realized-loss cooldown, max position/margin/leverage cap превышены.</w:t>
+      </w:r>
+    </w:p>
+    <w:p>
+      <w:pPr>
+        <w:pStyle w:val="ListBullet"/>
+      </w:pPr>
+      <w:r>
+        <w:t>Нельзя reconciled exchange/local state, fills или защитные уровни.</w:t>
+      </w:r>
+    </w:p>
+    <w:p>
+      <w:pPr>
+        <w:pStyle w:val="Heading1"/>
+      </w:pPr>
+      <w:r>
+        <w:t>6. Итоговый чек-лист оператора</w:t>
+      </w:r>
+    </w:p>
+    <w:p>
+      <w:pPr>
+        <w:pStyle w:val="ListBullet"/>
+      </w:pPr>
+      <w:r>
+        <w:t>Не использовать весь депозит как маржу.</w:t>
+      </w:r>
+    </w:p>
+    <w:p>
+      <w:pPr>
+        <w:pStyle w:val="ListBullet"/>
+      </w:pPr>
+      <w:r>
+        <w:t>Не повышать плечо ради слабого сигнала.</w:t>
+      </w:r>
+    </w:p>
+    <w:p>
+      <w:pPr>
+        <w:pStyle w:val="ListBullet"/>
+      </w:pPr>
+      <w:r>
+        <w:t>Не обходить blocking/critical статусы manual override.</w:t>
+      </w:r>
+    </w:p>
+    <w:p>
+      <w:pPr>
+        <w:pStyle w:val="ListBullet"/>
+      </w:pPr>
+      <w:r>
+        <w:t>Не запускать без fresh ticker, fresh candles и актуальной publication-chain.</w:t>
+      </w:r>
+    </w:p>
+    <w:p>
+      <w:pPr>
+        <w:pStyle w:val="ListBullet"/>
+      </w:pPr>
+      <w:r>
+        <w:t>Не запускать без проверки range, kill-switch, liquidation buffer и Bybit filters.</w:t>
+      </w:r>
+    </w:p>
+    <w:p>
+      <w:pPr>
+        <w:pStyle w:val="ListBullet"/>
+      </w:pPr>
+      <w:r>
+        <w:t>Вести журнал причины входа, причины отказа и результата.</w:t>
+      </w:r>
+    </w:p>
+    <w:p>
+      <w:pPr>
+        <w:pStyle w:val="ListBullet"/>
+      </w:pPr>
+      <w:r>
+        <w:t>Для удалённого стенда ADMIN_API_KEY обязателен.</w:t>
+      </w:r>
+    </w:p>
+    <w:p>
+      <w:r>
+        <w:rPr>
+          <w:rFonts w:ascii="DejaVu Sans" w:hAnsi="DejaVu Sans"/>
+          <w:i/>
+          <w:sz w:val="17"/>
+        </w:rPr>
+        <w:t>Связанная инфографика: how_to_trade.png. Текстовый source-of-truth: docs/HOW_TO_TRADE_INFOGRAPHIC.md. Версия: 2026-06-14.</w:t>
       </w:r>
     </w:p>
     <w:sectPr>
@@ -1580,7 +1712,7 @@
     <w:qFormat/>
     <w:rsid w:val="00FC693F"/>
     <w:rPr>
-      <w:rFonts w:ascii="Arial" w:hAnsi="Arial"/>
+      <w:rFonts w:ascii="DejaVu Sans" w:hAnsi="DejaVu Sans"/>
       <w:sz w:val="19"/>
     </w:rPr>
   </w:style>
@@ -1643,7 +1775,7 @@
       <w:outlineLvl w:val="0"/>
     </w:pPr>
     <w:rPr>
-      <w:rFonts w:asciiTheme="majorHAnsi" w:eastAsiaTheme="majorEastAsia" w:hAnsiTheme="majorHAnsi" w:cstheme="majorBidi" w:ascii="Arial" w:hAnsi="Arial"/>
+      <w:rFonts w:asciiTheme="majorHAnsi" w:eastAsiaTheme="majorEastAsia" w:hAnsiTheme="majorHAnsi" w:cstheme="majorBidi" w:ascii="DejaVu Sans" w:hAnsi="DejaVu Sans"/>
       <w:b/>
       <w:bCs/>
       <w:color w:val="365F91" w:themeColor="accent1" w:themeShade="BF"/>
@@ -1667,7 +1799,7 @@
       <w:outlineLvl w:val="1"/>
     </w:pPr>
     <w:rPr>
-      <w:rFonts w:asciiTheme="majorHAnsi" w:eastAsiaTheme="majorEastAsia" w:hAnsiTheme="majorHAnsi" w:cstheme="majorBidi" w:ascii="Arial" w:hAnsi="Arial"/>
+      <w:rFonts w:asciiTheme="majorHAnsi" w:eastAsiaTheme="majorEastAsia" w:hAnsiTheme="majorHAnsi" w:cstheme="majorBidi" w:ascii="DejaVu Sans" w:hAnsi="DejaVu Sans"/>
       <w:b/>
       <w:bCs/>
       <w:color w:val="4F81BD" w:themeColor="accent1"/>
@@ -1691,7 +1823,7 @@
       <w:outlineLvl w:val="2"/>
     </w:pPr>
     <w:rPr>
-      <w:rFonts w:asciiTheme="majorHAnsi" w:eastAsiaTheme="majorEastAsia" w:hAnsiTheme="majorHAnsi" w:cstheme="majorBidi" w:ascii="Arial" w:hAnsi="Arial"/>
+      <w:rFonts w:asciiTheme="majorHAnsi" w:eastAsiaTheme="majorEastAsia" w:hAnsiTheme="majorHAnsi" w:cstheme="majorBidi" w:ascii="DejaVu Sans" w:hAnsi="DejaVu Sans"/>
       <w:b/>
       <w:bCs/>
       <w:color w:val="4F81BD" w:themeColor="accent1"/>

</xml_diff>

<commit_message>
chore(config): sync leverage profile to 3-5x across repo
* set default leverage range to 3-5x in env/config
* update docs and operator materials to reference 3-5x leverage
* refresh infographic and generated operator PDF/DOCX
* update regression tests for 3-5x leverage policy
* add audit report and static scan for leverage sync
* verify compileall, node syntax check, and full pytest suite
</commit_message>
<xml_diff>
--- a/docs/instrukciya_operatora_bybit_recommender.docx
+++ b/docs/instrukciya_operatora_bybit_recommender.docx
@@ -115,7 +115,7 @@
         <w:pStyle w:val="ListBullet"/>
       </w:pPr>
       <w:r>
-        <w:t>Текущий shipped risk profile: min_leverage=5 и max_leverage=5. Плечо 5x допустимо только после прохождения всех guards и liquidation-buffer проверки.</w:t>
+        <w:t>Текущий shipped risk profile: min_leverage=3 и max_leverage=5. Интервал 3-5x leverage допустим только после прохождения всех guards и liquidation-buffer проверки.</w:t>
       </w:r>
     </w:p>
     <w:p>
@@ -123,7 +123,7 @@
         <w:pStyle w:val="ListBullet"/>
       </w:pPr>
       <w:r>
-        <w:t>Профиль 1-3x больше не является базовым actionable-режимом этой ревизии. Если max_leverage ниже 5, это осознанный safety-cap, при котором часть идей останется no_trade/blocked.</w:t>
+        <w:t>Профиль 3-5x leverage является базовым actionable-диапазоном этой ревизии. Если max_leverage ниже 5 или min_leverage ниже 3, это осознанный safety-cap, при котором часть идей останется no_trade/blocked.</w:t>
       </w:r>
     </w:p>
     <w:p>
@@ -323,6 +323,7 @@
                 <w:rFonts w:ascii="DejaVu Sans" w:hAnsi="DejaVu Sans"/>
                 <w:sz w:val="18"/>
               </w:rPr>
+              <w:t>3-5x после OK</w:t>
             </w:r>
             <w:r>
               <w:rPr>
@@ -330,7 +331,6 @@
                 <w:b w:val="0"/>
                 <w:sz w:val="18"/>
               </w:rPr>
-              <w:t>5x только после OK</w:t>
             </w:r>
           </w:p>
         </w:tc>
@@ -413,6 +413,7 @@
                 <w:rFonts w:ascii="DejaVu Sans" w:hAnsi="DejaVu Sans"/>
                 <w:sz w:val="18"/>
               </w:rPr>
+              <w:t>3-5x после OK</w:t>
             </w:r>
             <w:r>
               <w:rPr>
@@ -420,7 +421,6 @@
                 <w:b w:val="0"/>
                 <w:sz w:val="18"/>
               </w:rPr>
-              <w:t>5x только после OK</w:t>
             </w:r>
           </w:p>
         </w:tc>
@@ -503,6 +503,7 @@
                 <w:rFonts w:ascii="DejaVu Sans" w:hAnsi="DejaVu Sans"/>
                 <w:sz w:val="18"/>
               </w:rPr>
+              <w:t>3-5x после OK</w:t>
             </w:r>
             <w:r>
               <w:rPr>
@@ -510,7 +511,6 @@
                 <w:b w:val="0"/>
                 <w:sz w:val="18"/>
               </w:rPr>
-              <w:t>5x только после OK</w:t>
             </w:r>
           </w:p>
         </w:tc>
@@ -1335,7 +1335,7 @@
           <w:i/>
           <w:sz w:val="17"/>
         </w:rPr>
-        <w:t>Связанная инфографика: how_to_trade.png. Текстовый source-of-truth: docs/HOW_TO_TRADE_INFOGRAPHIC.md. Версия: 2026-06-14.</w:t>
+        <w:t>Связанная инфографика: how_to_trade.png. Текстовый source-of-truth: docs/HOW_TO_TRADE_INFOGRAPHIC.md. Версия: 2026-06-15.</w:t>
       </w:r>
     </w:p>
     <w:sectPr>

</xml_diff>

<commit_message>
fix(preflight): reprice live bid-ask costs before grid execution
</commit_message>
<xml_diff>
--- a/docs/instrukciya_operatora_bybit_recommender.docx
+++ b/docs/instrukciya_operatora_bybit_recommender.docx
@@ -171,7 +171,7 @@
         <w:pStyle w:val="ListBullet"/>
       </w:pPr>
       <w:r>
-        <w:t>Устаревшая publication-chain, stale market data или live ticker вне range/kill-switch.</w:t>
+        <w:t>Устаревшая publication-chain, stale market data, live ticker вне range/kill-switch, отсутствующая пара bid/ask, spread &gt;14 bps, live net edge &lt;2 bps или gross/cost coverage &lt;=1,10x.</w:t>
       </w:r>
     </w:p>
     <w:p>
@@ -222,10 +222,10 @@
         <w:rPr>
           <w:b/>
         </w:rPr>
-        <w:t xml:space="preserve">2. </w:t>
+        <w:t xml:space="preserve">2. Сверить current price, best bid/ask spread, live net edge, TTL, Bybit metadata, funding snapshot и liquidation buffer.</w:t>
       </w:r>
       <w:r>
-        <w:t>Сверить current price, TTL, Bybit metadata, funding snapshot и liquidation buffer.</w:t>
+        <w:t/>
       </w:r>
     </w:p>
     <w:p>

</xml_diff>

<commit_message>
fix(recommendations): require distinct evidence and preserve rec identity
• require two forward-moving closed snapshots before futures-grid publication
• keep details refresh bound to the immutable selected rec_id
• add RED/GREEN regressions and synchronize operator documentation
</commit_message>
<xml_diff>
--- a/docs/instrukciya_operatora_bybit_recommender.docx
+++ b/docs/instrukciya_operatora_bybit_recommender.docx
@@ -68,6 +68,32 @@
       </w:pPr>
       <w:r>
         <w:t>Любой blocking/critical preflight означает NO TRADE.</w:t>
+      </w:r>
+    </w:p>
+    <w:p>
+      <w:pPr>
+        <w:pStyle w:val="Heading1"/>
+      </w:pPr>
+      <w:r>
+        <w:t>Устойчивость сигнала и идентичность рекомендации</w:t>
+      </w:r>
+    </w:p>
+    <w:p>
+      <w:pPr/>
+      <w:r>
+        <w:t>Actionable futures_grid допускается только после двух разных последовательно закрытых evidence snapshots (features_ref_ts). Повторный цикл на той же закрытой свече не является вторым подтверждением; до нового snapshot статус остаётся pending.</w:t>
+      </w:r>
+    </w:p>
+    <w:p>
+      <w:pPr/>
+      <w:r>
+        <w:t>Обновление карточки перечитывает exact selected rec_id. Более новая строка по той же паре, включая no_trade или смену направления, показывается отдельно в истории и не должна незаметно подменять открытую рекомендацию.</w:t>
+      </w:r>
+    </w:p>
+    <w:p>
+      <w:pPr/>
+      <w:r>
+        <w:t>Raw confidence — эвристическое качество запуска, а не вероятность прибыли. Даже calibrated confidence относится к proxy outcomes и не подтверждает live edge без walk-forward/shadow статистики по фактическим fills и costs.</w:t>
       </w:r>
     </w:p>
     <w:p>

</xml_diff>

<commit_message>
fix(execution-evidence): link fills to recs and correct realised PnL
• store partial fills and funding as immutable events linked to origin rec_id
• prevent slippage double-counting and mixed-ledger risk
• add additive DB upgrades, secured evidence APIs, regressions and clean release tooling
</commit_message>
<xml_diff>
--- a/docs/instrukciya_operatora_bybit_recommender.docx
+++ b/docs/instrukciya_operatora_bybit_recommender.docx
@@ -279,6 +279,68 @@
     <w:p>
       <w:r>
         <w:br w:type="page"/>
+      </w:r>
+    </w:p>
+    <w:p>
+      <w:pPr>
+        <w:pStyle w:val="Heading1"/>
+      </w:pPr>
+      <w:r>
+        <w:t>Учёт фактического исполнения и PnL</w:t>
+      </w:r>
+    </w:p>
+    <w:p>
+      <w:pPr>
+        <w:pStyle w:val="ListBullet"/>
+      </w:pPr>
+      <w:r>
+        <w:t>Каждый fill передаётся отдельным immutable event с Bybit execId, orderId, фактическими price/qty и прямой связью с исходным rec_id.</w:t>
+      </w:r>
+    </w:p>
+    <w:p>
+      <w:pPr>
+        <w:pStyle w:val="ListBullet"/>
+      </w:pPr>
+      <w:r>
+        <w:t>Funding записывается отдельным signed transaction-log event. Exact evidence и legacy /trades нельзя смешивать для одного bot_id.</w:t>
+      </w:r>
+    </w:p>
+    <w:p>
+      <w:pPr>
+        <w:pStyle w:val="ListBullet"/>
+      </w:pPr>
+      <w:r>
+        <w:t>Канонический net PnL: фактический gross execPnl + funding - fee. Slippage уже отражён в fill prices и повторно не вычитается.</w:t>
+      </w:r>
+    </w:p>
+    <w:p>
+      <w:pPr>
+        <w:pStyle w:val="ListBullet"/>
+      </w:pPr>
+      <w:r>
+        <w:t>Для диагностики исполнения фиксируется отдельный timestamped pre-submit/decision benchmark; orderPrice не заменяет этот benchmark.</w:t>
+      </w:r>
+    </w:p>
+    <w:p>
+      <w:pPr>
+        <w:pStyle w:val="ListBullet"/>
+      </w:pPr>
+      <w:r>
+        <w:t>Чтение execution evidence и live-validation требует ADMIN_API_KEY. Статистика validation descriptive-only и не доказывает live edge.</w:t>
+      </w:r>
+    </w:p>
+    <w:p>
+      <w:pPr>
+        <w:pStyle w:val="ListBullet"/>
+      </w:pPr>
+      <w:r>
+        <w:t>Внешний адаптер обязан преобразовать Bybit millisecond timestamps в точные UTC seconds, сохранить исходный payload и учесть все fee components/rebates.</w:t>
+      </w:r>
+    </w:p>
+    <w:p>
+      <w:pPr/>
+      <w:r>
+        <w:t>Этот контур не выставляет, не изменяет и не отменяет ордера. Unrealised PnL, open inventory и account-level liquidation risk остаются ответственностью внешнего executor/reconciler.</w:t>
       </w:r>
     </w:p>
     <w:p>

</xml_diff>

<commit_message>
fix(validation): stop repeatedly executing loss-making strategy cohorts
• add fail-closed live-validation gates for loss streaks and negative expectancy
• scope exact execution evidence by model, symbol, direction and publication root
• add iteration 205 regression tests and synchronize operator documentation
</commit_message>
<xml_diff>
--- a/docs/instrukciya_operatora_bybit_recommender.docx
+++ b/docs/instrukciya_operatora_bybit_recommender.docx
@@ -326,7 +326,7 @@
         <w:pStyle w:val="ListBullet"/>
       </w:pPr>
       <w:r>
-        <w:t>Чтение execution evidence и live-validation требует ADMIN_API_KEY. Статистика validation descriptive-only и не доказывает live edge.</w:t>
+        <w:t>Чтение execution evidence и live-validation требует ADMIN_API_KEY. Статистика остаётся descriptive-only, но persistent negative exact evidence теперь является fail-closed stop condition.</w:t>
       </w:r>
     </w:p>
     <w:p>
@@ -341,6 +341,46 @@
       <w:pPr/>
       <w:r>
         <w:t>Этот контур не выставляет, не изменяет и не отменяет ордера. Unrealised PnL, open inventory и account-level liquidation risk остаются ответственностью внешнего executor/reconciler.</w:t>
+      </w:r>
+    </w:p>
+    <w:p>
+      <w:pPr>
+        <w:pStyle w:val="Heading1"/>
+      </w:pPr>
+      <w:r>
+        <w:t>Stop-критерий по exact execution evidence</w:t>
+      </w:r>
+    </w:p>
+    <w:p>
+      <w:pPr>
+        <w:pStyle w:val="ListBullet"/>
+      </w:pPr>
+      <w:r>
+        <w:t>В gate входят только stopped bots с exact fills/funding той же explicit model_version; повторные publication roots считаются один раз.</w:t>
+      </w:r>
+    </w:p>
+    <w:p>
+      <w:pPr>
+        <w:pStyle w:val="ListBullet"/>
+      </w:pPr>
+      <w:r>
+        <w:t>Пять последовательных убытков по одному symbol/direction блокируют следующий executed.</w:t>
+      </w:r>
+    </w:p>
+    <w:p>
+      <w:pPr>
+        <w:pStyle w:val="ListBullet"/>
+      </w:pPr>
+      <w:r>
+        <w:t>Отрицательные total и median net PnL при positive rate &lt;50% блокируют direction после 8, symbol после 12 и portfolio после 20 независимых наблюдений.</w:t>
+      </w:r>
+    </w:p>
+    <w:p>
+      <w:pPr>
+        <w:pStyle w:val="ListBullet"/>
+      </w:pPr>
+      <w:r>
+        <w:t>LIVE_VALIDATION_* нельзя обходить вручную. Отсутствие блока не означает доказанную прибыльность.</w:t>
       </w:r>
     </w:p>
     <w:p>

</xml_diff>

<commit_message>
fix(range-edge): block grids without independent mean reversion
• add multi-timeframe anti-persistence diagnostics and fail-closed gates
• isolate v4 calibration and model identity from legacy range semantics
• label expected_rr as a heuristic proxy and add iteration 208 regressions
</commit_message>
<xml_diff>
--- a/docs/instrukciya_operatora_bybit_recommender.docx
+++ b/docs/instrukciya_operatora_bybit_recommender.docx
@@ -93,7 +93,33 @@
     <w:p>
       <w:pPr/>
       <w:r>
-        <w:t>Raw confidence — эвристическое качество запуска, а не вероятность прибыли. Даже calibrated confidence относится к proxy outcomes и не подтверждает live edge без walk-forward/shadow статистики по фактическим fills и costs.</w:t>
+        <w:t>Raw confidence — эвристическое качество запуска, а не вероятность прибыли. Даже calibrated confidence относится к proxy outcomes и не подтверждает live edge без walk-forward/shadow статистики по фактическим fills и costs. Поле expected_rr в UI отображается как «Прокси capture/risk»: это не фактическое отношение прибыли к убытку.</w:t>
+      </w:r>
+    </w:p>
+    <w:p>
+      <w:pPr>
+        <w:pStyle w:val="Heading1"/>
+      </w:pPr>
+      <w:r>
+        <w:t>Подтверждение диапазонного edge</w:t>
+      </w:r>
+    </w:p>
+    <w:p>
+      <w:pPr/>
+      <w:r>
+        <w:t>Низкий trendiness или плоский MA slope сами по себе не подтверждают диапазон: так же выглядит driftless/random-walk path, у которого комиссии и spread создают отрицательное ожидание.</w:t>
+      </w:r>
+    </w:p>
+    <w:p>
+      <w:pPr/>
+      <w:r>
+        <w:t>Actionable futures_grid требует независимого anti-persistence evidence минимум на трёх закрытых timeframes: lag-1 return autocorrelation, variance ratio и sign-reversal rate.</w:t>
+      </w:r>
+    </w:p>
+    <w:p>
+      <w:pPr/>
+      <w:r>
+        <w:t>MEAN_REVERSION_EVIDENCE_INSUFFICIENT или MEAN_REVERSION_EDGE_UNCONFIRMED означает NO TRADE; высокий legacy range score, raw confidence или LLM verdict блок не отменяют.</w:t>
       </w:r>
     </w:p>
     <w:p>
@@ -189,7 +215,7 @@
         <w:pStyle w:val="ListBullet"/>
       </w:pPr>
       <w:r>
-        <w:t>INVALID_MARKET_REFERENCE_PRICE.</w:t>
+        <w:t>MEAN_REVERSION_EVIDENCE_INSUFFICIENT; MEAN_REVERSION_EDGE_UNCONFIRMED; INVALID_MARKET_REFERENCE_PRICE.</w:t>
       </w:r>
     </w:p>
     <w:p>
@@ -356,7 +382,7 @@
         <w:pStyle w:val="ListBullet"/>
       </w:pPr>
       <w:r>
-        <w:t>В gate входят только stopped bots с exact fills/funding той же explicit model_version; повторные publication roots считаются один раз.</w:t>
+        <w:t>В gate входят только stopped bots с exact fills/funding той же explicit model_version; повторные publication roots считаются один раз. Текущая версия сигнала: bybit-taxonomy-v3-mean-reversion; legacy v2 evidence не смешивается с новой калибровкой.</w:t>
       </w:r>
     </w:p>
     <w:p>

</xml_diff>

<commit_message>
fix(outcomes-risk): normalize grid returns and enforce daily loss budget
• remove per-leg TP shortcut from whole-grid proxy success
• normalize completed-leg PnL and costs by committed grid capital
• block execution when kill-switch loss exceeds remaining daily DD budget
• bump outcome labels to grid_label_v3 and update tests/operator docs
</commit_message>
<xml_diff>
--- a/docs/instrukciya_operatora_bybit_recommender.docx
+++ b/docs/instrukciya_operatora_bybit_recommender.docx
@@ -12,6 +12,15 @@
           <w:sz w:val="36"/>
         </w:rPr>
         <w:t>Инструкция оператора Bybit Recommender</w:t>
+      </w:r>
+    </w:p>
+    <w:p>
+      <w:pPr/>
+      <w:r>
+        <w:rPr>
+          <w:i/>
+        </w:rPr>
+        <w:t>Версия документа: 1.0.21 (outcome capital normalization and daily loss budget).</w:t>
       </w:r>
     </w:p>
     <w:p>
@@ -167,6 +176,38 @@
         <w:pStyle w:val="Heading1"/>
       </w:pPr>
       <w:r>
+        <w:t>Proxy outcome и калибровка</w:t>
+      </w:r>
+    </w:p>
+    <w:p>
+      <w:pPr>
+        <w:pStyle w:val="ListBullet"/>
+      </w:pPr>
+      <w:r>
+        <w:t>Отдельное касание directional tp_per_leg не подтверждает прибыль всего grid: OHLCV не показывает фактическое закрытие остаточного inventory.</w:t>
+      </w:r>
+    </w:p>
+    <w:p>
+      <w:pPr>
+        <w:pStyle w:val="ListBullet"/>
+      </w:pPr>
+      <w:r>
+        <w:t>Доходность завершённых grid-leg и их execution costs нормируются на капитал всей сетки через canonical grid_count.</w:t>
+      </w:r>
+    </w:p>
+    <w:p>
+      <w:pPr>
+        <w:pStyle w:val="ListBullet"/>
+      </w:pPr>
+      <w:r>
+        <w:t>Версия label grid_label_v3 не смешивается с прежними proxy outcomes; при первом запуске 1.0.21 старые reco_outcomes и calibrators будут очищены и накоплены заново.</w:t>
+      </w:r>
+    </w:p>
+    <w:p>
+      <w:pPr>
+        <w:pStyle w:val="Heading1"/>
+      </w:pPr>
+      <w:r>
         <w:t>Обязательный trade plan</w:t>
       </w:r>
     </w:p>
@@ -247,6 +288,14 @@
         <w:pStyle w:val="ListBullet"/>
       </w:pPr>
       <w:r>
+        <w:t>Оценочный loss до adverse kill-switch превышает остаток дневного лимита max_daily_dd_usdt - daily_dd (DAILY_LOSS_BUDGET_EXCEEDED).</w:t>
+      </w:r>
+    </w:p>
+    <w:p>
+      <w:pPr>
+        <w:pStyle w:val="ListBullet"/>
+      </w:pPr>
+      <w:r>
         <w:t>Unknown/conflicting same-symbol direction in one-way mode.</w:t>
       </w:r>
     </w:p>
@@ -271,13 +320,7 @@
     </w:p>
     <w:p>
       <w:r>
-        <w:rPr>
-          <w:b/>
-        </w:rPr>
-        <w:t xml:space="preserve">2. Сверить current price, best bid/ask spread, live net edge, TTL, Bybit metadata, funding snapshot и liquidation buffer.</w:t>
-      </w:r>
-      <w:r>
-        <w:t/>
+        <w:t>2. Сверить current price, best bid/ask spread, live net edge, TTL, Bybit metadata, funding snapshot, liquidation buffer и остаток дневного loss budget относительно kill-switch.</w:t>
       </w:r>
     </w:p>
     <w:p>
@@ -367,6 +410,12 @@
       <w:pPr/>
       <w:r>
         <w:t>Этот контур не выставляет, не изменяет и не отменяет ордера. Unrealised PnL, open inventory и account-level liquidation risk остаются ответственностью внешнего executor/reconciler.</w:t>
+      </w:r>
+    </w:p>
+    <w:p>
+      <w:pPr/>
+      <w:r>
+        <w:t>Prospective daily-budget guard является консервативной оценкой. Фактический open inventory, average fill price и account-level risk обязан проверять внешний executor/reconciler.</w:t>
       </w:r>
     </w:p>
     <w:p>

</xml_diff>

<commit_message>
fix(recommender): classify weak edge as no_trade and preserve shadow outcomes
• replace MEAN_REVERSION_EDGE_UNCONFIRMED hard block with no_trade semantics
• collect eligible no_trade candidates in a separate shadow outcome cohort
• keep shadow observations isolated from actionable recommendations and executed trades
• clarify calibration status and proxy-outcome terminology in the operator UI
• update regression tests, documentation, operator guide and release version to 1.0.22
</commit_message>
<xml_diff>
--- a/docs/instrukciya_operatora_bybit_recommender.docx
+++ b/docs/instrukciya_operatora_bybit_recommender.docx
@@ -18,13 +18,16 @@
       <w:pPr/>
       <w:r>
         <w:rPr>
-          <w:i/>
+          <w:sz w:val="21"/>
         </w:rPr>
-        <w:t>Версия документа: 1.0.21 (outcome capital normalization and daily loss budget).</w:t>
+        <w:t>Версия документа: 1.0.22 (no-trade semantics and shadow outcome continuity).</w:t>
       </w:r>
     </w:p>
     <w:p>
       <w:r>
+        <w:rPr>
+          <w:sz w:val="21"/>
+        </w:rPr>
         <w:t>Назначение: быстрый регламент проверки рекомендации перед ручным переносом параметров в Bybit Futures Grid Bot.</w:t>
       </w:r>
     </w:p>
@@ -32,10 +35,14 @@
       <w:r>
         <w:rPr>
           <w:b/>
+          <w:sz w:val="21"/>
         </w:rPr>
         <w:t xml:space="preserve">Граница системы. </w:t>
       </w:r>
       <w:r>
+        <w:rPr>
+          <w:sz w:val="21"/>
+        </w:rPr>
         <w:t>Репозиторий является recommendation/audit service, not OMS/EMS. Он не управляет live order lifecycle, open orders, fills, partial fills или reconciliation. Перед реальным запуском внешний execution-layer обязан повторно проверить Bybit account state, баланс, маржу, открытые ордера и фактические лимиты инструмента.</w:t>
       </w:r>
     </w:p>
@@ -44,6 +51,9 @@
         <w:pStyle w:val="Heading1"/>
       </w:pPr>
       <w:r>
+        <w:rPr>
+          <w:sz w:val="21"/>
+        </w:rPr>
         <w:t>Профиль риска поставки</w:t>
       </w:r>
     </w:p>
@@ -52,6 +62,9 @@
         <w:pStyle w:val="ListBullet"/>
       </w:pPr>
       <w:r>
+        <w:rPr>
+          <w:sz w:val="21"/>
+        </w:rPr>
         <w:t>`min_leverage=3`, `max_leverage=5`; 3-5x is the baseline actionable leverage interval.</w:t>
       </w:r>
     </w:p>
@@ -60,6 +73,9 @@
         <w:pStyle w:val="ListBullet"/>
       </w:pPr>
       <w:r>
+        <w:rPr>
+          <w:sz w:val="21"/>
+        </w:rPr>
         <w:t>По умолчанию разрешён один running bot на аккаунт/символ.</w:t>
       </w:r>
     </w:p>
@@ -68,6 +84,9 @@
         <w:pStyle w:val="ListBullet"/>
       </w:pPr>
       <w:r>
+        <w:rPr>
+          <w:sz w:val="21"/>
+        </w:rPr>
         <w:t>Поддерживается только Bybit Linear USDT Futures Grid; spot/inverse/options/non-USDT блокируются.</w:t>
       </w:r>
     </w:p>
@@ -76,6 +95,9 @@
         <w:pStyle w:val="ListBullet"/>
       </w:pPr>
       <w:r>
+        <w:rPr>
+          <w:sz w:val="21"/>
+        </w:rPr>
         <w:t>Любой blocking/critical preflight означает NO TRADE.</w:t>
       </w:r>
     </w:p>
@@ -84,24 +106,36 @@
         <w:pStyle w:val="Heading1"/>
       </w:pPr>
       <w:r>
+        <w:rPr>
+          <w:sz w:val="21"/>
+        </w:rPr>
         <w:t>Устойчивость сигнала и идентичность рекомендации</w:t>
       </w:r>
     </w:p>
     <w:p>
       <w:pPr/>
       <w:r>
+        <w:rPr>
+          <w:sz w:val="21"/>
+        </w:rPr>
         <w:t>Actionable futures_grid допускается только после двух разных последовательно закрытых evidence snapshots (features_ref_ts). Повторный цикл на той же закрытой свече не является вторым подтверждением; до нового snapshot статус остаётся pending.</w:t>
       </w:r>
     </w:p>
     <w:p>
       <w:pPr/>
       <w:r>
+        <w:rPr>
+          <w:sz w:val="21"/>
+        </w:rPr>
         <w:t>Обновление карточки перечитывает exact selected rec_id. Более новая строка по той же паре, включая no_trade или смену направления, показывается отдельно в истории и не должна незаметно подменять открытую рекомендацию.</w:t>
       </w:r>
     </w:p>
     <w:p>
       <w:pPr/>
       <w:r>
+        <w:rPr>
+          <w:sz w:val="21"/>
+        </w:rPr>
         <w:t>Raw confidence — эвристическое качество запуска, а не вероятность прибыли. Даже calibrated confidence относится к proxy outcomes и не подтверждает live edge без walk-forward/shadow статистики по фактическим fills и costs. Поле expected_rr в UI отображается как «Прокси capture/risk»: это не фактическое отношение прибыли к убытку.</w:t>
       </w:r>
     </w:p>
@@ -110,25 +144,37 @@
         <w:pStyle w:val="Heading1"/>
       </w:pPr>
       <w:r>
+        <w:rPr>
+          <w:sz w:val="21"/>
+        </w:rPr>
         <w:t>Подтверждение диапазонного edge</w:t>
       </w:r>
     </w:p>
     <w:p>
       <w:pPr/>
       <w:r>
+        <w:rPr>
+          <w:sz w:val="21"/>
+        </w:rPr>
         <w:t>Низкий trendiness или плоский MA slope сами по себе не подтверждают диапазон: так же выглядит driftless/random-walk path, у которого комиссии и spread создают отрицательное ожидание.</w:t>
       </w:r>
     </w:p>
     <w:p>
       <w:pPr/>
       <w:r>
+        <w:rPr>
+          <w:sz w:val="21"/>
+        </w:rPr>
         <w:t>Actionable futures_grid требует независимого anti-persistence evidence минимум на трёх закрытых timeframes: lag-1 return autocorrelation, variance ratio и sign-reversal rate.</w:t>
       </w:r>
     </w:p>
     <w:p>
       <w:pPr/>
       <w:r>
-        <w:t>MEAN_REVERSION_EVIDENCE_INSUFFICIENT или MEAN_REVERSION_EDGE_UNCONFIRMED означает NO TRADE; высокий legacy range score, raw confidence или LLM verdict блок не отменяют.</w:t>
+        <w:rPr>
+          <w:sz w:val="21"/>
+        </w:rPr>
+        <w:t>MEAN_REVERSION_EVIDENCE_INSUFFICIENT означает hard blocked из-за недостатка обязательных данных. MEAN_REVERSION_EDGE_UNCONFIRMED означает strategy no_trade: evidence рассчитан, но торговый тезис не подтверждён. Оба статуса означают НЕ ЗАПУСКАТЬ; высокий legacy range score, raw confidence или LLM verdict решение не отменяют.</w:t>
       </w:r>
     </w:p>
     <w:p>
@@ -136,6 +182,9 @@
         <w:pStyle w:val="Heading1"/>
       </w:pPr>
       <w:r>
+        <w:rPr>
+          <w:sz w:val="21"/>
+        </w:rPr>
         <w:t>Directional TP/SL</w:t>
       </w:r>
     </w:p>
@@ -144,6 +193,9 @@
         <w:pStyle w:val="ListBullet"/>
       </w:pPr>
       <w:r>
+        <w:rPr>
+          <w:sz w:val="21"/>
+        </w:rPr>
         <w:t>Long: TP above entry/reference, SL below entry/reference.</w:t>
       </w:r>
     </w:p>
@@ -152,6 +204,9 @@
         <w:pStyle w:val="ListBullet"/>
       </w:pPr>
       <w:r>
+        <w:rPr>
+          <w:sz w:val="21"/>
+        </w:rPr>
         <w:t>Short: TP below entry/reference, SL above entry/reference.</w:t>
       </w:r>
     </w:p>
@@ -160,6 +215,9 @@
         <w:pStyle w:val="ListBullet"/>
       </w:pPr>
       <w:r>
+        <w:rPr>
+          <w:sz w:val="21"/>
+        </w:rPr>
         <w:t>Neutral grid: направленного TP нет; нижняя и верхняя внешние границы являются kill-switch exits.</w:t>
       </w:r>
     </w:p>
@@ -168,6 +226,9 @@
         <w:pStyle w:val="ListBullet"/>
       </w:pPr>
       <w:r>
+        <w:rPr>
+          <w:sz w:val="21"/>
+        </w:rPr>
         <w:t>UI должен отображать directional_exit_levels из backend, а не локально пересчитывать TP/SL для linear long/short.</w:t>
       </w:r>
     </w:p>
@@ -176,7 +237,10 @@
         <w:pStyle w:val="Heading1"/>
       </w:pPr>
       <w:r>
-        <w:t>Proxy outcome и калибровка</w:t>
+        <w:rPr>
+          <w:sz w:val="21"/>
+        </w:rPr>
+        <w:t>Proxy outcome, shadow sample и калибровка</w:t>
       </w:r>
     </w:p>
     <w:p>
@@ -184,6 +248,9 @@
         <w:pStyle w:val="ListBullet"/>
       </w:pPr>
       <w:r>
+        <w:rPr>
+          <w:sz w:val="21"/>
+        </w:rPr>
         <w:t>Отдельное касание directional tp_per_leg не подтверждает прибыль всего grid: OHLCV не показывает фактическое закрытие остаточного inventory.</w:t>
       </w:r>
     </w:p>
@@ -192,6 +259,9 @@
         <w:pStyle w:val="ListBullet"/>
       </w:pPr>
       <w:r>
+        <w:rPr>
+          <w:sz w:val="21"/>
+        </w:rPr>
         <w:t>Доходность завершённых grid-leg и их execution costs нормируются на капитал всей сетки через canonical grid_count.</w:t>
       </w:r>
     </w:p>
@@ -200,6 +270,9 @@
         <w:pStyle w:val="ListBullet"/>
       </w:pPr>
       <w:r>
+        <w:rPr>
+          <w:sz w:val="21"/>
+        </w:rPr>
         <w:t>Версия label grid_label_v3 не смешивается с прежними proxy outcomes; при первом запуске 1.0.21 старые reco_outcomes и calibrators будут очищены и накоплены заново.</w:t>
       </w:r>
     </w:p>
@@ -208,6 +281,9 @@
         <w:pStyle w:val="Heading1"/>
       </w:pPr>
       <w:r>
+        <w:rPr>
+          <w:sz w:val="21"/>
+        </w:rPr>
         <w:t>Обязательный trade plan</w:t>
       </w:r>
     </w:p>
@@ -216,6 +292,9 @@
         <w:pStyle w:val="ListBullet"/>
       </w:pPr>
       <w:r>
+        <w:rPr>
+          <w:sz w:val="21"/>
+        </w:rPr>
         <w:t>Complete `params.trade_plan` exists; no empty/corrupted payload.</w:t>
       </w:r>
     </w:p>
@@ -224,6 +303,9 @@
         <w:pStyle w:val="ListBullet"/>
       </w:pPr>
       <w:r>
+        <w:rPr>
+          <w:sz w:val="21"/>
+        </w:rPr>
         <w:t>reference_price; levels.range.lower/upper; levels.kill_switch.lower/upper.</w:t>
       </w:r>
     </w:p>
@@ -232,6 +314,9 @@
         <w:pStyle w:val="ListBullet"/>
       </w:pPr>
       <w:r>
+        <w:rPr>
+          <w:sz w:val="21"/>
+        </w:rPr>
         <w:t>levels.grid_step.step_abs; tp_per_leg; grid_count; arithmetic grid model.</w:t>
       </w:r>
     </w:p>
@@ -240,6 +325,9 @@
         <w:pStyle w:val="ListBullet"/>
       </w:pPr>
       <w:r>
+        <w:rPr>
+          <w:sz w:val="21"/>
+        </w:rPr>
         <w:t>explicit leverage, isolated margin mode, sizing/economics for qtyStep, minNotional and margin checks.</w:t>
       </w:r>
     </w:p>
@@ -248,7 +336,10 @@
         <w:pStyle w:val="Heading1"/>
       </w:pPr>
       <w:r>
-        <w:t>NO TRADE условия</w:t>
+        <w:rPr>
+          <w:sz w:val="21"/>
+        </w:rPr>
+        <w:t>NO TRADE / BLOCKED условия</w:t>
       </w:r>
     </w:p>
     <w:p>
@@ -256,7 +347,10 @@
         <w:pStyle w:val="ListBullet"/>
       </w:pPr>
       <w:r>
-        <w:t>MEAN_REVERSION_EVIDENCE_INSUFFICIENT; MEAN_REVERSION_EDGE_UNCONFIRMED; INVALID_MARKET_REFERENCE_PRICE.</w:t>
+        <w:rPr>
+          <w:sz w:val="21"/>
+        </w:rPr>
+        <w:t>Hard blocked: MEAN_REVERSION_EVIDENCE_INSUFFICIENT, INVALID_MARKET_REFERENCE_PRICE и иные data/risk/Bybit/preflight failures. Strategy no_trade: MEAN_REVERSION_EDGE_UNCONFIRMED либо непрохождение launch-score/confidence/economics.</w:t>
       </w:r>
     </w:p>
     <w:p>
@@ -264,6 +358,9 @@
         <w:pStyle w:val="ListBullet"/>
       </w:pPr>
       <w:r>
+        <w:rPr>
+          <w:sz w:val="21"/>
+        </w:rPr>
         <w:t>Устаревшая publication-chain, stale market data, live ticker вне range/kill-switch, отсутствующая пара bid/ask, spread &gt;14 bps, live net edge &lt;2 bps или gross/cost coverage &lt;=1,10x.</w:t>
       </w:r>
     </w:p>
@@ -272,6 +369,9 @@
         <w:pStyle w:val="ListBullet"/>
       </w:pPr>
       <w:r>
+        <w:rPr>
+          <w:sz w:val="21"/>
+        </w:rPr>
         <w:t>Отсутствующие tickSize, qtyStep, minNotional, leverageFilter, non-Trading status.</w:t>
       </w:r>
     </w:p>
@@ -280,6 +380,9 @@
         <w:pStyle w:val="ListBullet"/>
       </w:pPr>
       <w:r>
+        <w:rPr>
+          <w:sz w:val="21"/>
+        </w:rPr>
         <w:t>Funding недоступен или adverse carry уничтожает net edge; LLM gate не OK при включённом gate-режиме.</w:t>
       </w:r>
     </w:p>
@@ -288,6 +391,9 @@
         <w:pStyle w:val="ListBullet"/>
       </w:pPr>
       <w:r>
+        <w:rPr>
+          <w:sz w:val="21"/>
+        </w:rPr>
         <w:t>Оценочный loss до adverse kill-switch превышает остаток дневного лимита max_daily_dd_usdt - daily_dd (DAILY_LOSS_BUDGET_EXCEEDED).</w:t>
       </w:r>
     </w:p>
@@ -296,6 +402,9 @@
         <w:pStyle w:val="ListBullet"/>
       </w:pPr>
       <w:r>
+        <w:rPr>
+          <w:sz w:val="21"/>
+        </w:rPr>
         <w:t>Unknown/conflicting same-symbol direction in one-way mode.</w:t>
       </w:r>
     </w:p>
@@ -304,22 +413,25 @@
         <w:pStyle w:val="Heading1"/>
       </w:pPr>
       <w:r>
+        <w:rPr>
+          <w:sz w:val="21"/>
+        </w:rPr>
         <w:t>Практическая последовательность</w:t>
       </w:r>
     </w:p>
     <w:p>
       <w:r>
         <w:rPr>
-          <w:b/>
+          <w:sz w:val="21"/>
         </w:rPr>
-        <w:t xml:space="preserve">1. </w:t>
-      </w:r>
-      <w:r>
-        <w:t>Проверить status/effective_status и отсутствие blocking errors.</w:t>
+        <w:t>1. Проверить status/effective_status: blocked означает жёсткий data/risk/Bybit/preflight отказ; no_trade означает неподтверждённый торговый тезис или launch/economics gate.</w:t>
       </w:r>
     </w:p>
     <w:p>
       <w:r>
+        <w:rPr>
+          <w:sz w:val="21"/>
+        </w:rPr>
         <w:t>2. Сверить current price, best bid/ask spread, live net edge, TTL, Bybit metadata, funding snapshot, liquidation buffer и остаток дневного loss budget относительно kill-switch.</w:t>
       </w:r>
     </w:p>
@@ -327,27 +439,86 @@
       <w:r>
         <w:rPr>
           <w:b/>
+          <w:sz w:val="21"/>
         </w:rPr>
         <w:t xml:space="preserve">3. </w:t>
       </w:r>
       <w:r>
+        <w:rPr>
+          <w:sz w:val="21"/>
+        </w:rPr>
         <w:t>Переносить в Bybit только полный trade_plan; не использовать пустой/legacy payload.</w:t>
       </w:r>
     </w:p>
     <w:p>
       <w:r>
         <w:rPr>
-          <w:b/>
+          <w:sz w:val="21"/>
         </w:rPr>
-        <w:t xml:space="preserve">4. </w:t>
-      </w:r>
-      <w:r>
-        <w:t>Не снижать severity guard-а вручную и не запускать при блокировках.</w:t>
+        <w:t>4. Не снижать severity guard-а вручную, не превращать no_trade в recommendation и не запускать при blocked/no_trade.</w:t>
       </w:r>
     </w:p>
     <w:p>
       <w:r>
+        <w:rPr>
+          <w:sz w:val="21"/>
+        </w:rPr>
         <w:br w:type="page"/>
+      </w:r>
+    </w:p>
+    <w:p>
+      <w:pPr>
+        <w:pStyle w:val="ListBullet"/>
+      </w:pPr>
+      <w:r>
+        <w:rPr>
+          <w:sz w:val="21"/>
+        </w:rPr>
+        <w:t>Журнал исходов обязан отдельно показывать shadow и non-shadow roots и не называть OHLCV proxy фактической торговлей.</w:t>
+      </w:r>
+    </w:p>
+    <w:p>
+      <w:pPr>
+        <w:pStyle w:val="ListBullet"/>
+      </w:pPr>
+      <w:r>
+        <w:rPr>
+          <w:sz w:val="21"/>
+        </w:rPr>
+        <w:t>Полный no_trade-кандидат без hard blocks может получить outcome_policy.sample_role=shadow_no_trade и после horizon войти в исследовательскую proxy-выборку. Это не реальный запуск, не fill и не основание для ручного исполнения.</w:t>
+      </w:r>
+    </w:p>
+    <w:p>
+      <w:pPr>
+        <w:pStyle w:val="ListBullet"/>
+      </w:pPr>
+      <w:r>
+        <w:rPr>
+          <w:sz w:val="21"/>
+        </w:rPr>
+        <w:t>Необученный bot-specific calibrator сам по себе публикацию не блокирует: до fit используется ограниченный raw-confidence, а deterministic gates работают независимо.</w:t>
+      </w:r>
+    </w:p>
+    <w:p>
+      <w:pPr>
+        <w:pStyle w:val="ListBullet"/>
+      </w:pPr>
+      <w:r>
+        <w:rPr>
+          <w:sz w:val="21"/>
+        </w:rPr>
+        <w:t>Отсутствие recommended/active является допустимым и безопасным результатом, особенно при отрицательной proxy-статистике или слабом range edge. Система не обязана постоянно выдавать сделки.</w:t>
+      </w:r>
+    </w:p>
+    <w:p>
+      <w:pPr>
+        <w:pStyle w:val="Heading2"/>
+      </w:pPr>
+      <w:r>
+        <w:rPr>
+          <w:sz w:val="21"/>
+        </w:rPr>
+        <w:t>Нет запускных рекомендаций</w:t>
       </w:r>
     </w:p>
     <w:p>
@@ -355,6 +526,9 @@
         <w:pStyle w:val="Heading1"/>
       </w:pPr>
       <w:r>
+        <w:rPr>
+          <w:sz w:val="21"/>
+        </w:rPr>
         <w:t>Учёт фактического исполнения и PnL</w:t>
       </w:r>
     </w:p>
@@ -363,6 +537,9 @@
         <w:pStyle w:val="ListBullet"/>
       </w:pPr>
       <w:r>
+        <w:rPr>
+          <w:sz w:val="21"/>
+        </w:rPr>
         <w:t>Каждый fill передаётся отдельным immutable event с Bybit execId, orderId, фактическими price/qty и прямой связью с исходным rec_id.</w:t>
       </w:r>
     </w:p>
@@ -371,6 +548,9 @@
         <w:pStyle w:val="ListBullet"/>
       </w:pPr>
       <w:r>
+        <w:rPr>
+          <w:sz w:val="21"/>
+        </w:rPr>
         <w:t>Funding записывается отдельным signed transaction-log event. Exact evidence и legacy /trades нельзя смешивать для одного bot_id.</w:t>
       </w:r>
     </w:p>
@@ -379,6 +559,9 @@
         <w:pStyle w:val="ListBullet"/>
       </w:pPr>
       <w:r>
+        <w:rPr>
+          <w:sz w:val="21"/>
+        </w:rPr>
         <w:t>Канонический net PnL: фактический gross execPnl + funding - fee. Slippage уже отражён в fill prices и повторно не вычитается.</w:t>
       </w:r>
     </w:p>
@@ -387,6 +570,9 @@
         <w:pStyle w:val="ListBullet"/>
       </w:pPr>
       <w:r>
+        <w:rPr>
+          <w:sz w:val="21"/>
+        </w:rPr>
         <w:t>Для диагностики исполнения фиксируется отдельный timestamped pre-submit/decision benchmark; orderPrice не заменяет этот benchmark.</w:t>
       </w:r>
     </w:p>
@@ -395,6 +581,9 @@
         <w:pStyle w:val="ListBullet"/>
       </w:pPr>
       <w:r>
+        <w:rPr>
+          <w:sz w:val="21"/>
+        </w:rPr>
         <w:t>Чтение execution evidence и live-validation требует ADMIN_API_KEY. Статистика остаётся descriptive-only, но persistent negative exact evidence теперь является fail-closed stop condition.</w:t>
       </w:r>
     </w:p>
@@ -403,18 +592,27 @@
         <w:pStyle w:val="ListBullet"/>
       </w:pPr>
       <w:r>
+        <w:rPr>
+          <w:sz w:val="21"/>
+        </w:rPr>
         <w:t>Внешний адаптер обязан преобразовать Bybit millisecond timestamps в точные UTC seconds, сохранить исходный payload и учесть все fee components/rebates.</w:t>
       </w:r>
     </w:p>
     <w:p>
       <w:pPr/>
       <w:r>
+        <w:rPr>
+          <w:sz w:val="21"/>
+        </w:rPr>
         <w:t>Этот контур не выставляет, не изменяет и не отменяет ордера. Unrealised PnL, open inventory и account-level liquidation risk остаются ответственностью внешнего executor/reconciler.</w:t>
       </w:r>
     </w:p>
     <w:p>
       <w:pPr/>
       <w:r>
+        <w:rPr>
+          <w:sz w:val="21"/>
+        </w:rPr>
         <w:t>Prospective daily-budget guard является консервативной оценкой. Фактический open inventory, average fill price и account-level risk обязан проверять внешний executor/reconciler.</w:t>
       </w:r>
     </w:p>
@@ -423,6 +621,9 @@
         <w:pStyle w:val="Heading1"/>
       </w:pPr>
       <w:r>
+        <w:rPr>
+          <w:sz w:val="21"/>
+        </w:rPr>
         <w:t>Stop-критерий по exact execution evidence</w:t>
       </w:r>
     </w:p>
@@ -431,6 +632,9 @@
         <w:pStyle w:val="ListBullet"/>
       </w:pPr>
       <w:r>
+        <w:rPr>
+          <w:sz w:val="21"/>
+        </w:rPr>
         <w:t>В gate входят только stopped bots с exact fills/funding той же explicit model_version; повторные publication roots считаются один раз. Текущая версия сигнала: bybit-taxonomy-v3-mean-reversion; legacy v2 evidence не смешивается с новой калибровкой.</w:t>
       </w:r>
     </w:p>
@@ -439,6 +643,9 @@
         <w:pStyle w:val="ListBullet"/>
       </w:pPr>
       <w:r>
+        <w:rPr>
+          <w:sz w:val="21"/>
+        </w:rPr>
         <w:t>Пять последовательных убытков по одному symbol/direction блокируют следующий executed.</w:t>
       </w:r>
     </w:p>
@@ -447,6 +654,9 @@
         <w:pStyle w:val="ListBullet"/>
       </w:pPr>
       <w:r>
+        <w:rPr>
+          <w:sz w:val="21"/>
+        </w:rPr>
         <w:t>Отрицательные total и median net PnL при positive rate &lt;50% блокируют direction после 8, symbol после 12 и portfolio после 20 независимых наблюдений.</w:t>
       </w:r>
     </w:p>
@@ -455,6 +665,9 @@
         <w:pStyle w:val="ListBullet"/>
       </w:pPr>
       <w:r>
+        <w:rPr>
+          <w:sz w:val="21"/>
+        </w:rPr>
         <w:t>LIVE_VALIDATION_* нельзя обходить вручную. Отсутствие блока не означает доказанную прибыльность.</w:t>
       </w:r>
     </w:p>
@@ -463,11 +676,17 @@
         <w:pStyle w:val="Heading1"/>
       </w:pPr>
       <w:r>
+        <w:rPr>
+          <w:sz w:val="21"/>
+        </w:rPr>
         <w:t>Operator infographic</w:t>
       </w:r>
     </w:p>
     <w:p>
       <w:r>
+        <w:rPr>
+          <w:sz w:val="21"/>
+        </w:rPr>
         <w:drawing>
           <wp:inline xmlns:a="http://schemas.openxmlformats.org/drawingml/2006/main" xmlns:pic="http://schemas.openxmlformats.org/drawingml/2006/picture">
             <wp:extent cx="5852160" cy="4389120"/>

</xml_diff>

<commit_message>
fix(outcomes): correct futures-grid proxy accounting
- count repeated completed grid trades and apply full interval economics
- fix neutral no-fill and directional residual-inventory PnL
- separate actionable and shadow outcome cohorts in API/UI
- bump outcome target to grid_label_v5
- add iteration212 regressions and synchronize operator documentation
</commit_message>
<xml_diff>
--- a/docs/instrukciya_operatora_bybit_recommender.docx
+++ b/docs/instrukciya_operatora_bybit_recommender.docx
@@ -20,7 +20,7 @@
         <w:rPr>
           <w:sz w:val="21"/>
         </w:rPr>
-        <w:t>Версия документа: 1.0.22 (no-trade semantics and shadow outcome continuity).</w:t>
+        <w:t>Версия документа: 1.0.24 (grid outcome accounting and actionable cohort statistics).</w:t>
       </w:r>
     </w:p>
     <w:p>
@@ -251,7 +251,7 @@
         <w:rPr>
           <w:sz w:val="21"/>
         </w:rPr>
-        <w:t>Отдельное касание directional tp_per_leg не подтверждает прибыль всего grid: OHLCV не показывает фактическое закрытие остаточного inventory.</w:t>
+        <w:t>Отдельное касание directional tp_per_leg не подтверждает прибыль всего grid. Завершённая proxy-сделка требует matched crossing; одна и та же сетка может закрываться повторно, поэтому cumulative completed trades не ограничиваются grid_count.</w:t>
       </w:r>
     </w:p>
     <w:p>
@@ -262,7 +262,7 @@
         <w:rPr>
           <w:sz w:val="21"/>
         </w:rPr>
-        <w:t>Доходность завершённых grid-leg и их execution costs нормируются на капитал всей сетки через canonical grid_count.</w:t>
+        <w:t>Gross одной inferred arithmetic-grid сделки равен полному interval; round-trip execution cost вычитается один раз, а результат нормируется на капитал всей сетки. Neutral starts flat: без matched crossing и residual inventory proxy-return равен нулю.</w:t>
       </w:r>
     </w:p>
     <w:p>
@@ -273,7 +273,7 @@
         <w:rPr>
           <w:sz w:val="21"/>
         </w:rPr>
-        <w:t>Версия label grid_label_v3 не смешивается с прежними proxy outcomes; при первом запуске 1.0.21 старые reco_outcomes и calibrators будут очищены и накоплены заново.</w:t>
+        <w:t>LONG/SHORT учитывают signed mark-to-market только на оценочный остаточный inventory. UI headline показывает actionable-когорту; all-roots и shadow no_trade показаны отдельно. Текущая несовместимая label-версия grid_label_v5 сбрасывает только старые reco_outcomes/calibrators.</w:t>
       </w:r>
     </w:p>
     <w:p>
@@ -474,7 +474,7 @@
         <w:rPr>
           <w:sz w:val="21"/>
         </w:rPr>
-        <w:t>Журнал исходов обязан отдельно показывать shadow и non-shadow roots и не называть OHLCV proxy фактической торговлей.</w:t>
+        <w:t>Журнал исходов обязан показывать actionable headline отдельно от all-roots и shadow no_trade research cohorts и не называть OHLCV proxy фактической торговлей.</w:t>
       </w:r>
     </w:p>
     <w:p>

</xml_diff>

<commit_message>
fix(outcomes): replace drift proxy with exact grid ledger
- use full adjacent interval for completed grid-trade economics
- model initial inventory, level fills, replacements and residual PnL
- preserve persisted range/grid_count in historical outcomes
- bump outcome contract to grid_label_v6
- add iteration213 red-to-green regressions and update operator artifacts
</commit_message>
<xml_diff>
--- a/docs/instrukciya_operatora_bybit_recommender.docx
+++ b/docs/instrukciya_operatora_bybit_recommender.docx
@@ -20,7 +20,7 @@
         <w:rPr>
           <w:sz w:val="21"/>
         </w:rPr>
-        <w:t>Версия документа: 1.0.24 (grid outcome accounting and actionable cohort statistics).</w:t>
+        <w:t>Версия документа: 1.0.25 (exact arithmetic-grid PnL ledger and interval economics).</w:t>
       </w:r>
     </w:p>
     <w:p>
@@ -251,7 +251,7 @@
         <w:rPr>
           <w:sz w:val="21"/>
         </w:rPr>
-        <w:t>Отдельное касание directional tp_per_leg не подтверждает прибыль всего grid. Завершённая proxy-сделка требует matched crossing; одна и та же сетка может закрываться повторно, поэтому cumulative completed trades не ограничиваются grid_count.</w:t>
+        <w:t>Отдельное касание directional tp_per_leg не подтверждает прибыль всего grid. Arithmetic tp_per_leg должен совпадать с полным соседним grid interval; коэффициент fill_efficiency не уменьшает PnL уже завершённой пары. Одна и та же сетка может закрываться повторно, поэтому cumulative completed trades не ограничиваются grid_count.</w:t>
       </w:r>
     </w:p>
     <w:p>
@@ -262,7 +262,7 @@
         <w:rPr>
           <w:sz w:val="21"/>
         </w:rPr>
-        <w:t>Gross одной inferred arithmetic-grid сделки равен полному interval; round-trip execution cost вычитается один раз, а результат нормируется на капитал всей сетки. Neutral starts flat: без matched crossing и residual inventory proxy-return равен нулю.</w:t>
+        <w:t>Outcome worker ведёт равноколичественный close-to-close ledger уровней: cash, LONG/SHORT lots, replacement orders, цены inferred fills и half round-trip cost на каждую исполненную leg. Gross завершённой arithmetic-grid пары равен полному interval; результат нормируется на капитал всей сетки. Neutral starts flat.</w:t>
       </w:r>
     </w:p>
     <w:p>
@@ -273,7 +273,7 @@
         <w:rPr>
           <w:sz w:val="21"/>
         </w:rPr>
-        <w:t>LONG/SHORT учитывают signed mark-to-market только на оценочный остаточный inventory. UI headline показывает actionable-когорту; all-roots и shadow no_trade показаны отдельно. Текущая несовместимая label-версия grid_label_v5 сбрасывает только старые reco_outcomes/calibrators.</w:t>
+        <w:t>LONG/SHORT включают исходную directional-позицию и mark-to-market фактически оставшегося proxy inventory по exact horizon exit. UI headline показывает actionable-когорту; all-roots и shadow no_trade показаны отдельно. Текущая несовместимая label-версия grid_label_v6 сбрасывает только старые reco_outcomes/calibrators. Proxy не доказывает intrabar fills, queue priority или live PnL.</w:t>
       </w:r>
     </w:p>
     <w:p>

</xml_diff>

<commit_message>
fix(outcomes): finalize inventory-based total PnL
- charge adverse funding against actual open inventory
- include terminal close execution cost for residual positions
- classify every positive net outcome as successful
- reject malformed fractional funding timestamps
- bump outcome contract to grid_label_v7
- add iteration214 red-to-green regressions and update operator documentation
</commit_message>
<xml_diff>
--- a/docs/instrukciya_operatora_bybit_recommender.docx
+++ b/docs/instrukciya_operatora_bybit_recommender.docx
@@ -20,7 +20,7 @@
         <w:rPr>
           <w:sz w:val="21"/>
         </w:rPr>
-        <w:t>Версия документа: 1.0.25 (exact arithmetic-grid PnL ledger and interval economics).</w:t>
+        <w:t>Версия документа: 1.0.26 (inventory-aware funding and liquidation-equivalent outcome finalization).</w:t>
       </w:r>
     </w:p>
     <w:p>
@@ -262,7 +262,7 @@
         <w:rPr>
           <w:sz w:val="21"/>
         </w:rPr>
-        <w:t>Outcome worker ведёт равноколичественный close-to-close ledger уровней: cash, LONG/SHORT lots, replacement orders, цены inferred fills и half round-trip cost на каждую исполненную leg. Gross завершённой arithmetic-grid пары равен полному interval; результат нормируется на капитал всей сетки. Neutral starts flat.</w:t>
+        <w:t>Outcome worker ведёт равноколичественный close-to-close ledger уровней: cash, LONG/SHORT lots, replacement orders и цены inferred fills. Half round-trip cost начисляется на каждую исполненную leg и на terminal close остаточного inventory; gross завершённой arithmetic-grid пары равен полному interval.</w:t>
       </w:r>
     </w:p>
     <w:p>
@@ -273,7 +273,7 @@
         <w:rPr>
           <w:sz w:val="21"/>
         </w:rPr>
-        <w:t>LONG/SHORT включают исходную directional-позицию и mark-to-market фактически оставшегося proxy inventory по exact horizon exit. UI headline показывает actionable-когорту; all-roots и shadow no_trade показаны отдельно. Текущая несовместимая label-версия grid_label_v6 сбрасывает только старые reco_outcomes/calibrators. Proxy не доказывает intrabar fills, queue priority или live PnL.</w:t>
+        <w:t>Adverse funding применяется только к фактическому net inventory на event time; neutral без позиции не платит, а возможное получение funding не повышает proxy-result. Success требует mode activity, положительного net total PnL и intact kill-switch без скрытого 5 bps cutoff. Текущая label-версия grid_label_v7 сбрасывает только старые reco_outcomes/calibrators; exact fills, queue priority и live PnL остаются внешней truth.</w:t>
       </w:r>
     </w:p>
     <w:p>

</xml_diff>

<commit_message>
fix(outcomes): enforce sign-consistent outcome labels
- classify positive liquidation-equivalent net PnL as success
- prevent aggregate funding fallback from overriding an exact no-event window
- resolve duplicate cost aliases using the strictest valid cost
- reject malformed OHLC geometry before outcome maturation
- bump outcome contract to grid_label_v8
- add iteration215 RED-to-GREEN regression coverage
</commit_message>
<xml_diff>
--- a/docs/instrukciya_operatora_bybit_recommender.docx
+++ b/docs/instrukciya_operatora_bybit_recommender.docx
@@ -17,10 +17,7 @@
     <w:p>
       <w:pPr/>
       <w:r>
-        <w:rPr>
-          <w:sz w:val="21"/>
-        </w:rPr>
-        <w:t>Версия документа: 1.0.26 (inventory-aware funding and liquidation-equivalent outcome finalization).</w:t>
+        <w:t>Версия документа: 1.0.27 (outcome label integrity and exact funding-window precedence).</w:t>
       </w:r>
     </w:p>
     <w:p>
@@ -270,10 +267,7 @@
         <w:pStyle w:val="ListBullet"/>
       </w:pPr>
       <w:r>
-        <w:rPr>
-          <w:sz w:val="21"/>
-        </w:rPr>
-        <w:t>Adverse funding применяется только к фактическому net inventory на event time; neutral без позиции не платит, а возможное получение funding не повышает proxy-result. Success требует mode activity, положительного net total PnL и intact kill-switch без скрытого 5 bps cutoff. Текущая label-версия grid_label_v7 сбрасывает только старые reco_outcomes/calibrators; exact fills, queue priority и live PnL остаются внешней truth.</w:t>
+        <w:t>Adverse funding применяется только к фактическому net inventory на точных событиях внутри horizon; подтверждённый schedule без события даёт нулевой funding. Любой finite положительный total net PnL является win при intact kill-switch — без скрытых activity/drift cutoff. Дубли cost_model разрешаются по максимальному валидному execution cost. Текущая label-версия grid_label_v8 сбрасывает только старые reco_outcomes/calibrators; exact fills, queue priority и live PnL остаются внешней truth.</w:t>
       </w:r>
     </w:p>
     <w:p>

</xml_diff>

<commit_message>
fix(outcomes): enforce post-publication entry integrity
- enter only on the first exact 1m candle after recommendation publication
- reject conflicting grid-count and range aliases
- treat invalid grid contracts as unavailable instead of zero-return losses
- require duplicated funding blocks to form one consistent model
- bump outcome target to grid_label_v9
- add iteration216 RED-to-GREEN regressions and update operator artifacts
</commit_message>
<xml_diff>
--- a/docs/instrukciya_operatora_bybit_recommender.docx
+++ b/docs/instrukciya_operatora_bybit_recommender.docx
@@ -17,7 +17,7 @@
     <w:p>
       <w:pPr/>
       <w:r>
-        <w:t>Версия документа: 1.0.27 (outcome label integrity and exact funding-window precedence).</w:t>
+        <w:t>Версия документа: 1.0.28 (post-publication entry and persisted grid-contract integrity).</w:t>
       </w:r>
     </w:p>
     <w:p>
@@ -267,7 +267,7 @@
         <w:pStyle w:val="ListBullet"/>
       </w:pPr>
       <w:r>
-        <w:t>Adverse funding применяется только к фактическому net inventory на точных событиях внутри horizon; подтверждённый schedule без события даёт нулевой funding. Любой finite положительный total net PnL является win при intact kill-switch — без скрытых activity/drift cutoff. Дубли cost_model разрешаются по максимальному валидному execution cost. Текущая label-версия grid_label_v8 сбрасывает только старые reco_outcomes/calibrators; exact fills, queue priority и live PnL остаются внешней truth.</w:t>
+        <w:t>Outcome entry — open первой точной 1m-свечи, начинающейся строго после publication timestamp; уже открывшаяся до публикации свеча не используется задним числом. Конфликтующие grid_count/grid_levels, разные валидные range aliases, malformed explicit range или несовместимые funding aliases делают proxy label unavailable, а не искусственным ret=0/loss. Adverse funding применяется только к фактическому net inventory на точных событиях внутри horizon. Любой finite положительный liquidation-equivalent net PnL является win без kill-switch breach. Текущий контракт — grid_label_v9; первый запуск v1.0.28 сбрасывает только старые proxy outcomes/calibrators.</w:t>
       </w:r>
     </w:p>
     <w:p>
@@ -678,12 +678,9 @@
     </w:p>
     <w:p>
       <w:r>
-        <w:rPr>
-          <w:sz w:val="21"/>
-        </w:rPr>
         <w:drawing>
           <wp:inline xmlns:a="http://schemas.openxmlformats.org/drawingml/2006/main" xmlns:pic="http://schemas.openxmlformats.org/drawingml/2006/picture">
-            <wp:extent cx="5852160" cy="4389120"/>
+            <wp:extent cx="5852160" cy="4876800"/>
             <wp:docPr id="1" name="Picture 1"/>
             <wp:cNvGraphicFramePr>
               <a:graphicFrameLocks noChangeAspect="1"/>
@@ -696,7 +693,7 @@
                     <pic:cNvPicPr/>
                   </pic:nvPicPr>
                   <pic:blipFill>
-                    <a:blip r:embed="rId9"/>
+                    <a:blip r:embed="rId10"/>
                     <a:stretch>
                       <a:fillRect/>
                     </a:stretch>
@@ -704,7 +701,7 @@
                   <pic:spPr>
                     <a:xfrm>
                       <a:off x="0" y="0"/>
-                      <a:ext cx="5852160" cy="4389120"/>
+                      <a:ext cx="5852160" cy="4876800"/>
                     </a:xfrm>
                     <a:prstGeom prst="rect"/>
                   </pic:spPr>

</xml_diff>

<commit_message>
fix(outcomes): finalize grid topology and protective stops
- restore adjacent directional TP orders and initial inventory slots
- process observable close-open and open-close grid crossings
- account for unambiguous single-sided OHLC excursions
- terminate ledger and funding at the first kill-switch breach
- reject missing, internal or dual-boundary protective geometry
- bump outcome contract to grid_label_v10
- add iteration217 RED-to-GREEN regression coverage
</commit_message>
<xml_diff>
--- a/docs/instrukciya_operatora_bybit_recommender.docx
+++ b/docs/instrukciya_operatora_bybit_recommender.docx
@@ -17,7 +17,7 @@
     <w:p>
       <w:pPr/>
       <w:r>
-        <w:t>Версия документа: 1.0.28 (post-publication entry and persisted grid-contract integrity).</w:t>
+        <w:t>Версия документа: 1.0.29 (grid ledger topology and protective-stop finalization).</w:t>
       </w:r>
     </w:p>
     <w:p>
@@ -256,10 +256,7 @@
         <w:pStyle w:val="ListBullet"/>
       </w:pPr>
       <w:r>
-        <w:rPr>
-          <w:sz w:val="21"/>
-        </w:rPr>
-        <w:t>Outcome worker ведёт равноколичественный close-to-close ledger уровней: cash, LONG/SHORT lots, replacement orders и цены inferred fills. Half round-trip cost начисляется на каждую исполненную leg и на terminal close остаточного inventory; gross завершённой arithmetic-grid пары равен полному interval.</w:t>
+        <w:t>Outcome worker ведёт равноколичественный endpoint-aware ledger уровней: cash, LONG/SHORT lots, replacement orders и цены inferred fills. Для входа между уровнями LONG получает ближайший верхний TP и соответствующий initial long slot; SHORT симметрично получает ближайший нижний buy-to-close и initial short slot. Наблюдаемые close→open и open→close движения учитываются отдельно; двусторонний intrabar order из OHLC не выдумывается.</w:t>
       </w:r>
     </w:p>
     <w:p>
@@ -267,7 +264,7 @@
         <w:pStyle w:val="ListBullet"/>
       </w:pPr>
       <w:r>
-        <w:t>Outcome entry — open первой точной 1m-свечи, начинающейся строго после publication timestamp; уже открывшаяся до публикации свеча не используется задним числом. Конфликтующие grid_count/grid_levels, разные валидные range aliases, malformed explicit range или несовместимые funding aliases делают proxy label unavailable, а не искусственным ret=0/loss. Adverse funding применяется только к фактическому net inventory на точных событиях внутри horizon. Любой finite положительный liquidation-equivalent net PnL является win без kill-switch breach. Текущий контракт — grid_label_v9; первый запуск v1.0.28 сбрасывает только старые proxy outcomes/calibrators.</w:t>
+        <w:t>Outcome entry — open первой точной 1m-свечи, начинающейся строго после publication timestamp. Kill-switch обязан строго охватывать grid range и является terminal event: после первого breach residual inventory закрывается на защитной границе, последующие grid fills и funding не учитываются. Missing/inside-range protection, одновременное касание обеих outer boundaries, конфликтующие grid_count/range/funding aliases или malformed explicit contract делают proxy label unavailable. Half round-trip cost начисляется на каждую leg и terminal close; adverse funding применяется только к фактическому inventory. Текущий контракт — grid_label_v10; первый запуск v1.0.29 сбрасывает только старые proxy outcomes/calibrators.</w:t>
       </w:r>
     </w:p>
     <w:p>

</xml_diff>

<commit_message>
fix(grid): unify commitment and reject path-dependent outcomes
- derive active levels, inventory and notional from exact arithmetic topology
- use one commitment model in sizing, snap, preflight, runtime caps and outcomes
- reject two-sided OHLC candles whose admissible paths produce different ledgers
- bump outcome target to grid_label_v11
- add iteration218 RED-to-GREEN coverage and synchronize operator artifacts
</commit_message>
<xml_diff>
--- a/docs/instrukciya_operatora_bybit_recommender.docx
+++ b/docs/instrukciya_operatora_bybit_recommender.docx
@@ -17,7 +17,10 @@
     <w:p>
       <w:pPr/>
       <w:r>
-        <w:t>Версия документа: 1.0.29 (grid ledger topology and protective-stop finalization).</w:t>
+        <w:rPr>
+          <w:sz w:val="19"/>
+        </w:rPr>
+        <w:t>Версия документа: 1.0.30 (exact grid commitment and intrabar path integrity).</w:t>
       </w:r>
     </w:p>
     <w:p>
@@ -256,6 +259,9 @@
         <w:pStyle w:val="ListBullet"/>
       </w:pPr>
       <w:r>
+        <w:rPr>
+          <w:sz w:val="19"/>
+        </w:rPr>
         <w:t>Outcome worker ведёт равноколичественный endpoint-aware ledger уровней: cash, LONG/SHORT lots, replacement orders и цены inferred fills. Для входа между уровнями LONG получает ближайший верхний TP и соответствующий initial long slot; SHORT симметрично получает ближайший нижний buy-to-close и initial short slot. Наблюдаемые close→open и open→close движения учитываются отдельно; двусторонний intrabar order из OHLC не выдумывается.</w:t>
       </w:r>
     </w:p>
@@ -264,7 +270,10 @@
         <w:pStyle w:val="ListBullet"/>
       </w:pPr>
       <w:r>
-        <w:t>Outcome entry — open первой точной 1m-свечи, начинающейся строго после publication timestamp. Kill-switch обязан строго охватывать grid range и является terminal event: после первого breach residual inventory закрывается на защитной границе, последующие grid fills и funding не учитываются. Missing/inside-range protection, одновременное касание обеих outer boundaries, конфликтующие grid_count/range/funding aliases или malformed explicit contract делают proxy label unavailable. Half round-trip cost начисляется на каждую leg и terminal close; adverse funding применяется только к фактическому inventory. Текущий контракт — grid_label_v10; первый запуск v1.0.29 сбрасывает только старые proxy outcomes/calibrators.</w:t>
+        <w:rPr>
+          <w:sz w:val="19"/>
+        </w:rPr>
+        <w:t>Outcome entry — open первой точной 1m-свечи, начинающейся строго после publication timestamp. Arithmetic grid_count означает число интервалов, а не всегда число активных уровней: при reference точно на уровне активны N orders, между уровнями — N+1. LONG/SHORT capital commitment включает initial directional inventory и adverse-side opening orders по фактическим grid prices; recommender, auto-snap, preflight, runtime caps и outcome denominator обязаны использовать одну модель. Для свечи с material high и low excursions сравниваются O→H→L→C и O→L→H→C; если ledger, stop или PnL различаются, proxy label unavailable. Kill-switch обязан строго охватывать grid range и является terminal event. Missing/inside-range protection, conflicting aliases или malformed explicit contract делают label unavailable. Текущий контракт — grid_label_v11; первый запуск v1.0.30 сбрасывает только старые proxy outcomes/calibrators.</w:t>
       </w:r>
     </w:p>
     <w:p>
@@ -317,9 +326,9 @@
       </w:pPr>
       <w:r>
         <w:rPr>
-          <w:sz w:val="21"/>
+          <w:sz w:val="19"/>
         </w:rPr>
-        <w:t>explicit leverage, isolated margin mode, sizing/economics for qtyStep, minNotional and margin checks.</w:t>
+        <w:t>explicit leverage, isolated margin mode, sizing/economics for qtyStep, minNotional, exact active-order count, committed notional, margin and worst-case exposure checks.</w:t>
       </w:r>
     </w:p>
     <w:p>
@@ -675,6 +684,9 @@
     </w:p>
     <w:p>
       <w:r>
+        <w:rPr>
+          <w:sz w:val="19"/>
+        </w:rPr>
         <w:drawing>
           <wp:inline xmlns:a="http://schemas.openxmlformats.org/drawingml/2006/main" xmlns:pic="http://schemas.openxmlformats.org/drawingml/2006/picture">
             <wp:extent cx="5852160" cy="4876800"/>

</xml_diff>

<commit_message>
fix(outcomes): preserve same-level grid order quantities
- aggregate directional lots resting at the same grid price
- account for every fill, fee and funding-relevant inventory change
- reject gap-through kill-switch outcomes with unknowable execution prices
- derive daily-loss fallback from canonical active-order topology
- bump outcome contract to grid_label_v12
- add iteration219 RED-to-GREEN regressions and update operator artifacts
</commit_message>
<xml_diff>
--- a/docs/instrukciya_operatora_bybit_recommender.docx
+++ b/docs/instrukciya_operatora_bybit_recommender.docx
@@ -20,7 +20,7 @@
         <w:rPr>
           <w:sz w:val="19"/>
         </w:rPr>
-        <w:t>Версия документа: 1.0.30 (exact grid commitment and intrabar path integrity).</w:t>
+        <w:t>Версия документа: 1.0.31 (quantity-aware grid ledger and gap-stop integrity).</w:t>
       </w:r>
     </w:p>
     <w:p>
@@ -262,7 +262,7 @@
         <w:rPr>
           <w:sz w:val="19"/>
         </w:rPr>
-        <w:t>Outcome worker ведёт равноколичественный endpoint-aware ledger уровней: cash, LONG/SHORT lots, replacement orders и цены inferred fills. Для входа между уровнями LONG получает ближайший верхний TP и соответствующий initial long slot; SHORT симметрично получает ближайший нижний buy-to-close и initial short slot. Наблюдаемые close→open и open→close движения учитываются отдельно; двусторонний intrabar order из OHLC не выдумывается.</w:t>
+        <w:t>Outcome worker ведёт quantity-aware endpoint ledger уровней: cash, LONG/SHORT lots, цены inferred fills и целое количество resting orders на каждом уровне. Если ближайший TP исходной directional-позиции и replacement TP после соседнего buy/sell совпадают по цене, оба lots сохраняются и исполняются; один не заменяет другой. Наблюдаемые close→open и open→close движения учитываются отдельно; двусторонний intrabar order из OHLC не выдумывается.</w:t>
       </w:r>
     </w:p>
     <w:p>
@@ -273,7 +273,7 @@
         <w:rPr>
           <w:sz w:val="19"/>
         </w:rPr>
-        <w:t>Outcome entry — open первой точной 1m-свечи, начинающейся строго после publication timestamp. Arithmetic grid_count означает число интервалов, а не всегда число активных уровней: при reference точно на уровне активны N orders, между уровнями — N+1. LONG/SHORT capital commitment включает initial directional inventory и adverse-side opening orders по фактическим grid prices; recommender, auto-snap, preflight, runtime caps и outcome denominator обязаны использовать одну модель. Для свечи с material high и low excursions сравниваются O→H→L→C и O→L→H→C; если ledger, stop или PnL различаются, proxy label unavailable. Kill-switch обязан строго охватывать grid range и является terminal event. Missing/inside-range protection, conflicting aliases или malformed explicit contract делают label unavailable. Текущий контракт — grid_label_v11; первый запуск v1.0.30 сбрасывает только старые proxy outcomes/calibrators.</w:t>
+        <w:t>Outcome entry — open первой точной 1m-свечи, начинающейся строго после publication timestamp. Arithmetic grid_count означает число интервалов: при reference точно на уровне активны N orders, между уровнями — N+1. LONG/SHORT capital commitment включает initial directional inventory и adverse-side opening orders по фактическим grid prices; recommender, auto-snap, preflight, runtime caps, daily-loss fallback и outcome denominator используют одну модель. Для свечи с material high/low сравниваются O→H→L→C и O→L→H→C; если ledger, stop или PnL различаются, label unavailable. Kill-switch строго охватывает grid range и завершает ledger. Close→open gap, перескочивший kill-switch, не оценивается по недостижимой boundary price: такой proxy outcome unavailable. Текущий контракт — grid_label_v12; первый запуск v1.0.31 сбрасывает только старые proxy outcomes/calibrators.</w:t>
       </w:r>
     </w:p>
     <w:p>
@@ -394,7 +394,7 @@
         <w:rPr>
           <w:sz w:val="21"/>
         </w:rPr>
-        <w:t>Оценочный loss до adverse kill-switch превышает остаток дневного лимита max_daily_dd_usdt - daily_dd (DAILY_LOSS_BUDGET_EXCEEDED).</w:t>
+        <w:t>Оценочный loss до adverse kill-switch превышает остаток дневного лимита max_daily_dd_usdt - daily_dd (DAILY_LOSS_BUDGET_EXCEEDED). Fallback notional обязан использовать каноническое число активных заявок N или N+1, а не безусловный grid_count.</w:t>
       </w:r>
     </w:p>
     <w:p>

</xml_diff>

<commit_message>
fix(grid): apply one-way commitment to neutral grids
- separate active resting orders from committed and max-position slots
- reserve neutral capital by the more expensive directional opening stack
- align sizing, snap, preflight, runtime caps, daily-loss guard and outcomes
- bump outcome target to grid_label_v13
- add iteration220 RED-to-GREEN regressions
- synchronize operator DOCX/PDF and infographic
</commit_message>
<xml_diff>
--- a/docs/instrukciya_operatora_bybit_recommender.docx
+++ b/docs/instrukciya_operatora_bybit_recommender.docx
@@ -17,10 +17,7 @@
     <w:p>
       <w:pPr/>
       <w:r>
-        <w:rPr>
-          <w:sz w:val="19"/>
-        </w:rPr>
-        <w:t>Версия документа: 1.0.31 (quantity-aware grid ledger and gap-stop integrity).</w:t>
+        <w:t>Версия документа: 1.0.32 (neutral one-way commitment integrity).</w:t>
       </w:r>
     </w:p>
     <w:p>
@@ -270,10 +267,7 @@
         <w:pStyle w:val="ListBullet"/>
       </w:pPr>
       <w:r>
-        <w:rPr>
-          <w:sz w:val="19"/>
-        </w:rPr>
-        <w:t>Outcome entry — open первой точной 1m-свечи, начинающейся строго после publication timestamp. Arithmetic grid_count означает число интервалов: при reference точно на уровне активны N orders, между уровнями — N+1. LONG/SHORT capital commitment включает initial directional inventory и adverse-side opening orders по фактическим grid prices; recommender, auto-snap, preflight, runtime caps, daily-loss fallback и outcome denominator используют одну модель. Для свечи с material high/low сравниваются O→H→L→C и O→L→H→C; если ledger, stop или PnL различаются, label unavailable. Kill-switch строго охватывает grid range и завершает ledger. Close→open gap, перескочивший kill-switch, не оценивается по недостижимой boundary price: такой proxy outcome unavailable. Текущий контракт — grid_label_v12; первый запуск v1.0.31 сбрасывает только старые proxy outcomes/calibrators.</w:t>
+        <w:t>Outcome entry — open первой точной 1m-свечи, начинающейся строго после publication timestamp. Arithmetic grid_count означает число интервалов: при reference точно на уровне активны N orders, между уровнями — N+1. Active resting orders не равны одновременно финансируемым slots. В one-way NEUTRAL commitment равен более дорогому directional opening stack: max(сумма Buy opening prices, сумма Sell opening prices) × qty, а не сумме обеих сторон. LONG/SHORT commitment включает initial directional inventory и adverse-side opening orders. Recommender, auto-snap, preflight, runtime caps, daily-loss fallback и outcome denominator используют одну модель. Для свечи с material high/low сравниваются O→H→L→C и O→L→H→C; если ledger, stop или PnL различаются, label unavailable. Kill-switch строго охватывает grid range и завершает ledger. Close→open gap, перескочивший kill-switch, не оценивается по недостижимой boundary price. Текущий контракт — grid_label_v13; первый запуск v1.0.32 сбрасывает только старые proxy outcomes/calibrators.</w:t>
       </w:r>
     </w:p>
     <w:p>
@@ -325,10 +319,7 @@
         <w:pStyle w:val="ListBullet"/>
       </w:pPr>
       <w:r>
-        <w:rPr>
-          <w:sz w:val="19"/>
-        </w:rPr>
-        <w:t>explicit leverage, isolated margin mode, sizing/economics for qtyStep, minNotional, exact active-order count, committed notional, margin and worst-case exposure checks.</w:t>
+        <w:t>explicit leverage, isolated margin mode, sizing/economics for qtyStep, minNotional, active resting-order count, one-way committed slots/notional, maximum directional exposure and margin checks.</w:t>
       </w:r>
     </w:p>
     <w:p>
@@ -391,10 +382,7 @@
         <w:pStyle w:val="ListBullet"/>
       </w:pPr>
       <w:r>
-        <w:rPr>
-          <w:sz w:val="21"/>
-        </w:rPr>
-        <w:t>Оценочный loss до adverse kill-switch превышает остаток дневного лимита max_daily_dd_usdt - daily_dd (DAILY_LOSS_BUDGET_EXCEEDED). Fallback notional обязан использовать каноническое число активных заявок N или N+1, а не безусловный grid_count.</w:t>
+        <w:t>Оценочный loss до adverse kill-switch превышает остаток дневного лимита max_daily_dd_usdt - daily_dd (DAILY_LOSS_BUDGET_EXCEEDED). Fallback notional обязан использовать каноническое maximum one-way position: для NEUTRAL — более крупный Buy/Sell opening stack, для LONG/SHORT — initial inventory плюс adverse-side openings; total active-order count и безусловный grid_count не являются заменой.</w:t>
       </w:r>
     </w:p>
     <w:p>
@@ -458,14 +446,7 @@
         <w:t>4. Не снижать severity guard-а вручную, не превращать no_trade в recommendation и не запускать при blocked/no_trade.</w:t>
       </w:r>
     </w:p>
-    <w:p>
-      <w:r>
-        <w:rPr>
-          <w:sz w:val="21"/>
-        </w:rPr>
-        <w:br w:type="page"/>
-      </w:r>
-    </w:p>
+    <w:p/>
     <w:p>
       <w:pPr>
         <w:pStyle w:val="ListBullet"/>

</xml_diff>

<commit_message>
fix(grid): enforce dynamic off-grid bridge topology
- keep exactly N initial orders across N+1 arithmetic prices
- leave the adjacent bridge level idle until a neighbouring fill
- remove phantom directional inventory, fills, fees and funding
- align sizing, snap, preflight, runtime risk and outcome ledger
- bump outcome contract to grid_label_v14
- add iteration221 RED-to-GREEN regression coverage
</commit_message>
<xml_diff>
--- a/docs/instrukciya_operatora_bybit_recommender.docx
+++ b/docs/instrukciya_operatora_bybit_recommender.docx
@@ -17,7 +17,7 @@
     <w:p>
       <w:pPr/>
       <w:r>
-        <w:t>Версия документа: 1.0.32 (neutral one-way commitment integrity).</w:t>
+        <w:t>Версия документа: 1.0.33 (dynamic off-grid bridge topology).</w:t>
       </w:r>
     </w:p>
     <w:p>
@@ -267,7 +267,7 @@
         <w:pStyle w:val="ListBullet"/>
       </w:pPr>
       <w:r>
-        <w:t>Outcome entry — open первой точной 1m-свечи, начинающейся строго после publication timestamp. Arithmetic grid_count означает число интервалов: при reference точно на уровне активны N orders, между уровнями — N+1. Active resting orders не равны одновременно финансируемым slots. В one-way NEUTRAL commitment равен более дорогому directional opening stack: max(сумма Buy opening prices, сумма Sell opening prices) × qty, а не сумме обеих сторон. LONG/SHORT commitment включает initial directional inventory и adverse-side opening orders. Recommender, auto-snap, preflight, runtime caps, daily-loss fallback и outcome denominator используют одну модель. Для свечи с material high/low сравниваются O→H→L→C и O→L→H→C; если ledger, stop или PnL различаются, label unavailable. Kill-switch строго охватывает grid range и завершает ledger. Close→open gap, перескочивший kill-switch, не оценивается по недостижимой boundary price. Текущий контракт — grid_label_v13; первый запуск v1.0.32 сбрасывает только старые proxy outcomes/calibrators.</w:t>
+        <w:t>Outcome entry — open первой точной 1m-свечи, начинающейся строго после publication timestamp. Arithmetic grid_count означает число интервалов: N интервалов создают N+1 ценовых уровней, но dynamic Futures Grid имеет ровно N начальных заявок и один idle pivot/bridge level. Для NEUTRAL/LONG между уровнями idle bridge — ближайший верхний уровень; для SHORT — ближайший нижний. До исполнения соседней заявки касание bridge не создаёт fill, fee, inventory или PnL; replacement-order может появиться там только после adjacent fill. Active resting orders не равны одновременно финансируемым slots. В one-way NEUTRAL commitment равен более дорогому directional opening stack: max(сумма Buy opening prices, сумма Sell opening prices) × qty. LONG/SHORT commitment включает только фактический initial directional inventory и adverse-side opening orders. Recommender, auto-snap, preflight, runtime caps, daily-loss fallback и outcome denominator используют одну topology. Для свечи с material high/low сравниваются O→H→L→C и O→L→H→C; если ledger, stop или PnL различаются, label unavailable. Kill-switch завершает ledger; gap через boundary не оценивается по недостижимой цене. Текущий контракт — grid_label_v14; первый запуск v1.0.33 сбрасывает только старые proxy outcomes/calibrators.</w:t>
       </w:r>
     </w:p>
     <w:p>

</xml_diff>

<commit_message>
fix(grid): reserve every neutral opening order
- sum all initial neutral Buy/Sell orders in committed notional
- keep maximum one-way position separate from margin commitment
- align sizing, snap, preflight, runtime caps and outcome normalization
- reject legacy max-side neutral payloads
- bump outcome contract to grid_label_v15
- add iteration222 RED-to-GREEN regressions
</commit_message>
<xml_diff>
--- a/docs/instrukciya_operatora_bybit_recommender.docx
+++ b/docs/instrukciya_operatora_bybit_recommender.docx
@@ -17,7 +17,7 @@
     <w:p>
       <w:pPr/>
       <w:r>
-        <w:t>Версия документа: 1.0.33 (dynamic off-grid bridge topology).</w:t>
+        <w:t>Версия документа: 1.0.34 (neutral opening-order margin reservation).</w:t>
       </w:r>
     </w:p>
     <w:p>
@@ -267,7 +267,7 @@
         <w:pStyle w:val="ListBullet"/>
       </w:pPr>
       <w:r>
-        <w:t>Outcome entry — open первой точной 1m-свечи, начинающейся строго после publication timestamp. Arithmetic grid_count означает число интервалов: N интервалов создают N+1 ценовых уровней, но dynamic Futures Grid имеет ровно N начальных заявок и один idle pivot/bridge level. Для NEUTRAL/LONG между уровнями idle bridge — ближайший верхний уровень; для SHORT — ближайший нижний. До исполнения соседней заявки касание bridge не создаёт fill, fee, inventory или PnL; replacement-order может появиться там только после adjacent fill. Active resting orders не равны одновременно финансируемым slots. В one-way NEUTRAL commitment равен более дорогому directional opening stack: max(сумма Buy opening prices, сумма Sell opening prices) × qty. LONG/SHORT commitment включает только фактический initial directional inventory и adverse-side opening orders. Recommender, auto-snap, preflight, runtime caps, daily-loss fallback и outcome denominator используют одну topology. Для свечи с material high/low сравниваются O→H→L→C и O→L→H→C; если ledger, stop или PnL различаются, label unavailable. Kill-switch завершает ledger; gap через boundary не оценивается по недостижимой цене. Текущий контракт — grid_label_v14; первый запуск v1.0.33 сбрасывает только старые proxy outcomes/calibrators.</w:t>
+        <w:t>Outcome entry — open первой точной 1m-свечи, начинающейся строго после publication timestamp. Arithmetic grid_count означает число интервалов: N интервалов создают N+1 ценовых уровней, но dynamic Futures Grid имеет ровно N начальных заявок и один idle pivot/bridge level. Для NEUTRAL/LONG между уровнями idle bridge — ближайший верхний уровень; для SHORT — ближайший нижний. NEUTRAL стартует без позиции, поэтому все первоначальные Buy и Sell заявки являются opening orders и входят в commitment: сумма цен всех начальных Buy/Sell × qty. Maximum one-way position считается отдельно как max(Buy slots, Sell slots); противоположная сторона не считается бесплатной. LONG/SHORT commitment включает фактический initial directional inventory и adverse-side opening orders. Recommender, auto-snap, preflight, runtime caps и outcome denominator используют одну topology. Для свечи с material high/low сравниваются O→H→L→C и O→L→H→C; если ledger, stop или PnL различаются, label unavailable. Kill-switch завершает ledger; gap через boundary не оценивается по недостижимой цене. Текущий контракт — grid_label_v15; первый запуск v1.0.34 сбрасывает только старые proxy outcomes/calibrators.</w:t>
       </w:r>
     </w:p>
     <w:p>
@@ -319,7 +319,7 @@
         <w:pStyle w:val="ListBullet"/>
       </w:pPr>
       <w:r>
-        <w:t>explicit leverage, isolated margin mode, sizing/economics for qtyStep, minNotional, active resting-order count, one-way committed slots/notional, maximum directional exposure and margin checks.</w:t>
+        <w:t>explicit leverage, isolated margin mode, sizing/economics for qtyStep, minNotional, active resting-order count, full initial opening-order committed slots/notional, maximum one-way position exposure and margin checks.</w:t>
       </w:r>
     </w:p>
     <w:p>
@@ -382,7 +382,7 @@
         <w:pStyle w:val="ListBullet"/>
       </w:pPr>
       <w:r>
-        <w:t>Оценочный loss до adverse kill-switch превышает остаток дневного лимита max_daily_dd_usdt - daily_dd (DAILY_LOSS_BUDGET_EXCEEDED). Fallback notional обязан использовать каноническое maximum one-way position: для NEUTRAL — более крупный Buy/Sell opening stack, для LONG/SHORT — initial inventory плюс adverse-side openings; total active-order count и безусловный grid_count не являются заменой.</w:t>
+        <w:t>Оценочный loss до adverse kill-switch превышает остаток дневного лимита max_daily_dd_usdt - daily_dd (DAILY_LOSS_BUDGET_EXCEEDED). Fallback notional обязан разделять commitment и exposure: для NEUTRAL commitment включает все первоначальные Buy/Sell opening orders, а maximum one-way position — только более крупный directional stack; для LONG/SHORT учитываются initial inventory плюс adverse-side openings. Total active-order count, committed slots и max-position slots нельзя взаимозаменять.</w:t>
       </w:r>
     </w:p>
     <w:p>

</xml_diff>

<commit_message>
fix(risk): align Futures Grid with Bybit cross margin
- publish unified cross-margin one-way execution contract
- replace isolated liquidation oracle with deterministic bot-equity stress
- recompute stress in leverage selection and strict preflight
- block legacy isolated Grid Bot payloads fail-closed
- bump outcome target to grid_label_v16
- add iteration223 RED-to-GREEN regressions and update operator artifacts
</commit_message>
<xml_diff>
--- a/docs/instrukciya_operatora_bybit_recommender.docx
+++ b/docs/instrukciya_operatora_bybit_recommender.docx
@@ -17,7 +17,7 @@
     <w:p>
       <w:pPr/>
       <w:r>
-        <w:t>Версия документа: 1.0.34 (neutral opening-order margin reservation).</w:t>
+        <w:t>Версия документа: 1.0.35 (Bybit cross-margin safety contract).</w:t>
       </w:r>
     </w:p>
     <w:p>
@@ -267,7 +267,7 @@
         <w:pStyle w:val="ListBullet"/>
       </w:pPr>
       <w:r>
-        <w:t>Outcome entry — open первой точной 1m-свечи, начинающейся строго после publication timestamp. Arithmetic grid_count означает число интервалов: N интервалов создают N+1 ценовых уровней, но dynamic Futures Grid имеет ровно N начальных заявок и один idle pivot/bridge level. Для NEUTRAL/LONG между уровнями idle bridge — ближайший верхний уровень; для SHORT — ближайший нижний. NEUTRAL стартует без позиции, поэтому все первоначальные Buy и Sell заявки являются opening orders и входят в commitment: сумма цен всех начальных Buy/Sell × qty. Maximum one-way position считается отдельно как max(Buy slots, Sell slots); противоположная сторона не считается бесплатной. LONG/SHORT commitment включает фактический initial directional inventory и adverse-side opening orders. Recommender, auto-snap, preflight, runtime caps и outcome denominator используют одну topology. Для свечи с material high/low сравниваются O→H→L→C и O→L→H→C; если ledger, stop или PnL различаются, label unavailable. Kill-switch завершает ledger; gap через boundary не оценивается по недостижимой цене. Текущий контракт — grid_label_v15; первый запуск v1.0.34 сбрасывает только старые proxy outcomes/calibrators.</w:t>
+        <w:t>Outcome entry — open первой точной 1m-свечи, начинающейся строго после publication timestamp. Arithmetic grid_count означает число интервалов: N интервалов создают N+1 ценовых уровней, но dynamic Futures Grid имеет ровно N начальных заявок и один idle pivot/bridge level. Для NEUTRAL/LONG между уровнями idle bridge — ближайший верхний уровень; для SHORT — ближайший нижний. NEUTRAL стартует без позиции, поэтому все первоначальные Buy и Sell заявки являются opening orders и входят в commitment. Bybit Futures Grid Bot моделируется как unified account, cross margin и one-way position mode. Safety gate использует cross-margin equity stress на обеих kill-switch границах: committed capital, adverse inventory loss, execution cost и maintenance reserve; funding receipts и hypothetical grid profit не кредитуются. Одиночная isolated liquidation price не публикуется. Текущий контракт — grid_label_v16; первый запуск v1.0.35 сбрасывает только старые proxy outcomes/calibrators.</w:t>
       </w:r>
     </w:p>
     <w:p>
@@ -319,7 +319,7 @@
         <w:pStyle w:val="ListBullet"/>
       </w:pPr>
       <w:r>
-        <w:t>explicit leverage, isolated margin mode, sizing/economics for qtyStep, minNotional, active resting-order count, full initial opening-order committed slots/notional, maximum one-way position exposure and margin checks.</w:t>
+        <w:t>explicit leverage, cross margin, one-way position mode, sizing/economics for qtyStep, minNotional, active resting-order count, full initial opening-order committed slots/notional, maximum one-way position exposure and cross-margin equity-stress checks.</w:t>
       </w:r>
     </w:p>
     <w:p>
@@ -417,10 +417,7 @@
     </w:p>
     <w:p>
       <w:r>
-        <w:rPr>
-          <w:sz w:val="21"/>
-        </w:rPr>
-        <w:t>2. Сверить current price, best bid/ask spread, live net edge, TTL, Bybit metadata, funding snapshot, liquidation buffer и остаток дневного loss budget относительно kill-switch.</w:t>
+        <w:t>2. Сверить current price, best bid/ask spread, live net edge, TTL, Bybit metadata, funding snapshot, cross-margin equity buffer и остаток дневного loss budget относительно kill-switch.</w:t>
       </w:r>
     </w:p>
     <w:p>

</xml_diff>

<commit_message>
fix(economics): separate recurring grid costs
- charge completed grid pairs only for their two fill fees
- keep spread and slippage as one-time market friction
- apply funding by inventory and event timing
- align grid spacing, live edge and outcome ledger
- bump outcome target to grid_label_v17
- add iteration224 RED-to-GREEN regressions
</commit_message>
<xml_diff>
--- a/docs/instrukciya_operatora_bybit_recommender.docx
+++ b/docs/instrukciya_operatora_bybit_recommender.docx
@@ -17,7 +17,7 @@
     <w:p>
       <w:pPr/>
       <w:r>
-        <w:t>Версия документа: 1.0.35 (Bybit cross-margin safety contract).</w:t>
+        <w:t>Версия документа: 1.0.36 (grid cost-layer separation; Bybit cross-margin safety contract).</w:t>
       </w:r>
     </w:p>
     <w:p>
@@ -245,10 +245,7 @@
         <w:pStyle w:val="ListBullet"/>
       </w:pPr>
       <w:r>
-        <w:rPr>
-          <w:sz w:val="21"/>
-        </w:rPr>
-        <w:t>Отдельное касание directional tp_per_leg не подтверждает прибыль всего grid. Arithmetic tp_per_leg должен совпадать с полным соседним grid interval; коэффициент fill_efficiency не уменьшает PnL уже завершённой пары. Одна и та же сетка может закрываться повторно, поэтому cumulative completed trades не ограничиваются grid_count.</w:t>
+        <w:t>Отдельное касание directional tp_per_leg не подтверждает прибыль всего grid. Arithmetic tp_per_leg совпадает с полным соседним interval. Grid Profit завершённой пары уменьшается только на комиссии её двух resting fills. Bid/ask spread и slippage относятся к разовой market setup/terminal exit, а funding — к position-time Total P&amp;L; эти слои нельзя повторно вычитать из каждой пары. Одна и та же сетка может закрываться многократно, поэтому cumulative completed trades не ограничиваются grid_count.</w:t>
       </w:r>
     </w:p>
     <w:p>
@@ -267,7 +264,7 @@
         <w:pStyle w:val="ListBullet"/>
       </w:pPr>
       <w:r>
-        <w:t>Outcome entry — open первой точной 1m-свечи, начинающейся строго после publication timestamp. Arithmetic grid_count означает число интервалов: N интервалов создают N+1 ценовых уровней, но dynamic Futures Grid имеет ровно N начальных заявок и один idle pivot/bridge level. Для NEUTRAL/LONG между уровнями idle bridge — ближайший верхний уровень; для SHORT — ближайший нижний. NEUTRAL стартует без позиции, поэтому все первоначальные Buy и Sell заявки являются opening orders и входят в commitment. Bybit Futures Grid Bot моделируется как unified account, cross margin и one-way position mode. Safety gate использует cross-margin equity stress на обеих kill-switch границах: committed capital, adverse inventory loss, execution cost и maintenance reserve; funding receipts и hypothetical grid profit не кредитуются. Одиночная isolated liquidation price не публикуется. Текущий контракт — grid_label_v16; первый запуск v1.0.35 сбрасывает только старые proxy outcomes/calibrators.</w:t>
+        <w:t>Outcome entry — open первой точной 1m-свечи, начинающейся строго после publication timestamp. Arithmetic grid_count означает число интервалов: N интервалов создают N+1 ценовых уровней, но dynamic Futures Grid имеет ровно N начальных заявок и один idle pivot/bridge level. Для NEUTRAL/LONG между уровнями idle bridge — ближайший верхний уровень; для SHORT — ближайший нижний. NEUTRAL стартует без позиции, поэтому все первоначальные Buy и Sell заявки являются opening orders и входят в commitment. Bybit Futures Grid Bot моделируется как unified account, cross margin и one-way position mode. Safety gate использует cross-margin equity stress на обеих kill-switch границах: committed capital, adverse inventory loss, execution cost и maintenance reserve; funding receipts и hypothetical grid profit не кредитуются. Одиночная isolated liquidation price не публикуется. Текущий контракт — grid_label_v17; первый запуск v1.0.36 сбрасывает только старые proxy outcomes/calibrators.</w:t>
       </w:r>
     </w:p>
     <w:p>
@@ -349,10 +346,7 @@
         <w:pStyle w:val="ListBullet"/>
       </w:pPr>
       <w:r>
-        <w:rPr>
-          <w:sz w:val="21"/>
-        </w:rPr>
-        <w:t>Устаревшая publication-chain, stale market data, live ticker вне range/kill-switch, отсутствующая пара bid/ask, spread &gt;14 bps, live net edge &lt;2 bps или gross/cost coverage &lt;=1,10x.</w:t>
+        <w:t>Устаревшая publication-chain, stale market data, live ticker вне range/kill-switch, отсутствующая пара bid/ask, spread &gt;14 bps, recurring grid edge &lt;2 bps или gross/fee coverage &lt;=1,10x. Spread остаётся отдельным liquidity gate, funding — отдельным inventory/schedule guard.</w:t>
       </w:r>
     </w:p>
     <w:p>

</xml_diff>

<commit_message>
fix(outcomes): use settled funding history
- collect immutable Bybit funding settlements from the public history endpoint
- apply signed funding cashflows to inventory held at each event
- include historical funding receipts in Total P&L
- block labels when a required settlement is unavailable
- add dual-database settlement persistence
- bump outcome target to grid_label_v18
- add iteration225 RED-to-GREEN regression coverage
</commit_message>
<xml_diff>
--- a/docs/instrukciya_operatora_bybit_recommender.docx
+++ b/docs/instrukciya_operatora_bybit_recommender.docx
@@ -17,7 +17,7 @@
     <w:p>
       <w:pPr/>
       <w:r>
-        <w:t>Версия документа: 1.0.36 (grid cost-layer separation; Bybit cross-margin safety contract).</w:t>
+        <w:t>Версия документа: 1.0.37 (grid cost-layer separation; Bybit cross-margin safety contract).</w:t>
       </w:r>
     </w:p>
     <w:p>
@@ -264,7 +264,15 @@
         <w:pStyle w:val="ListBullet"/>
       </w:pPr>
       <w:r>
-        <w:t>Outcome entry — open первой точной 1m-свечи, начинающейся строго после publication timestamp. Arithmetic grid_count означает число интервалов: N интервалов создают N+1 ценовых уровней, но dynamic Futures Grid имеет ровно N начальных заявок и один idle pivot/bridge level. Для NEUTRAL/LONG между уровнями idle bridge — ближайший верхний уровень; для SHORT — ближайший нижний. NEUTRAL стартует без позиции, поэтому все первоначальные Buy и Sell заявки являются opening orders и входят в commitment. Bybit Futures Grid Bot моделируется как unified account, cross margin и one-way position mode. Safety gate использует cross-margin equity stress на обеих kill-switch границах: committed capital, adverse inventory loss, execution cost и maintenance reserve; funding receipts и hypothetical grid profit не кредитуются. Одиночная isolated liquidation price не публикуется. Текущий контракт — grid_label_v17; первый запуск v1.0.36 сбрасывает только старые proxy outcomes/calibrators.</w:t>
+        <w:t>Outcome entry — open первой точной 1m-свечи, начинающейся строго после publication timestamp. Arithmetic grid_count означает число интервалов: N интервалов создают N+1 ценовых уровней, но dynamic Futures Grid имеет ровно N начальных заявок и один idle pivot/bridge level. Для NEUTRAL/LONG между уровнями idle bridge — ближайший верхний уровень; для SHORT — ближайший нижний. NEUTRAL стартует без позиции, поэтому все первоначальные Buy и Sell заявки являются opening orders и входят в commitment. Bybit Futures Grid Bot моделируется как unified account, cross margin и one-way position mode. Safety gate использует cross-margin equity stress на обеих kill-switch границах: committed capital, adverse inventory loss, execution cost и maintenance reserve; funding receipts и hypothetical grid profit не кредитуются. Одиночная isolated liquidation price не публикуется. Текущий контракт — grid_label_v18; первый запуск v1.0.37 сбрасывает только старые proxy outcomes/calibrators.</w:t>
+      </w:r>
+    </w:p>
+    <w:p>
+      <w:pPr>
+        <w:pStyle w:val="ListBullet"/>
+      </w:pPr>
+      <w:r>
+        <w:t>Исторический funding в proxy outcomes берётся только из фактически рассчитанных Bybit settlements, собранных через публичный funding-history endpoint. Ticker fundingRate остаётся прогнозом для approval/risk и не подменяет исторический факт. Положительная ставка означает: LONG платит, SHORT получает; отрицательная ставка меняет знак. Полученный funding входит в исторический Total P&amp;L, но прогнозное получение не улучшает approval edge. Если в момент ожидаемого funding event позиция ненулевая, а settlement row отсутствует, label не создаётся fail-closed.</w:t>
       </w:r>
     </w:p>
     <w:p>

</xml_diff>

<commit_message>
fix(risk): block tail-loss cohorts on negative cumulative exact PnL
- stop direction/symbol/portfolio execution after the sample floor despite positive median or win rate
- add iteration227 red-to-green regression and synchronize operator artifacts
- verify 1008 collected tests in exhaustive batches; no DB, API or env changes
</commit_message>
<xml_diff>
--- a/docs/instrukciya_operatora_bybit_recommender.docx
+++ b/docs/instrukciya_operatora_bybit_recommender.docx
@@ -17,7 +17,7 @@
     <w:p>
       <w:pPr/>
       <w:r>
-        <w:t>Версия документа: 1.0.37 (grid cost-layer separation; Bybit cross-margin safety contract).</w:t>
+        <w:t>Версия документа: 1.0.39 (tail-loss exact-evidence stop gate; grid cost-layer separation; Bybit cross-margin safety contract).</w:t>
       </w:r>
     </w:p>
     <w:p>
@@ -637,7 +637,7 @@
         <w:rPr>
           <w:sz w:val="21"/>
         </w:rPr>
-        <w:t>Отрицательные total и median net PnL при positive rate &lt;50% блокируют direction после 8, symbol после 12 и portfolio после 20 независимых наблюдений.</w:t>
+        <w:t>После 8 независимых наблюдений по direction, 12 по symbol или 20 по portfolio отрицательный cumulative exact net PnL блокирует следующий executed независимо от median и positive rate. Высокая доля малых выигрышей не компенсирует крупный range-break loss для stop gate.</w:t>
       </w:r>
     </w:p>
     <w:p>

</xml_diff>

<commit_message>
fix(calibration): gate confidence on monetary expectancy
- reject non-positive matured proxy return before probability fitting
- persist expectancy diagnostics and emit explicit futures-grid no-trade
- add iteration228 asymmetric-payoff, tail-risk and cache regressions
- verify 1016 tests; no DB schema, API or env changes
</commit_message>
<xml_diff>
--- a/docs/instrukciya_operatora_bybit_recommender.docx
+++ b/docs/instrukciya_operatora_bybit_recommender.docx
@@ -17,7 +17,7 @@
     <w:p>
       <w:pPr/>
       <w:r>
-        <w:t>Версия документа: 1.0.39 (tail-loss exact-evidence stop gate; grid cost-layer separation; Bybit cross-margin safety contract).</w:t>
+        <w:t>Версия документа: 1.0.40 (monetary-expectancy calibration gate; tail-loss exact-evidence stop gate; Bybit cross-margin safety contract).</w:t>
       </w:r>
     </w:p>
     <w:p>
@@ -134,6 +134,32 @@
           <w:sz w:val="21"/>
         </w:rPr>
         <w:t>Raw confidence — эвристическое качество запуска, а не вероятность прибыли. Даже calibrated confidence относится к proxy outcomes и не подтверждает live edge без walk-forward/shadow статистики по фактическим fills и costs. Поле expected_rr в UI отображается как «Прокси capture/risk»: это не фактическое отношение прибыли к убытку.</w:t>
+      </w:r>
+    </w:p>
+    <w:p>
+      <w:pPr>
+        <w:pStyle w:val="Heading1"/>
+      </w:pPr>
+      <w:r>
+        <w:t>Денежное ожидание калибровки</w:t>
+      </w:r>
+    </w:p>
+    <w:p>
+      <w:pPr/>
+      <w:r>
+        <w:t>Высокая доля успешных proxy labels не является доказательством прибыли. Cohort из множества малых выигрышей и меньшего числа крупных убытков может иметь высокий hit rate, но отрицательный net return.</w:t>
+      </w:r>
+    </w:p>
+    <w:p>
+      <w:pPr/>
+      <w:r>
+        <w:t>После минимальной matured-return выборки bot-specific calibration допускается только при положительном recency-weighted mean proxy return. Если mean return &lt;= 0, модель не обучается, сохраняется expectancy_status=negative, а рекомендация получает NO_TRADE с кодом PROXY_MONETARY_EXPECTANCY_NON_POSITIVE. Lower-tail expected shortfall показывается как диагностика. Обходить этот статус из-за confidence, median или win rate запрещено.</w:t>
+      </w:r>
+    </w:p>
+    <w:p>
+      <w:pPr/>
+      <w:r>
+        <w:t>Это защитный OHLCV proxy gate, а не доказательство live edge. После реальных запусков authoritative evidence — exact fills, fees, funding и realized net PnL внешнего execution/reconciliation layer.</w:t>
       </w:r>
     </w:p>
     <w:p>
@@ -473,10 +499,7 @@
         <w:pStyle w:val="ListBullet"/>
       </w:pPr>
       <w:r>
-        <w:rPr>
-          <w:sz w:val="21"/>
-        </w:rPr>
-        <w:t>Необученный bot-specific calibrator сам по себе публикацию не блокирует: до fit используется ограниченный raw-confidence, а deterministic gates работают независимо.</w:t>
+        <w:t>Необученный calibrator из-за недостаточной выборки сам по себе публикацию не блокирует: до fit используется ограниченный raw-confidence. Но подтверждённый expectancy_status=negative является отдельным NO_TRADE и не может быть проигнорирован.</w:t>
       </w:r>
     </w:p>
     <w:p>
@@ -484,10 +507,7 @@
         <w:pStyle w:val="ListBullet"/>
       </w:pPr>
       <w:r>
-        <w:rPr>
-          <w:sz w:val="21"/>
-        </w:rPr>
-        <w:t>Отсутствие recommended/active является допустимым и безопасным результатом, особенно при отрицательной proxy-статистике или слабом range edge. Система не обязана постоянно выдавать сделки.</w:t>
+        <w:t>Отсутствие recommended/active является допустимым и безопасным результатом, особенно при отрицательной monetary proxy-статистике, коде PROXY_MONETARY_EXPECTANCY_NON_POSITIVE или слабом range edge. Система не обязана постоянно выдавать сделки.</w:t>
       </w:r>
     </w:p>
     <w:p>

</xml_diff>

<commit_message>
fix(calibration): expire unreconstructable positive calibrators
- deactivate stale bot, global and direction calibration on insufficient current evidence
- preserve confirmed negative monetary expectancy as a conservative no-trade veto
- persist insufficient state to prevent stale coefficients from returning after restart
- bump calibrator identities to v7/v6 and add iteration230 regressions
- verify 1025 tests; no DB schema, API or env changes
</commit_message>
<xml_diff>
--- a/docs/instrukciya_operatora_bybit_recommender.docx
+++ b/docs/instrukciya_operatora_bybit_recommender.docx
@@ -17,7 +17,7 @@
     <w:p>
       <w:pPr/>
       <w:r>
-        <w:t>Версия документа: 1.0.40 (monetary-expectancy calibration gate; tail-loss exact-evidence stop gate; Bybit cross-margin safety contract).</w:t>
+        <w:t>Версия документа: 1.0.42 (stale positive calibrator fail-closed; independent shadow outcomes; monetary-expectancy calibration gate; tail-loss exact-evidence stop gate; Bybit cross-margin safety contract).</w:t>
       </w:r>
     </w:p>
     <w:p>
@@ -153,7 +153,7 @@
     <w:p>
       <w:pPr/>
       <w:r>
-        <w:t>После минимальной matured-return выборки bot-specific calibration допускается только при положительном recency-weighted mean proxy return. Если mean return &lt;= 0, модель не обучается, сохраняется expectancy_status=negative, а рекомендация получает NO_TRADE с кодом PROXY_MONETARY_EXPECTANCY_NON_POSITIVE. Lower-tail expected shortfall показывается как диагностика. Обходить этот статус из-за confidence, median или win rate запрещено.</w:t>
+        <w:t>После минимальной matured-return выборки bot-specific calibration допускается только при положительном recency-weighted mean proxy return. Если mean return &lt;= 0, модель не обучается, сохраняется expectancy_status=negative, а рекомендация получает NO_TRADE с кодом PROXY_MONETARY_EXPECTANCY_NON_POSITIVE. Lower-tail expected shortfall показывается как диагностика. Обходить этот статус из-за confidence, median или win rate запрещено. Положительный calibrated confidence допустим только пока коэффициенты воспроизводятся из текущей retained outcome-выборки. После истечения cache interval stale positive bot/global/direction calibrator обязан пройти refit; если текущих данных недостаточно, он деактивируется и в cache сохраняется состояние insufficient.</w:t>
       </w:r>
     </w:p>
     <w:p>
@@ -499,7 +499,7 @@
         <w:pStyle w:val="ListBullet"/>
       </w:pPr>
       <w:r>
-        <w:t>Необученный calibrator из-за недостаточной выборки сам по себе публикацию не блокирует: до fit используется ограниченный raw-confidence. Но подтверждённый expectancy_status=negative является отдельным NO_TRADE и не может быть проигнорирован.</w:t>
+        <w:t>Необученный текущий calibrator из-за недостаточной выборки сам по себе публикацию не блокирует: до fit используется ограниченный raw-confidence. Однако stale положительный calibrator не может заменять текущую evidence-выборку: после refit при insufficient старые коэффициенты отключаются, а source/fitted/n_samples в UI и API должны показывать отсутствие актуальной калибровки. Подтверждённый expectancy_status=negative является отдельным NO_TRADE и сохраняется консервативно до появления новой положительной evidence-выборки.</w:t>
       </w:r>
     </w:p>
     <w:p>
@@ -632,10 +632,7 @@
         <w:pStyle w:val="ListBullet"/>
       </w:pPr>
       <w:r>
-        <w:rPr>
-          <w:sz w:val="21"/>
-        </w:rPr>
-        <w:t>В gate входят только stopped bots с exact fills/funding той же explicit model_version; повторные publication roots считаются один раз. Текущая версия сигнала: bybit-taxonomy-v3-mean-reversion; legacy v2 evidence не смешивается с новой калибровкой.</w:t>
+        <w:t>В gate входят только stopped bots с exact fills/funding той же explicit model_version; повторные publication roots считаются один раз. Текущая версия сигнала: bybit-taxonomy-v4-independent-shadow-roots; legacy model evidence не смешивается с новой калибровкой. Текущие ключи cache: logreg_futures_grid_v7, logreg_global_v7 и platt_direction_v6.</w:t>
       </w:r>
     </w:p>
     <w:p>

</xml_diff>

<commit_message>
fix(calibration): require positive uncertainty-bounded expectancy
- calculate weighted dispersion, Kish effective sample size and one-sided 95% lower bound
- keep unknown, insufficient and uncertain monetary evidence as shadow no-trade
- prevent raw confidence from making an unproven futures-grid strategy actionable
- bump bot and global calibrator identities to v8
- add iteration231 end-to-end and persistence regressions
- verify 1034 tests; no DB schema or env changes
</commit_message>
<xml_diff>
--- a/docs/instrukciya_operatora_bybit_recommender.docx
+++ b/docs/instrukciya_operatora_bybit_recommender.docx
@@ -17,7 +17,7 @@
     <w:p>
       <w:pPr/>
       <w:r>
-        <w:t>Версия документа: 1.0.42 (stale positive calibrator fail-closed; independent shadow outcomes; monetary-expectancy calibration gate; tail-loss exact-evidence stop gate; Bybit cross-margin safety contract).</w:t>
+        <w:t>Версия документа: 1.0.43 (uncertainty-bounded monetary expectancy gate; stale-calibrator fail-closed; independent shadow outcomes; tail-loss exact-evidence stop gate; Bybit cross-margin safety contract).</w:t>
       </w:r>
     </w:p>
     <w:p>
@@ -153,13 +153,13 @@
     <w:p>
       <w:pPr/>
       <w:r>
-        <w:t>После минимальной matured-return выборки bot-specific calibration допускается только при положительном recency-weighted mean proxy return. Если mean return &lt;= 0, модель не обучается, сохраняется expectancy_status=negative, а рекомендация получает NO_TRADE с кодом PROXY_MONETARY_EXPECTANCY_NON_POSITIVE. Lower-tail expected shortfall показывается как диагностика. Обходить этот статус из-за confidence, median или win rate запрещено. Положительный calibrated confidence допустим только пока коэффициенты воспроизводятся из текущей retained outcome-выборки. После истечения cache interval stale positive bot/global/direction calibrator обязан пройти refit; если текущих данных недостаточно, он деактивируется и в cache сохраняется состояние insufficient.</w:t>
+        <w:t>Actionable futures_grid допускается только когда текущая независимая matured-return выборка имеет достаточный Kish effective sample size и одностороннюю 95% нижнюю границу recency-weighted mean proxy return строго выше нуля. Статусы expectancy_status=unknown, insufficient или uncertain означают NO_TRADE с кодом PROXY_MONETARY_EXPECTANCY_UNPROVEN; weighted mean &lt;= 0 означает PROXY_MONETARY_EXPECTANCY_NON_POSITIVE. Raw confidence, median, win rate и положительное наблюдаемое среднее не могут отменить этот gate. В confidence_model проверяйте weighted_effective_return_samples, weighted_return_std, weighted_mean_return_lower_bound и expectancy_confidence_level. Положительный calibrator обязан воспроизводиться из текущей retained outcome-выборки после истечения cache interval.</w:t>
       </w:r>
     </w:p>
     <w:p>
       <w:pPr/>
       <w:r>
-        <w:t>Это защитный OHLCV proxy gate, а не доказательство live edge. После реальных запусков authoritative evidence — exact fills, fees, funding и realized net PnL внешнего execution/reconciliation layer.</w:t>
+        <w:t>Это защитный OHLCV proxy gate, а не доказательство live edge или гарантии прибыли. Даже положительная нижняя граница не отменяет deterministic risk/preflight checks. После реальных запусков authoritative evidence — exact fills, fees, settled funding, slippage и realized net PnL внешнего execution/reconciliation layer.</w:t>
       </w:r>
     </w:p>
     <w:p>

</xml_diff>

<commit_message>
fix(calibration): require purged OOF before feature LogReg activation
- withhold full-sample feature coefficients when purged OOF is insufficient
- degrade safely to score-only Platt or capped raw confidence
- persist and expose OOF activation diagnostics
- bump bot/global calibrator identities to v16
- add iteration242 concentrated/distributed/persistence regressions
- verify 1072 test nodes; no outcome, DB schema, route or env changes
</commit_message>
<xml_diff>
--- a/docs/instrukciya_operatora_bybit_recommender.docx
+++ b/docs/instrukciya_operatora_bybit_recommender.docx
@@ -9,7 +9,7 @@
       <w:r>
         <w:rPr>
           <w:b/>
-          <w:sz w:val="36"/>
+          <w:sz w:val="40"/>
         </w:rPr>
         <w:t>Инструкция оператора Bybit Recommender</w:t>
       </w:r>
@@ -17,30 +17,118 @@
     <w:p>
       <w:pPr/>
       <w:r>
-        <w:t>Версия документа: 1.0.43 (uncertainty-bounded monetary expectancy gate; stale-calibrator fail-closed; independent shadow outcomes; tail-loss exact-evidence stop gate; Bybit cross-margin safety contract).</w:t>
+        <w:t>Версия документа: 1.0.54 (historical-only simulation boundary; purged OOF activation gate; conservative OHLCV proxy fills; monetary/temporal validation; no runtime order executability)</w:t>
       </w:r>
     </w:p>
     <w:p>
       <w:r>
-        <w:rPr>
-          <w:sz w:val="21"/>
-        </w:rPr>
-        <w:t>Назначение: быстрый регламент проверки рекомендации перед ручным переносом параметров в Bybit Futures Grid Bot.</w:t>
+        <w:t>Назначение: регламент интерпретации рекомендаций и исторических proxy-outcomes в paper/shadow-режиме. Документ не является инструкцией по переносу параметров в биржевой бот.</w:t>
       </w:r>
     </w:p>
     <w:p>
       <w:r>
-        <w:rPr>
-          <w:b/>
-          <w:sz w:val="21"/>
-        </w:rPr>
-        <w:t xml:space="preserve">Граница системы. </w:t>
+        <w:t>Граница системы. Репозиторий является recommendation/audit service, not OMS/EMS. Он не выставляет ордера, не подтверждает runtime-исполнимость, не знает очередь, partial fills, состояние аккаунта или фактическую доступность маржи. Статус recommended означает модельный сигнал, а не готовый к исполнению ордер.</w:t>
       </w:r>
+    </w:p>
+    <w:p>
+      <w:pPr>
+        <w:pStyle w:val="Heading1"/>
+      </w:pPr>
       <w:r>
-        <w:rPr>
-          <w:sz w:val="21"/>
-        </w:rPr>
-        <w:t>Репозиторий является recommendation/audit service, not OMS/EMS. Он не управляет live order lifecycle, open orders, fills, partial fills или reconciliation. Перед реальным запуском внешний execution-layer обязан повторно проверить Bybit account state, баланс, маржу, открытые ордера и фактические лимиты инструмента.</w:t>
+        <w:t>Граница исторического моделирования</w:t>
+      </w:r>
+    </w:p>
+    <w:p>
+      <w:pPr/>
+      <w:r>
+        <w:t>Recommendation publication и outcome labeling не зависят от текущих Bybit tickSize, qtyStep, minOrderQty, minNotional или статуса инструмента. Отсутствие этих данных не переводит рекомендацию в blocked и не отменяет созревший исторический outcome.</w:t>
+      </w:r>
+    </w:p>
+    <w:p>
+      <w:pPr/>
+      <w:r>
+        <w:t>В reasons.simulation_scope должны быть: mode=historical_proxy_only, runtime_order_submission=false, runtime_execution_validation=not_performed, exchange_fill_attestation=not_available. Это основной контракт текущей версии 1.0.54.</w:t>
+      </w:r>
+    </w:p>
+    <w:p>
+      <w:pPr/>
+      <w:r>
+        <w:t>Явный preflight с текущими биржевыми фильтрами может использоваться только как отдельная справочная диагностика. Он не изменяет сохранённую рекомендацию, её статус, историческую геометрию, outcome или calibration evidence.</w:t>
+      </w:r>
+    </w:p>
+    <w:p>
+      <w:pPr>
+        <w:pStyle w:val="Heading1"/>
+      </w:pPr>
+      <w:r>
+        <w:t>Объёмное подтверждение proxy fills</w:t>
+      </w:r>
+    </w:p>
+    <w:p>
+      <w:pPr/>
+      <w:r>
+        <w:t>Trade-through означает только, что рынок прошёл за лимитный уровень. Полный proxy fill не подтверждён, если размер модельной заявки превышает весь наблюдаемый минутный объём.</w:t>
+      </w:r>
+    </w:p>
+    <w:p>
+      <w:pPr/>
+      <w:r>
+        <w:t>Для grid_label_v26 стартовая directional-позиция и все смоделированные fills расходуют общий candle-volume budget в base/contract quantity. Коды insufficient_candle_volume_for_full_fill и insufficient_candle_volume_for_initial_inventory означают: outcome unavailable, статистического evidence нет.</w:t>
+      </w:r>
+    </w:p>
+    <w:p>
+      <w:pPr/>
+      <w:r>
+        <w:t>Даже достаточный общий объём не доказывает очередь, ликвидность на конкретном уровне, partial fills или отсутствие market impact. Это консервативная историческая модель, а не exchange-attested execution.</w:t>
+      </w:r>
+    </w:p>
+    <w:p>
+      <w:pPr>
+        <w:pStyle w:val="Heading2"/>
+      </w:pPr>
+      <w:r>
+        <w:t>Ликвидность на границе horizon и при защитном закрытии</w:t>
+      </w:r>
+    </w:p>
+    <w:p>
+      <w:r>
+        <w:t>Объёмный бюджет одной минутной свечи заканчивается вместе с этой свечой. Gap-fill на точном horizon-open не может использовать объём предыдущей минуты: он и terminal close остаточной позиции расходуют единый бюджет граничной свечи.</w:t>
+      </w:r>
+    </w:p>
+    <w:p>
+      <w:r>
+        <w:t>При kill-switch все grid-fills до защитной границы и закрытие остаточного inventory расходуют единый объём breach-candle. Коды insufficient_candle_volume_for_terminal_liquidation и insufficient_candle_volume_for_kill_switch_liquidation означают NO EVIDENCE, а не частичную прибыль или убыток.</w:t>
+      </w:r>
+    </w:p>
+    <w:p>
+      <w:r>
+        <w:t>Стратегический horizon не увеличивается: для futures_grid он остаётся 12 часов. Но label_available_ts наступает через 60 секунд после horizon-end, когда полный объём граничной минуты уже исторически известен. Это proxy-правило, а не runtime-подтверждение исполнения.</w:t>
+      </w:r>
+    </w:p>
+    <w:p>
+      <w:pPr>
+        <w:pStyle w:val="Heading1"/>
+      </w:pPr>
+      <w:r>
+        <w:t>Консервативная цена kill-switch</w:t>
+      </w:r>
+    </w:p>
+    <w:p>
+      <w:pPr/>
+      <w:r>
+        <w:t>При внутрисвечном пробое защитной границы историческая модель сначала обрабатывает resting grid-orders только до kill-switch. Остаточная позиция не считается идеально закрытой ровно по trigger-price, если свеча уже доказывает дальнейшее неблагоприятное движение.</w:t>
+      </w:r>
+    </w:p>
+    <w:p>
+      <w:pPr/>
+      <w:r>
+        <w:t>Residual SHORT при пробое верхнего kill-switch закрывается по наблюдаемому high свечи; residual LONG при пробое нижнего kill-switch — по наблюдаемому low. Если продолжение цены выгодно остаточной позиции, положительное проскальзывание не кредитуется и сохраняется цена границы.</w:t>
+      </w:r>
+    </w:p>
+    <w:p>
+      <w:pPr/>
+      <w:r>
+        <w:t>Диагностика: kill_switch_fill_confirmation=adverse_observed_extreme_v1, kill_switch_boundary_price, kill_switch_observed_extreme и kill_switch_liquidation_price. Gap, перескочивший границу между свечами, по-прежнему не размечается.</w:t>
       </w:r>
     </w:p>
     <w:p>
@@ -92,10 +180,7 @@
         <w:pStyle w:val="ListBullet"/>
       </w:pPr>
       <w:r>
-        <w:rPr>
-          <w:sz w:val="21"/>
-        </w:rPr>
-        <w:t>Любой blocking/critical preflight означает NO TRADE.</w:t>
+        <w:t>Любой deterministic data/risk/model blocker означает NO TRADE. Необязательная текущая preflight-диагностика не переписывает модельный статус.</w:t>
       </w:r>
     </w:p>
     <w:p>
@@ -130,10 +215,53 @@
     <w:p>
       <w:pPr/>
       <w:r>
-        <w:rPr>
-          <w:sz w:val="21"/>
-        </w:rPr>
-        <w:t>Raw confidence — эвристическое качество запуска, а не вероятность прибыли. Даже calibrated confidence относится к proxy outcomes и не подтверждает live edge без walk-forward/shadow статистики по фактическим fills и costs. Поле expected_rr в UI отображается как «Прокси capture/risk»: это не фактическое отношение прибыли к убытку.</w:t>
+        <w:t>Raw confidence — эвристическое качество модельного сигнала, а не вероятность прибыли и не runtime-исполнимость. Даже calibrated confidence относится только к proxy outcomes. Поле expected_rr в UI отображается как «Прокси capture/risk» и не является фактическим отношением прибыли к убытку.</w:t>
+      </w:r>
+    </w:p>
+    <w:p>
+      <w:pPr>
+        <w:pStyle w:val="Heading1"/>
+      </w:pPr>
+      <w:r>
+        <w:t>Purged OOF для feature LogReg</w:t>
+      </w:r>
+    </w:p>
+    <w:p>
+      <w:r>
+        <w:t>Полная feature LogReg не считается калиброванной только потому, что коэффициенты успешно обучены на всей retained-выборке. Для источника bot_logreg требуется не менее CALIB_MIN_SAMPLES действительно out-of-fold прогнозов, полученных хронологически после purging по label_available_ts, и fitted Platt-on-top на этих OOF logits.</w:t>
+      </w:r>
+    </w:p>
+    <w:p>
+      <w:r>
+        <w:t>В confidence_model проверяйте purged_oof_status, purged_oof_samples и purged_oof_required_samples. Статус sufficient и samples &gt;= required разрешают feature LogReg. insufficient/error означает, что feature coefficients не используются; система возвращается к score-only Platt или capped raw confidence.</w:t>
+      </w:r>
+    </w:p>
+    <w:p>
+      <w:r>
+        <w:t>Fallback не отменяет monetary expectancy, temporal-cluster lower bound, blocked/no_trade и другие deterministic gates. Score-only Platt является более простым proxy-calibration слоем и не доказывает generalisation feature model или live profitability.</w:t>
+      </w:r>
+    </w:p>
+    <w:p>
+      <w:pPr>
+        <w:pStyle w:val="Heading1"/>
+      </w:pPr>
+      <w:r>
+        <w:t>Независимость временных evidence-кластеров</w:t>
+      </w:r>
+    </w:p>
+    <w:p>
+      <w:r>
+        <w:t>Количество монет не равно количеству независимых экспериментов. Outcomes разных символов, чьи интервалы [ts, label_available_ts] пересекаются прямо или транзитивно, считаются одним рыночным временным кластером.</w:t>
+      </w:r>
+    </w:p>
+    <w:p>
+      <w:r>
+        <w:t>Для штатного CALIB_MIN_SAMPLES=80 требуется минимум 20 эффективных неперекрывающихся time clusters. В confidence_model проверьте time_clusters и time_cluster_lower_bound: нижняя односторонняя 95% граница должна быть строго положительной одновременно на уровне строк и средних по временным кластерам.</w:t>
+      </w:r>
+    </w:p>
+    <w:p>
+      <w:r>
+        <w:t>Недостаток временных кластеров, отсутствующая диагностика или неположительная cluster lower bound означает shadow NO TRADE с PROXY_MONETARY_EXPECTANCY_UNPROVEN. Высокий score, win rate или десятки коррелированных символов не являются основанием для обхода.</w:t>
       </w:r>
     </w:p>
     <w:p>
@@ -159,7 +287,7 @@
     <w:p>
       <w:pPr/>
       <w:r>
-        <w:t>Это защитный OHLCV proxy gate, а не доказательство live edge или гарантии прибыли. Даже положительная нижняя граница не отменяет deterministic risk/preflight checks. После реальных запусков authoritative evidence — exact fills, fees, settled funding, slippage и realized net PnL внешнего execution/reconciliation layer.</w:t>
+        <w:t>Это защитный OHLCV proxy gate, а не доказательство live edge, исполнимости или гарантии прибыли. Внешняя post-hoc сверка с fills может использоваться отдельным исследованием, но не является runtime-контрактом системы.</w:t>
       </w:r>
     </w:p>
     <w:p>
@@ -194,10 +322,7 @@
     <w:p>
       <w:pPr/>
       <w:r>
-        <w:rPr>
-          <w:sz w:val="21"/>
-        </w:rPr>
-        <w:t>MEAN_REVERSION_EVIDENCE_INSUFFICIENT означает hard blocked из-за недостатка обязательных данных. MEAN_REVERSION_EDGE_UNCONFIRMED означает strategy no_trade: evidence рассчитан, но торговый тезис не подтверждён. Оба статуса означают НЕ ЗАПУСКАТЬ; высокий legacy range score, raw confidence или LLM verdict решение не отменяют.</w:t>
+        <w:t>MEAN_REVERSION_EVIDENCE_INSUFFICIENT означает hard blocked из-за недостатка обязательных исторических данных. MEAN_REVERSION_EDGE_UNCONFIRMED означает strategy no_trade: evidence рассчитан, но модельный тезис не подтверждён. Оба статуса исключают использование строки как положительного статистического evidence; высокий score, raw confidence или LLM verdict решение не отменяют.</w:t>
       </w:r>
     </w:p>
     <w:p>
@@ -290,7 +415,7 @@
         <w:pStyle w:val="ListBullet"/>
       </w:pPr>
       <w:r>
-        <w:t>Outcome entry — open первой точной 1m-свечи, начинающейся строго после publication timestamp. Arithmetic grid_count означает число интервалов: N интервалов создают N+1 ценовых уровней, но dynamic Futures Grid имеет ровно N начальных заявок и один idle pivot/bridge level. Для NEUTRAL/LONG между уровнями idle bridge — ближайший верхний уровень; для SHORT — ближайший нижний. NEUTRAL стартует без позиции, поэтому все первоначальные Buy и Sell заявки являются opening orders и входят в commitment. Bybit Futures Grid Bot моделируется как unified account, cross margin и one-way position mode. Safety gate использует cross-margin equity stress на обеих kill-switch границах: committed capital, adverse inventory loss, execution cost и maintenance reserve; funding receipts и hypothetical grid profit не кредитуются. Одиночная isolated liquidation price не публикуется. Текущий контракт — grid_label_v18; первый запуск v1.0.37 сбрасывает только старые proxy outcomes/calibrators.</w:t>
+        <w:t>Outcome contract остаётся grid_label_v26. Версия 1.0.54 не удаляет исторические outcomes, но bot/global calibrators refit под identity v16, поскольку изменилось правило активации feature LogReg.</w:t>
       </w:r>
     </w:p>
     <w:p>
@@ -298,7 +423,7 @@
         <w:pStyle w:val="ListBullet"/>
       </w:pPr>
       <w:r>
-        <w:t>Исторический funding в proxy outcomes берётся только из фактически рассчитанных Bybit settlements, собранных через публичный funding-history endpoint. Ticker fundingRate остаётся прогнозом для approval/risk и не подменяет исторический факт. Положительная ставка означает: LONG платит, SHORT получает; отрицательная ставка меняет знак. Полученный funding входит в исторический Total P&amp;L, но прогнозное получение не улучшает approval edge. Если в момент ожидаемого funding event позиция ненулевая, а settlement row отсутствует, label не создаётся fail-closed.</w:t>
+        <w:t>Исторический funding в proxy outcomes берётся только из фактически рассчитанных Bybit settlements, собранных через публичный funding-history endpoint. Ticker fundingRate остаётся прогнозом для approval/risk и не подменяет исторический факт. Положительная ставка означает: LONG платит, SHORT получает; отрицательная ставка меняет знак. Для canonical proxy ret и monetary calibration adverse settled funding всегда вычитается, а положительный receipt не кредитуется как устойчивый alpha и не может превратить плоскую/убыточную сетку в success. Signed funding остаётся диагностикой исторической модели; возможная внешняя post-hoc сверка не входит в runtime-контракт системы. Если в момент ожидаемого funding event позиция ненулевая, а settlement row отсутствует, label не создаётся fail-closed.</w:t>
       </w:r>
     </w:p>
     <w:p>
@@ -369,10 +494,7 @@
         <w:pStyle w:val="ListBullet"/>
       </w:pPr>
       <w:r>
-        <w:rPr>
-          <w:sz w:val="21"/>
-        </w:rPr>
-        <w:t>Hard blocked: MEAN_REVERSION_EVIDENCE_INSUFFICIENT, INVALID_MARKET_REFERENCE_PRICE и иные data/risk/Bybit/preflight failures. Strategy no_trade: MEAN_REVERSION_EDGE_UNCONFIRMED либо непрохождение launch-score/confidence/economics.</w:t>
+        <w:t>Hard blocked: MEAN_REVERSION_EVIDENCE_INSUFFICIENT, INVALID_MARKET_REFERENCE_PRICE и иные data/risk/model failures. Strategy no_trade: MEAN_REVERSION_EDGE_UNCONFIRMED либо непрохождение score/confidence/economics.</w:t>
       </w:r>
     </w:p>
     <w:p>
@@ -388,10 +510,7 @@
         <w:pStyle w:val="ListBullet"/>
       </w:pPr>
       <w:r>
-        <w:rPr>
-          <w:sz w:val="21"/>
-        </w:rPr>
-        <w:t>Отсутствующие tickSize, qtyStep, minNotional, leverageFilter, non-Trading status.</w:t>
+        <w:t>В explicit operator preflight отсутствующие tickSize, qtyStep, minNotional, leverageFilter или non-Trading status делают только текущую справочную проверку недоступной; historical recommendation/outcome из-за этого не блокируются.</w:t>
       </w:r>
     </w:p>
     <w:p>
@@ -437,38 +556,22 @@
     </w:p>
     <w:p>
       <w:r>
-        <w:rPr>
-          <w:sz w:val="21"/>
-        </w:rPr>
-        <w:t>1. Проверить status/effective_status: blocked означает жёсткий data/risk/Bybit/preflight отказ; no_trade означает неподтверждённый торговый тезис или launch/economics gate.</w:t>
+        <w:t>1. Проверить status/effective_status: blocked означает жёсткий data/risk/model отказ; no_trade означает неподтверждённый тезис или статистический/economic gate.</w:t>
       </w:r>
     </w:p>
     <w:p>
       <w:r>
-        <w:t>2. Сверить current price, best bid/ask spread, live net edge, TTL, Bybit metadata, funding snapshot, cross-margin equity buffer и остаток дневного loss budget относительно kill-switch.</w:t>
+        <w:t>2. Сверить полноту исторических данных, features_ref_ts, horizon, cost/funding assumptions, simulation_scope и денежные/временные diagnostics.</w:t>
       </w:r>
     </w:p>
     <w:p>
       <w:r>
-        <w:rPr>
-          <w:b/>
-          <w:sz w:val="21"/>
-        </w:rPr>
-        <w:t xml:space="preserve">3. </w:t>
-      </w:r>
-      <w:r>
-        <w:rPr>
-          <w:sz w:val="21"/>
-        </w:rPr>
-        <w:t>Переносить в Bybit только полный trade_plan; не использовать пустой/legacy payload.</w:t>
+        <w:t>3. Не интерпретировать trade_plan как готовый биржевой payload: это геометрия исторической симуляции.</w:t>
       </w:r>
     </w:p>
     <w:p>
       <w:r>
-        <w:rPr>
-          <w:sz w:val="21"/>
-        </w:rPr>
-        <w:t>4. Не снижать severity guard-а вручную, не превращать no_trade в recommendation и не запускать при blocked/no_trade.</w:t>
+        <w:t>4. Не снижать severity guard-а вручную и не превращать blocked/no_trade в положительный исследовательский результат.</w:t>
       </w:r>
     </w:p>
     <w:p/>
@@ -488,10 +591,7 @@
         <w:pStyle w:val="ListBullet"/>
       </w:pPr>
       <w:r>
-        <w:rPr>
-          <w:sz w:val="21"/>
-        </w:rPr>
-        <w:t>Полный no_trade-кандидат без hard blocks может получить outcome_policy.sample_role=shadow_no_trade и после horizon войти в исследовательскую proxy-выборку. Это не реальный запуск, не fill и не основание для ручного исполнения.</w:t>
+        <w:t>Полный no_trade-кандидат без hard blocks может получить outcome_policy.sample_role=shadow_no_trade и после horizon войти в исследовательскую proxy-выборку. Это не реальный запуск, не exchange fill и не основание утверждать исполнимость.</w:t>
       </w:r>
     </w:p>
     <w:p>
@@ -499,7 +599,7 @@
         <w:pStyle w:val="ListBullet"/>
       </w:pPr>
       <w:r>
-        <w:t>Необученный текущий calibrator из-за недостаточной выборки сам по себе публикацию не блокирует: до fit используется ограниченный raw-confidence. Однако stale положительный calibrator не может заменять текущую evidence-выборку: после refit при insufficient старые коэффициенты отключаются, а source/fitted/n_samples в UI и API должны показывать отсутствие актуальной калибровки. Подтверждённый expectancy_status=negative является отдельным NO_TRADE и сохраняется консервативно до появления новой положительной evidence-выборки.</w:t>
+        <w:t>Необученный или статистически неподтверждённый bot-specific calibrator означает shadow NO_TRADE: raw confidence остаётся audit-only и не может сделать рекомендацию actionable. Stale положительный calibrator не заменяет текущую evidence-выборку; после refit при insufficient старые коэффициенты отключаются. Подтверждённый expectancy_status=negative сохраняется консервативно до появления новой выборки с положительной односторонней нижней границей.</w:t>
       </w:r>
     </w:p>
     <w:p>
@@ -515,10 +615,7 @@
         <w:pStyle w:val="Heading2"/>
       </w:pPr>
       <w:r>
-        <w:rPr>
-          <w:sz w:val="21"/>
-        </w:rPr>
-        <w:t>Нет запускных рекомендаций</w:t>
+        <w:t>Нет положительных модельных рекомендаций</w:t>
       </w:r>
     </w:p>
     <w:p>
@@ -526,10 +623,7 @@
         <w:pStyle w:val="Heading1"/>
       </w:pPr>
       <w:r>
-        <w:rPr>
-          <w:sz w:val="21"/>
-        </w:rPr>
-        <w:t>Учёт фактического исполнения и PnL</w:t>
+        <w:t>Опциональная внешняя post-hoc сверка PnL</w:t>
       </w:r>
     </w:p>
     <w:p>
@@ -537,10 +631,7 @@
         <w:pStyle w:val="ListBullet"/>
       </w:pPr>
       <w:r>
-        <w:rPr>
-          <w:sz w:val="21"/>
-        </w:rPr>
-        <w:t>Каждый fill передаётся отдельным immutable event с Bybit execId, orderId, фактическими price/qty и прямой связью с исходным rec_id.</w:t>
+        <w:t>Если отдельно подключена внешняя post-hoc сверка, каждый fill передаётся immutable event с execId/orderId, price/qty и связью с rec_id. Этот контур не используется для runtime-публикации рекомендаций и не меняет историческую fill-модель.</w:t>
       </w:r>
     </w:p>
     <w:p>
@@ -570,10 +661,7 @@
         <w:pStyle w:val="ListBullet"/>
       </w:pPr>
       <w:r>
-        <w:rPr>
-          <w:sz w:val="21"/>
-        </w:rPr>
-        <w:t>Для диагностики исполнения фиксируется отдельный timestamped pre-submit/decision benchmark; orderPrice не заменяет этот benchmark.</w:t>
+        <w:t>Для внешней post-hoc диагностики может фиксироваться отдельный timestamped benchmark; он не является обязательной частью системы исторического моделирования.</w:t>
       </w:r>
     </w:p>
     <w:p>
@@ -581,10 +669,7 @@
         <w:pStyle w:val="ListBullet"/>
       </w:pPr>
       <w:r>
-        <w:rPr>
-          <w:sz w:val="21"/>
-        </w:rPr>
-        <w:t>Чтение execution evidence и live-validation требует ADMIN_API_KEY. Статистика остаётся descriptive-only, но persistent negative exact evidence теперь является fail-closed stop condition.</w:t>
+        <w:t>Чтение внешнего execution evidence требует ADMIN_API_KEY. Такая статистика descriptive-only и отделена от recommendation/outcome publication path.</w:t>
       </w:r>
     </w:p>
     <w:p>
@@ -592,10 +677,7 @@
         <w:pStyle w:val="ListBullet"/>
       </w:pPr>
       <w:r>
-        <w:rPr>
-          <w:sz w:val="21"/>
-        </w:rPr>
-        <w:t>Внешний адаптер обязан преобразовать Bybit millisecond timestamps в точные UTC seconds, сохранить исходный payload и учесть все fee components/rebates.</w:t>
+        <w:t>При использовании внешнего адаптера он обязан преобразовать millisecond timestamps в UTC seconds, сохранить исходный payload и учесть fee/rebates. Это отдельная интеграция, а не runtime-функция рекомендательной системы.</w:t>
       </w:r>
     </w:p>
     <w:p>
@@ -621,10 +703,7 @@
         <w:pStyle w:val="Heading1"/>
       </w:pPr>
       <w:r>
-        <w:rPr>
-          <w:sz w:val="21"/>
-        </w:rPr>
-        <w:t>Stop-критерий по exact execution evidence</w:t>
+        <w:t>Опциональная terminal finalization внешнего evidence</w:t>
       </w:r>
     </w:p>
     <w:p>
@@ -632,7 +711,39 @@
         <w:pStyle w:val="ListBullet"/>
       </w:pPr>
       <w:r>
-        <w:t>В gate входят только stopped bots с exact fills/funding той же explicit model_version; повторные publication roots считаются один раз. Текущая версия сигнала: bybit-taxonomy-v4-independent-shadow-roots; legacy model evidence не смешивается с новой калибровкой. Текущие ключи cache: logreg_futures_grid_v7, logreg_global_v7 и platt_direction_v6.</w:t>
+        <w:t>Частичные события сохраняются immutable и видимы в audit API, но не входят в LIVE_VALIDATION_* до передачи всех opening/closing fills и signed funding внешним read-only adapter-ом.</w:t>
+      </w:r>
+    </w:p>
+    <w:p>
+      <w:pPr>
+        <w:pStyle w:val="ListBullet"/>
+      </w:pPr>
+      <w:r>
+        <w:t>Проверяйте поля total_pnl_finalized=true, position_flat=true и net_position_qty около нуля. validation_ineligible_reasons объясняет отсутствие eligibility.</w:t>
+      </w:r>
+    </w:p>
+    <w:p>
+      <w:pPr>
+        <w:pStyle w:val="ListBullet"/>
+      </w:pPr>
+      <w:r>
+        <w:t>Stopped status сам по себе не означает завершённый PnL. Любой unmatched Buy/Sell quantity означает residual inventory и исключает bot из live-validation.</w:t>
+      </w:r>
+    </w:p>
+    <w:p>
+      <w:pPr>
+        <w:pStyle w:val="Heading1"/>
+      </w:pPr>
+      <w:r>
+        <w:t>Опциональный stop-критерий по внешнему evidence</w:t>
+      </w:r>
+    </w:p>
+    <w:p>
+      <w:pPr>
+        <w:pStyle w:val="ListBullet"/>
+      </w:pPr>
+      <w:r>
+        <w:t>При отдельно включённой post-hoc validation в gate входят только stopped bots той же model_version с terminally finalized evidence. Текущая версия сигнала: bybit-taxonomy-v6-historical-proxy-shadow-roots. Текущие ключи: logreg_futures_grid_v15, logreg_global_v15 и platt_direction_v12.</w:t>
       </w:r>
     </w:p>
     <w:p>
@@ -673,49 +784,140 @@
         <w:pStyle w:val="Heading1"/>
       </w:pPr>
       <w:r>
-        <w:rPr>
-          <w:sz w:val="21"/>
-        </w:rPr>
-        <w:t>Operator infographic</w:t>
+        <w:t>Историческая справка v1.0.48: обязательная exchange geometry (отменена в v1.0.51)</w:t>
       </w:r>
     </w:p>
     <w:p>
       <w:r>
+        <w:t>Описанное ниже обязательное применение текущих Bybit-фильтров было удалено в v1.0.51 как несоответствующее historical-only контракту.</w:t>
+      </w:r>
+    </w:p>
+    <w:p>
+      <w:pPr>
+        <w:pStyle w:val="ListBullet"/>
+        <w:spacing w:after="60"/>
+      </w:pPr>
+      <w:r>
+        <w:t>Не применять в v1.0.51+: текущие exchange metadata являются только необязательной справочной диагностикой и не блокируют модельную рекомендацию.</w:t>
+      </w:r>
+    </w:p>
+    <w:p>
+      <w:pPr>
+        <w:pStyle w:val="ListBullet"/>
+        <w:spacing w:after="60"/>
+      </w:pPr>
+      <w:r>
+        <w:t>Диапазон, reference, kill-switch и grid step должны быть кратны tick_size.</w:t>
+      </w:r>
+    </w:p>
+    <w:p>
+      <w:pPr>
+        <w:pStyle w:val="ListBullet"/>
+        <w:spacing w:after="60"/>
+      </w:pPr>
+      <w:r>
+        <w:t>Количество на ордер должно быть кратно qty_step и не ниже min_order_qty/min_notional.</w:t>
+      </w:r>
+    </w:p>
+    <w:p>
+      <w:pPr>
+        <w:pStyle w:val="ListBullet"/>
+        <w:spacing w:after="60"/>
+      </w:pPr>
+      <w:r>
+        <w:t>Не применять в v1.0.51+: текущие exchange metadata являются только необязательной справочной диагностикой и не блокируют модельную рекомендацию.</w:t>
+      </w:r>
+    </w:p>
+    <w:p>
+      <w:pPr>
+        <w:pStyle w:val="ListBullet"/>
+        <w:spacing w:after="60"/>
+      </w:pPr>
+      <w:r>
+        <w:t>Точное касание свечой лимитного уровня не считается исполнением: Buy требует движения ниже уровня, Sell - выше.</w:t>
+      </w:r>
+    </w:p>
+    <w:p>
+      <w:pPr>
+        <w:pStyle w:val="ListBullet"/>
+        <w:spacing w:after="60"/>
+      </w:pPr>
+      <w:r>
+        <w:t>Даже strict trade-through остаётся proxy и не доказывает queue priority, объём и partial fills.</w:t>
+      </w:r>
+    </w:p>
+    <w:p>
+      <w:pPr>
+        <w:pStyle w:val="ListBullet"/>
+        <w:spacing w:after="60"/>
+      </w:pPr>
+      <w:r>
+        <w:t>После обновления v1.0.53 старые proxy outcomes/calibrators очищаются; ожидайте новую grid_label_v26 выборку.</w:t>
+      </w:r>
+    </w:p>
+    <w:p>
+      <w:r>
+        <w:t>Операторское правило v1.0.53: не трактовать рекомендацию как биржевой ордер или подтверждение runtime-исполнимости.</w:t>
+      </w:r>
+    </w:p>
+    <w:p>
+      <w:pPr>
+        <w:pStyle w:val="Heading1"/>
+      </w:pPr>
+      <w:r>
+        <w:t>Обновление v1.0.50: время активации replacement-ордера</w:t>
+      </w:r>
+    </w:p>
+    <w:p>
+      <w:pPr>
+        <w:pStyle w:val="ListBullet"/>
+      </w:pPr>
+      <w:r>
         <w:rPr>
-          <w:sz w:val="19"/>
+          <w:sz w:val="20"/>
         </w:rPr>
-        <w:drawing>
-          <wp:inline xmlns:a="http://schemas.openxmlformats.org/drawingml/2006/main" xmlns:pic="http://schemas.openxmlformats.org/drawingml/2006/picture">
-            <wp:extent cx="5852160" cy="4876800"/>
-            <wp:docPr id="1" name="Picture 1"/>
-            <wp:cNvGraphicFramePr>
-              <a:graphicFrameLocks noChangeAspect="1"/>
-            </wp:cNvGraphicFramePr>
-            <a:graphic>
-              <a:graphicData uri="http://schemas.openxmlformats.org/drawingml/2006/picture">
-                <pic:pic>
-                  <pic:nvPicPr>
-                    <pic:cNvPr id="0" name="how_to_trade.png"/>
-                    <pic:cNvPicPr/>
-                  </pic:nvPicPr>
-                  <pic:blipFill>
-                    <a:blip r:embed="rId10"/>
-                    <a:stretch>
-                      <a:fillRect/>
-                    </a:stretch>
-                  </pic:blipFill>
-                  <pic:spPr>
-                    <a:xfrm>
-                      <a:off x="0" y="0"/>
-                      <a:ext cx="5852160" cy="4876800"/>
-                    </a:xfrm>
-                    <a:prstGeom prst="rect"/>
-                  </pic:spPr>
-                </pic:pic>
-              </a:graphicData>
-            </a:graphic>
-          </wp:inline>
-        </w:drawing>
+        <w:t>Fill исходного grid-ордера и fill созданного после него replacement-ордера внутри одной минутной свечи не считаются доказанным циклом.</w:t>
+      </w:r>
+    </w:p>
+    <w:p>
+      <w:pPr>
+        <w:pStyle w:val="ListBullet"/>
+      </w:pPr>
+      <w:r>
+        <w:rPr>
+          <w:sz w:val="20"/>
+        </w:rPr>
+        <w:t>OHLCV не содержит точного времени parent fill, задержки реакции бота, времени отправки/подтверждения replacement и его места в очереди Bybit.</w:t>
+      </w:r>
+    </w:p>
+    <w:p>
+      <w:pPr>
+        <w:pStyle w:val="ListBullet"/>
+      </w:pPr>
+      <w:r>
+        <w:rPr>
+          <w:sz w:val="20"/>
+        </w:rPr>
+        <w:t>Если цена в той же свече пересекает только что созданный replacement, outcome недоступен с кодом intrabar_replacement_fill_timing_unobservable. Это NO EVIDENCE / NO TRADE, а не убыток и не прибыль.</w:t>
+      </w:r>
+    </w:p>
+    <w:p>
+      <w:pPr>
+        <w:pStyle w:val="ListBullet"/>
+      </w:pPr>
+      <w:r>
+        <w:rPr>
+          <w:sz w:val="20"/>
+        </w:rPr>
+        <w:t>Replacement становится допустимым для proxy-модели с начала следующей свечи. Цикл, подтверждённый в разных свечах, оценивается по прежней PnL/fee/funding/volume-математике.</w:t>
+      </w:r>
+    </w:p>
+    <w:p>
+      <w:pPr>
+        <w:pStyle w:val="ListBullet"/>
+      </w:pPr>
+      <w:r>
+        <w:t>Даже межсвечное proxy-исполнение не доказывает queue priority, partial fills или фактическую задержку; это ограниченная историческая модель.</w:t>
       </w:r>
     </w:p>
     <w:sectPr>

</xml_diff>

<commit_message>
fix(calibration): recover mean-reversion and temporal evidence flow
• replace unreachable fixed 0.55 screen with configurable 0.25 candidate floor
• prevent transitive overlap chains from collapsing all temporal evidence into one cluster
• preserve independent monetary fail-closed gate and truthful NO_TRADE diagnostics
• bump bot/global calibrators to v17 and add iteration243 red-to-green coverage
• update tests, operator artifacts, documentation and clean release packaging
</commit_message>
<xml_diff>
--- a/docs/instrukciya_operatora_bybit_recommender.docx
+++ b/docs/instrukciya_operatora_bybit_recommender.docx
@@ -17,7 +17,7 @@
     <w:p>
       <w:pPr/>
       <w:r>
-        <w:t>Версия документа: 1.0.54 (historical-only simulation boundary; purged OOF activation gate; conservative OHLCV proxy fills; monetary/temporal validation; no runtime order executability)</w:t>
+        <w:t>Версия документа: 1.0.55 (historical-only simulation boundary; configurable mean-reversion candidate floor; non-overlapping temporal decision cohorts; purged OOF activation; conservative OHLCV proxy fills; no runtime order executability)</w:t>
       </w:r>
     </w:p>
     <w:p>
@@ -47,7 +47,7 @@
     <w:p>
       <w:pPr/>
       <w:r>
-        <w:t>В reasons.simulation_scope должны быть: mode=historical_proxy_only, runtime_order_submission=false, runtime_execution_validation=not_performed, exchange_fill_attestation=not_available. Это основной контракт текущей версии 1.0.54.</w:t>
+        <w:t>В reasons.simulation_scope должны быть: mode=historical_proxy_only, runtime_order_submission=false, runtime_execution_validation=not_performed, exchange_fill_attestation=not_available. Это основной контракт текущей версии 1.0.55.</w:t>
       </w:r>
     </w:p>
     <w:p>
@@ -251,12 +251,12 @@
     </w:p>
     <w:p>
       <w:r>
-        <w:t>Количество монет не равно количеству независимых экспериментов. Outcomes разных символов, чьи интервалы [ts, label_available_ts] пересекаются прямо или транзитивно, считаются одним рыночным временным кластером.</w:t>
+        <w:t>Количество монет не равно количеству независимых экспериментов. Сначала outcomes с одинаковым временем решения ts объединяются в один поперечный временной cohort. Затем из cohort-интервалов [ts, label_available_ts] выбирается максимальное по числу детерминированное множество попарно непересекающихся интервалов методом earliest-finish. Транзитивное перекрытие больше не склеивает непрерывную историю в один бесконечно растущий кластер.</w:t>
       </w:r>
     </w:p>
     <w:p>
       <w:r>
-        <w:t>Для штатного CALIB_MIN_SAMPLES=80 требуется минимум 20 эффективных неперекрывающихся time clusters. В confidence_model проверьте time_clusters и time_cluster_lower_bound: нижняя односторонняя 95% граница должна быть строго положительной одновременно на уровне строк и средних по временным кластерам.</w:t>
+        <w:t>Для штатного CALIB_MIN_SAMPLES=80 требуется минимум 20 эффективных попарно неперекрывающихся time cohorts. Строки с одинаковым recommendation timestamp сначала объединяются в одно cross-sectional решение, затем earliest-finish scheduling выбирает максимальный набор неперекрывающихся интервалов. В confidence_model проверьте time_clusters и time_cluster_lower_bound: нижняя односторонняя 95% граница должна быть строго положительной одновременно на уровне строк и cohort means.</w:t>
       </w:r>
     </w:p>
     <w:p>
@@ -322,7 +322,7 @@
     <w:p>
       <w:pPr/>
       <w:r>
-        <w:t>MEAN_REVERSION_EVIDENCE_INSUFFICIENT означает hard blocked из-за недостатка обязательных исторических данных. MEAN_REVERSION_EDGE_UNCONFIRMED означает strategy no_trade: evidence рассчитан, но модельный тезис не подтверждён. Оба статуса исключают использование строки как положительного статистического evidence; высокий score, raw confidence или LLM verdict решение не отменяют.</w:t>
+        <w:t>MEAN_REVERSION_EVIDENCE_INSUFFICIENT означает hard blocked из-за недостатка обязательных исторических данных. MEAN_REVERSION_EDGE_UNCONFIRMED означает strategy no_trade: evidence рассчитан, но score ниже MEAN_REVERSION_MIN_SCORE (по умолчанию 0.25). Этот порог является candidate screen и не доказывает ни прибыль, ни отрицательное ожидание; monetary expectancy проверяется отдельно по matured outcomes. Высокий raw confidence или LLM verdict решение не отменяют.</w:t>
       </w:r>
     </w:p>
     <w:p>
@@ -415,7 +415,7 @@
         <w:pStyle w:val="ListBullet"/>
       </w:pPr>
       <w:r>
-        <w:t>Outcome contract остаётся grid_label_v26. Версия 1.0.54 не удаляет исторические outcomes, но bot/global calibrators refit под identity v16, поскольку изменилось правило активации feature LogReg.</w:t>
+        <w:t>Outcome contract остаётся grid_label_v26. Версия 1.0.55 не удаляет исторические outcomes, но bot/global calibrators refit под identity v17, поскольку изменилось правило temporal cohort selection; purged OOF activation v16 сохраняется.</w:t>
       </w:r>
     </w:p>
     <w:p>

</xml_diff>

<commit_message>
fix(calibration): reset model lineage and expose eligible evidence
• advance recommendation lineage to v7 and calibrator identities to v18/v13
• preserve historical outcomes while excluding old-model rows from current fitting
• separate archive, current-model, feature-eligible, fit-row and temporal-cohort counts
• update calibration UI, cache-busting and operator documentation
• add iteration244 RED-to-GREEN coverage and pass 1082 offline tests
</commit_message>
<xml_diff>
--- a/docs/instrukciya_operatora_bybit_recommender.docx
+++ b/docs/instrukciya_operatora_bybit_recommender.docx
@@ -17,7 +17,7 @@
     <w:p>
       <w:pPr/>
       <w:r>
-        <w:t>Версия документа: 1.0.55 (historical-only simulation boundary; configurable mean-reversion candidate floor; non-overlapping temporal decision cohorts; purged OOF activation; conservative OHLCV proxy fills; no runtime order executability)</w:t>
+        <w:t>Версия документа: 1.0.56 (new calibration model lineage; historical/current/eligible evidence separation; configurable mean-reversion candidate floor; non-overlapping temporal decision cohorts; no runtime order executability)</w:t>
       </w:r>
     </w:p>
     <w:p>
@@ -28,6 +28,24 @@
     <w:p>
       <w:r>
         <w:t>Граница системы. Репозиторий является recommendation/audit service, not OMS/EMS. Он не выставляет ордера, не подтверждает runtime-исполнимость, не знает очередь, partial fills, состояние аккаунта или фактическую доступность маржи. Статус recommended означает модельный сигнал, а не готовый к исполнению ордер.</w:t>
+      </w:r>
+    </w:p>
+    <w:p>
+      <w:pPr>
+        <w:pStyle w:val="Heading1"/>
+      </w:pPr>
+      <w:r>
+        <w:t>История исходов и текущая model lineage</w:t>
+      </w:r>
+    </w:p>
+    <w:p>
+      <w:r>
+        <w:t>После обновления v1.0.56 таблица reco_outcomes не очищается: старые строки остаются неизменяемой аудиторской историей. Однако они не считаются evidence текущей модели и не ускоряют обучение нового калибратора.</w:t>
+      </w:r>
+    </w:p>
+    <w:p>
+      <w:r>
+        <w:t>Оператор должен различать: исторический архив; outcomes текущей model_version; feature-eligible rows; фактически принятые fit rows; независимые matured temporal cohorts. Для новой lineage нормальное начальное состояние — архив непуст, а current/eligible/fit/time_clusters равны нулю.</w:t>
       </w:r>
     </w:p>
     <w:p>
@@ -47,7 +65,7 @@
     <w:p>
       <w:pPr/>
       <w:r>
-        <w:t>В reasons.simulation_scope должны быть: mode=historical_proxy_only, runtime_order_submission=false, runtime_execution_validation=not_performed, exchange_fill_attestation=not_available. Это основной контракт текущей версии 1.0.55.</w:t>
+        <w:t>В reasons.simulation_scope должны быть: mode=historical_proxy_only, runtime_order_submission=false, runtime_execution_validation=not_performed, exchange_fill_attestation=not_available. Это основной контракт текущей версии 1.0.56.</w:t>
       </w:r>
     </w:p>
     <w:p>
@@ -415,7 +433,7 @@
         <w:pStyle w:val="ListBullet"/>
       </w:pPr>
       <w:r>
-        <w:t>Outcome contract остаётся grid_label_v26. Версия 1.0.55 не удаляет исторические outcomes, но bot/global calibrators refit под identity v17, поскольку изменилось правило temporal cohort selection; purged OOF activation v16 сохраняется.</w:t>
+        <w:t>Outcome contract остаётся grid_label_v26. Версия 1.0.56 не удаляет исторические outcomes: они сохраняются как аудиторский архив. Новая recommendation lineage v7 допускает в обучение только новые совместимые outcomes; bot/global calibrators используют identity v18, direction calibrator — v13.</w:t>
       </w:r>
     </w:p>
     <w:p>
@@ -743,7 +761,7 @@
         <w:pStyle w:val="ListBullet"/>
       </w:pPr>
       <w:r>
-        <w:t>При отдельно включённой post-hoc validation в gate входят только stopped bots той же model_version с terminally finalized evidence. Текущая версия сигнала: bybit-taxonomy-v6-historical-proxy-shadow-roots. Текущие ключи: logreg_futures_grid_v15, logreg_global_v15 и platt_direction_v12.</w:t>
+        <w:t>При отдельно включённой post-hoc validation в gate входят только stopped bots той же model_version с terminally finalized evidence. Текущая версия сигнала: bybit-taxonomy-v7-mr-floor-temporal-cohorts. Текущие ключи: logreg_futures_grid_v18, logreg_global_v18 и platt_direction_v13.</w:t>
       </w:r>
     </w:p>
     <w:p>

</xml_diff>

<commit_message>
fix: bind calibration to policy and require reconciled live evidence
</commit_message>
<xml_diff>
--- a/docs/instrukciya_operatora_bybit_recommender.docx
+++ b/docs/instrukciya_operatora_bybit_recommender.docx
@@ -17,7 +17,7 @@
     <w:p>
       <w:pPr/>
       <w:r>
-        <w:t>Версия документа: 1.0.56 (new calibration model lineage; historical/current/eligible evidence separation; configurable mean-reversion candidate floor; non-overlapping temporal decision cohorts; no runtime order executability)</w:t>
+        <w:t>Версия документа: 1.0.57 (policy-conditioned calibration; complete censoring denominator; terminal held-out model; exchange-reconciled live PnL boundary; no runtime order execution)</w:t>
       </w:r>
     </w:p>
     <w:p>
@@ -35,12 +35,38 @@
         <w:pStyle w:val="Heading1"/>
       </w:pPr>
       <w:r>
+        <w:t>Policy-conditioned evidence contract</w:t>
+      </w:r>
+    </w:p>
+    <w:p>
+      <w:pPr/>
+      <w:r>
+        <w:t>Каждый root сохраняет canonical policy_contract и SHA-256 fingerprint: model/outcome versions, feature schema, candidate thresholds, universe, LLM gate и active risk limits. Fit и denominator заново вычисляют digest из contract; скопированный hash при изменённом/отсутствующем contract считается unresolved.</w:t>
+      </w:r>
+    </w:p>
+    <w:p>
+      <w:pPr/>
+      <w:r>
+        <w:t>Policy evaluation и shadow exploration разделены. Статистические calibration gates исключаются из pre-calibration candidate policy, чтобы отсутствие модели не делало сбор evidence логически невозможным; hard data/risk/economic veto по-прежнему исключает root.</w:t>
+      </w:r>
+    </w:p>
+    <w:p>
+      <w:pPr/>
+      <w:r>
+        <w:t>Outcome worker ведёт независимый ledger waiting/censored/labeled и ротирует waiting rows по last_attempt_ts. Неразмеченные зрелые roots не могут исчезнуть из denominator или навсегда забить bounded queue.</w:t>
+      </w:r>
+    </w:p>
+    <w:p>
+      <w:pPr>
+        <w:pStyle w:val="Heading1"/>
+      </w:pPr>
+      <w:r>
         <w:t>История исходов и текущая model lineage</w:t>
       </w:r>
     </w:p>
     <w:p>
       <w:r>
-        <w:t>После обновления v1.0.56 таблица reco_outcomes не очищается: старые строки остаются неизменяемой аудиторской историей. Однако они не считаются evidence текущей модели и не ускоряют обучение нового калибратора.</w:t>
+        <w:t>После обновления v1.0.57 таблица reco_outcomes не очищается: старые строки остаются неизменяемой аудиторской историей. В калибровку входят только outcomes той же model lineage и того же полного policy fingerprint; изменение порога, universe, LLM gate или risk limits начинает отдельную evidence-выборку.</w:t>
       </w:r>
     </w:p>
     <w:p>
@@ -65,7 +91,7 @@
     <w:p>
       <w:pPr/>
       <w:r>
-        <w:t>В reasons.simulation_scope должны быть: mode=historical_proxy_only, runtime_order_submission=false, runtime_execution_validation=not_performed, exchange_fill_attestation=not_available. Это основной контракт текущей версии 1.0.56.</w:t>
+        <w:t>В reasons.simulation_scope должны быть: mode=historical_proxy_only, runtime_order_submission=false, runtime_execution_validation=not_performed, exchange_fill_attestation=not_available. Это основной контракт текущей версии 1.0.57.</w:t>
       </w:r>
     </w:p>
     <w:p>
@@ -251,12 +277,12 @@
     </w:p>
     <w:p>
       <w:r>
-        <w:t>В confidence_model проверяйте purged_oof_status, purged_oof_samples и purged_oof_required_samples. Статус sufficient и samples &gt;= required разрешают feature LogReg. insufficient/error означает, что feature coefficients не используются; система возвращается к score-only Platt или capped raw confidence.</w:t>
+        <w:t>В confidence_model проверяйте purged_oof_status, purged_oof_skill_status, aggregate/final log-loss и policy fingerprint. Модель разрешена только при sufficient + accepted и превосходстве score-only/null baseline как на walk-forward совокупности, так и на терминальном будущем блоке. Иначе coefficients и Platt не используются, а capped raw confidence остаётся audit-only.</w:t>
       </w:r>
     </w:p>
     <w:p>
       <w:r>
-        <w:t>Fallback не отменяет monetary expectancy, temporal-cluster lower bound, blocked/no_trade и другие deterministic gates. Score-only Platt является более простым proxy-calibration слоем и не доказывает generalisation feature model или live profitability.</w:t>
+        <w:t>In-sample score-only Platt больше не является probability fallback. Активный LogReg + Platt обучается только на данных до терминального holdout; сам holdout не входит в финальный fit. Недостаток или отсутствие held-out skill при REQUIRE_CONF_GATE=1 означает CALIBRATED_CONFIDENCE_UNAVAILABLE и NO TRADE.</w:t>
       </w:r>
     </w:p>
     <w:p>
@@ -274,7 +300,7 @@
     </w:p>
     <w:p>
       <w:r>
-        <w:t>Для штатного CALIB_MIN_SAMPLES=80 требуется минимум 20 эффективных попарно неперекрывающихся time cohorts. Строки с одинаковым recommendation timestamp сначала объединяются в одно cross-sectional решение, затем earliest-finish scheduling выбирает максимальный набор неперекрывающихся интервалов. В confidence_model проверьте time_clusters и time_cluster_lower_bound: нижняя односторонняя 95% граница должна быть строго положительной одновременно на уровне строк и cohort means.</w:t>
+        <w:t>Для штатного CALIB_MIN_SAMPLES=80 требуется минимум 20 эффективных попарно неперекрывающихся time cohorts. Строки с одинаковым recommendation timestamp сначала объединяются в одно cross-sectional решение, затем earliest-finish scheduling выбирает максимальный набор неперекрывающихся интервалов. Односторонняя 95% lower bound теперь использует Student-t critical value по effective sample size, а не прежнюю normal approximation; граница должна быть строго положительной на уровне строк и cohort means.</w:t>
       </w:r>
     </w:p>
     <w:p>
@@ -299,13 +325,13 @@
     <w:p>
       <w:pPr/>
       <w:r>
-        <w:t>Actionable futures_grid допускается только когда текущая независимая matured-return выборка имеет достаточный Kish effective sample size и одностороннюю 95% нижнюю границу recency-weighted mean proxy return строго выше нуля. Статусы expectancy_status=unknown, insufficient или uncertain означают NO_TRADE с кодом PROXY_MONETARY_EXPECTANCY_UNPROVEN; weighted mean &lt;= 0 означает PROXY_MONETARY_EXPECTANCY_NON_POSITIVE. Raw confidence, median, win rate и положительное наблюдаемое среднее не могут отменить этот gate. В confidence_model проверяйте weighted_effective_return_samples, weighted_return_std, weighted_mean_return_lower_bound и expectancy_confidence_level. Положительный calibrator обязан воспроизводиться из текущей retained outcome-выборки после истечения cache interval.</w:t>
+        <w:t>Actionable futures_grid допускается только когда точная policy-conditioned matured-return выборка имеет достаточный Kish effective sample size и положительную одностороннюю 95% Student-t lower bound. Каждый matured policy root входит в denominator как labeled, censored или unresolved. Любой censored/unresolved/invalid-labeled root либо исчезнувшая поддержка cache означает PROXY_OUTCOME_CENSORING_UNBOUNDED и NO TRADE немедленно, не только после cache interval.</w:t>
       </w:r>
     </w:p>
     <w:p>
       <w:pPr/>
       <w:r>
-        <w:t>Это защитный OHLCV proxy gate, а не доказательство live edge, исполнимости или гарантии прибыли. Внешняя post-hoc сверка с fills может использоваться отдельным исследованием, но не является runtime-контрактом системы.</w:t>
+        <w:t>Это защитный OHLCV proxy gate, а не доказательство live edge, исполнимости или гарантии прибыли. Live validation учитывает положительный PnL только после stopped + local flat + complete terminal reconciliation от доверенного внешнего read-only Bybit private-API adapter; totals fills/fees/funding, event counts, position и open orders должны совпасть. Сам сервис проверяет согласованность, но не криптографически доказывает происхождение внешнего снимка.</w:t>
       </w:r>
     </w:p>
     <w:p>
@@ -433,7 +459,7 @@
         <w:pStyle w:val="ListBullet"/>
       </w:pPr>
       <w:r>
-        <w:t>Outcome contract остаётся grid_label_v26. Версия 1.0.56 не удаляет исторические outcomes: они сохраняются как аудиторский архив. Новая recommendation lineage v7 допускает в обучение только новые совместимые outcomes; bot/global calibrators используют identity v18, direction calibrator — v13.</w:t>
+        <w:t>Outcome contract остаётся grid_label_v26. Версия 1.0.57 не удаляет исторические outcomes: они сохраняются как аудит. Текущая recommendation lineage v8 допускает только verified exact-policy outcomes; bot/global calibrators используют v19. Direction v14 использует horizon-price target, но его Platt audit-only до отдельного chronological skill gate и не меняет decision feature.</w:t>
       </w:r>
     </w:p>
     <w:p>
@@ -617,7 +643,7 @@
         <w:pStyle w:val="ListBullet"/>
       </w:pPr>
       <w:r>
-        <w:t>Необученный или статистически неподтверждённый bot-specific calibrator означает shadow NO_TRADE: raw confidence остаётся audit-only и не может сделать рекомендацию actionable. Stale положительный calibrator не заменяет текущую evidence-выборку; после refit при insufficient старые коэффициенты отключаются. Подтверждённый expectancy_status=negative сохраняется консервативно до появления новой выборки с положительной односторонней нижней границей.</w:t>
+        <w:t>Необученный, цензурированный или не подтвердивший terminal held-out skill bot-specific calibrator означает shadow NO_TRADE: raw confidence audit-only. Положительный cache обязан немедленно воспроизводиться по текущему policy denominator; исчезновение supporting rows отключает его до refit. Подтверждённый negative expectancy сохраняется как консервативный veto.</w:t>
       </w:r>
     </w:p>
     <w:p>
@@ -687,7 +713,7 @@
         <w:pStyle w:val="ListBullet"/>
       </w:pPr>
       <w:r>
-        <w:t>Чтение внешнего execution evidence требует ADMIN_API_KEY. Такая статистика descriptive-only и отделена от recommendation/outcome publication path.</w:t>
+        <w:t>Запись execution evidence и terminal reconciliation требует ADMIN_API_KEY. До полного reconciliation записи descriptive-only: положительные суммы не кредитуются в live PnL или risk recovery, а неподтверждённые убытки учитываются консервативно. Внешний adapter остаётся отдельной доверенной границей и не выставляет ордера через этот сервис.</w:t>
       </w:r>
     </w:p>
     <w:p>

</xml_diff>

<commit_message>
fix(calibration): add bounded censoring sensitivity analysis for v1.0.59
- separate terminally censored outcomes from unresolved and invalid labels
- keep unresolved, malformed, and policy-inconsistent outcomes fail-closed
- replace unconditional calibrator invalidation by conservative censoring sensitivity analysis
- apply adverse return assumptions to terminally censored observations
- block calibration when censoring exceeds 5% or adjusted expectancy is non-positive
- persist censoring rate, assumed return, adjusted mean, and sensitivity status
- preserve existing outcome label version, model lineage, policy fingerprint, and database schema
- add regression tests for low censoring, excessive censoring, unresolved outcomes, and weak expectancy
- update version to 1.0.59 and synchronize changelog, risks, trading logic, and audit documentation
</commit_message>
<xml_diff>
--- a/docs/instrukciya_operatora_bybit_recommender.docx
+++ b/docs/instrukciya_operatora_bybit_recommender.docx
@@ -17,7 +17,7 @@
     <w:p>
       <w:pPr/>
       <w:r>
-        <w:t>Версия документа: 1.0.57 (policy-conditioned calibration; complete censoring denominator; terminal held-out model; exchange-reconciled live PnL boundary; no runtime order execution)</w:t>
+        <w:t>Версия документа: 1.0.58 (verified current-policy outcome scope; separate historical archive; truthful 80/300 calibration readiness; no runtime order execution)</w:t>
       </w:r>
     </w:p>
     <w:p>
@@ -66,12 +66,12 @@
     </w:p>
     <w:p>
       <w:r>
-        <w:t>После обновления v1.0.57 таблица reco_outcomes не очищается: старые строки остаются неизменяемой аудиторской историей. В калибровку входят только outcomes той же model lineage и того же полного policy fingerprint; изменение порога, universe, LLM gate или risk limits начинает отдельную evidence-выборку.</w:t>
+        <w:t>После обновления v1.0.58 таблица reco_outcomes не очищается: старые строки остаются неизменяемой аудиторской историей. Окно «Исходы» по умолчанию показывает только verified current_policy: текущую model lineage, точный active policy fingerprint и contract, digest которого успешно пересчитан. Исторический архив загружается и показывается отдельно; его win-rate и return не входят в текущий headline.</w:t>
       </w:r>
     </w:p>
     <w:p>
       <w:r>
-        <w:t>Оператор должен различать: исторический архив; outcomes текущей model_version; feature-eligible rows; фактически принятые fit rows; независимые matured temporal cohorts. Для новой lineage нормальное начальное состояние — архив непуст, а current/eligible/fit/time_clusters равны нулю.</w:t>
+        <w:t>Оператор должен различать: исторический архив; verified current-policy outcomes; outcomes текущей model_version; feature-eligible rows; фактически принятые fit rows; независимые matured temporal cohorts. Для новой policy нормальное начальное состояние — архив непуст, а current-policy/eligible/fit/time_clusters равны нулю.</w:t>
       </w:r>
     </w:p>
     <w:p>
@@ -91,7 +91,7 @@
     <w:p>
       <w:pPr/>
       <w:r>
-        <w:t>В reasons.simulation_scope должны быть: mode=historical_proxy_only, runtime_order_submission=false, runtime_execution_validation=not_performed, exchange_fill_attestation=not_available. Это основной контракт текущей версии 1.0.57.</w:t>
+        <w:t>В reasons.simulation_scope должны быть: mode=historical_proxy_only, runtime_order_submission=false, runtime_execution_validation=not_performed, exchange_fill_attestation=not_available. Это основной контракт текущей версии 1.0.58.</w:t>
       </w:r>
     </w:p>
     <w:p>
@@ -272,7 +272,13 @@
     </w:p>
     <w:p>
       <w:r>
-        <w:t>Полная feature LogReg не считается калиброванной только потому, что коэффициенты успешно обучены на всей retained-выборке. Для источника bot_logreg требуется не менее CALIB_MIN_SAMPLES действительно out-of-fold прогнозов, полученных хронологически после purging по label_available_ts, и fitted Platt-on-top на этих OOF logits.</w:t>
+        <w:t>Полная feature LogReg не считается калиброванной только потому, что достигнут денежный floor CALIB_MIN_SAMPLES=80 или коэффициенты обучены на retained-выборке. Для источника bot_logreg действует отдельный minimum probability sample floor 300 exact-policy labels, а также sufficient purged OOF predictions, fitted Platt-on-top и accepted aggregate/terminal held-out skill.</w:t>
+      </w:r>
+    </w:p>
+    <w:p>
+      <w:pPr/>
+      <w:r>
+        <w:t>Temporal floor: при 12-часовом label horizon и требовании 20 неперекрывающихся temporal cohorts денежный temporal gate физически не может быть выполнен быстрее 10 суток непрерывной работы с неизменным policy fingerprint. Любая смена model/policy fingerprint начинает новую exact-policy evidence-когорту; архив прежней политики в текущий прогресс не входит.</w:t>
       </w:r>
     </w:p>
     <w:p>
@@ -325,7 +331,7 @@
     <w:p>
       <w:pPr/>
       <w:r>
-        <w:t>Actionable futures_grid допускается только когда точная policy-conditioned matured-return выборка имеет достаточный Kish effective sample size и положительную одностороннюю 95% Student-t lower bound. Каждый matured policy root входит в denominator как labeled, censored или unresolved. Любой censored/unresolved/invalid-labeled root либо исчезнувшая поддержка cache означает PROXY_OUTCOME_CENSORING_UNBOUNDED и NO TRADE немедленно, не только после cache interval.</w:t>
+        <w:t>Actionable futures_grid допускается только когда точная policy-conditioned matured-return выборка имеет достаточный Kish effective sample size и положительную одностороннюю 95% Student-t lower bound. Каждый matured policy root входит в denominator как labeled, censored или unresolved. Любой censored/unresolved/invalid-labeled root либо исчезнувшая поддержка cache означает PROXY_OUTCOME_CENSORING_UNBOUNDED и NO TRADE немедленно. Это защищает от survivorship bias, но создаёт открытый liveness-риск: один постоянный censored root способен блокировать всю policy-когорту. Не обходить вручную; необходим отдельный validated bounded-censor contract.</w:t>
       </w:r>
     </w:p>
     <w:p>
@@ -459,7 +465,7 @@
         <w:pStyle w:val="ListBullet"/>
       </w:pPr>
       <w:r>
-        <w:t>Outcome contract остаётся grid_label_v26. Версия 1.0.57 не удаляет исторические outcomes: они сохраняются как аудит. Текущая recommendation lineage v8 допускает только verified exact-policy outcomes; bot/global calibrators используют v19. Direction v14 использует horizon-price target, но его Platt audit-only до отдельного chronological skill gate и не меняет decision feature.</w:t>
+        <w:t>Outcome contract остаётся grid_label_v26. Версия 1.0.58 не удаляет исторические outcomes: они сохраняются как аудит. Текущая recommendation lineage v8 допускает только verified exact-policy outcomes; bot/global calibrators используют v19. Direction v14 использует horizon-price target, но его Platt audit-only до отдельного chronological skill gate и не меняет decision feature.</w:t>
       </w:r>
     </w:p>
     <w:p>
@@ -627,7 +633,7 @@
         <w:rPr>
           <w:sz w:val="21"/>
         </w:rPr>
-        <w:t>Журнал исходов обязан показывать actionable headline отдельно от all-roots и shadow no_trade research cohorts и не называть OHLCV proxy фактической торговлей.</w:t>
+        <w:t>Журнал исходов обязан строить headline только по verified current_policy и отдельно показывать immutable historical archive. Архивные строки не входят в current-policy win-rate/return. OHLCV proxy нельзя называть фактической торговлей.</w:t>
       </w:r>
     </w:p>
     <w:p>
@@ -643,7 +649,7 @@
         <w:pStyle w:val="ListBullet"/>
       </w:pPr>
       <w:r>
-        <w:t>Необученный, цензурированный или не подтвердивший terminal held-out skill bot-specific calibrator означает shadow NO_TRADE: raw confidence audit-only. Положительный cache обязан немедленно воспроизводиться по текущему policy denominator; исчезновение supporting rows отключает его до refit. Подтверждённый negative expectancy сохраняется как консервативный veto.</w:t>
+        <w:t>Необученный, цензурированный или не подтвердивший terminal held-out skill bot-specific calibrator означает shadow NO_TRADE: raw confidence audit-only. 80 exact-policy rows — только денежный floor; при REQUIRE_CONF_GATE=1 полная probability readiness начинается не ранее 300 rows и требует accepted purged OOF/terminal holdout. Положительный cache обязан воспроизводиться по текущему policy denominator; исчезновение supporting rows отключает его. Подтверждённый negative expectancy сохраняется как консервативный veto.</w:t>
       </w:r>
     </w:p>
     <w:p>
@@ -787,7 +793,7 @@
         <w:pStyle w:val="ListBullet"/>
       </w:pPr>
       <w:r>
-        <w:t>При отдельно включённой post-hoc validation в gate входят только stopped bots той же model_version с terminally finalized evidence. Текущая версия сигнала: bybit-taxonomy-v7-mr-floor-temporal-cohorts. Текущие ключи: logreg_futures_grid_v18, logreg_global_v18 и platt_direction_v13.</w:t>
+        <w:t>При отдельно включённой post-hoc validation в gate входят только stopped bots той же model_version с terminally finalized evidence. Текущая версия сигнала: bybit-taxonomy-v8-policy-conditioned-censor-aware. Текущие ключи: logreg_futures_grid_v19, logreg_global_v19 и platt_direction_v14.</w:t>
       </w:r>
     </w:p>
     <w:p>

</xml_diff>

<commit_message>
feat(operator): replace proxy RR with plan and empirical decision metrics
- calculate concrete Plan RR without recurring fee double counting
- expose exact-policy expectancy, confidence interval and tail ratio
- simplify primary UI to Plan RR, empirical expectancy, risk buffer and status
- keep the legacy heuristic backend-only
- add iteration249 regressions and update operator artifacts
</commit_message>
<xml_diff>
--- a/docs/instrukciya_operatora_bybit_recommender.docx
+++ b/docs/instrukciya_operatora_bybit_recommender.docx
@@ -17,12 +17,12 @@
     <w:p>
       <w:pPr/>
       <w:r>
-        <w:t>Версия документа: 1.0.58 (verified current-policy outcome scope; separate historical archive; truthful 80/300 calibration readiness; no runtime order execution)</w:t>
+        <w:t>Версия документа: 1.0.61 (Plan RR; empirical expectancy/CI; internal-only heuristic capture; no runtime order execution)</w:t>
       </w:r>
     </w:p>
     <w:p>
       <w:r>
-        <w:t>Назначение: регламент интерпретации рекомендаций и исторических proxy-outcomes в paper/shadow-режиме. Документ не является инструкцией по переносу параметров в биржевой бот.</w:t>
+        <w:t>Назначение: регламент принятия операторского решения по конкретному grid-плану и по статистике exact-current-policy proxy outcomes в paper/shadow-режиме. Документ не является инструкцией по переносу параметров в биржевой бот.</w:t>
       </w:r>
     </w:p>
     <w:p>
@@ -91,7 +91,7 @@
     <w:p>
       <w:pPr/>
       <w:r>
-        <w:t>В reasons.simulation_scope должны быть: mode=historical_proxy_only, runtime_order_submission=false, runtime_execution_validation=not_performed, exchange_fill_attestation=not_available. Это основной контракт текущей версии 1.0.58.</w:t>
+        <w:t>В reasons.simulation_scope должны быть: mode=historical_proxy_only, runtime_order_submission=false, runtime_execution_validation=not_performed, exchange_fill_attestation=not_available. Это основной контракт текущей версии 1.0.61.</w:t>
       </w:r>
     </w:p>
     <w:p>
@@ -259,7 +259,51 @@
     <w:p>
       <w:pPr/>
       <w:r>
-        <w:t>Raw confidence — эвристическое качество модельного сигнала, а не вероятность прибыли и не runtime-исполнимость. Даже calibrated confidence относится только к proxy outcomes. Поле expected_rr в UI отображается как «Прокси capture/risk» и не является фактическим отношением прибыли к убытку.</w:t>
+        <w:t>Raw confidence — эвристическое качество модельного сигнала, а не вероятность прибыли и не runtime-исполнимость. Даже calibrated confidence относится только к proxy outcomes. Legacy expected_rr остаётся внутренним heuristic capture score и не показывается оператору как R/R. Для решения используются отдельные Plan RR и Empirical expectancy с доверительным интервалом; ни один из них не отменяет BLOCKED/NO TRADE.</w:t>
+      </w:r>
+    </w:p>
+    <w:p>
+      <w:pPr>
+        <w:pStyle w:val="Heading1"/>
+      </w:pPr>
+      <w:r>
+        <w:t>Метрики принятия решения v1.0.61</w:t>
+      </w:r>
+    </w:p>
+    <w:p>
+      <w:pPr/>
+      <w:r>
+        <w:t>Основная таблица сведена к данным решения: символ, направление, Plan RR, Empirical expectancy, cross-margin risk buffer и итоговый статус. Raw rank, model confidence, direction confidence и видимый фильтр минимальной уверенности убраны из первичного экрана; они остаются только модельной диагностикой в деталях/API. Plan RR и empirical expectancy не объединяются в общий score и не заменяют deterministic risk/economics gates.</w:t>
+      </w:r>
+    </w:p>
+    <w:p>
+      <w:pPr>
+        <w:pStyle w:val="ListBullet"/>
+      </w:pPr>
+      <w:r>
+        <w:t>Plan RR — сценарное отношение projected net reward конкретного grid-плана к worst-side kill-switch loss. Числитель учитывает завершённые пары после recurring fees, отдельно разовые spread/slippage и adverse funding. Знаменатель включает ценовой убыток и terminal execution cost; maintenance reserve остаётся стресс-резервом, а не реализованным убытком.</w:t>
+      </w:r>
+    </w:p>
+    <w:p>
+      <w:pPr>
+        <w:pStyle w:val="ListBullet"/>
+      </w:pPr>
+      <w:r>
+        <w:t>Empirical expectancy — средняя net-доходность matured proxy outcomes точной текущей policy. Показываются двусторонний Student-t confidence interval, expected shortfall и mean-to-tail ratio, когда выборка позволяет их оценить.</w:t>
+      </w:r>
+    </w:p>
+    <w:p>
+      <w:pPr>
+        <w:pStyle w:val="ListBullet"/>
+      </w:pPr>
+      <w:r>
+        <w:t>Heuristic capture score (legacy expected_rr) — внутренний ranking diagnostic. Он может присутствовать в техническом JSON для совместимости, но не является операторским reward:risk и не выводится в основной таблице, истории или экономическом блоке.</w:t>
+      </w:r>
+    </w:p>
+    <w:p>
+      <w:pPr/>
+      <w:r>
+        <w:t>Интерпретация: Plan RR отвечает на вопрос «что даёт и чем рискует этот рассчитанный план при заданных допущениях»; empirical expectancy отвечает на вопрос «что наблюдалось у неизменной policy». Положительное значение одного показателя не компенсирует отсутствие или неопределённость другого. Старые строки до v1.0.61 могут корректно показывать «недоступно», поскольку система не переписывает исторические рекомендации задним числом.</w:t>
       </w:r>
     </w:p>
     <w:p>

</xml_diff>

<commit_message>
fix(outcomes): restore shadow learning and simplify operator decision table
- allow explicit risk-clean shadow no_trade outcomes without impossible LLM verdict
- keep actionable recommendations fail-closed behind completed LLM review
- expose outcome-worker liveness and stable operator_summary contract
- reduce primary table to six one-glance decision fields
- honor Bybit rate-limit reset timestamp and confirm missing instruments
- add iteration250 regressions and synchronize operator documentation
</commit_message>
<xml_diff>
--- a/docs/instrukciya_operatora_bybit_recommender.docx
+++ b/docs/instrukciya_operatora_bybit_recommender.docx
@@ -17,7 +17,11 @@
     <w:p>
       <w:pPr/>
       <w:r>
-        <w:t>Версия документа: 1.0.61 (Plan RR; empirical expectancy/CI; internal-only heuristic capture; no runtime order execution)</w:t>
+        <w:rPr>
+          <w:rFonts w:ascii="Arial" w:hAnsi="Arial"/>
+          <w:sz w:val="20"/>
+        </w:rPr>
+        <w:t>Версия документа: 1.0.62 (outcome/LLM bootstrap recovery; minimum six-field operator table; no runtime order execution)</w:t>
       </w:r>
     </w:p>
     <w:p>
@@ -91,7 +95,11 @@
     <w:p>
       <w:pPr/>
       <w:r>
-        <w:t>В reasons.simulation_scope должны быть: mode=historical_proxy_only, runtime_order_submission=false, runtime_execution_validation=not_performed, exchange_fill_attestation=not_available. Это основной контракт текущей версии 1.0.61.</w:t>
+        <w:rPr>
+          <w:rFonts w:ascii="Arial" w:hAnsi="Arial"/>
+          <w:sz w:val="20"/>
+        </w:rPr>
+        <w:t>В reasons.simulation_scope должны быть: mode=historical_proxy_only, runtime_order_submission=false, runtime_execution_validation=not_performed, exchange_fill_attestation=not_available. Это основной контракт текущей версии 1.0.62.</w:t>
       </w:r>
     </w:p>
     <w:p>
@@ -267,13 +275,21 @@
         <w:pStyle w:val="Heading1"/>
       </w:pPr>
       <w:r>
-        <w:t>Метрики принятия решения v1.0.61</w:t>
+        <w:rPr>
+          <w:rFonts w:ascii="Arial" w:hAnsi="Arial"/>
+          <w:sz w:val="20"/>
+        </w:rPr>
+        <w:t>Метрики принятия решения v1.0.62</w:t>
       </w:r>
     </w:p>
     <w:p>
       <w:pPr/>
       <w:r>
-        <w:t>Основная таблица сведена к данным решения: символ, направление, Plan RR, Empirical expectancy, cross-margin risk buffer и итоговый статус. Raw rank, model confidence, direction confidence и видимый фильтр минимальной уверенности убраны из первичного экрана; они остаются только модельной диагностикой в деталях/API. Plan RR и empirical expectancy не объединяются в общий score и не заменяют deterministic risk/economics gates.</w:t>
+        <w:rPr>
+          <w:rFonts w:ascii="Arial" w:hAnsi="Arial"/>
+          <w:sz w:val="20"/>
+        </w:rPr>
+        <w:t>Основная таблица сведена к абсолютному минимуму для решения: символ, направление, Plan RR, Empirical expectancy, решение и одна главная причина. Уверенность направления, model confidence, risk buffer, цена, диапазон, sizing, funding и технические проверки остаются в окне «Детали». Кнопка «Детали» размещена в ячейке символа и не создаёт отдельную колонку.</w:t>
       </w:r>
     </w:p>
     <w:p>
@@ -1014,6 +1030,44 @@
         <w:t>Даже межсвечное proxy-исполнение не доказывает queue priority, partial fills или фактическую задержку; это ограниченная историческая модель.</w:t>
       </w:r>
     </w:p>
+    <w:p>
+      <w:pPr>
+        <w:pStyle w:val="Heading2"/>
+      </w:pPr>
+      <w:r>
+        <w:rPr>
+          <w:rFonts w:ascii="Arial" w:hAnsi="Arial"/>
+        </w:rPr>
+        <w:t>Восстановление исходов при включённом LLM (v1.0.62)</w:t>
+      </w:r>
+    </w:p>
+    <w:p>
+      <w:r>
+        <w:rPr>
+          <w:rFonts w:ascii="Arial" w:hAnsi="Arial"/>
+          <w:sz w:val="20"/>
+        </w:rPr>
+        <w:t>LLM reviewer проверяет только потенциально исполнимые рекомендации. Поэтому явно разрешённые, прошедшие deterministic risk checks shadow-no_trade roots не требуют LLM verdict для расчёта proxy outcome. Это не делает no_trade исполнимым: actionable roots при включённом LLM по-прежнему остаются fail-closed до завершённого verdict.</w:t>
+      </w:r>
+    </w:p>
+    <w:p>
+      <w:r>
+        <w:rPr>
+          <w:rFonts w:ascii="Arial" w:hAnsi="Arial"/>
+          <w:sz w:val="20"/>
+        </w:rPr>
+        <w:t>Созревшие исходы версии 1.0.61 обрабатываются обычным outcome-worker автоматически после обновления. В /api/v1/status поле outcome_worker показывает state, количество matured pending и unattempted roots; код OUTCOME_WORKER_STALLED означает, что созревшие eligible roots не получают попыток обработки.</w:t>
+      </w:r>
+    </w:p>
+    <w:p>
+      <w:r>
+        <w:rPr>
+          <w:rFonts w:ascii="Arial" w:hAnsi="Arial"/>
+          <w:sz w:val="20"/>
+        </w:rPr>
+        <w:t>При retCode 10006 клиент ждёт до указанного Bybit reset timestamp. Если точный ticker отсутствует, символ временно отключается только после подтверждения отсутствия public instrument metadata; затем проверка повторяется по штатному TTL.</w:t>
+      </w:r>
+    </w:p>
     <w:sectPr>
       <w:pgSz w:w="12240" w:h="15840"/>
       <w:pgMar w:top="1440" w:right="1800" w:bottom="1440" w:left="1800" w:header="720" w:footer="720" w:gutter="0"/>

</xml_diff>

<commit_message>
feat(operator-ui): localize trading terminology and diagnostics
- translate operator statuses, directions, trading terms and dynamic messages
- add accessible Russian hints for complex decision and risk fields
- preserve machine codes and API contracts for compatibility and audit
- keep the primary table limited to five decision fields
- add iteration252 regressions and update operator documentation
</commit_message>
<xml_diff>
--- a/docs/instrukciya_operatora_bybit_recommender.docx
+++ b/docs/instrukciya_operatora_bybit_recommender.docx
@@ -21,7 +21,7 @@
           <w:rFonts w:ascii="Arial" w:hAnsi="Arial"/>
           <w:sz w:val="20"/>
         </w:rPr>
-        <w:t>Версия документа: 1.0.62 (outcome/LLM bootstrap recovery; minimum six-field operator table; no runtime order execution)</w:t>
+        <w:t>Версия документа: 1.0.64 (русский операторский UI, понятные подсказки; без исполнения биржевых ордеров)</w:t>
       </w:r>
     </w:p>
     <w:p>
@@ -32,6 +32,90 @@
     <w:p>
       <w:r>
         <w:t>Граница системы. Репозиторий является recommendation/audit service, not OMS/EMS. Он не выставляет ордера, не подтверждает runtime-исполнимость, не знает очередь, partial fills, состояние аккаунта или фактическую доступность маржи. Статус recommended означает модельный сигнал, а не готовый к исполнению ордер.</w:t>
+      </w:r>
+    </w:p>
+    <w:p>
+      <w:pPr>
+        <w:pStyle w:val="Heading1"/>
+      </w:pPr>
+      <w:r>
+        <w:t>Как читать русский интерфейс v1.0.64</w:t>
+      </w:r>
+    </w:p>
+    <w:p>
+      <w:pPr/>
+      <w:r>
+        <w:t>Все видимые оператору названия, статусы и сообщения приведены к однозначной русской терминологии. Исключения: LLM, UI, RR, собственное имя Bybit, USDT, обозначения торговых пар и машинные коды в подробной диагностике.</w:t>
+      </w:r>
+    </w:p>
+    <w:p>
+      <w:pPr>
+        <w:pStyle w:val="ListBullet"/>
+      </w:pPr>
+      <w:r>
+        <w:t>Покупка (рост) — направление, которое выигрывает при росте цены; внутреннее значение long.</w:t>
+      </w:r>
+    </w:p>
+    <w:p>
+      <w:pPr>
+        <w:pStyle w:val="ListBullet"/>
+      </w:pPr>
+      <w:r>
+        <w:t>Продажа (снижение) — направление, которое выигрывает при снижении цены; внутреннее значение short.</w:t>
+      </w:r>
+    </w:p>
+    <w:p>
+      <w:pPr>
+        <w:pStyle w:val="ListBullet"/>
+      </w:pPr>
+      <w:r>
+        <w:t>Нейтральная сетка — торговля внутри диапазона без единственной направленной цели прибыли; внутреннее значение neutral.</w:t>
+      </w:r>
+    </w:p>
+    <w:p>
+      <w:pPr>
+        <w:pStyle w:val="ListBullet"/>
+      </w:pPr>
+      <w:r>
+        <w:t>RR плана — расчётный чистый результат конкретного плана, делённый на стресс-убыток на аварийной границе выхода. Это не вероятность прибыли.</w:t>
+      </w:r>
+    </w:p>
+    <w:p>
+      <w:pPr>
+        <w:pStyle w:val="ListBullet"/>
+      </w:pPr>
+      <w:r>
+        <w:t>Доходность по наблюдениям — статистика созревших наблюдений текущего набора правил. «Недостаточно данных» не означает нулевую доходность.</w:t>
+      </w:r>
+    </w:p>
+    <w:p>
+      <w:pPr>
+        <w:pStyle w:val="ListBullet"/>
+      </w:pPr>
+      <w:r>
+        <w:t>Платёж финансирования — периодический платёж между участниками бессрочного фьючерса. Разница цен покупки и продажи и проскальзывание относятся к издержкам исполнения.</w:t>
+      </w:r>
+    </w:p>
+    <w:p>
+      <w:pPr>
+        <w:pStyle w:val="ListBullet"/>
+      </w:pPr>
+      <w:r>
+        <w:t>Предзапусковая проверка — последняя проверка цены, диапазона, количества, маржи и риска перед операторским подтверждением.</w:t>
+      </w:r>
+    </w:p>
+    <w:p>
+      <w:pPr>
+        <w:pStyle w:val="ListBullet"/>
+      </w:pPr>
+      <w:r>
+        <w:t>Значок вопроса открывает краткую подсказку. Полные числа, пороги, исходные сообщения и машинные коды находятся в окне «Детали».</w:t>
+      </w:r>
+    </w:p>
+    <w:p>
+      <w:pPr/>
+      <w:r>
+        <w:t>Главная таблица не расширена: символ, направление, RR плана, доходность по наблюдениям и решение. Все уверенности, размеры, издержки и риск-показатели остаются в «Деталях».</w:t>
       </w:r>
     </w:p>
     <w:p>
@@ -105,7 +189,7 @@
     <w:p>
       <w:pPr/>
       <w:r>
-        <w:t>Явный preflight с текущими биржевыми фильтрами может использоваться только как отдельная справочная диагностика. Он не изменяет сохранённую рекомендацию, её статус, историческую геометрию, outcome или calibration evidence.</w:t>
+        <w:t>Явный предзапусковая проверка с текущими биржевыми фильтрами может использоваться только как отдельная справочная диагностика. Он не изменяет сохранённую рекомендацию, её статус, историческую геометрию, outcome или calibration evidence.</w:t>
       </w:r>
     </w:p>
     <w:p>
@@ -149,7 +233,7 @@
     </w:p>
     <w:p>
       <w:r>
-        <w:t>При kill-switch все grid-fills до защитной границы и закрытие остаточного inventory расходуют единый объём breach-candle. Коды insufficient_candle_volume_for_terminal_liquidation и insufficient_candle_volume_for_kill_switch_liquidation означают NO EVIDENCE, а не частичную прибыль или убыток.</w:t>
+        <w:t>При аварийная граница выхода все grid-fills до защитной границы и закрытие остаточного inventory расходуют единый объём breach-candle. Коды insufficient_candle_volume_for_terminal_liquidation и insufficient_candle_volume_for_kill_switch_liquidation означают NO EVIDENCE, а не частичную прибыль или убыток.</w:t>
       </w:r>
     </w:p>
     <w:p>
@@ -162,19 +246,19 @@
         <w:pStyle w:val="Heading1"/>
       </w:pPr>
       <w:r>
-        <w:t>Консервативная цена kill-switch</w:t>
+        <w:t>Консервативная цена аварийная граница выхода</w:t>
       </w:r>
     </w:p>
     <w:p>
       <w:pPr/>
       <w:r>
-        <w:t>При внутрисвечном пробое защитной границы историческая модель сначала обрабатывает resting grid-orders только до kill-switch. Остаточная позиция не считается идеально закрытой ровно по trigger-price, если свеча уже доказывает дальнейшее неблагоприятное движение.</w:t>
+        <w:t>При внутрисвечном пробое защитной границы историческая модель сначала обрабатывает resting grid-orders только до аварийная граница выхода. Остаточная позиция не считается идеально закрытой ровно по trigger-price, если свеча уже доказывает дальнейшее неблагоприятное движение.</w:t>
       </w:r>
     </w:p>
     <w:p>
       <w:pPr/>
       <w:r>
-        <w:t>Residual SHORT при пробое верхнего kill-switch закрывается по наблюдаемому high свечи; residual LONG при пробое нижнего kill-switch — по наблюдаемому low. Если продолжение цены выгодно остаточной позиции, положительное проскальзывание не кредитуется и сохраняется цена границы.</w:t>
+        <w:t>Residual SHORT при пробое верхнего аварийная граница выхода закрывается по наблюдаемому high свечи; residual LONG при пробое нижнего аварийная граница выхода — по наблюдаемому low. Если продолжение цены выгодно остаточной позиции, положительное проскальзывание не кредитуется и сохраняется цена границы.</w:t>
       </w:r>
     </w:p>
     <w:p>
@@ -232,7 +316,7 @@
         <w:pStyle w:val="ListBullet"/>
       </w:pPr>
       <w:r>
-        <w:t>Любой deterministic data/risk/model blocker означает NO TRADE. Необязательная текущая preflight-диагностика не переписывает модельный статус.</w:t>
+        <w:t>Любой deterministic data/risk/model blocker означает НЕ ТОРГОВАТЬ. Необязательная текущая предзапусковая проверка-диагностика не переписывает модельный статус.</w:t>
       </w:r>
     </w:p>
     <w:p>
@@ -267,7 +351,7 @@
     <w:p>
       <w:pPr/>
       <w:r>
-        <w:t>Raw confidence — эвристическое качество модельного сигнала, а не вероятность прибыли и не runtime-исполнимость. Даже calibrated confidence относится только к proxy outcomes. Legacy expected_rr остаётся внутренним heuristic capture score и не показывается оператору как R/R. Для решения используются отдельные Plan RR и Empirical expectancy с доверительным интервалом; ни один из них не отменяет BLOCKED/NO TRADE.</w:t>
+        <w:t>Исходная уверенность — эвристическое качество модельного сигнала, а не вероятность прибыли и не runtime-исполнимость. Даже откалиброванная уверенность относится только к proxy outcomes. Legacy expected_rr остаётся внутренним heuristic capture score и не показывается оператору как R/R. Для решения используются отдельные RR плана и Доходность по наблюдениям с доверительным интервалом; ни один из них не отменяет BLOCKED/НЕ ТОРГОВАТЬ.</w:t>
       </w:r>
     </w:p>
     <w:p>
@@ -279,7 +363,7 @@
           <w:rFonts w:ascii="Arial" w:hAnsi="Arial"/>
           <w:sz w:val="20"/>
         </w:rPr>
-        <w:t>Метрики принятия решения v1.0.62</w:t>
+        <w:t>Метрики принятия решения v1.0.63</w:t>
       </w:r>
     </w:p>
     <w:p>
@@ -289,7 +373,7 @@
           <w:rFonts w:ascii="Arial" w:hAnsi="Arial"/>
           <w:sz w:val="20"/>
         </w:rPr>
-        <w:t>Основная таблица сведена к абсолютному минимуму для решения: символ, направление, Plan RR, Empirical expectancy, решение и одна главная причина. Уверенность направления, model confidence, risk buffer, цена, диапазон, sizing, funding и технические проверки остаются в окне «Детали». Кнопка «Детали» размещена в ячейке символа и не создаёт отдельную колонку.</w:t>
+        <w:t>Основная таблица сведена к абсолютному минимуму для решения: символ, направление, RR плана, Доходность по наблюдениям и решение. Отдельной колонки «Причина» нет. При наведении указателя или фокусе на лейбле решения показывается одна короткая человекочитаемая подсказка, например «Возвратность цены не подтверждена» или «Недостаточно данных об эффективности». Полные коды, числовые пороги, исходные сообщения, уверенности, risk buffer, цена, диапазон, sizing, платёж финансирования и технические проверки остаются в окне «Детали». Кнопка «Детали» размещена в ячейке символа и не создаёт отдельную колонку.</w:t>
       </w:r>
     </w:p>
     <w:p>
@@ -297,7 +381,7 @@
         <w:pStyle w:val="ListBullet"/>
       </w:pPr>
       <w:r>
-        <w:t>Plan RR — сценарное отношение projected net reward конкретного grid-плана к worst-side kill-switch loss. Числитель учитывает завершённые пары после recurring fees, отдельно разовые spread/slippage и adverse funding. Знаменатель включает ценовой убыток и terminal execution cost; maintenance reserve остаётся стресс-резервом, а не реализованным убытком.</w:t>
+        <w:t>RR плана — сценарное отношение projected net reward конкретного grid-плана к worst-side аварийная граница выхода loss. Числитель учитывает завершённые пары после recurring fees, отдельно разовые разница цен покупки и продажи / проскальзывание и adverse платёж финансирования. Знаменатель включает ценовой убыток и terminal execution cost; maintenance reserve остаётся стресс-резервом, а не реализованным убытком.</w:t>
       </w:r>
     </w:p>
     <w:p>
@@ -305,7 +389,7 @@
         <w:pStyle w:val="ListBullet"/>
       </w:pPr>
       <w:r>
-        <w:t>Empirical expectancy — средняя net-доходность matured proxy outcomes точной текущей policy. Показываются двусторонний Student-t confidence interval, expected shortfall и mean-to-tail ratio, когда выборка позволяет их оценить.</w:t>
+        <w:t>Доходность по наблюдениям — средняя net-доходность matured proxy outcomes точной текущей policy. Показываются двусторонний Student-t confidence interval, expected shortfall и mean-to-tail ratio, когда выборка позволяет их оценить.</w:t>
       </w:r>
     </w:p>
     <w:p>
@@ -319,7 +403,7 @@
     <w:p>
       <w:pPr/>
       <w:r>
-        <w:t>Интерпретация: Plan RR отвечает на вопрос «что даёт и чем рискует этот рассчитанный план при заданных допущениях»; empirical expectancy отвечает на вопрос «что наблюдалось у неизменной policy». Положительное значение одного показателя не компенсирует отсутствие или неопределённость другого. Старые строки до v1.0.61 могут корректно показывать «недоступно», поскольку система не переписывает исторические рекомендации задним числом.</w:t>
+        <w:t>Интерпретация: RR плана отвечает на вопрос «что даёт и чем рискует этот рассчитанный план при заданных допущениях»; empirical expectancy отвечает на вопрос «что наблюдалось у неизменной policy». Положительное значение одного показателя не компенсирует отсутствие или неопределённость другого. Старые строки до v1.0.61 могут корректно показывать «недоступно», поскольку система не переписывает исторические рекомендации задним числом.</w:t>
       </w:r>
     </w:p>
     <w:p>
@@ -348,7 +432,7 @@
     </w:p>
     <w:p>
       <w:r>
-        <w:t>In-sample score-only Platt больше не является probability fallback. Активный LogReg + Platt обучается только на данных до терминального holdout; сам holdout не входит в финальный fit. Недостаток или отсутствие held-out skill при REQUIRE_CONF_GATE=1 означает CALIBRATED_CONFIDENCE_UNAVAILABLE и NO TRADE.</w:t>
+        <w:t>In-sample score-only Platt больше не является probability fallback. Активный LogReg + Platt обучается только на данных до терминального holdout; сам holdout не входит в финальный fit. Недостаток или отсутствие held-out skill при REQUIRE_CONF_GATE=1 означает CALIBRATED_CONFIDENCE_UNAVAILABLE и НЕ ТОРГОВАТЬ.</w:t>
       </w:r>
     </w:p>
     <w:p>
@@ -371,7 +455,7 @@
     </w:p>
     <w:p>
       <w:r>
-        <w:t>Недостаток временных кластеров, отсутствующая диагностика или неположительная cluster lower bound означает shadow NO TRADE с PROXY_MONETARY_EXPECTANCY_UNPROVEN. Высокий score, win rate или десятки коррелированных символов не являются основанием для обхода.</w:t>
+        <w:t>Недостаток временных кластеров, отсутствующая диагностика или неположительная cluster lower bound означает shadow НЕ ТОРГОВАТЬ с PROXY_MONETARY_EXPECTANCY_UNPROVEN. Высокий score, win rate или десятки коррелированных символов не являются основанием для обхода.</w:t>
       </w:r>
     </w:p>
     <w:p>
@@ -391,13 +475,13 @@
     <w:p>
       <w:pPr/>
       <w:r>
-        <w:t>Actionable futures_grid допускается только когда точная policy-conditioned matured-return выборка имеет достаточный Kish effective sample size и положительную одностороннюю 95% Student-t lower bound. Каждый matured policy root входит в denominator как labeled, censored или unresolved. Любой censored/unresolved/invalid-labeled root либо исчезнувшая поддержка cache означает PROXY_OUTCOME_CENSORING_UNBOUNDED и NO TRADE немедленно. Это защищает от survivorship bias, но создаёт открытый liveness-риск: один постоянный censored root способен блокировать всю policy-когорту. Не обходить вручную; необходим отдельный validated bounded-censor contract.</w:t>
+        <w:t>Actionable futures_grid допускается только когда точная policy-conditioned matured-return выборка имеет достаточный Kish effective sample size и положительную одностороннюю 95% Student-t lower bound. Каждый matured policy root входит в denominator как labeled, censored или unresolved. Любой censored/unresolved/invalid-labeled root либо исчезнувшая поддержка cache означает PROXY_OUTCOME_CENSORING_UNBOUNDED и НЕ ТОРГОВАТЬ немедленно. Это защищает от survivorship bias, но создаёт открытый liveness-риск: один постоянный censored root способен блокировать всю policy-когорту. Не обходить вручную; необходим отдельный validated bounded-censor contract.</w:t>
       </w:r>
     </w:p>
     <w:p>
       <w:pPr/>
       <w:r>
-        <w:t>Это защитный OHLCV proxy gate, а не доказательство live edge, исполнимости или гарантии прибыли. Live validation учитывает положительный PnL только после stopped + local flat + complete terminal reconciliation от доверенного внешнего read-only Bybit private-API adapter; totals fills/fees/funding, event counts, position и open orders должны совпасть. Сам сервис проверяет согласованность, но не криптографически доказывает происхождение внешнего снимка.</w:t>
+        <w:t>Это защитный OHLCV proxy gate, а не доказательство live edge, исполнимости или гарантии прибыли. Live validation учитывает положительный PnL только после stopped + local flat + complete terminal reconciliation от доверенного внешнего read-only Bybit private-API adapter; totals fills/fees/платёж финансирования, event counts, position и open orders должны совпасть. Сам сервис проверяет согласованность, но не криптографически доказывает происхождение внешнего снимка.</w:t>
       </w:r>
     </w:p>
     <w:p>
@@ -476,7 +560,7 @@
         <w:rPr>
           <w:sz w:val="21"/>
         </w:rPr>
-        <w:t>Neutral grid: направленного TP нет; нижняя и верхняя внешние границы являются kill-switch exits.</w:t>
+        <w:t>Neutral grid: направленного TP нет; нижняя и верхняя внешние границы являются аварийная граница выхода exits.</w:t>
       </w:r>
     </w:p>
     <w:p>
@@ -506,7 +590,7 @@
         <w:pStyle w:val="ListBullet"/>
       </w:pPr>
       <w:r>
-        <w:t>Отдельное касание directional tp_per_leg не подтверждает прибыль всего grid. Arithmetic tp_per_leg совпадает с полным соседним interval. Grid Profit завершённой пары уменьшается только на комиссии её двух resting fills. Bid/ask spread и slippage относятся к разовой market setup/terminal exit, а funding — к position-time Total P&amp;L; эти слои нельзя повторно вычитать из каждой пары. Одна и та же сетка может закрываться многократно, поэтому cumulative completed trades не ограничиваются grid_count.</w:t>
+        <w:t>Отдельное касание directional tp_per_leg не подтверждает прибыль всего grid. Arithmetic tp_per_leg совпадает с полным соседним interval. Grid Profit завершённой пары уменьшается только на комиссии её двух resting fills. Bid/ask spread и slippage относятся к разовой market setup/terminal exit, а платёж финансирования — к position-time Total P&amp;L; эти слои нельзя повторно вычитать из каждой пары. Одна и та же сетка может закрываться многократно, поэтому cumulative completed trades не ограничиваются grid_count.</w:t>
       </w:r>
     </w:p>
     <w:p>
@@ -533,7 +617,7 @@
         <w:pStyle w:val="ListBullet"/>
       </w:pPr>
       <w:r>
-        <w:t>Исторический funding в proxy outcomes берётся только из фактически рассчитанных Bybit settlements, собранных через публичный funding-history endpoint. Ticker fundingRate остаётся прогнозом для approval/risk и не подменяет исторический факт. Положительная ставка означает: LONG платит, SHORT получает; отрицательная ставка меняет знак. Для canonical proxy ret и monetary calibration adverse settled funding всегда вычитается, а положительный receipt не кредитуется как устойчивый alpha и не может превратить плоскую/убыточную сетку в success. Signed funding остаётся диагностикой исторической модели; возможная внешняя post-hoc сверка не входит в runtime-контракт системы. Если в момент ожидаемого funding event позиция ненулевая, а settlement row отсутствует, label не создаётся fail-closed.</w:t>
+        <w:t>Исторический платёж финансирования в proxy outcomes берётся только из фактически рассчитанных Bybit settlements, собранных через публичный платёж финансирования-history endpoint. Ticker платёж финансированияRate остаётся прогнозом для approval/risk и не подменяет исторический факт. Положительная ставка означает: LONG платит, SHORT получает; отрицательная ставка меняет знак. Для canonical proxy ret и monetary calibration adverse settled платёж финансирования всегда вычитается, а положительный receipt не кредитуется как устойчивый alpha и не может превратить плоскую/убыточную сетку в success. Signed платёж финансирования остаётся диагностикой исторической модели; возможная внешняя post-hoc сверка не входит в runtime-контракт системы. Если в момент ожидаемого платёж финансирования event позиция ненулевая, а settlement row отсутствует, label не создаётся fail-closed.</w:t>
       </w:r>
     </w:p>
     <w:p>
@@ -585,7 +669,7 @@
         <w:pStyle w:val="ListBullet"/>
       </w:pPr>
       <w:r>
-        <w:t>explicit leverage, cross margin, one-way position mode, sizing/economics for qtyStep, minNotional, active resting-order count, full initial opening-order committed slots/notional, maximum one-way position exposure and cross-margin equity-stress checks.</w:t>
+        <w:t>explicit leverage, общая маржа, one-way position mode, sizing/economics for qtyStep, minNotional, active resting-order count, full initial opening-order committed slots/notional, maximum one-way position exposure and общая маржа equity-stress checks.</w:t>
       </w:r>
     </w:p>
     <w:p>
@@ -596,7 +680,7 @@
         <w:rPr>
           <w:sz w:val="21"/>
         </w:rPr>
-        <w:t>NO TRADE / BLOCKED условия</w:t>
+        <w:t>НЕ ТОРГОВАТЬ / BLOCKED условия</w:t>
       </w:r>
     </w:p>
     <w:p>
@@ -612,7 +696,7 @@
         <w:pStyle w:val="ListBullet"/>
       </w:pPr>
       <w:r>
-        <w:t>Устаревшая publication-chain, stale market data, live ticker вне range/kill-switch, отсутствующая пара bid/ask, spread &gt;14 bps, recurring grid edge &lt;2 bps или gross/fee coverage &lt;=1,10x. Spread остаётся отдельным liquidity gate, funding — отдельным inventory/schedule guard.</w:t>
+        <w:t>Устаревшая publication-chain, stale market data, live ticker вне range/аварийная граница выхода, отсутствующая пара bid/ask, spread &gt;14 bps, recurring grid edge &lt;2 bps или gross/fee coverage &lt;=1,10x. Spread остаётся отдельным liquidity gate, платёж финансирования — отдельным inventory/schedule guard.</w:t>
       </w:r>
     </w:p>
     <w:p>
@@ -620,7 +704,7 @@
         <w:pStyle w:val="ListBullet"/>
       </w:pPr>
       <w:r>
-        <w:t>В explicit operator preflight отсутствующие tickSize, qtyStep, minNotional, leverageFilter или non-Trading status делают только текущую справочную проверку недоступной; historical recommendation/outcome из-за этого не блокируются.</w:t>
+        <w:t>В explicit operator предзапусковая проверка отсутствующие tickSize, qtyStep, minNotional, leverageFilter или non-Trading status делают только текущую справочную проверку недоступной; historical recommendation/outcome из-за этого не блокируются.</w:t>
       </w:r>
     </w:p>
     <w:p>
@@ -631,7 +715,7 @@
         <w:rPr>
           <w:sz w:val="21"/>
         </w:rPr>
-        <w:t>Funding недоступен или adverse carry уничтожает net edge; LLM gate не OK при включённом gate-режиме.</w:t>
+        <w:t>Платёж финансирования недоступен или adverse carry уничтожает net edge; LLM gate не OK при включённом gate-режиме.</w:t>
       </w:r>
     </w:p>
     <w:p>
@@ -639,7 +723,7 @@
         <w:pStyle w:val="ListBullet"/>
       </w:pPr>
       <w:r>
-        <w:t>Оценочный loss до adverse kill-switch превышает остаток дневного лимита max_daily_dd_usdt - daily_dd (DAILY_LOSS_BUDGET_EXCEEDED). Fallback notional обязан разделять commitment и exposure: для NEUTRAL commitment включает все первоначальные Buy/Sell opening orders, а maximum one-way position — только более крупный directional stack; для LONG/SHORT учитываются initial inventory плюс adverse-side openings. Total active-order count, committed slots и max-position slots нельзя взаимозаменять.</w:t>
+        <w:t>Оценочный loss до adverse аварийная граница выхода превышает остаток дневного лимита max_daily_dd_usdt - daily_dd (DAILY_LOSS_BUDGET_EXCEEDED). Fallback notional обязан разделять commitment и exposure: для NEUTRAL commitment включает все первоначальные Buy/Sell opening orders, а maximum one-way position — только более крупный directional stack; для LONG/SHORT учитываются initial inventory плюс adverse-side openings. Total active-order count, committed slots и max-position slots нельзя взаимозаменять.</w:t>
       </w:r>
     </w:p>
     <w:p>
@@ -671,7 +755,7 @@
     </w:p>
     <w:p>
       <w:r>
-        <w:t>2. Сверить полноту исторических данных, features_ref_ts, horizon, cost/funding assumptions, simulation_scope и денежные/временные diagnostics.</w:t>
+        <w:t>2. Сверить полноту исторических данных, features_ref_ts, horizon, cost/платёж финансирования assumptions, simulation_scope и денежные/временные diagnostics.</w:t>
       </w:r>
     </w:p>
     <w:p>
@@ -709,7 +793,7 @@
         <w:pStyle w:val="ListBullet"/>
       </w:pPr>
       <w:r>
-        <w:t>Необученный, цензурированный или не подтвердивший terminal held-out skill bot-specific calibrator означает shadow NO_TRADE: raw confidence audit-only. 80 exact-policy rows — только денежный floor; при REQUIRE_CONF_GATE=1 полная probability readiness начинается не ранее 300 rows и требует accepted purged OOF/terminal holdout. Положительный cache обязан воспроизводиться по текущему policy denominator; исчезновение supporting rows отключает его. Подтверждённый negative expectancy сохраняется как консервативный veto.</w:t>
+        <w:t>Необученный, цензурированный или не подтвердивший terminal held-out skill bot-specific calibrator означает shadow НЕ ТОРГОВАТЬ: raw confidence audit-only. 80 exact-policy rows — только денежный floor; при REQUIRE_CONF_GATE=1 полная probability readiness начинается не ранее 300 rows и требует accepted purged OOF/terminal holdout. Положительный cache обязан воспроизводиться по текущему policy denominator; исчезновение supporting rows отключает его. Подтверждённый negative expectancy сохраняется как консервативный veto.</w:t>
       </w:r>
     </w:p>
     <w:p>
@@ -752,7 +836,7 @@
         <w:rPr>
           <w:sz w:val="21"/>
         </w:rPr>
-        <w:t>Funding записывается отдельным signed transaction-log event. Exact evidence и legacy /trades нельзя смешивать для одного bot_id.</w:t>
+        <w:t>Платёж финансирования записывается отдельным signed transaction-log event. Exact evidence и legacy /trades нельзя смешивать для одного bot_id.</w:t>
       </w:r>
     </w:p>
     <w:p>
@@ -763,7 +847,7 @@
         <w:rPr>
           <w:sz w:val="21"/>
         </w:rPr>
-        <w:t>Канонический net PnL: фактический gross execPnl + funding - fee. Slippage уже отражён в fill prices и повторно не вычитается.</w:t>
+        <w:t>Канонический net PnL: фактический gross execPnl + платёж финансирования - fee. Slippage уже отражён в fill prices и повторно не вычитается.</w:t>
       </w:r>
     </w:p>
     <w:p>
@@ -821,7 +905,7 @@
         <w:pStyle w:val="ListBullet"/>
       </w:pPr>
       <w:r>
-        <w:t>Частичные события сохраняются immutable и видимы в audit API, но не входят в LIVE_VALIDATION_* до передачи всех opening/closing fills и signed funding внешним read-only adapter-ом.</w:t>
+        <w:t>Частичные события сохраняются immutable и видимы в audit API, но не входят в LIVE_VALIDATION_* до передачи всех opening/closing fills и signed платёж финансирования внешним read-only adapter-ом.</w:t>
       </w:r>
     </w:p>
     <w:p>
@@ -917,7 +1001,7 @@
         <w:spacing w:after="60"/>
       </w:pPr>
       <w:r>
-        <w:t>Диапазон, reference, kill-switch и grid step должны быть кратны tick_size.</w:t>
+        <w:t>Диапазон, reference, аварийная граница выхода и grid step должны быть кратны tick_size.</w:t>
       </w:r>
     </w:p>
     <w:p>
@@ -1008,7 +1092,7 @@
         <w:rPr>
           <w:sz w:val="20"/>
         </w:rPr>
-        <w:t>Если цена в той же свече пересекает только что созданный replacement, outcome недоступен с кодом intrabar_replacement_fill_timing_unobservable. Это NO EVIDENCE / NO TRADE, а не убыток и не прибыль.</w:t>
+        <w:t>Если цена в той же свече пересекает только что созданный replacement, outcome недоступен с кодом intrabar_replacement_fill_timing_unobservable. Это NO EVIDENCE / НЕ ТОРГОВАТЬ, а не убыток и не прибыль.</w:t>
       </w:r>
     </w:p>
     <w:p>
@@ -1019,7 +1103,7 @@
         <w:rPr>
           <w:sz w:val="20"/>
         </w:rPr>
-        <w:t>Replacement становится допустимым для proxy-модели с начала следующей свечи. Цикл, подтверждённый в разных свечах, оценивается по прежней PnL/fee/funding/volume-математике.</w:t>
+        <w:t>Replacement становится допустимым для proxy-модели с начала следующей свечи. Цикл, подтверждённый в разных свечах, оценивается по прежней PnL/fee/платёж финансирования/volume-математике.</w:t>
       </w:r>
     </w:p>
     <w:p>

</xml_diff>

<commit_message>
fix(outcomes): restore shadow exploration liveness under advisory LLM
• allow explicit risk-clean shadow outcomes without impossible LLM verdict
• keep exploration outside exact-policy calibration and preserve all trading gates
• add iteration258 RED→GREEN regression, sync version and operator documentation
</commit_message>
<xml_diff>
--- a/docs/instrukciya_operatora_bybit_recommender.docx
+++ b/docs/instrukciya_operatora_bybit_recommender.docx
@@ -16,8 +16,9 @@
     </w:p>
     <w:p>
       <w:pPr/>
+      <w:r/>
       <w:r>
-        <w:t>Версия документа: 1.0.69 (целостность диагностики после перезапуска, полный снимок публикации и контроль непрерывности БД; без исполнения биржевых ордеров)</w:t>
+        <w:t>Версия документа: 1.0.70 (исследовательские shadow outcomes при advisory-LLM без ослабления торговых и калибровочных gates; без исполнения биржевых ордеров)</w:t>
       </w:r>
     </w:p>
     <w:p>
@@ -1171,11 +1172,7 @@
     </w:p>
     <w:p>
       <w:r>
-        <w:rPr>
-          <w:rFonts w:ascii="Arial" w:hAnsi="Arial"/>
-          <w:sz w:val="20"/>
-        </w:rPr>
-        <w:t>LLM reviewer проверяет только потенциально исполнимые рекомендации. Поэтому явно разрешённые, прошедшие deterministic risk checks shadow-no_trade roots не требуют LLM verdict для расчёта proxy outcome. Это не делает no_trade исполнимым: actionable roots при включённом LLM по-прежнему остаются fail-closed до завершённого verdict.</w:t>
+        <w:t>Модуль LLM проверяет только потенциально исполнимые рекомендации. Поэтому явно разрешённые, риск-чистые учебные строки `shadow_no_trade` не требуют заключения LLM для расчёта учебного исхода. Это не делает статус `no_trade` исполнимым: торговые рекомендации остаются заблокированными до заключения. В v1.0.70 правило распространяется на `shadow_exploration` вне текущего набора отбора. Такие исходы пополняют общую историю, но при `policy_evaluation_eligible=false` не входят в калибровку и не увеличивают `calibrator_n`. Торговые пороги не снижаются.</w:t>
       </w:r>
     </w:p>
     <w:p>

</xml_diff>

<commit_message>
fix(runtime): restore safe Windows restart handover
• release owned background runtime locks on graceful shutdown
• expose collector lock owner, TTL and takeover diagnostics
• keep shadow exploration labelable without weakening calibration gates
• preserve audit identifiers and localize outcome censor reasons
• add iteration258 RED→GREEN regression and update operator documentation
</commit_message>
<xml_diff>
--- a/docs/instrukciya_operatora_bybit_recommender.docx
+++ b/docs/instrukciya_operatora_bybit_recommender.docx
@@ -16,9 +16,8 @@
     </w:p>
     <w:p>
       <w:pPr/>
-      <w:r/>
       <w:r>
-        <w:t>Версия документа: 1.0.70 (исследовательские shadow outcomes при advisory-LLM без ослабления торговых и калибровочных gates; без исполнения биржевых ордеров)</w:t>
+        <w:t>Версия документа: 1.0.71 (целостность диагностики после перезапуска, полный снимок публикации и контроль непрерывности БД; без исполнения биржевых ордеров)</w:t>
       </w:r>
     </w:p>
     <w:p>
@@ -36,7 +35,7 @@
         <w:pStyle w:val="Heading1"/>
       </w:pPr>
       <w:r>
-        <w:t>Проверка здоровья системы v1.0.69</w:t>
+        <w:t>Проверка здоровья системы v1.0.71</w:t>
       </w:r>
     </w:p>
     <w:p>
@@ -1172,7 +1171,11 @@
     </w:p>
     <w:p>
       <w:r>
-        <w:t>Модуль LLM проверяет только потенциально исполнимые рекомендации. Поэтому явно разрешённые, риск-чистые учебные строки `shadow_no_trade` не требуют заключения LLM для расчёта учебного исхода. Это не делает статус `no_trade` исполнимым: торговые рекомендации остаются заблокированными до заключения. В v1.0.70 правило распространяется на `shadow_exploration` вне текущего набора отбора. Такие исходы пополняют общую историю, но при `policy_evaluation_eligible=false` не входят в калибровку и не увеличивают `calibrator_n`. Торговые пороги не снижаются.</w:t>
+        <w:rPr>
+          <w:rFonts w:ascii="Arial" w:hAnsi="Arial"/>
+          <w:sz w:val="20"/>
+        </w:rPr>
+        <w:t>LLM reviewer проверяет только потенциально исполнимые рекомендации. Поэтому явно разрешённые, прошедшие deterministic risk checks shadow-no_trade roots не требуют LLM verdict для расчёта proxy outcome. Это не делает no_trade исполнимым: actionable roots при включённом LLM по-прежнему остаются fail-closed до завершённого verdict.</w:t>
       </w:r>
     </w:p>
     <w:p>
@@ -1219,6 +1222,94 @@
     <w:p>
       <w:r>
         <w:t>Сводка последней публикации должна учитывать все инструменты публикационного цикла, включая строки, которые повторно используют ранее созданный outcome-root. Число строк сводки должно соответствовать count_all в событии PUBLISH, а не только числу новых outcome-root.</w:t>
+      </w:r>
+    </w:p>
+    <w:p>
+      <w:pPr>
+        <w:pStyle w:val="Heading1"/>
+      </w:pPr>
+      <w:r>
+        <w:t>Безопасный перезапуск и передача блокировок v1.0.71</w:t>
+      </w:r>
+    </w:p>
+    <w:p>
+      <w:pPr>
+        <w:pStyle w:val="ListBullet"/>
+      </w:pPr>
+      <w:r>
+        <w:t>При штатном завершении приложения фоновые контуры освобождают только принадлежащие текущему процессу блокировки. Новый процесс не должен ожидать полный срок блокировки предыдущего PID.</w:t>
+      </w:r>
+    </w:p>
+    <w:p>
+      <w:pPr>
+        <w:pStyle w:val="ListBullet"/>
+      </w:pPr>
+      <w:r>
+        <w:t>Состояние «передача управления» означает штатное ожидание безопасного перехвата блокировки. Оно не означает свежесть рынка и не разрешает торговлю по устаревшим данным.</w:t>
+      </w:r>
+    </w:p>
+    <w:p>
+      <w:pPr>
+        <w:pStyle w:val="ListBullet"/>
+      </w:pPr>
+      <w:r>
+        <w:t>В окне здоровья проверяйте владельца блокировки сборщика, срок блокировки и время до разрешённого перехвата. Не выполняйте повторные перезапуски, пока идёт штатная передача управления.</w:t>
+      </w:r>
+    </w:p>
+    <w:p>
+      <w:pPr>
+        <w:pStyle w:val="ListBullet"/>
+      </w:pPr>
+      <w:r>
+        <w:t>После передачи должны одновременно появиться: блокировка принадлежит текущему процессу, цикл сборщика текущего процесса — «Да», публикация текущего процесса — «Да», устаревших инструментов — 0.</w:t>
+      </w:r>
+    </w:p>
+    <w:p>
+      <w:pPr>
+        <w:pStyle w:val="Heading1"/>
+      </w:pPr>
+      <w:r>
+        <w:t>Как читать журнал исходов v1.0.71</w:t>
+      </w:r>
+    </w:p>
+    <w:p>
+      <w:pPr>
+        <w:pStyle w:val="ListBullet"/>
+      </w:pPr>
+      <w:r>
+        <w:t>Машинные коды действий, причин и идентификаторы рекомендаций сохраняются без перевода. Рядом выводится связное русское пояснение.</w:t>
+      </w:r>
+    </w:p>
+    <w:p>
+      <w:pPr>
+        <w:pStyle w:val="ListBullet"/>
+      </w:pPr>
+      <w:r>
+        <w:t>OUTCOME_SKIP_INVALID_GRID_CONTRACT означает, что результат нельзя доказательно восстановить по доступным OHLCV-данным; это терминальное fail-closed цензурирование.</w:t>
+      </w:r>
+    </w:p>
+    <w:p>
+      <w:pPr>
+        <w:pStyle w:val="ListBullet"/>
+      </w:pPr>
+      <w:r>
+        <w:t>intrabar_extreme_order_unobservable означает неизвестный порядок касаний цен внутри одной свечи. Система не назначает прибыль или убыток по предположению.</w:t>
+      </w:r>
+    </w:p>
+    <w:p>
+      <w:pPr>
+        <w:pStyle w:val="ListBullet"/>
+      </w:pPr>
+      <w:r>
+        <w:t>Недостаточный объём свечи означает, что моделируемое исполнение требуемого количества нельзя подтвердить. Ослаблять эту проверку вручную запрещено.</w:t>
+      </w:r>
+    </w:p>
+    <w:p>
+      <w:pPr>
+        <w:pStyle w:val="ListBullet"/>
+      </w:pPr>
+      <w:r>
+        <w:t>Исследовательские shadow-исходы без LLM могут рассчитываться, но не входят в exact-policy калибровку и не разрешают торговлю.</w:t>
       </w:r>
     </w:p>
     <w:sectPr>

</xml_diff>

<commit_message>
fix(outcomes): preserve terminal audit diagnostics
• persist kill-switch reason, boundary and observed extreme for labeled outcomes
• render strategy outcome, net proxy P&L and terminal reason separately
• reject boolean and malformed outcome numbers in the frontend
• add iteration263 RED→GREEN regression coverage
• update version, operator documentation and audit report
</commit_message>
<xml_diff>
--- a/docs/instrukciya_operatora_bybit_recommender.docx
+++ b/docs/instrukciya_operatora_bybit_recommender.docx
@@ -17,12 +17,12 @@
     <w:p>
       <w:pPr/>
       <w:r>
-        <w:t>Версия документа: 1.0.71 (целостность диагностики после перезапуска, полный снимок публикации и контроль непрерывности БД; без исполнения биржевых ордеров)</w:t>
+        <w:t>Версия документа: 1.0.76 (терминальная диагностика proxy outcomes, строгая числовая семантика журнала и сохранение audit-причин; без исполнения биржевых ордеров)</w:t>
       </w:r>
     </w:p>
     <w:p>
       <w:r>
-        <w:t>Назначение: регламент принятия операторского решения по конкретному grid-плану и по статистике exact-current-policy proxy outcomes в paper/shadow-режиме. Документ не является инструкцией по переносу параметров в биржевой бот.</w:t>
+        <w:t>Назначение: регламент принятия операторского решения по конкретному grid-плану и по статистике exact-current-policy proxy outcomes в paper/shadow-режиме. Документ не является инструкцией по переносу параметров в биржевой бот. Журнал исходов обязан показывать терминальную причину отдельно от знака расчётного proxy P&amp;L.</w:t>
       </w:r>
     </w:p>
     <w:p>
@@ -1269,7 +1269,39 @@
         <w:pStyle w:val="Heading1"/>
       </w:pPr>
       <w:r>
-        <w:t>Как читать журнал исходов v1.0.71</w:t>
+        <w:t>Как читать журнал исходов v1.0.76</w:t>
+      </w:r>
+    </w:p>
+    <w:p>
+      <w:pPr>
+        <w:pStyle w:val="ListBullet"/>
+      </w:pPr>
+      <w:r>
+        <w:t>В журнале отдельно показаны «Исход по правилам стратегии», «Расчётный net proxy P&amp;L» и «Причина исхода». Эти поля нельзя трактовать как одно и то же.</w:t>
+      </w:r>
+    </w:p>
+    <w:p>
+      <w:pPr>
+        <w:pStyle w:val="ListBullet"/>
+      </w:pPr>
+      <w:r>
+        <w:t>Положительный net proxy P&amp;L при «Неуспех · kill-switch» означает: сетка ранее накопила прибыль, но затем нарушила защитную границу. По контракту grid_label_v26 такой terminal outcome остаётся неуспешным независимо от знака P&amp;L.</w:t>
+      </w:r>
+    </w:p>
+    <w:p>
+      <w:pPr>
+        <w:pStyle w:val="ListBullet"/>
+      </w:pPr>
+      <w:r>
+        <w:t>Для новых outcomes колонка причины показывает сторону и цену kill-switch и наблюдавшийся экстремум. Legacy-строки без terminal diagnostics не реконструируются предположением.</w:t>
+      </w:r>
+    </w:p>
+    <w:p>
+      <w:pPr>
+        <w:pStyle w:val="ListBullet"/>
+      </w:pPr>
+      <w:r>
+        <w:t>«Неизвестно» и «—» означают invalid/missing numeric contract. Boolean, пустые строки, NaN и Infinity не должны интерпретироваться как 1, 0 или 0%.</w:t>
       </w:r>
     </w:p>
     <w:p>

</xml_diff>

<commit_message>
fix(outcome-lineage): separate operator TTL from 12h label windows
- add independent outcome_root_rec_id lineage and additive DB migration
- refresh operator publications without duplicating overlapping outcomes
- update history UI, model identity, regressions and operator documentation
</commit_message>
<xml_diff>
--- a/docs/instrukciya_operatora_bybit_recommender.docx
+++ b/docs/instrukciya_operatora_bybit_recommender.docx
@@ -17,7 +17,7 @@
     <w:p>
       <w:pPr/>
       <w:r>
-        <w:t>Версия документа: 1.0.76 (терминальная диагностика proxy outcomes, строгая числовая семантика журнала и сохранение audit-причин; без исполнения биржевых ордеров)</w:t>
+        <w:t>Версия документа: 1.0.78 (разделение операторской свежести рекомендации и независимой outcome-lineage; без исполнения биржевых ордеров)</w:t>
       </w:r>
     </w:p>
     <w:p>
@@ -28,6 +28,46 @@
     <w:p>
       <w:r>
         <w:t>Граница системы. Репозиторий является recommendation/audit service, not OMS/EMS. Он не выставляет ордера, не подтверждает runtime-исполнимость, не знает очередь, partial fills, состояние аккаунта или фактическую доступность маржи. Статус recommended означает модельный сигнал, а не готовый к исполнению ордер.</w:t>
+      </w:r>
+    </w:p>
+    <w:p>
+      <w:pPr>
+        <w:pStyle w:val="Heading1"/>
+      </w:pPr>
+      <w:r>
+        <w:t>Свежесть рекомендации и окно исхода v1.0.78</w:t>
+      </w:r>
+    </w:p>
+    <w:p>
+      <w:pPr>
+        <w:pStyle w:val="ListBullet"/>
+      </w:pPr>
+      <w:r>
+        <w:t>RECO_TTL_SEC — это срок операторской актуальности конкретной publication-chain. После его истечения старую рекомендацию исполнять нельзя; новый подтверждённый сигнал может быть опубликован как свежая рекомендация.</w:t>
+      </w:r>
+    </w:p>
+    <w:p>
+      <w:pPr>
+        <w:pStyle w:val="ListBullet"/>
+      </w:pPr>
+      <w:r>
+        <w:t>12-часовой label horizon — отдельное статистическое окно псевдо-позиции futures_grid. Пока оно не завершилось, свежая операторская публикация может иметь новый publication_root_rec_id, но сохраняет прежний outcome_root_rec_id и не создаёт дополнительный обучающий исход.</w:t>
+      </w:r>
+    </w:p>
+    <w:p>
+      <w:pPr>
+        <w:pStyle w:val="ListBullet"/>
+      </w:pPr>
+      <w:r>
+        <w:t>12 часов не считаются доказанно оптимальными. Переход на 6 или 24 часа требует отдельного versioned purged walk-forward сравнения; простое изменение константы меняет target, срок готовности метки, embargo и funding exposure.</w:t>
+      </w:r>
+    </w:p>
+    <w:p>
+      <w:pPr>
+        <w:pStyle w:val="ListBullet"/>
+      </w:pPr>
+      <w:r>
+        <w:t>В истории рекомендаций различайте «операторскую цепочку» и «независимое окно исхода». Несколько свежих публикаций могут относиться к одному outcome-window — это штатно и предотвращает псевдорепликацию данных.</w:t>
       </w:r>
     </w:p>
     <w:p>
@@ -227,7 +267,7 @@
           <w:rFonts w:ascii="Arial" w:hAnsi="Arial"/>
           <w:sz w:val="20"/>
         </w:rPr>
-        <w:t>В reasons.simulation_scope должны быть: mode=historical_proxy_only, runtime_order_submission=false, runtime_execution_validation=not_performed, exchange_fill_attestation=not_available. Это основной контракт текущей версии 1.0.62.</w:t>
+        <w:t>В reasons.simulation_scope должны быть: mode=historical_proxy_only, runtime_order_submission=false, runtime_execution_validation=not_performed, exchange_fill_attestation=not_available. Это основной контракт текущей версии 1.0.78.</w:t>
       </w:r>
     </w:p>
     <w:p>
@@ -653,7 +693,7 @@
         <w:pStyle w:val="ListBullet"/>
       </w:pPr>
       <w:r>
-        <w:t>Outcome contract остаётся grid_label_v26. Версия 1.0.58 не удаляет исторические outcomes: они сохраняются как аудит. Текущая recommendation lineage v8 допускает только verified exact-policy outcomes; bot/global calibrators используют v19. Direction v14 использует horizon-price target, но его Platt audit-only до отдельного chronological skill gate и не меняет decision feature.</w:t>
+        <w:t>Outcome contract остаётся grid_label_v26. Исторические outcomes сохраняются как аудит. Текущая recommendation lineage bybit-taxonomy-v11-separated-operator-outcome-lineage принимает только verified exact-policy outcomes; bot/global calibrators используют v21. Direction v14 использует horizon-price target, но его Platt audit-only до отдельного chronological skill gate и не меняет decision feature.</w:t>
       </w:r>
     </w:p>
     <w:p>
@@ -740,7 +780,7 @@
         <w:pStyle w:val="ListBullet"/>
       </w:pPr>
       <w:r>
-        <w:t>Устаревшая publication-chain, stale market data, live ticker вне range/аварийная граница выхода, отсутствующая пара bid/ask, spread &gt;14 bps, recurring grid edge &lt;2 bps или gross/fee coverage &lt;=1,10x. Spread остаётся отдельным liquidity gate, платёж финансирования — отдельным inventory/schedule guard.</w:t>
+        <w:t>Устаревшая operator publication-chain, stale market data, live ticker вне range/аварийной границы выхода, отсутствующая пара bid/ask, spread &gt;14 bps, recurring grid edge &lt;2 bps или gross/fee coverage &lt;=1,10x. Истечение operator TTL блокирует запуск старой рекомендации, но не создаёт новый независимый outcome-root до конца label horizon.</w:t>
       </w:r>
     </w:p>
     <w:p>
@@ -981,7 +1021,8 @@
         <w:pStyle w:val="ListBullet"/>
       </w:pPr>
       <w:r>
-        <w:t>При отдельно включённой post-hoc validation в gate входят только stopped bots той же model_version с terminally finalized evidence. Текущая версия сигнала: bybit-taxonomy-v8-policy-conditioned-censor-aware. Текущие ключи: logreg_futures_grid_v19, logreg_global_v19 и platt_direction_v14.</w:t>
+        <w:rPr/>
+        <w:t>При отдельно включённой post-hoc validation в gate входят только stopped bots той же model_version с terminally finalized evidence. Текущая версия сигнала: bybit-taxonomy-v11-separated-operator-outcome-lineage. Текущие ключи: logreg_futures_grid_v21, logreg_global_v21 и platt_direction_v14.</w:t>
       </w:r>
     </w:p>
     <w:p>

</xml_diff>

<commit_message>
feat(strategy): add independent directional trend shadow policy
- route strong coherent trends to a separate single-position strategy
- add trend-specific scoring, TP/SL outcome and calibrator lineage
- keep directional trend fail-closed and non-executable
- preserve existing futures-grid mechanics and execution contract
- add regression coverage and synchronize operator documentation
</commit_message>
<xml_diff>
--- a/docs/instrukciya_operatora_bybit_recommender.docx
+++ b/docs/instrukciya_operatora_bybit_recommender.docx
@@ -17,24 +17,106 @@
     <w:p>
       <w:pPr/>
       <w:r>
-        <w:t>Версия документа: 1.0.78 (разделение операторской свежести рекомендации и независимой outcome-lineage; без исполнения биржевых ордеров)</w:t>
+        <w:rPr>
+          <w:sz w:val="21"/>
+        </w:rPr>
+        <w:t>Версия документа: 1.1.0 (отдельная directional trend-ветка в shadow-режиме; без исполнения биржевых ордеров)</w:t>
       </w:r>
     </w:p>
     <w:p>
       <w:r>
-        <w:t>Назначение: регламент принятия операторского решения по конкретному grid-плану и по статистике exact-current-policy proxy outcomes в paper/shadow-режиме. Документ не является инструкцией по переносу параметров в биржевой бот. Журнал исходов обязан показывать терминальную причину отдельно от знака расчётного proxy P&amp;L.</w:t>
+        <w:rPr>
+          <w:sz w:val="21"/>
+        </w:rPr>
+        <w:t>Назначение: регламент принятия операторского решения по исполнимому grid-плану и чтения отдельной исследовательской directional trend-ветки, а также статистики exact-current-policy proxy outcomes. Документ не является инструкцией по переносу trend-параметров в биржевой бот.</w:t>
       </w:r>
     </w:p>
     <w:p>
       <w:r>
+        <w:rPr>
+          <w:sz w:val="21"/>
+        </w:rPr>
         <w:t>Граница системы. Репозиторий является recommendation/audit service, not OMS/EMS. Он не выставляет ордера, не подтверждает runtime-исполнимость, не знает очередь, partial fills, состояние аккаунта или фактическую доступность маржи. Статус recommended означает модельный сигнал, а не готовый к исполнению ордер.</w:t>
       </w:r>
     </w:p>
     <w:p>
       <w:pPr>
         <w:pStyle w:val="Heading1"/>
+        <w:spacing w:before="200" w:after="100"/>
       </w:pPr>
       <w:r>
+        <w:rPr>
+          <w:b/>
+          <w:sz w:val="32"/>
+        </w:rPr>
+        <w:t>Направленный тренд v1.1.0 - только shadow</w:t>
+      </w:r>
+    </w:p>
+    <w:p>
+      <w:pPr>
+        <w:pStyle w:val="ListBullet"/>
+      </w:pPr>
+      <w:r>
+        <w:rPr>
+          <w:sz w:val="21"/>
+        </w:rPr>
+        <w:t>directional_trend - отдельная стратегия, а не новое имя для long/short grid. Сетка остаётся range/mean-reversion механикой с directional bias.</w:t>
+      </w:r>
+    </w:p>
+    <w:p>
+      <w:pPr>
+        <w:pStyle w:val="ListBullet"/>
+      </w:pPr>
+      <w:r>
+        <w:rPr>
+          <w:sz w:val="21"/>
+        </w:rPr>
+        <w:t>Trend-план содержит одну long или short позицию, take-profit и stop-loss. Grid levels, усреднение и pyramiding запрещены контрактом.</w:t>
+      </w:r>
+    </w:p>
+    <w:p>
+      <w:pPr>
+        <w:pStyle w:val="ListBullet"/>
+      </w:pPr>
+      <w:r>
+        <w:rPr>
+          <w:sz w:val="21"/>
+        </w:rPr>
+        <w:t>В этой версии trend всегда имеет статус НЕ ТОРГОВАТЬ / shadow и код DIRECTIONAL_TREND_SHADOW_ONLY. Execution endpoint и создание bot_instance заблокированы fail-closed.</w:t>
+      </w:r>
+    </w:p>
+    <w:p>
+      <w:pPr>
+        <w:pStyle w:val="ListBullet"/>
+      </w:pPr>
+      <w:r>
+        <w:rPr>
+          <w:sz w:val="21"/>
+        </w:rPr>
+        <w:t>Trend-outcome рассчитывается отдельно по непрерывным минутным свечам: первое однозначное TP/SL или точный open на границе 12-часового horizon. Касание TP и SL в одной свече либо пропуск минуты цензурируются.</w:t>
+      </w:r>
+    </w:p>
+    <w:p>
+      <w:pPr>
+        <w:pStyle w:val="ListBullet"/>
+      </w:pPr>
+      <w:r>
+        <w:rPr>
+          <w:sz w:val="21"/>
+        </w:rPr>
+        <w:t>Grid и trend имеют разные outcome contracts и calibrators. Их результаты нельзя складывать в общий win rate или использовать как доказательство live edge.</w:t>
+      </w:r>
+    </w:p>
+    <w:p>
+      <w:pPr>
+        <w:pStyle w:val="Heading1"/>
+        <w:spacing w:before="200" w:after="100"/>
+      </w:pPr>
+      <w:r>
+        <w:rPr>
+          <w:b/>
+          <w:sz w:val="32"/>
+        </w:rPr>
         <w:t>Свежесть рекомендации и окно исхода v1.0.78</w:t>
       </w:r>
     </w:p>
@@ -43,6 +125,9 @@
         <w:pStyle w:val="ListBullet"/>
       </w:pPr>
       <w:r>
+        <w:rPr>
+          <w:sz w:val="21"/>
+        </w:rPr>
         <w:t>RECO_TTL_SEC — это срок операторской актуальности конкретной publication-chain. После его истечения старую рекомендацию исполнять нельзя; новый подтверждённый сигнал может быть опубликован как свежая рекомендация.</w:t>
       </w:r>
     </w:p>
@@ -51,6 +136,9 @@
         <w:pStyle w:val="ListBullet"/>
       </w:pPr>
       <w:r>
+        <w:rPr>
+          <w:sz w:val="21"/>
+        </w:rPr>
         <w:t>12-часовой label horizon — отдельное статистическое окно псевдо-позиции futures_grid. Пока оно не завершилось, свежая операторская публикация может иметь новый publication_root_rec_id, но сохраняет прежний outcome_root_rec_id и не создаёт дополнительный обучающий исход.</w:t>
       </w:r>
     </w:p>
@@ -59,6 +147,9 @@
         <w:pStyle w:val="ListBullet"/>
       </w:pPr>
       <w:r>
+        <w:rPr>
+          <w:sz w:val="21"/>
+        </w:rPr>
         <w:t>12 часов не считаются доказанно оптимальными. Переход на 6 или 24 часа требует отдельного versioned purged walk-forward сравнения; простое изменение константы меняет target, срок готовности метки, embargo и funding exposure.</w:t>
       </w:r>
     </w:p>
@@ -67,14 +158,22 @@
         <w:pStyle w:val="ListBullet"/>
       </w:pPr>
       <w:r>
+        <w:rPr>
+          <w:sz w:val="21"/>
+        </w:rPr>
         <w:t>В истории рекомендаций различайте «операторскую цепочку» и «независимое окно исхода». Несколько свежих публикаций могут относиться к одному outcome-window — это штатно и предотвращает псевдорепликацию данных.</w:t>
       </w:r>
     </w:p>
     <w:p>
       <w:pPr>
         <w:pStyle w:val="Heading1"/>
+        <w:spacing w:before="200" w:after="100"/>
       </w:pPr>
       <w:r>
+        <w:rPr>
+          <w:b/>
+          <w:sz w:val="32"/>
+        </w:rPr>
         <w:t>Проверка здоровья системы v1.0.71</w:t>
       </w:r>
     </w:p>
@@ -83,6 +182,9 @@
         <w:pStyle w:val="ListBullet"/>
       </w:pPr>
       <w:r>
+        <w:rPr>
+          <w:sz w:val="21"/>
+        </w:rPr>
         <w:t>Откройте «Здоровье системы» после запуска. Состояние БД должно показывать применённую outcome-миграцию и нулевой остаток materialization; обязательные фоновые контуры и outcome-worker не должны находиться в stalled/error.</w:t>
       </w:r>
     </w:p>
@@ -91,6 +193,9 @@
         <w:pStyle w:val="ListBullet"/>
       </w:pPr>
       <w:r>
+        <w:rPr>
+          <w:sz w:val="21"/>
+        </w:rPr>
         <w:t>«Работает, торговых кандидатов нет» означает, что инфраструктура исправна, но последняя публикация не содержит recommended/active. Это штатный fail-closed результат, а не разрешение обходить условия допуска.</w:t>
       </w:r>
     </w:p>
@@ -99,6 +204,9 @@
         <w:pStyle w:val="ListBullet"/>
       </w:pPr>
       <w:r>
+        <w:rPr>
+          <w:sz w:val="21"/>
+        </w:rPr>
         <w:t>В блоках причин отдельно показываются жёлтые «НЕ ТОРГОВАТЬ» (качество, экономика или доказательность не подтверждены) и красные «ЗАБЛОКИРОВАНО» (жёсткий запрет по риску, данным или предзапусковому контракту).</w:t>
       </w:r>
     </w:p>
@@ -107,20 +215,31 @@
         <w:pStyle w:val="ListBullet"/>
       </w:pPr>
       <w:r>
+        <w:rPr>
+          <w:sz w:val="21"/>
+        </w:rPr>
         <w:t>Для технического разбора нажмите «Скачать диагностику JSON». Передавайте этот файл и приблизительное время проблемы; не передавайте .env, API-ключи, пароли, полный DSN или production-дамп БД.</w:t>
       </w:r>
     </w:p>
     <w:p>
       <w:pPr>
         <w:pStyle w:val="Heading1"/>
+        <w:spacing w:before="200" w:after="100"/>
       </w:pPr>
       <w:r>
+        <w:rPr>
+          <w:b/>
+          <w:sz w:val="32"/>
+        </w:rPr>
         <w:t>Как читать русский интерфейс v1.0.64</w:t>
       </w:r>
     </w:p>
     <w:p>
       <w:pPr/>
       <w:r>
+        <w:rPr>
+          <w:sz w:val="21"/>
+        </w:rPr>
         <w:t>Все видимые оператору названия, статусы и сообщения приведены к однозначной русской терминологии. Исключения: LLM, UI, RR, собственное имя Bybit, USDT, обозначения торговых пар и машинные коды в подробной диагностике.</w:t>
       </w:r>
     </w:p>
@@ -129,6 +248,9 @@
         <w:pStyle w:val="ListBullet"/>
       </w:pPr>
       <w:r>
+        <w:rPr>
+          <w:sz w:val="21"/>
+        </w:rPr>
         <w:t>Покупка (рост) — направление, которое выигрывает при росте цены; внутреннее значение long.</w:t>
       </w:r>
     </w:p>
@@ -137,6 +259,9 @@
         <w:pStyle w:val="ListBullet"/>
       </w:pPr>
       <w:r>
+        <w:rPr>
+          <w:sz w:val="21"/>
+        </w:rPr>
         <w:t>Продажа (снижение) — направление, которое выигрывает при снижении цены; внутреннее значение short.</w:t>
       </w:r>
     </w:p>
@@ -145,6 +270,9 @@
         <w:pStyle w:val="ListBullet"/>
       </w:pPr>
       <w:r>
+        <w:rPr>
+          <w:sz w:val="21"/>
+        </w:rPr>
         <w:t>Нейтральная сетка — торговля внутри диапазона без единственной направленной цели прибыли; внутреннее значение neutral.</w:t>
       </w:r>
     </w:p>
@@ -153,6 +281,9 @@
         <w:pStyle w:val="ListBullet"/>
       </w:pPr>
       <w:r>
+        <w:rPr>
+          <w:sz w:val="21"/>
+        </w:rPr>
         <w:t>RR плана — расчётный чистый результат конкретного плана, делённый на стресс-убыток на аварийной границе выхода. Это не вероятность прибыли.</w:t>
       </w:r>
     </w:p>
@@ -161,6 +292,9 @@
         <w:pStyle w:val="ListBullet"/>
       </w:pPr>
       <w:r>
+        <w:rPr>
+          <w:sz w:val="21"/>
+        </w:rPr>
         <w:t>Доходность по наблюдениям — статистика созревших наблюдений текущего набора правил. «Недостаточно данных» не означает нулевую доходность.</w:t>
       </w:r>
     </w:p>
@@ -169,6 +303,9 @@
         <w:pStyle w:val="ListBullet"/>
       </w:pPr>
       <w:r>
+        <w:rPr>
+          <w:sz w:val="21"/>
+        </w:rPr>
         <w:t>Платёж финансирования — периодический платёж между участниками бессрочного фьючерса. Разница цен покупки и продажи и проскальзывание относятся к издержкам исполнения.</w:t>
       </w:r>
     </w:p>
@@ -177,6 +314,9 @@
         <w:pStyle w:val="ListBullet"/>
       </w:pPr>
       <w:r>
+        <w:rPr>
+          <w:sz w:val="21"/>
+        </w:rPr>
         <w:t>Предзапусковая проверка — последняя проверка цены, диапазона, количества, маржи и риска перед операторским подтверждением.</w:t>
       </w:r>
     </w:p>
@@ -185,6 +325,9 @@
         <w:pStyle w:val="ListBullet"/>
       </w:pPr>
       <w:r>
+        <w:rPr>
+          <w:sz w:val="21"/>
+        </w:rPr>
         <w:t>Значок вопроса открывает краткую подсказку. Полные числа, пороги, исходные сообщения и машинные коды находятся в окне «Детали».</w:t>
       </w:r>
     </w:p>
@@ -193,70 +336,109 @@
         <w:pStyle w:val="ListBullet"/>
       </w:pPr>
       <w:r>
+        <w:rPr>
+          <w:sz w:val="21"/>
+        </w:rPr>
         <w:t>Цветовой контракт: «МОЖНО ТОРГОВАТЬ» — зелёный; «НЕ ТОРГОВАТЬ» и «ОЖИДАЕТ ПРОВЕРКИ» — жёлтый; «ЗАБЛОКИРОВАНО» — красный. Цвет никогда не заменяет текстовую подпись.</w:t>
       </w:r>
     </w:p>
     <w:p>
       <w:pPr/>
       <w:r>
+        <w:rPr>
+          <w:sz w:val="21"/>
+        </w:rPr>
         <w:t>Главная таблица содержит шесть фиксированных колонок: символ, направление, RR плана, доходность по наблюдениям, решение и «Детали». Все уверенности, размеры, издержки и риск-показатели остаются внутри панели «Детали»; отдельная крайняя правая колонка нужна только для удобного последовательного открытия строк.</w:t>
       </w:r>
     </w:p>
     <w:p>
       <w:pPr>
         <w:pStyle w:val="Heading1"/>
+        <w:spacing w:before="200" w:after="100"/>
       </w:pPr>
       <w:r>
+        <w:rPr>
+          <w:b/>
+          <w:sz w:val="32"/>
+        </w:rPr>
         <w:t>Policy-conditioned evidence contract</w:t>
       </w:r>
     </w:p>
     <w:p>
       <w:pPr/>
       <w:r>
+        <w:rPr>
+          <w:sz w:val="21"/>
+        </w:rPr>
         <w:t>Каждый root сохраняет canonical policy_contract и SHA-256 fingerprint: model/outcome versions, feature schema, candidate thresholds, universe, LLM gate и active risk limits. Fit и denominator заново вычисляют digest из contract; скопированный hash при изменённом/отсутствующем contract считается unresolved.</w:t>
       </w:r>
     </w:p>
     <w:p>
       <w:pPr/>
       <w:r>
+        <w:rPr>
+          <w:sz w:val="21"/>
+        </w:rPr>
         <w:t>Policy evaluation и shadow exploration разделены. Статистические calibration gates исключаются из pre-calibration candidate policy, чтобы отсутствие модели не делало сбор evidence логически невозможным; hard data/risk/economic veto по-прежнему исключает root.</w:t>
       </w:r>
     </w:p>
     <w:p>
       <w:pPr/>
       <w:r>
+        <w:rPr>
+          <w:sz w:val="21"/>
+        </w:rPr>
         <w:t>Outcome worker ведёт независимый ledger waiting/censored/labeled и ротирует waiting rows по last_attempt_ts. Неразмеченные зрелые roots не могут исчезнуть из denominator или навсегда забить bounded queue.</w:t>
       </w:r>
     </w:p>
     <w:p>
       <w:pPr>
         <w:pStyle w:val="Heading1"/>
+        <w:spacing w:before="200" w:after="100"/>
       </w:pPr>
       <w:r>
+        <w:rPr>
+          <w:b/>
+          <w:sz w:val="32"/>
+        </w:rPr>
         <w:t>История исходов и текущая model lineage</w:t>
       </w:r>
     </w:p>
     <w:p>
       <w:r>
+        <w:rPr>
+          <w:sz w:val="21"/>
+        </w:rPr>
         <w:t>После обновления v1.0.58 таблица reco_outcomes не очищается: старые строки остаются неизменяемой аудиторской историей. Окно «Исходы» по умолчанию показывает только verified current_policy: текущую model lineage, точный active policy fingerprint и contract, digest которого успешно пересчитан. Исторический архив загружается и показывается отдельно; его win-rate и return не входят в текущий headline.</w:t>
       </w:r>
     </w:p>
     <w:p>
       <w:r>
+        <w:rPr>
+          <w:sz w:val="21"/>
+        </w:rPr>
         <w:t>Оператор должен различать: исторический архив; verified current-policy outcomes; outcomes текущей model_version; feature-eligible rows; фактически принятые fit rows; независимые matured temporal cohorts. Для новой policy нормальное начальное состояние — архив непуст, а current-policy/eligible/fit/time_clusters равны нулю.</w:t>
       </w:r>
     </w:p>
     <w:p>
       <w:pPr>
         <w:pStyle w:val="Heading1"/>
+        <w:spacing w:before="200" w:after="100"/>
       </w:pPr>
       <w:r>
+        <w:rPr>
+          <w:b/>
+          <w:sz w:val="32"/>
+        </w:rPr>
         <w:t>Граница исторического моделирования</w:t>
       </w:r>
     </w:p>
     <w:p>
       <w:pPr/>
       <w:r>
+        <w:rPr>
+          <w:sz w:val="21"/>
+        </w:rPr>
         <w:t>Recommendation publication и outcome labeling не зависят от текущих Bybit tickSize, qtyStep, minOrderQty, minNotional или статуса инструмента. Отсутствие этих данных не переводит рекомендацию в blocked и не отменяет созревший исторический outcome.</w:t>
       </w:r>
     </w:p>
@@ -264,100 +446,146 @@
       <w:pPr/>
       <w:r>
         <w:rPr>
-          <w:rFonts w:ascii="Arial" w:hAnsi="Arial"/>
-          <w:sz w:val="20"/>
+          <w:sz w:val="21"/>
         </w:rPr>
-        <w:t>В reasons.simulation_scope должны быть: mode=historical_proxy_only, runtime_order_submission=false, runtime_execution_validation=not_performed, exchange_fill_attestation=not_available. Это основной контракт текущей версии 1.0.78.</w:t>
+        <w:t>В reasons.simulation_scope должны быть: mode=historical_proxy_only, runtime_order_submission=false, runtime_execution_validation=not_performed, exchange_fill_attestation=not_available. Это основной контракт текущей версии 1.1.0.</w:t>
       </w:r>
     </w:p>
     <w:p>
       <w:pPr/>
       <w:r>
+        <w:rPr>
+          <w:sz w:val="21"/>
+        </w:rPr>
         <w:t>Явный предзапусковая проверка с текущими биржевыми фильтрами может использоваться только как отдельная справочная диагностика. Он не изменяет сохранённую рекомендацию, её статус, историческую геометрию, outcome или calibration evidence.</w:t>
       </w:r>
     </w:p>
     <w:p>
       <w:pPr>
         <w:pStyle w:val="Heading1"/>
+        <w:spacing w:before="200" w:after="100"/>
       </w:pPr>
       <w:r>
+        <w:rPr>
+          <w:b/>
+          <w:sz w:val="32"/>
+        </w:rPr>
         <w:t>Объёмное подтверждение proxy fills</w:t>
       </w:r>
     </w:p>
     <w:p>
       <w:pPr/>
       <w:r>
+        <w:rPr>
+          <w:sz w:val="21"/>
+        </w:rPr>
         <w:t>Trade-through означает только, что рынок прошёл за лимитный уровень. Полный proxy fill не подтверждён, если размер модельной заявки превышает весь наблюдаемый минутный объём.</w:t>
       </w:r>
     </w:p>
     <w:p>
       <w:pPr/>
       <w:r>
+        <w:rPr>
+          <w:sz w:val="21"/>
+        </w:rPr>
         <w:t>Для grid_label_v26 стартовая directional-позиция и все смоделированные fills расходуют общий candle-volume budget в base/contract quantity. Коды insufficient_candle_volume_for_full_fill и insufficient_candle_volume_for_initial_inventory означают: outcome unavailable, статистического evidence нет.</w:t>
       </w:r>
     </w:p>
     <w:p>
       <w:pPr/>
       <w:r>
+        <w:rPr>
+          <w:sz w:val="21"/>
+        </w:rPr>
         <w:t>Даже достаточный общий объём не доказывает очередь, ликвидность на конкретном уровне, partial fills или отсутствие market impact. Это консервативная историческая модель, а не exchange-attested execution.</w:t>
       </w:r>
     </w:p>
     <w:p>
       <w:pPr>
         <w:pStyle w:val="Heading2"/>
+        <w:spacing w:before="160" w:after="80"/>
       </w:pPr>
       <w:r>
+        <w:rPr>
+          <w:b/>
+          <w:sz w:val="26"/>
+        </w:rPr>
         <w:t>Ликвидность на границе horizon и при защитном закрытии</w:t>
       </w:r>
     </w:p>
     <w:p>
       <w:r>
+        <w:rPr>
+          <w:sz w:val="21"/>
+        </w:rPr>
         <w:t>Объёмный бюджет одной минутной свечи заканчивается вместе с этой свечой. Gap-fill на точном horizon-open не может использовать объём предыдущей минуты: он и terminal close остаточной позиции расходуют единый бюджет граничной свечи.</w:t>
       </w:r>
     </w:p>
     <w:p>
       <w:r>
+        <w:rPr>
+          <w:sz w:val="21"/>
+        </w:rPr>
         <w:t>При аварийная граница выхода все grid-fills до защитной границы и закрытие остаточного inventory расходуют единый объём breach-candle. Коды insufficient_candle_volume_for_terminal_liquidation и insufficient_candle_volume_for_kill_switch_liquidation означают NO EVIDENCE, а не частичную прибыль или убыток.</w:t>
       </w:r>
     </w:p>
     <w:p>
       <w:r>
+        <w:rPr>
+          <w:sz w:val="21"/>
+        </w:rPr>
         <w:t>Стратегический horizon не увеличивается: для futures_grid он остаётся 12 часов. Но label_available_ts наступает через 60 секунд после horizon-end, когда полный объём граничной минуты уже исторически известен. Это proxy-правило, а не runtime-подтверждение исполнения.</w:t>
       </w:r>
     </w:p>
     <w:p>
       <w:pPr>
         <w:pStyle w:val="Heading1"/>
+        <w:spacing w:before="200" w:after="100"/>
       </w:pPr>
       <w:r>
+        <w:rPr>
+          <w:b/>
+          <w:sz w:val="32"/>
+        </w:rPr>
         <w:t>Консервативная цена аварийная граница выхода</w:t>
       </w:r>
     </w:p>
     <w:p>
       <w:pPr/>
       <w:r>
+        <w:rPr>
+          <w:sz w:val="21"/>
+        </w:rPr>
         <w:t>При внутрисвечном пробое защитной границы историческая модель сначала обрабатывает resting grid-orders только до аварийная граница выхода. Остаточная позиция не считается идеально закрытой ровно по trigger-price, если свеча уже доказывает дальнейшее неблагоприятное движение.</w:t>
       </w:r>
     </w:p>
     <w:p>
       <w:pPr/>
       <w:r>
+        <w:rPr>
+          <w:sz w:val="21"/>
+        </w:rPr>
         <w:t>Residual SHORT при пробое верхнего аварийная граница выхода закрывается по наблюдаемому high свечи; residual LONG при пробое нижнего аварийная граница выхода — по наблюдаемому low. Если продолжение цены выгодно остаточной позиции, положительное проскальзывание не кредитуется и сохраняется цена границы.</w:t>
       </w:r>
     </w:p>
     <w:p>
       <w:pPr/>
       <w:r>
+        <w:rPr>
+          <w:sz w:val="21"/>
+        </w:rPr>
         <w:t>Диагностика: kill_switch_fill_confirmation=adverse_observed_extreme_v1, kill_switch_boundary_price, kill_switch_observed_extreme и kill_switch_liquidation_price. Gap, перескочивший границу между свечами, по-прежнему не размечается.</w:t>
       </w:r>
     </w:p>
     <w:p>
       <w:pPr>
         <w:pStyle w:val="Heading1"/>
+        <w:spacing w:before="200" w:after="100"/>
       </w:pPr>
       <w:r>
         <w:rPr>
-          <w:sz w:val="21"/>
+          <w:b/>
+          <w:sz w:val="32"/>
         </w:rPr>
         <w:t>Профиль риска поставки</w:t>
       </w:r>
@@ -370,7 +598,7 @@
         <w:rPr>
           <w:sz w:val="21"/>
         </w:rPr>
-        <w:t>`min_leverage=3`, `max_leverage=5`; 3-5x is the baseline actionable leverage interval.</w:t>
+        <w:t>min_leverage=3, max_leverage=5; 3-5x is the baseline actionable leverage interval.</w:t>
       </w:r>
     </w:p>
     <w:p>
@@ -392,7 +620,7 @@
         <w:rPr>
           <w:sz w:val="21"/>
         </w:rPr>
-        <w:t>Поддерживается только Bybit Linear USDT Futures Grid; spot/inverse/options/non-USDT блокируются.</w:t>
+        <w:t>Для operator execution поддерживается только Bybit Linear USDT Futures Grid. Отдельный directional_trend публикуется только как shadow research; spot/inverse/options/non-USDT блокируются.</w:t>
       </w:r>
     </w:p>
     <w:p>
@@ -400,16 +628,21 @@
         <w:pStyle w:val="ListBullet"/>
       </w:pPr>
       <w:r>
+        <w:rPr>
+          <w:sz w:val="21"/>
+        </w:rPr>
         <w:t>Любой deterministic data/risk/model blocker означает НЕ ТОРГОВАТЬ. Необязательная текущая предзапусковая проверка-диагностика не переписывает модельный статус.</w:t>
       </w:r>
     </w:p>
     <w:p>
       <w:pPr>
         <w:pStyle w:val="Heading1"/>
+        <w:spacing w:before="200" w:after="100"/>
       </w:pPr>
       <w:r>
         <w:rPr>
-          <w:sz w:val="21"/>
+          <w:b/>
+          <w:sz w:val="32"/>
         </w:rPr>
         <w:t>Устойчивость сигнала и идентичность рекомендации</w:t>
       </w:r>
@@ -435,17 +668,22 @@
     <w:p>
       <w:pPr/>
       <w:r>
+        <w:rPr>
+          <w:sz w:val="21"/>
+        </w:rPr>
         <w:t>Исходная уверенность — эвристическое качество модельного сигнала, а не вероятность прибыли и не runtime-исполнимость. Даже откалиброванная уверенность относится только к proxy outcomes. Legacy expected_rr остаётся внутренним heuristic capture score и не показывается оператору как R/R. Для решения используются отдельные RR плана и Доходность по наблюдениям с доверительным интервалом; ни один из них не отменяет BLOCKED/НЕ ТОРГОВАТЬ.</w:t>
       </w:r>
     </w:p>
     <w:p>
       <w:pPr>
         <w:pStyle w:val="Heading1"/>
+        <w:spacing w:before="200" w:after="100"/>
       </w:pPr>
       <w:r>
         <w:rPr>
           <w:rFonts w:ascii="Arial" w:hAnsi="Arial"/>
-          <w:sz w:val="20"/>
+          <w:b/>
+          <w:sz w:val="32"/>
         </w:rPr>
         <w:t>Метрики принятия решения v1.0.63</w:t>
       </w:r>
@@ -455,7 +693,7 @@
       <w:r>
         <w:rPr>
           <w:rFonts w:ascii="Arial" w:hAnsi="Arial"/>
-          <w:sz w:val="20"/>
+          <w:sz w:val="21"/>
         </w:rPr>
         <w:t>Основная таблица сведена к минимальному набору для решения: символ, направление, RR плана, Доходность по наблюдениям, решение и отдельная крайняя правая колонка «Детали». Отдельной колонки «Причина» нет. При наведении указателя или фокусе на лейбле решения показывается одна короткая человекочитаемая подсказка, например «Возвратность цены не подтверждена» или «Недостаточно данных об эффективности». Полные коды, числовые пороги, исходные сообщения, уверенности, запас капитала, цена, диапазон, размер позиции, платёж финансирования и технические проверки остаются в окне «Детали».</w:t>
       </w:r>
@@ -465,6 +703,9 @@
         <w:pStyle w:val="ListBullet"/>
       </w:pPr>
       <w:r>
+        <w:rPr>
+          <w:sz w:val="21"/>
+        </w:rPr>
         <w:t>RR плана — сценарное отношение projected net reward конкретного grid-плана к worst-side аварийная граница выхода loss. Числитель учитывает завершённые пары после recurring fees, отдельно разовые разница цен покупки и продажи / проскальзывание и adverse платёж финансирования. Знаменатель включает ценовой убыток и terminal execution cost; maintenance reserve остаётся стресс-резервом, а не реализованным убытком.</w:t>
       </w:r>
     </w:p>
@@ -473,6 +714,9 @@
         <w:pStyle w:val="ListBullet"/>
       </w:pPr>
       <w:r>
+        <w:rPr>
+          <w:sz w:val="21"/>
+        </w:rPr>
         <w:t>Доходность по наблюдениям — средняя net-доходность matured proxy outcomes точной текущей policy. Показываются двусторонний Student-t confidence interval, expected shortfall и mean-to-tail ratio, когда выборка позволяет их оценить.</w:t>
       </w:r>
     </w:p>
@@ -481,100 +725,153 @@
         <w:pStyle w:val="ListBullet"/>
       </w:pPr>
       <w:r>
+        <w:rPr>
+          <w:sz w:val="21"/>
+        </w:rPr>
         <w:t>Heuristic capture score (legacy expected_rr) — внутренний ranking diagnostic. Он может присутствовать в техническом JSON для совместимости, но не является операторским reward:risk и не выводится в основной таблице, истории или экономическом блоке.</w:t>
       </w:r>
     </w:p>
     <w:p>
       <w:pPr/>
       <w:r>
+        <w:rPr>
+          <w:sz w:val="21"/>
+        </w:rPr>
         <w:t>Интерпретация: RR плана отвечает на вопрос «что даёт и чем рискует этот рассчитанный план при заданных допущениях»; empirical expectancy отвечает на вопрос «что наблюдалось у неизменной policy». Положительное значение одного показателя не компенсирует отсутствие или неопределённость другого. Старые строки до v1.0.61 могут корректно показывать «недоступно», поскольку система не переписывает исторические рекомендации задним числом.</w:t>
       </w:r>
     </w:p>
     <w:p>
       <w:pPr>
         <w:pStyle w:val="Heading1"/>
+        <w:spacing w:before="200" w:after="100"/>
       </w:pPr>
       <w:r>
+        <w:rPr>
+          <w:b/>
+          <w:sz w:val="32"/>
+        </w:rPr>
         <w:t>Purged OOF для feature LogReg</w:t>
       </w:r>
     </w:p>
     <w:p>
       <w:r>
+        <w:rPr>
+          <w:sz w:val="21"/>
+        </w:rPr>
         <w:t>Полная feature LogReg не считается калиброванной только потому, что достигнут денежный floor CALIB_MIN_SAMPLES=80 или коэффициенты обучены на retained-выборке. Для источника bot_logreg действует отдельный minimum probability sample floor 300 exact-policy labels, а также sufficient purged OOF predictions, fitted Platt-on-top и accepted aggregate/terminal held-out skill.</w:t>
       </w:r>
     </w:p>
     <w:p>
       <w:pPr/>
       <w:r>
+        <w:rPr>
+          <w:sz w:val="21"/>
+        </w:rPr>
         <w:t>Temporal floor: при 12-часовом label horizon и требовании 20 неперекрывающихся temporal cohorts денежный temporal gate физически не может быть выполнен быстрее 10 суток непрерывной работы с неизменным policy fingerprint. Любая смена model/policy fingerprint начинает новую exact-policy evidence-когорту; архив прежней политики в текущий прогресс не входит.</w:t>
       </w:r>
     </w:p>
     <w:p>
       <w:r>
+        <w:rPr>
+          <w:sz w:val="21"/>
+        </w:rPr>
         <w:t>В confidence_model проверяйте purged_oof_status, purged_oof_skill_status, aggregate/final log-loss и policy fingerprint. Модель разрешена только при sufficient + accepted и превосходстве score-only/null baseline как на walk-forward совокупности, так и на терминальном будущем блоке. Иначе coefficients и Platt не используются, а capped raw confidence остаётся audit-only.</w:t>
       </w:r>
     </w:p>
     <w:p>
       <w:r>
+        <w:rPr>
+          <w:sz w:val="21"/>
+        </w:rPr>
         <w:t>In-sample score-only Platt больше не является probability fallback. Активный LogReg + Platt обучается только на данных до терминального holdout; сам holdout не входит в финальный fit. Недостаток или отсутствие held-out skill при REQUIRE_CONF_GATE=1 означает CALIBRATED_CONFIDENCE_UNAVAILABLE и НЕ ТОРГОВАТЬ.</w:t>
       </w:r>
     </w:p>
     <w:p>
       <w:pPr>
         <w:pStyle w:val="Heading1"/>
+        <w:spacing w:before="200" w:after="100"/>
       </w:pPr>
       <w:r>
+        <w:rPr>
+          <w:b/>
+          <w:sz w:val="32"/>
+        </w:rPr>
         <w:t>Независимость временных evidence-кластеров</w:t>
       </w:r>
     </w:p>
     <w:p>
       <w:r>
+        <w:rPr>
+          <w:sz w:val="21"/>
+        </w:rPr>
         <w:t>Количество монет не равно количеству независимых экспериментов. Сначала outcomes с одинаковым временем решения ts объединяются в один поперечный временной cohort. Затем из cohort-интервалов [ts, label_available_ts] выбирается максимальное по числу детерминированное множество попарно непересекающихся интервалов методом earliest-finish. Транзитивное перекрытие больше не склеивает непрерывную историю в один бесконечно растущий кластер.</w:t>
       </w:r>
     </w:p>
     <w:p>
       <w:r>
+        <w:rPr>
+          <w:sz w:val="21"/>
+        </w:rPr>
         <w:t>Для штатного CALIB_MIN_SAMPLES=80 требуется минимум 20 эффективных попарно неперекрывающихся time cohorts. Строки с одинаковым recommendation timestamp сначала объединяются в одно cross-sectional решение, затем earliest-finish scheduling выбирает максимальный набор неперекрывающихся интервалов. Односторонняя 95% lower bound теперь использует Student-t critical value по effective sample size, а не прежнюю normal approximation; граница должна быть строго положительной на уровне строк и cohort means.</w:t>
       </w:r>
     </w:p>
     <w:p>
       <w:r>
+        <w:rPr>
+          <w:sz w:val="21"/>
+        </w:rPr>
         <w:t>Недостаток временных кластеров, отсутствующая диагностика или неположительная cluster lower bound означает shadow НЕ ТОРГОВАТЬ с PROXY_MONETARY_EXPECTANCY_UNPROVEN. Высокий score, win rate или десятки коррелированных символов не являются основанием для обхода.</w:t>
       </w:r>
     </w:p>
     <w:p>
       <w:pPr>
         <w:pStyle w:val="Heading1"/>
+        <w:spacing w:before="200" w:after="100"/>
       </w:pPr>
       <w:r>
+        <w:rPr>
+          <w:b/>
+          <w:sz w:val="32"/>
+        </w:rPr>
         <w:t>Денежное ожидание калибровки</w:t>
       </w:r>
     </w:p>
     <w:p>
       <w:pPr/>
       <w:r>
+        <w:rPr>
+          <w:sz w:val="21"/>
+        </w:rPr>
         <w:t>Высокая доля успешных proxy labels не является доказательством прибыли. Cohort из множества малых выигрышей и меньшего числа крупных убытков может иметь высокий hit rate, но отрицательный net return.</w:t>
       </w:r>
     </w:p>
     <w:p>
       <w:pPr/>
       <w:r>
+        <w:rPr>
+          <w:sz w:val="21"/>
+        </w:rPr>
         <w:t>Actionable futures_grid допускается только когда точная policy-conditioned matured-return выборка имеет достаточный Kish effective sample size и положительную одностороннюю 95% Student-t lower bound. Каждый matured policy root входит в denominator как labeled, censored или unresolved. Любой censored/unresolved/invalid-labeled root либо исчезнувшая поддержка cache означает PROXY_OUTCOME_CENSORING_UNBOUNDED и НЕ ТОРГОВАТЬ немедленно. Это защищает от survivorship bias, но создаёт открытый liveness-риск: один постоянный censored root способен блокировать всю policy-когорту. Не обходить вручную; необходим отдельный validated bounded-censor contract.</w:t>
       </w:r>
     </w:p>
     <w:p>
       <w:pPr/>
       <w:r>
+        <w:rPr>
+          <w:sz w:val="21"/>
+        </w:rPr>
         <w:t>Это защитный OHLCV proxy gate, а не доказательство live edge, исполнимости или гарантии прибыли. Live validation учитывает положительный PnL только после stopped + local flat + complete terminal reconciliation от доверенного внешнего read-only Bybit private-API adapter; totals fills/fees/платёж финансирования, event counts, position и open orders должны совпасть. Сам сервис проверяет согласованность, но не криптографически доказывает происхождение внешнего снимка.</w:t>
       </w:r>
     </w:p>
     <w:p>
       <w:pPr>
         <w:pStyle w:val="Heading1"/>
+        <w:spacing w:before="200" w:after="100"/>
       </w:pPr>
       <w:r>
         <w:rPr>
-          <w:sz w:val="21"/>
+          <w:b/>
+          <w:sz w:val="32"/>
         </w:rPr>
         <w:t>Подтверждение диапазонного edge</w:t>
       </w:r>
@@ -600,16 +897,21 @@
     <w:p>
       <w:pPr/>
       <w:r>
+        <w:rPr>
+          <w:sz w:val="21"/>
+        </w:rPr>
         <w:t>MEAN_REVERSION_EVIDENCE_INSUFFICIENT означает hard blocked из-за недостатка обязательных исторических данных. MEAN_REVERSION_EDGE_UNCONFIRMED означает strategy no_trade: evidence рассчитан, но score ниже MEAN_REVERSION_MIN_SCORE (по умолчанию 0.25). Этот порог является candidate screen и не доказывает ни прибыль, ни отрицательное ожидание; monetary expectancy проверяется отдельно по matured outcomes. Высокий raw confidence или LLM verdict решение не отменяют.</w:t>
       </w:r>
     </w:p>
     <w:p>
       <w:pPr>
         <w:pStyle w:val="Heading1"/>
+        <w:spacing w:before="200" w:after="100"/>
       </w:pPr>
       <w:r>
         <w:rPr>
-          <w:sz w:val="21"/>
+          <w:b/>
+          <w:sz w:val="32"/>
         </w:rPr>
         <w:t>Directional TP/SL</w:t>
       </w:r>
@@ -661,10 +963,12 @@
     <w:p>
       <w:pPr>
         <w:pStyle w:val="Heading1"/>
+        <w:spacing w:before="200" w:after="100"/>
       </w:pPr>
       <w:r>
         <w:rPr>
-          <w:sz w:val="21"/>
+          <w:b/>
+          <w:sz w:val="32"/>
         </w:rPr>
         <w:t>Proxy outcome, shadow sample и калибровка</w:t>
       </w:r>
@@ -674,6 +978,9 @@
         <w:pStyle w:val="ListBullet"/>
       </w:pPr>
       <w:r>
+        <w:rPr>
+          <w:sz w:val="21"/>
+        </w:rPr>
         <w:t>Отдельное касание directional tp_per_leg не подтверждает прибыль всего grid. Arithmetic tp_per_leg совпадает с полным соседним interval. Grid Profit завершённой пары уменьшается только на комиссии её двух resting fills. Bid/ask spread и slippage относятся к разовой market setup/terminal exit, а платёж финансирования — к position-time Total P&amp;L; эти слои нельзя повторно вычитать из каждой пары. Одна и та же сетка может закрываться многократно, поэтому cumulative completed trades не ограничиваются grid_count.</w:t>
       </w:r>
     </w:p>
@@ -683,7 +990,7 @@
       </w:pPr>
       <w:r>
         <w:rPr>
-          <w:sz w:val="19"/>
+          <w:sz w:val="21"/>
         </w:rPr>
         <w:t>Outcome worker ведёт quantity-aware endpoint ledger уровней: cash, LONG/SHORT lots, цены inferred fills и целое количество resting orders на каждом уровне. Если ближайший TP исходной directional-позиции и replacement TP после соседнего buy/sell совпадают по цене, оба lots сохраняются и исполняются; один не заменяет другой. Наблюдаемые close→open и open→close движения учитываются отдельно; двусторонний intrabar order из OHLC не выдумывается.</w:t>
       </w:r>
@@ -693,6 +1000,9 @@
         <w:pStyle w:val="ListBullet"/>
       </w:pPr>
       <w:r>
+        <w:rPr>
+          <w:sz w:val="21"/>
+        </w:rPr>
         <w:t>Outcome contract остаётся grid_label_v26. Исторические outcomes сохраняются как аудит. Текущая recommendation lineage bybit-taxonomy-v11-separated-operator-outcome-lineage принимает только verified exact-policy outcomes; bot/global calibrators используют v21. Direction v14 использует horizon-price target, но его Platt audit-only до отдельного chronological skill gate и не меняет decision feature.</w:t>
       </w:r>
     </w:p>
@@ -701,16 +1011,21 @@
         <w:pStyle w:val="ListBullet"/>
       </w:pPr>
       <w:r>
+        <w:rPr>
+          <w:sz w:val="21"/>
+        </w:rPr>
         <w:t>Исторический платёж финансирования в proxy outcomes берётся только из фактически рассчитанных Bybit settlements, собранных через публичный платёж финансирования-history endpoint. Ticker платёж финансированияRate остаётся прогнозом для approval/risk и не подменяет исторический факт. Положительная ставка означает: LONG платит, SHORT получает; отрицательная ставка меняет знак. Для canonical proxy ret и monetary calibration adverse settled платёж финансирования всегда вычитается, а положительный receipt не кредитуется как устойчивый alpha и не может превратить плоскую/убыточную сетку в success. Signed платёж финансирования остаётся диагностикой исторической модели; возможная внешняя post-hoc сверка не входит в runtime-контракт системы. Если в момент ожидаемого платёж финансирования event позиция ненулевая, а settlement row отсутствует, label не создаётся fail-closed.</w:t>
       </w:r>
     </w:p>
     <w:p>
       <w:pPr>
         <w:pStyle w:val="Heading1"/>
+        <w:spacing w:before="200" w:after="100"/>
       </w:pPr>
       <w:r>
         <w:rPr>
-          <w:sz w:val="21"/>
+          <w:b/>
+          <w:sz w:val="32"/>
         </w:rPr>
         <w:t>Обязательный trade plan</w:t>
       </w:r>
@@ -723,7 +1038,7 @@
         <w:rPr>
           <w:sz w:val="21"/>
         </w:rPr>
-        <w:t>Complete `params.trade_plan` exists; no empty/corrupted payload.</w:t>
+        <w:t>Complete params.trade_plan exists; no empty/corrupted payload.</w:t>
       </w:r>
     </w:p>
     <w:p>
@@ -753,16 +1068,21 @@
         <w:pStyle w:val="ListBullet"/>
       </w:pPr>
       <w:r>
+        <w:rPr>
+          <w:sz w:val="21"/>
+        </w:rPr>
         <w:t>explicit leverage, общая маржа, one-way position mode, sizing/economics for qtyStep, minNotional, active resting-order count, full initial opening-order committed slots/notional, maximum one-way position exposure and общая маржа equity-stress checks.</w:t>
       </w:r>
     </w:p>
     <w:p>
       <w:pPr>
         <w:pStyle w:val="Heading1"/>
+        <w:spacing w:before="200" w:after="100"/>
       </w:pPr>
       <w:r>
         <w:rPr>
-          <w:sz w:val="21"/>
+          <w:b/>
+          <w:sz w:val="32"/>
         </w:rPr>
         <w:t>НЕ ТОРГОВАТЬ / BLOCKED условия</w:t>
       </w:r>
@@ -772,6 +1092,9 @@
         <w:pStyle w:val="ListBullet"/>
       </w:pPr>
       <w:r>
+        <w:rPr>
+          <w:sz w:val="21"/>
+        </w:rPr>
         <w:t>Hard blocked: MEAN_REVERSION_EVIDENCE_INSUFFICIENT, INVALID_MARKET_REFERENCE_PRICE и иные data/risk/model failures. Strategy no_trade: MEAN_REVERSION_EDGE_UNCONFIRMED либо непрохождение score/confidence/economics.</w:t>
       </w:r>
     </w:p>
@@ -780,6 +1103,9 @@
         <w:pStyle w:val="ListBullet"/>
       </w:pPr>
       <w:r>
+        <w:rPr>
+          <w:sz w:val="21"/>
+        </w:rPr>
         <w:t>Устаревшая operator publication-chain, stale market data, live ticker вне range/аварийной границы выхода, отсутствующая пара bid/ask, spread &gt;14 bps, recurring grid edge &lt;2 bps или gross/fee coverage &lt;=1,10x. Истечение operator TTL блокирует запуск старой рекомендации, но не создаёт новый независимый outcome-root до конца label horizon.</w:t>
       </w:r>
     </w:p>
@@ -788,6 +1114,9 @@
         <w:pStyle w:val="ListBullet"/>
       </w:pPr>
       <w:r>
+        <w:rPr>
+          <w:sz w:val="21"/>
+        </w:rPr>
         <w:t>В explicit operator предзапусковая проверка отсутствующие tickSize, qtyStep, minNotional, leverageFilter или non-Trading status делают только текущую справочную проверку недоступной; historical recommendation/outcome из-за этого не блокируются.</w:t>
       </w:r>
     </w:p>
@@ -807,6 +1136,9 @@
         <w:pStyle w:val="ListBullet"/>
       </w:pPr>
       <w:r>
+        <w:rPr>
+          <w:sz w:val="21"/>
+        </w:rPr>
         <w:t>Оценочный loss до adverse аварийная граница выхода превышает остаток дневного лимита max_daily_dd_usdt - daily_dd (DAILY_LOSS_BUDGET_EXCEEDED). Fallback notional обязан разделять commitment и exposure: для NEUTRAL commitment включает все первоначальные Buy/Sell opening orders, а maximum one-way position — только более крупный directional stack; для LONG/SHORT учитываются initial inventory плюс adverse-side openings. Total active-order count, committed slots и max-position slots нельзя взаимозаменять.</w:t>
       </w:r>
     </w:p>
@@ -824,31 +1156,45 @@
     <w:p>
       <w:pPr>
         <w:pStyle w:val="Heading1"/>
+        <w:spacing w:before="200" w:after="100"/>
       </w:pPr>
       <w:r>
         <w:rPr>
-          <w:sz w:val="21"/>
+          <w:b/>
+          <w:sz w:val="32"/>
         </w:rPr>
         <w:t>Практическая последовательность</w:t>
       </w:r>
     </w:p>
     <w:p>
       <w:r>
+        <w:rPr>
+          <w:sz w:val="21"/>
+        </w:rPr>
         <w:t>1. Проверить status/effective_status: blocked означает жёсткий data/risk/model отказ; no_trade означает неподтверждённый тезис или статистический/economic gate.</w:t>
       </w:r>
     </w:p>
     <w:p>
       <w:r>
+        <w:rPr>
+          <w:sz w:val="21"/>
+        </w:rPr>
         <w:t>2. Сверить полноту исторических данных, features_ref_ts, horizon, cost/платёж финансирования assumptions, simulation_scope и денежные/временные diagnostics.</w:t>
       </w:r>
     </w:p>
     <w:p>
       <w:r>
+        <w:rPr>
+          <w:sz w:val="21"/>
+        </w:rPr>
         <w:t>3. Не интерпретировать trade_plan как готовый биржевой payload: это геометрия исторической симуляции.</w:t>
       </w:r>
     </w:p>
     <w:p>
       <w:r>
+        <w:rPr>
+          <w:sz w:val="21"/>
+        </w:rPr>
         <w:t>4. Не снижать severity guard-а вручную и не превращать blocked/no_trade в положительный исследовательский результат.</w:t>
       </w:r>
     </w:p>
@@ -869,6 +1215,9 @@
         <w:pStyle w:val="ListBullet"/>
       </w:pPr>
       <w:r>
+        <w:rPr>
+          <w:sz w:val="21"/>
+        </w:rPr>
         <w:t>Полный no_trade-кандидат без hard blocks может получить outcome_policy.sample_role=shadow_no_trade и после horizon войти в исследовательскую proxy-выборку. Это не реальный запуск, не exchange fill и не основание утверждать исполнимость.</w:t>
       </w:r>
     </w:p>
@@ -877,6 +1226,9 @@
         <w:pStyle w:val="ListBullet"/>
       </w:pPr>
       <w:r>
+        <w:rPr>
+          <w:sz w:val="21"/>
+        </w:rPr>
         <w:t>Необученный, цензурированный или не подтвердивший terminal held-out skill bot-specific calibrator означает shadow НЕ ТОРГОВАТЬ: raw confidence audit-only. 80 exact-policy rows — только денежный floor; при REQUIRE_CONF_GATE=1 полная probability readiness начинается не ранее 300 rows и требует accepted purged OOF/terminal holdout. Положительный cache обязан воспроизводиться по текущему policy denominator; исчезновение supporting rows отключает его. Подтверждённый negative expectancy сохраняется как консервативный veto.</w:t>
       </w:r>
     </w:p>
@@ -885,22 +1237,35 @@
         <w:pStyle w:val="ListBullet"/>
       </w:pPr>
       <w:r>
+        <w:rPr>
+          <w:sz w:val="21"/>
+        </w:rPr>
         <w:t>Отсутствие recommended/active является допустимым и безопасным результатом, особенно при отрицательной monetary proxy-статистике, коде PROXY_MONETARY_EXPECTANCY_NON_POSITIVE или слабом range edge. Система не обязана постоянно выдавать сделки.</w:t>
       </w:r>
     </w:p>
     <w:p>
       <w:pPr>
         <w:pStyle w:val="Heading2"/>
+        <w:spacing w:before="160" w:after="80"/>
       </w:pPr>
       <w:r>
+        <w:rPr>
+          <w:b/>
+          <w:sz w:val="26"/>
+        </w:rPr>
         <w:t>Нет положительных модельных рекомендаций</w:t>
       </w:r>
     </w:p>
     <w:p>
       <w:pPr>
         <w:pStyle w:val="Heading1"/>
+        <w:spacing w:before="200" w:after="100"/>
       </w:pPr>
       <w:r>
+        <w:rPr>
+          <w:b/>
+          <w:sz w:val="32"/>
+        </w:rPr>
         <w:t>Опциональная внешняя post-hoc сверка PnL</w:t>
       </w:r>
     </w:p>
@@ -909,6 +1274,9 @@
         <w:pStyle w:val="ListBullet"/>
       </w:pPr>
       <w:r>
+        <w:rPr>
+          <w:sz w:val="21"/>
+        </w:rPr>
         <w:t>Если отдельно подключена внешняя post-hoc сверка, каждый fill передаётся immutable event с execId/orderId, price/qty и связью с rec_id. Этот контур не используется для runtime-публикации рекомендаций и не меняет историческую fill-модель.</w:t>
       </w:r>
     </w:p>
@@ -939,6 +1307,9 @@
         <w:pStyle w:val="ListBullet"/>
       </w:pPr>
       <w:r>
+        <w:rPr>
+          <w:sz w:val="21"/>
+        </w:rPr>
         <w:t>Для внешней post-hoc диагностики может фиксироваться отдельный timestamped benchmark; он не является обязательной частью системы исторического моделирования.</w:t>
       </w:r>
     </w:p>
@@ -947,6 +1318,9 @@
         <w:pStyle w:val="ListBullet"/>
       </w:pPr>
       <w:r>
+        <w:rPr>
+          <w:sz w:val="21"/>
+        </w:rPr>
         <w:t>Запись execution evidence и terminal reconciliation требует ADMIN_API_KEY. До полного reconciliation записи descriptive-only: положительные суммы не кредитуются в live PnL или risk recovery, а неподтверждённые убытки учитываются консервативно. Внешний adapter остаётся отдельной доверенной границей и не выставляет ордера через этот сервис.</w:t>
       </w:r>
     </w:p>
@@ -955,6 +1329,9 @@
         <w:pStyle w:val="ListBullet"/>
       </w:pPr>
       <w:r>
+        <w:rPr>
+          <w:sz w:val="21"/>
+        </w:rPr>
         <w:t>При использовании внешнего адаптера он обязан преобразовать millisecond timestamps в UTC seconds, сохранить исходный payload и учесть fee/rebates. Это отдельная интеграция, а не runtime-функция рекомендательной системы.</w:t>
       </w:r>
     </w:p>
@@ -979,8 +1356,13 @@
     <w:p>
       <w:pPr>
         <w:pStyle w:val="Heading1"/>
+        <w:spacing w:before="200" w:after="100"/>
       </w:pPr>
       <w:r>
+        <w:rPr>
+          <w:b/>
+          <w:sz w:val="32"/>
+        </w:rPr>
         <w:t>Опциональная terminal finalization внешнего evidence</w:t>
       </w:r>
     </w:p>
@@ -989,6 +1371,9 @@
         <w:pStyle w:val="ListBullet"/>
       </w:pPr>
       <w:r>
+        <w:rPr>
+          <w:sz w:val="21"/>
+        </w:rPr>
         <w:t>Частичные события сохраняются immutable и видимы в audit API, но не входят в LIVE_VALIDATION_* до передачи всех opening/closing fills и signed платёж финансирования внешним read-only adapter-ом.</w:t>
       </w:r>
     </w:p>
@@ -997,6 +1382,9 @@
         <w:pStyle w:val="ListBullet"/>
       </w:pPr>
       <w:r>
+        <w:rPr>
+          <w:sz w:val="21"/>
+        </w:rPr>
         <w:t>Проверяйте поля total_pnl_finalized=true, position_flat=true и net_position_qty около нуля. validation_ineligible_reasons объясняет отсутствие eligibility.</w:t>
       </w:r>
     </w:p>
@@ -1005,14 +1393,22 @@
         <w:pStyle w:val="ListBullet"/>
       </w:pPr>
       <w:r>
+        <w:rPr>
+          <w:sz w:val="21"/>
+        </w:rPr>
         <w:t>Stopped status сам по себе не означает завершённый PnL. Любой unmatched Buy/Sell quantity означает residual inventory и исключает bot из live-validation.</w:t>
       </w:r>
     </w:p>
     <w:p>
       <w:pPr>
         <w:pStyle w:val="Heading1"/>
+        <w:spacing w:before="200" w:after="100"/>
       </w:pPr>
       <w:r>
+        <w:rPr>
+          <w:b/>
+          <w:sz w:val="32"/>
+        </w:rPr>
         <w:t>Опциональный stop-критерий по внешнему evidence</w:t>
       </w:r>
     </w:p>
@@ -1021,8 +1417,10 @@
         <w:pStyle w:val="ListBullet"/>
       </w:pPr>
       <w:r>
-        <w:rPr/>
-        <w:t>При отдельно включённой post-hoc validation в gate входят только stopped bots той же model_version с terminally finalized evidence. Текущая версия сигнала: bybit-taxonomy-v11-separated-operator-outcome-lineage. Текущие ключи: logreg_futures_grid_v21, logreg_global_v21 и platt_direction_v14.</w:t>
+        <w:rPr>
+          <w:sz w:val="21"/>
+        </w:rPr>
+        <w:t>При отдельно включённой post-hoc validation в gate входят только stopped bots той же model_version с terminally finalized evidence. Grid identity: bybit-taxonomy-v11-separated-operator-outcome-lineage; trend shadow identity: bybit-taxonomy-v11-separated-operator-outcome-lineage+directional-trend-v1. Ключи: logreg_futures_grid_v21 и logreg_directional_trend_v1; разные механики не объединяются в один inference-calibrator.</w:t>
       </w:r>
     </w:p>
     <w:p>
@@ -1061,13 +1459,21 @@
     <w:p>
       <w:pPr>
         <w:pStyle w:val="Heading1"/>
+        <w:spacing w:before="200" w:after="100"/>
       </w:pPr>
       <w:r>
+        <w:rPr>
+          <w:b/>
+          <w:sz w:val="32"/>
+        </w:rPr>
         <w:t>Историческая справка v1.0.48: обязательная exchange geometry (отменена в v1.0.51)</w:t>
       </w:r>
     </w:p>
     <w:p>
       <w:r>
+        <w:rPr>
+          <w:sz w:val="21"/>
+        </w:rPr>
         <w:t>Описанное ниже обязательное применение текущих Bybit-фильтров было удалено в v1.0.51 как несоответствующее historical-only контракту.</w:t>
       </w:r>
     </w:p>
@@ -1077,6 +1483,9 @@
         <w:spacing w:after="60"/>
       </w:pPr>
       <w:r>
+        <w:rPr>
+          <w:sz w:val="21"/>
+        </w:rPr>
         <w:t>Не применять в v1.0.51+: текущие exchange metadata являются только необязательной справочной диагностикой и не блокируют модельную рекомендацию.</w:t>
       </w:r>
     </w:p>
@@ -1086,6 +1495,9 @@
         <w:spacing w:after="60"/>
       </w:pPr>
       <w:r>
+        <w:rPr>
+          <w:sz w:val="21"/>
+        </w:rPr>
         <w:t>Диапазон, reference, аварийная граница выхода и grid step должны быть кратны tick_size.</w:t>
       </w:r>
     </w:p>
@@ -1095,6 +1507,9 @@
         <w:spacing w:after="60"/>
       </w:pPr>
       <w:r>
+        <w:rPr>
+          <w:sz w:val="21"/>
+        </w:rPr>
         <w:t>Количество на ордер должно быть кратно qty_step и не ниже min_order_qty/min_notional.</w:t>
       </w:r>
     </w:p>
@@ -1104,6 +1519,9 @@
         <w:spacing w:after="60"/>
       </w:pPr>
       <w:r>
+        <w:rPr>
+          <w:sz w:val="21"/>
+        </w:rPr>
         <w:t>Не применять в v1.0.51+: текущие exchange metadata являются только необязательной справочной диагностикой и не блокируют модельную рекомендацию.</w:t>
       </w:r>
     </w:p>
@@ -1113,6 +1531,9 @@
         <w:spacing w:after="60"/>
       </w:pPr>
       <w:r>
+        <w:rPr>
+          <w:sz w:val="21"/>
+        </w:rPr>
         <w:t>Точное касание свечой лимитного уровня не считается исполнением: Buy требует движения ниже уровня, Sell - выше.</w:t>
       </w:r>
     </w:p>
@@ -1122,6 +1543,9 @@
         <w:spacing w:after="60"/>
       </w:pPr>
       <w:r>
+        <w:rPr>
+          <w:sz w:val="21"/>
+        </w:rPr>
         <w:t>Даже strict trade-through остаётся proxy и не доказывает queue priority, объём и partial fills.</w:t>
       </w:r>
     </w:p>
@@ -1131,19 +1555,30 @@
         <w:spacing w:after="60"/>
       </w:pPr>
       <w:r>
+        <w:rPr>
+          <w:sz w:val="21"/>
+        </w:rPr>
         <w:t>После обновления v1.0.53 старые proxy outcomes/calibrators очищаются; ожидайте новую grid_label_v26 выборку.</w:t>
       </w:r>
     </w:p>
     <w:p>
       <w:r>
+        <w:rPr>
+          <w:sz w:val="21"/>
+        </w:rPr>
         <w:t>Операторское правило v1.0.53: не трактовать рекомендацию как биржевой ордер или подтверждение runtime-исполнимости.</w:t>
       </w:r>
     </w:p>
     <w:p>
       <w:pPr>
         <w:pStyle w:val="Heading1"/>
+        <w:spacing w:before="200" w:after="100"/>
       </w:pPr>
       <w:r>
+        <w:rPr>
+          <w:b/>
+          <w:sz w:val="32"/>
+        </w:rPr>
         <w:t>Обновление v1.0.50: время активации replacement-ордера</w:t>
       </w:r>
     </w:p>
@@ -1153,7 +1588,7 @@
       </w:pPr>
       <w:r>
         <w:rPr>
-          <w:sz w:val="20"/>
+          <w:sz w:val="21"/>
         </w:rPr>
         <w:t>Fill исходного grid-ордера и fill созданного после него replacement-ордера внутри одной минутной свечи не считаются доказанным циклом.</w:t>
       </w:r>
@@ -1164,7 +1599,7 @@
       </w:pPr>
       <w:r>
         <w:rPr>
-          <w:sz w:val="20"/>
+          <w:sz w:val="21"/>
         </w:rPr>
         <w:t>OHLCV не содержит точного времени parent fill, задержки реакции бота, времени отправки/подтверждения replacement и его места в очереди Bybit.</w:t>
       </w:r>
@@ -1175,7 +1610,7 @@
       </w:pPr>
       <w:r>
         <w:rPr>
-          <w:sz w:val="20"/>
+          <w:sz w:val="21"/>
         </w:rPr>
         <w:t>Если цена в той же свече пересекает только что созданный replacement, outcome недоступен с кодом intrabar_replacement_fill_timing_unobservable. Это NO EVIDENCE / НЕ ТОРГОВАТЬ, а не убыток и не прибыль.</w:t>
       </w:r>
@@ -1186,7 +1621,7 @@
       </w:pPr>
       <w:r>
         <w:rPr>
-          <w:sz w:val="20"/>
+          <w:sz w:val="21"/>
         </w:rPr>
         <w:t>Replacement становится допустимым для proxy-модели с начала следующей свечи. Цикл, подтверждённый в разных свечах, оценивается по прежней PnL/fee/платёж финансирования/volume-математике.</w:t>
       </w:r>
@@ -1196,16 +1631,22 @@
         <w:pStyle w:val="ListBullet"/>
       </w:pPr>
       <w:r>
+        <w:rPr>
+          <w:sz w:val="21"/>
+        </w:rPr>
         <w:t>Даже межсвечное proxy-исполнение не доказывает queue priority, partial fills или фактическую задержку; это ограниченная историческая модель.</w:t>
       </w:r>
     </w:p>
     <w:p>
       <w:pPr>
         <w:pStyle w:val="Heading2"/>
+        <w:spacing w:before="160" w:after="80"/>
       </w:pPr>
       <w:r>
         <w:rPr>
           <w:rFonts w:ascii="Arial" w:hAnsi="Arial"/>
+          <w:b/>
+          <w:sz w:val="26"/>
         </w:rPr>
         <w:t>Восстановление исходов при включённом LLM (v1.0.62)</w:t>
       </w:r>
@@ -1214,7 +1655,7 @@
       <w:r>
         <w:rPr>
           <w:rFonts w:ascii="Arial" w:hAnsi="Arial"/>
-          <w:sz w:val="20"/>
+          <w:sz w:val="21"/>
         </w:rPr>
         <w:t>LLM reviewer проверяет только потенциально исполнимые рекомендации. Поэтому явно разрешённые, прошедшие deterministic risk checks shadow-no_trade roots не требуют LLM verdict для расчёта proxy outcome. Это не делает no_trade исполнимым: actionable roots при включённом LLM по-прежнему остаются fail-closed до завершённого verdict.</w:t>
       </w:r>
@@ -1223,7 +1664,7 @@
       <w:r>
         <w:rPr>
           <w:rFonts w:ascii="Arial" w:hAnsi="Arial"/>
-          <w:sz w:val="20"/>
+          <w:sz w:val="21"/>
         </w:rPr>
         <w:t>Созревшие исходы версии 1.0.61 обрабатываются обычным outcome-worker автоматически после обновления. В /api/v1/status поле outcome_worker показывает state, количество matured pending и unattempted roots; код OUTCOME_WORKER_STALLED означает, что созревшие eligible roots не получают попыток обработки.</w:t>
       </w:r>
@@ -1232,7 +1673,7 @@
       <w:r>
         <w:rPr>
           <w:rFonts w:ascii="Arial" w:hAnsi="Arial"/>
-          <w:sz w:val="20"/>
+          <w:sz w:val="21"/>
         </w:rPr>
         <w:t>При retCode 10006 клиент ждёт до указанного Bybit reset timestamp. Если точный ticker отсутствует, символ временно отключается только после подтверждения отсутствия public instrument metadata; затем проверка повторяется по штатному TTL.</w:t>
       </w:r>
@@ -1240,36 +1681,58 @@
     <w:p>
       <w:pPr>
         <w:pStyle w:val="Heading1"/>
+        <w:spacing w:before="200" w:after="100"/>
       </w:pPr>
       <w:r>
+        <w:rPr>
+          <w:b/>
+          <w:sz w:val="32"/>
+        </w:rPr>
         <w:t>Дополнение версии 1.0.69: проверка после перезапуска</w:t>
       </w:r>
     </w:p>
     <w:p>
       <w:r>
+        <w:rPr>
+          <w:sz w:val="21"/>
+        </w:rPr>
         <w:t>После перезапуска состояние «Запускается / накапливает данные» сохраняется до тех пор, пока именно текущий процесс не завершит собственный цикл сборщика и собственную публикацию рекомендаций. Данные последнего цикла прежнего процесса больше не считаются доказательством готовности нового процесса.</w:t>
       </w:r>
     </w:p>
     <w:p>
       <w:r>
+        <w:rPr>
+          <w:sz w:val="21"/>
+        </w:rPr>
         <w:t>В окне «Здоровье системы» проверьте поля «Цикл сборщика текущего процесса» и «Публикация текущего процесса». Оба поля должны перейти в «Да». Если период запуска завершился, а хотя бы одно поле осталось «Нет», состояние должно стать деградированным.</w:t>
       </w:r>
     </w:p>
     <w:p>
       <w:r>
+        <w:rPr>
+          <w:sz w:val="21"/>
+        </w:rPr>
         <w:t>Поле «Идентификатор БД» является безопасным постоянным идентификатором конкретного хранилища. Запишите его перед обновлением. После обновления он должен остаться тем же. Изменение идентификатора означает подключение к другой или заново созданной БД и требует проверки DB_PATH либо DATABASE_URL.</w:t>
       </w:r>
     </w:p>
     <w:p>
       <w:r>
+        <w:rPr>
+          <w:sz w:val="21"/>
+        </w:rPr>
         <w:t>Сводка последней публикации должна учитывать все инструменты публикационного цикла, включая строки, которые повторно используют ранее созданный outcome-root. Число строк сводки должно соответствовать count_all в событии PUBLISH, а не только числу новых outcome-root.</w:t>
       </w:r>
     </w:p>
     <w:p>
       <w:pPr>
         <w:pStyle w:val="Heading1"/>
+        <w:spacing w:before="200" w:after="100"/>
       </w:pPr>
       <w:r>
+        <w:rPr>
+          <w:b/>
+          <w:sz w:val="32"/>
+        </w:rPr>
         <w:t>Безопасный перезапуск и передача блокировок v1.0.71</w:t>
       </w:r>
     </w:p>
@@ -1278,6 +1741,9 @@
         <w:pStyle w:val="ListBullet"/>
       </w:pPr>
       <w:r>
+        <w:rPr>
+          <w:sz w:val="21"/>
+        </w:rPr>
         <w:t>При штатном завершении приложения фоновые контуры освобождают только принадлежащие текущему процессу блокировки. Новый процесс не должен ожидать полный срок блокировки предыдущего PID.</w:t>
       </w:r>
     </w:p>
@@ -1286,6 +1752,9 @@
         <w:pStyle w:val="ListBullet"/>
       </w:pPr>
       <w:r>
+        <w:rPr>
+          <w:sz w:val="21"/>
+        </w:rPr>
         <w:t>Состояние «передача управления» означает штатное ожидание безопасного перехвата блокировки. Оно не означает свежесть рынка и не разрешает торговлю по устаревшим данным.</w:t>
       </w:r>
     </w:p>
@@ -1294,6 +1763,9 @@
         <w:pStyle w:val="ListBullet"/>
       </w:pPr>
       <w:r>
+        <w:rPr>
+          <w:sz w:val="21"/>
+        </w:rPr>
         <w:t>В окне здоровья проверяйте владельца блокировки сборщика, срок блокировки и время до разрешённого перехвата. Не выполняйте повторные перезапуски, пока идёт штатная передача управления.</w:t>
       </w:r>
     </w:p>
@@ -1302,14 +1774,22 @@
         <w:pStyle w:val="ListBullet"/>
       </w:pPr>
       <w:r>
+        <w:rPr>
+          <w:sz w:val="21"/>
+        </w:rPr>
         <w:t>После передачи должны одновременно появиться: блокировка принадлежит текущему процессу, цикл сборщика текущего процесса — «Да», публикация текущего процесса — «Да», устаревших инструментов — 0.</w:t>
       </w:r>
     </w:p>
     <w:p>
       <w:pPr>
         <w:pStyle w:val="Heading1"/>
+        <w:spacing w:before="200" w:after="100"/>
       </w:pPr>
       <w:r>
+        <w:rPr>
+          <w:b/>
+          <w:sz w:val="32"/>
+        </w:rPr>
         <w:t>Как читать журнал исходов v1.0.76</w:t>
       </w:r>
     </w:p>
@@ -1318,6 +1798,9 @@
         <w:pStyle w:val="ListBullet"/>
       </w:pPr>
       <w:r>
+        <w:rPr>
+          <w:sz w:val="21"/>
+        </w:rPr>
         <w:t>В журнале отдельно показаны «Исход по правилам стратегии», «Расчётный net proxy P&amp;L» и «Причина исхода». Эти поля нельзя трактовать как одно и то же.</w:t>
       </w:r>
     </w:p>
@@ -1326,6 +1809,9 @@
         <w:pStyle w:val="ListBullet"/>
       </w:pPr>
       <w:r>
+        <w:rPr>
+          <w:sz w:val="21"/>
+        </w:rPr>
         <w:t>Положительный net proxy P&amp;L при «Неуспех · kill-switch» означает: сетка ранее накопила прибыль, но затем нарушила защитную границу. По контракту grid_label_v26 такой terminal outcome остаётся неуспешным независимо от знака P&amp;L.</w:t>
       </w:r>
     </w:p>
@@ -1334,6 +1820,9 @@
         <w:pStyle w:val="ListBullet"/>
       </w:pPr>
       <w:r>
+        <w:rPr>
+          <w:sz w:val="21"/>
+        </w:rPr>
         <w:t>Для новых outcomes колонка причины показывает сторону и цену kill-switch и наблюдавшийся экстремум. Legacy-строки без terminal diagnostics не реконструируются предположением.</w:t>
       </w:r>
     </w:p>
@@ -1342,6 +1831,9 @@
         <w:pStyle w:val="ListBullet"/>
       </w:pPr>
       <w:r>
+        <w:rPr>
+          <w:sz w:val="21"/>
+        </w:rPr>
         <w:t>«Неизвестно» и «—» означают invalid/missing numeric contract. Boolean, пустые строки, NaN и Infinity не должны интерпретироваться как 1, 0 или 0%.</w:t>
       </w:r>
     </w:p>
@@ -1350,6 +1842,9 @@
         <w:pStyle w:val="ListBullet"/>
       </w:pPr>
       <w:r>
+        <w:rPr>
+          <w:sz w:val="21"/>
+        </w:rPr>
         <w:t>Машинные коды действий, причин и идентификаторы рекомендаций сохраняются без перевода. Рядом выводится связное русское пояснение.</w:t>
       </w:r>
     </w:p>
@@ -1358,6 +1853,9 @@
         <w:pStyle w:val="ListBullet"/>
       </w:pPr>
       <w:r>
+        <w:rPr>
+          <w:sz w:val="21"/>
+        </w:rPr>
         <w:t>OUTCOME_SKIP_INVALID_GRID_CONTRACT означает, что результат нельзя доказательно восстановить по доступным OHLCV-данным; это терминальное fail-closed цензурирование.</w:t>
       </w:r>
     </w:p>
@@ -1366,6 +1864,9 @@
         <w:pStyle w:val="ListBullet"/>
       </w:pPr>
       <w:r>
+        <w:rPr>
+          <w:sz w:val="21"/>
+        </w:rPr>
         <w:t>intrabar_extreme_order_unobservable означает неизвестный порядок касаний цен внутри одной свечи. Система не назначает прибыль или убыток по предположению.</w:t>
       </w:r>
     </w:p>
@@ -1374,6 +1875,9 @@
         <w:pStyle w:val="ListBullet"/>
       </w:pPr>
       <w:r>
+        <w:rPr>
+          <w:sz w:val="21"/>
+        </w:rPr>
         <w:t>Недостаточный объём свечи означает, что моделируемое исполнение требуемого количества нельзя подтвердить. Ослаблять эту проверку вручную запрещено.</w:t>
       </w:r>
     </w:p>
@@ -1382,6 +1886,9 @@
         <w:pStyle w:val="ListBullet"/>
       </w:pPr>
       <w:r>
+        <w:rPr>
+          <w:sz w:val="21"/>
+        </w:rPr>
         <w:t>Исследовательские shadow-исходы без LLM могут рассчитываться, но не входят в exact-policy калибровку и не разрешают торговлю.</w:t>
       </w:r>
     </w:p>

</xml_diff>

<commit_message>
feat(strategy-router): select grid or trend by risk-adjusted profitability
* compare bot-specific calibrated expectancy, confidence bounds and expected shortfall
* choose no-trade when neither strategy has a statistically supported advantage
* preserve the losing strategy as a shadow competitor for continued outcome collection
* add a fail-closed directional single-position plan with entry, TP, SL and sizing
* prevent simultaneous grid and trend execution on the same one-way symbol
* keep exchange order submission outside the recommendation/audit service
* update regression tests, operator documentation and version to 1.2.0
</commit_message>
<xml_diff>
--- a/docs/instrukciya_operatora_bybit_recommender.docx
+++ b/docs/instrukciya_operatora_bybit_recommender.docx
@@ -17,26 +17,17 @@
     <w:p>
       <w:pPr/>
       <w:r>
-        <w:rPr>
-          <w:sz w:val="21"/>
-        </w:rPr>
-        <w:t>Версия документа: 1.1.0 (отдельная directional trend-ветка в shadow-режиме; без исполнения биржевых ордеров)</w:t>
+        <w:t>Версия документа: 1.2.0 (выбор grid или single-position trend по доказанной risk-adjusted ожидаемой прибыльности; без отправки биржевых ордеров)</w:t>
       </w:r>
     </w:p>
     <w:p>
       <w:r>
-        <w:rPr>
-          <w:sz w:val="21"/>
-        </w:rPr>
-        <w:t>Назначение: регламент принятия операторского решения по исполнимому grid-плану и чтения отдельной исследовательской directional trend-ветки, а также статистики exact-current-policy proxy outcomes. Документ не является инструкцией по переносу trend-параметров в биржевой бот.</w:t>
+        <w:t>Назначение: регламент чтения двух strategy families, решения strategy-profitability router и операторского подтверждения внешнего grid-плана либо одной directional trend-позиции. Документ не является инструкцией по автоматическому выставлению ордеров Bybit.</w:t>
       </w:r>
     </w:p>
     <w:p>
       <w:r>
-        <w:rPr>
-          <w:sz w:val="21"/>
-        </w:rPr>
-        <w:t>Граница системы. Репозиторий является recommendation/audit service, not OMS/EMS. Он не выставляет ордера, не подтверждает runtime-исполнимость, не знает очередь, partial fills, состояние аккаунта или фактическую доступность маржи. Статус recommended означает модельный сигнал, а не готовый к исполнению ордер.</w:t>
+        <w:t>Граница системы. Репозиторий является recommendation/audit service, not OMS/EMS. Он проверяет план по публичным Bybit metadata, текущей цене, funding и внутренним risk limits, но не выставляет ордера, не знает очередь, реальные partial fills, состояние аккаунта или фактическую доступность маржи. Статус executed означает созданный внутренний audit-instance, а не подтверждённое биржевое исполнение.</w:t>
       </w:r>
     </w:p>
     <w:p>
@@ -45,11 +36,7 @@
         <w:spacing w:before="200" w:after="100"/>
       </w:pPr>
       <w:r>
-        <w:rPr>
-          <w:b/>
-          <w:sz w:val="32"/>
-        </w:rPr>
-        <w:t>Направленный тренд v1.1.0 - только shadow</w:t>
+        <w:t>Выбор стратегии v1.2.0</w:t>
       </w:r>
     </w:p>
     <w:p>
@@ -57,10 +44,7 @@
         <w:pStyle w:val="ListBullet"/>
       </w:pPr>
       <w:r>
-        <w:rPr>
-          <w:sz w:val="21"/>
-        </w:rPr>
-        <w:t>directional_trend - отдельная стратегия, а не новое имя для long/short grid. Сетка остаётся range/mean-reversion механикой с directional bias.</w:t>
+        <w:t>Для одного symbol и timestamp независимо оцениваются futures_grid и directional_trend. Их raw score не сравнивается: он имеет разную экономическую семантику.</w:t>
       </w:r>
     </w:p>
     <w:p>
@@ -68,10 +52,7 @@
         <w:pStyle w:val="ListBullet"/>
       </w:pPr>
       <w:r>
-        <w:rPr>
-          <w:sz w:val="21"/>
-        </w:rPr>
-        <w:t>Trend-план содержит одну long или short позицию, take-profit и stop-loss. Grid levels, усреднение и pyramiding запрещены контрактом.</w:t>
+        <w:t>Strategy-profitability router допускает модель только при bot-specific fitted calibrator, exact-policy fingerprint, положительной selected-policy и terminal-holdout денежной ожидаемости, положительных lower bounds и доступном expected shortfall.</w:t>
       </w:r>
     </w:p>
     <w:p>
@@ -79,10 +60,7 @@
         <w:pStyle w:val="ListBullet"/>
       </w:pPr>
       <w:r>
-        <w:rPr>
-          <w:sz w:val="21"/>
-        </w:rPr>
-        <w:t>В этой версии trend всегда имеет статус НЕ ТОРГОВАТЬ / shadow и код DIRECTIONAL_TREND_SHADOW_ONLY. Execution endpoint и создание bot_instance заблокированы fail-closed.</w:t>
+        <w:t>futures_grid остаётся сеткой. Его long/short варианты — directional grid. directional_trend — одна long/short позиция с entry, TP и SL, без grid levels, усреднения и pyramiding.</w:t>
       </w:r>
     </w:p>
     <w:p>
@@ -90,10 +68,7 @@
         <w:pStyle w:val="ListBullet"/>
       </w:pPr>
       <w:r>
-        <w:rPr>
-          <w:sz w:val="21"/>
-        </w:rPr>
-        <w:t>Trend-outcome рассчитывается отдельно по непрерывным минутным свечам: первое однозначное TP/SL или точный open на границе 12-часового horizon. Касание TP и SL в одной свече либо пропуск минуты цензурируются.</w:t>
+        <w:t>Если utility одной стратегии доказанно выше, она становится операторским кандидатом. При недоказанной прибыльности или слишком малом преимуществе router выбирает НЕ ТОРГОВАТЬ. Проигравшая модель сохраняется как paired shadow_competitor для отдельного outcome и дальнейшего обучения.</w:t>
       </w:r>
     </w:p>
     <w:p>
@@ -101,10 +76,7 @@
         <w:pStyle w:val="ListBullet"/>
       </w:pPr>
       <w:r>
-        <w:rPr>
-          <w:sz w:val="21"/>
-        </w:rPr>
-        <w:t>Grid и trend имеют разные outcome contracts и calibrators. Их результаты нельзя складывать в общий win rate или использовать как доказательство live edge.</w:t>
+        <w:t>Подтверждение directional_trend создаёт external_single_order_audit и directional-single-order-package-v1 для ручного или внешнего executor. Обязательные признаки: recommendation_only=true и exchange_order_submitted=false; сам сервис Bybit order не отправляет.</w:t>
       </w:r>
     </w:p>
     <w:p>
@@ -376,10 +348,7 @@
     <w:p>
       <w:pPr/>
       <w:r>
-        <w:rPr>
-          <w:sz w:val="21"/>
-        </w:rPr>
-        <w:t>Policy evaluation и shadow exploration разделены. Статистические calibration gates исключаются из pre-calibration candidate policy, чтобы отсутствие модели не делало сбор evidence логически невозможным; hard data/risk/economic veto по-прежнему исключает root.</w:t>
+        <w:t>Policy evaluation и paired exploration разделены. Статистические calibration gates не должны делать сбор evidence логически невозможным; hard data, market, risk и economic veto по-прежнему исключают candidate root. Не выбранный router-ом кандидат может сохраняться только как неисполняемый shadow_competitor.</w:t>
       </w:r>
     </w:p>
     <w:p>
@@ -445,10 +414,7 @@
     <w:p>
       <w:pPr/>
       <w:r>
-        <w:rPr>
-          <w:sz w:val="21"/>
-        </w:rPr>
-        <w:t>В reasons.simulation_scope должны быть: mode=historical_proxy_only, runtime_order_submission=false, runtime_execution_validation=not_performed, exchange_fill_attestation=not_available. Это основной контракт текущей версии 1.1.0.</w:t>
+        <w:t>В reasons.simulation_scope исторического proxy должны быть: mode=historical_proxy_only, runtime_order_submission=false, runtime_execution_validation=not_performed, exchange_fill_attestation=not_available. Для operator audit v1.2.0 отдельно хранится validated execution package, но биржевое исполнение всё равно не подтверждается.</w:t>
       </w:r>
     </w:p>
     <w:p>
@@ -617,10 +583,7 @@
         <w:pStyle w:val="ListBullet"/>
       </w:pPr>
       <w:r>
-        <w:rPr>
-          <w:sz w:val="21"/>
-        </w:rPr>
-        <w:t>Для operator execution поддерживается только Bybit Linear USDT Futures Grid. Отдельный directional_trend публикуется только как shadow research; spot/inverse/options/non-USDT блокируются.</w:t>
+        <w:t>Для operator lifecycle поддерживаются Bybit Linear USDT futures_grid и выбранный router-ом directional_trend. Grid требует arithmetic grid contract; trend требует single-position TP/SL contract и isolated margin. Spot, inverse, options и non-USDT блокируются. Реальная отправка order остаётся обязанностью внешнего/manual executor.</w:t>
       </w:r>
     </w:p>
     <w:p>
@@ -650,10 +613,7 @@
     <w:p>
       <w:pPr/>
       <w:r>
-        <w:rPr>
-          <w:sz w:val="21"/>
-        </w:rPr>
-        <w:t>Actionable futures_grid допускается только после двух разных последовательно закрытых evidence snapshots (features_ref_ts). Повторный цикл на той же закрытой свече не является вторым подтверждением; до нового snapshot статус остаётся pending.</w:t>
+        <w:t>Actionable strategy допускается только после требуемых последовательно закрытых evidence snapshots. Повторный цикл на той же закрытой свече не является новым подтверждением; до нового snapshot статус остаётся pending.</w:t>
       </w:r>
     </w:p>
     <w:p>
@@ -817,10 +777,7 @@
     </w:p>
     <w:p>
       <w:r>
-        <w:rPr>
-          <w:sz w:val="21"/>
-        </w:rPr>
-        <w:t>Недостаток временных кластеров, отсутствующая диагностика или неположительная cluster lower bound означает shadow НЕ ТОРГОВАТЬ с PROXY_MONETARY_EXPECTANCY_UNPROVEN. Высокий score, win rate или десятки коррелированных символов не являются основанием для обхода.</w:t>
+        <w:t>Недостаток временных кластеров, отсутствующая диагностика или неположительная cluster lower bound означает НЕ ТОРГОВАТЬ с PROXY_MONETARY_EXPECTANCY_UNPROVEN. Высокий score, win rate или десятки коррелированных символов не являются основанием для обхода.</w:t>
       </w:r>
     </w:p>
     <w:p>
@@ -848,10 +805,7 @@
     <w:p>
       <w:pPr/>
       <w:r>
-        <w:rPr>
-          <w:sz w:val="21"/>
-        </w:rPr>
-        <w:t>Actionable futures_grid допускается только когда точная policy-conditioned matured-return выборка имеет достаточный Kish effective sample size и положительную одностороннюю 95% Student-t lower bound. Каждый matured policy root входит в denominator как labeled, censored или unresolved. Любой censored/unresolved/invalid-labeled root либо исчезнувшая поддержка cache означает PROXY_OUTCOME_CENSORING_UNBOUNDED и НЕ ТОРГОВАТЬ немедленно. Это защищает от survivorship bias, но создаёт открытый liveness-риск: один постоянный censored root способен блокировать всю policy-когорту. Не обходить вручную; необходим отдельный validated bounded-censor contract.</w:t>
+        <w:t>Actionable grid или trend допускается только когда его собственная exact-policy matured-return выборка имеет достаточный Kish effective sample size и положительную одностороннюю 95% Student-t lower bound, а terminal holdout подтверждает денежную политику. Каждый matured policy root входит в denominator как labeled, censored или unresolved. Censoring/unresolved evidence нельзя скрывать ради допуска.</w:t>
       </w:r>
     </w:p>
     <w:p>
@@ -909,11 +863,7 @@
         <w:spacing w:before="200" w:after="100"/>
       </w:pPr>
       <w:r>
-        <w:rPr>
-          <w:b/>
-          <w:sz w:val="32"/>
-        </w:rPr>
-        <w:t>Directional TP/SL</w:t>
+        <w:t>Grid exits и single-position trend TP/SL</w:t>
       </w:r>
     </w:p>
     <w:p>
@@ -966,11 +916,7 @@
         <w:spacing w:before="200" w:after="100"/>
       </w:pPr>
       <w:r>
-        <w:rPr>
-          <w:b/>
-          <w:sz w:val="32"/>
-        </w:rPr>
-        <w:t>Proxy outcome, shadow sample и калибровка</w:t>
+        <w:t>Proxy outcome, paired competitor и раздельная калибровка</w:t>
       </w:r>
     </w:p>
     <w:p>
@@ -1215,10 +1161,7 @@
         <w:pStyle w:val="ListBullet"/>
       </w:pPr>
       <w:r>
-        <w:rPr>
-          <w:sz w:val="21"/>
-        </w:rPr>
-        <w:t>Полный no_trade-кандидат без hard blocks может получить outcome_policy.sample_role=shadow_no_trade и после horizon войти в исследовательскую proxy-выборку. Это не реальный запуск, не exchange fill и не основание утверждать исполнимость.</w:t>
+        <w:t>Полный no_trade-кандидат без hard blocks либо проигравший router-кандидат может получить outcome_policy.sample_role=shadow_no_trade/shadow_competitor и после horizon войти в соответствующую исследовательскую proxy-выборку. Это не реальный запуск и не exchange fill.</w:t>
       </w:r>
     </w:p>
     <w:p>
@@ -1226,10 +1169,7 @@
         <w:pStyle w:val="ListBullet"/>
       </w:pPr>
       <w:r>
-        <w:rPr>
-          <w:sz w:val="21"/>
-        </w:rPr>
-        <w:t>Необученный, цензурированный или не подтвердивший terminal held-out skill bot-specific calibrator означает shadow НЕ ТОРГОВАТЬ: raw confidence audit-only. 80 exact-policy rows — только денежный floor; при REQUIRE_CONF_GATE=1 полная probability readiness начинается не ранее 300 rows и требует accepted purged OOF/terminal holdout. Положительный cache обязан воспроизводиться по текущему policy denominator; исчезновение supporting rows отключает его. Подтверждённый negative expectancy сохраняется как консервативный veto.</w:t>
+        <w:t>Необученный, цензурированный или не подтвердивший terminal held-out skill bot-specific calibrator означает НЕ ТОРГОВАТЬ: raw confidence audit-only. Grid и trend проходят эти условия отдельно; положительная модель одной стратегии не разрешает использовать неподтверждённую другую. Подтверждённый negative expectancy остаётся консервативным veto.</w:t>
       </w:r>
     </w:p>
     <w:p>
@@ -1417,10 +1357,7 @@
         <w:pStyle w:val="ListBullet"/>
       </w:pPr>
       <w:r>
-        <w:rPr>
-          <w:sz w:val="21"/>
-        </w:rPr>
-        <w:t>При отдельно включённой post-hoc validation в gate входят только stopped bots той же model_version с terminally finalized evidence. Grid identity: bybit-taxonomy-v11-separated-operator-outcome-lineage; trend shadow identity: bybit-taxonomy-v11-separated-operator-outcome-lineage+directional-trend-v1. Ключи: logreg_futures_grid_v21 и logreg_directional_trend_v1; разные механики не объединяются в один inference-calibrator.</w:t>
+        <w:t>При отдельно включённой post-hoc validation в gate входят только terminally finalized evidence той же model/policy lineage. Grid identity: bybit-taxonomy-v11-separated-operator-outcome-lineage; historical trend contract identity: bybit-taxonomy-v11-separated-operator-outcome-lineage+directional-trend-v1. Ключи logreg_futures_grid_v21 и logreg_directional_trend_v1 не объединяются. Слово shadow в историческом trend contract id не является runtime permission.</w:t>
       </w:r>
     </w:p>
     <w:p>
@@ -1653,11 +1590,7 @@
     </w:p>
     <w:p>
       <w:r>
-        <w:rPr>
-          <w:rFonts w:ascii="Arial" w:hAnsi="Arial"/>
-          <w:sz w:val="21"/>
-        </w:rPr>
-        <w:t>LLM reviewer проверяет только потенциально исполнимые рекомендации. Поэтому явно разрешённые, прошедшие deterministic risk checks shadow-no_trade roots не требуют LLM verdict для расчёта proxy outcome. Это не делает no_trade исполнимым: actionable roots при включённом LLM по-прежнему остаются fail-closed до завершённого verdict.</w:t>
+        <w:t>LLM reviewer проверяет потенциально исполнимого победителя router. Не выбранные/no_trade paired roots могут рассчитывать proxy outcome без LLM только по явно разрешённому исследовательскому контракту; это не делает их исполнимыми. Actionable winner при включённом LLM остаётся fail-closed до завершённого verdict.</w:t>
       </w:r>
     </w:p>
     <w:p>
@@ -1879,17 +1812,6 @@
           <w:sz w:val="21"/>
         </w:rPr>
         <w:t>Недостаточный объём свечи означает, что моделируемое исполнение требуемого количества нельзя подтвердить. Ослаблять эту проверку вручную запрещено.</w:t>
-      </w:r>
-    </w:p>
-    <w:p>
-      <w:pPr>
-        <w:pStyle w:val="ListBullet"/>
-      </w:pPr>
-      <w:r>
-        <w:rPr>
-          <w:sz w:val="21"/>
-        </w:rPr>
-        <w:t>Исследовательские shadow-исходы без LLM могут рассчитываться, но не входят в exact-policy калибровку и не разрешают торговлю.</w:t>
       </w:r>
     </w:p>
     <w:sectPr>

</xml_diff>

<commit_message>
feat(trend-outcomes): require first-touch probability and positive event EV
- persist TP_FIRST, SL_FIRST and HORIZON_EXIT while censoring ambiguous paths
- fit an exact-policy three-class trend model with untouched terminal holdout
- reject labels without exact availability and use conservative uncertainty
- route trend only when TP-first ordering and monetary EV lower bound are positive
- update SQLite/PostgreSQL bootstrap, UI, operator docs and iterative PDF prompt
- validate 1237 baseline and 1252 post-change tests
</commit_message>
<xml_diff>
--- a/docs/instrukciya_operatora_bybit_recommender.docx
+++ b/docs/instrukciya_operatora_bybit_recommender.docx
@@ -17,7 +17,7 @@
     <w:p>
       <w:pPr/>
       <w:r>
-        <w:t>Версия документа: 1.2.0 (выбор grid или single-position trend по доказанной risk-adjusted ожидаемой прибыльности; без отправки биржевых ордеров)</w:t>
+        <w:t>Версия документа: 1.3.0 (выбор grid или single-position trend по доказанной risk-adjusted ожидаемой прибыльности; без отправки биржевых ордеров)</w:t>
       </w:r>
     </w:p>
     <w:p>
@@ -36,7 +36,7 @@
         <w:spacing w:before="200" w:after="100"/>
       </w:pPr>
       <w:r>
-        <w:t>Выбор стратегии v1.2.0</w:t>
+        <w:t>Выбор стратегии v1.3.0</w:t>
       </w:r>
     </w:p>
     <w:p>
@@ -77,6 +77,54 @@
       </w:pPr>
       <w:r>
         <w:t>Подтверждение directional_trend создаёт external_single_order_audit и directional-single-order-package-v1 для ручного или внешнего executor. Обязательные признаки: recommendation_only=true и exchange_order_submitted=false; сам сервис Bybit order не отправляет.</w:t>
+      </w:r>
+    </w:p>
+    <w:p>
+      <w:pPr>
+        <w:pStyle w:val="Heading1"/>
+      </w:pPr>
+      <w:r>
+        <w:t>First-touch модель directional trend v1.3.0</w:t>
+      </w:r>
+    </w:p>
+    <w:p>
+      <w:pPr>
+        <w:pStyle w:val="ListBullet"/>
+      </w:pPr>
+      <w:r>
+        <w:t>Trend-outcome хранит явный тип события: TP_FIRST, SL_FIRST, HORIZON_EXIT или AMBIGUOUS. TP_FIRST означает доказанное достижение TP раньше SL; прибыльный выход по времени остаётся HORIZON_EXIT и не переименовывается в TP_FIRST.</w:t>
+      </w:r>
+    </w:p>
+    <w:p>
+      <w:pPr>
+        <w:pStyle w:val="ListBullet"/>
+      </w:pPr>
+      <w:r>
+        <w:t>Если одна минутная свеча касается TP и SL либо порядок касаний недоказуем, наблюдение цензурируется. Оператор не должен вручную назначать ему успех или неуспех.</w:t>
+      </w:r>
+    </w:p>
+    <w:p>
+      <w:pPr>
+        <w:pStyle w:val="ListBullet"/>
+      </w:pPr>
+      <w:r>
+        <w:t>В деталях trend-кандидата отдельно проверяйте P(TP раньше SL), P(SL раньше TP), вероятность выхода по времени, first-touch EV и её нижнюю доверительную границу. Бинарная вероятность успеха сама по себе не разрешает сделку.</w:t>
+      </w:r>
+    </w:p>
+    <w:p>
+      <w:pPr>
+        <w:pStyle w:val="ListBullet"/>
+      </w:pPr>
+      <w:r>
+        <w:t>Trend допускается router-ом только когда консервативная нижняя оценка P(TP_FIRST) выше верхней оценки P(SL_FIRST), а first-touch EV и её lower bound положительны после комиссий, проскальзывания и adverse funding.</w:t>
+      </w:r>
+    </w:p>
+    <w:p>
+      <w:pPr>
+        <w:pStyle w:val="ListBullet"/>
+      </w:pPr>
+      <w:r>
+        <w:t>Статусы model unavailable, order uncertain, expectancy non-positive или AMBIGUOUS означают НЕ ТОРГОВАТЬ. Сервис по-прежнему не отправляет биржевой ордер.</w:t>
       </w:r>
     </w:p>
     <w:p>
@@ -1357,7 +1405,7 @@
         <w:pStyle w:val="ListBullet"/>
       </w:pPr>
       <w:r>
-        <w:t>При отдельно включённой post-hoc validation в gate входят только terminally finalized evidence той же model/policy lineage. Grid identity: bybit-taxonomy-v11-separated-operator-outcome-lineage; historical trend contract identity: bybit-taxonomy-v11-separated-operator-outcome-lineage+directional-trend-v1. Ключи logreg_futures_grid_v21 и logreg_directional_trend_v1 не объединяются. Слово shadow в историческом trend contract id не является runtime permission.</w:t>
+        <w:t>При отдельно включённой post-hoc validation в gate входят только terminally finalized evidence той же model/policy lineage. Grid identity: bybit-taxonomy-v11-separated-operator-outcome-lineage; historical trend contract identity: bybit-taxonomy-v11-separated-operator-outcome-lineage+directional-trend-v1. Ключи logreg_futures_grid_v21 и logreg_directional_trend_v2 не объединяются. Слово shadow в историческом trend contract id не является runtime permission.</w:t>
       </w:r>
     </w:p>
     <w:p>

</xml_diff>

<commit_message>
fix(observability): align grid and trend across DB, API and operator UI
- materialize per-strategy outcome schedules at recommendation publication
- preserve canonical grid/trend event types and semantic integrity checks
- render strategy-native Details and immutable history geometry
- fix multi-point history charts and fail-visible API/render errors
- expose strategy identity in journal, outcomes and health
- update operator docs and iterative audit prompt for v1.4.0
</commit_message>
<xml_diff>
--- a/docs/instrukciya_operatora_bybit_recommender.docx
+++ b/docs/instrukciya_operatora_bybit_recommender.docx
@@ -17,7 +17,7 @@
     <w:p>
       <w:pPr/>
       <w:r>
-        <w:t>Версия документа: 1.3.0 (выбор grid или single-position trend по доказанной risk-adjusted ожидаемой прибыльности; без отправки биржевых ордеров)</w:t>
+        <w:t>Версия документа: 1.4.0 (выбор grid или single-position trend по доказанной risk-adjusted ожидаемой прибыльности; без отправки биржевых ордеров)</w:t>
       </w:r>
     </w:p>
     <w:p>
@@ -36,7 +36,7 @@
         <w:spacing w:before="200" w:after="100"/>
       </w:pPr>
       <w:r>
-        <w:t>Выбор стратегии v1.3.0</w:t>
+        <w:t>Выбор стратегии и наблюдаемость v1.4.0</w:t>
       </w:r>
     </w:p>
     <w:p>
@@ -125,6 +125,70 @@
       </w:pPr>
       <w:r>
         <w:t>Статусы model unavailable, order uncertain, expectancy non-positive или AMBIGUOUS означают НЕ ТОРГОВАТЬ. Сервис по-прежнему не отправляет биржевой ордер.</w:t>
+      </w:r>
+    </w:p>
+    <w:p>
+      <w:pPr>
+        <w:pStyle w:val="Heading1"/>
+      </w:pPr>
+      <w:r>
+        <w:t>Сквозная наблюдаемость grid/trend v1.4.0</w:t>
+      </w:r>
+    </w:p>
+    <w:p>
+      <w:pPr>
+        <w:pStyle w:val="ListBullet"/>
+      </w:pPr>
+      <w:r>
+        <w:t>Окно «Детали» обязано показывать стратегию и её собственную торговую геометрию. Для futures_grid это reference, диапазон, число уровней и внешние защитные границы; для directional_trend — одна позиция, entry, TP и SL. Уровни одной стратегии запрещено выводить через формулы другой.</w:t>
+      </w:r>
+    </w:p>
+    <w:p>
+      <w:pPr>
+        <w:pStyle w:val="ListBullet"/>
+      </w:pPr>
+      <w:r>
+        <w:t>Сразу после публикации рекомендации система создаёт durable запись очереди исхода с точным сроком созревания. До истечения 12-часового горизонта в «Деталях» и «Здоровье» должно отображаться «ожидает горизонта», а не ложный ноль или отсутствие исхода.</w:t>
+      </w:r>
+    </w:p>
+    <w:p>
+      <w:pPr>
+        <w:pStyle w:val="ListBullet"/>
+      </w:pPr>
+      <w:r>
+        <w:t>В «Исходах» проверяйте bot_type и канонический event_type. Для grid используется GRID_OUTCOME; для trend — TP_FIRST, SL_FIRST или HORIZON_EXIT. AMBIGUOUS хранится только как цензурированная диагностика и не должен появляться как размеченный outcome.</w:t>
+      </w:r>
+    </w:p>
+    <w:p>
+      <w:pPr>
+        <w:pStyle w:val="ListBullet"/>
+      </w:pPr>
+      <w:r>
+        <w:t>В «Журнале» каждая запись должна явно содержать strategy family, symbol, direction, recommendation status и model version. Без strategy family одинаковые машинные коды grid и trend нельзя интерпретировать безопасно.</w:t>
+      </w:r>
+    </w:p>
+    <w:p>
+      <w:pPr>
+        <w:pStyle w:val="ListBullet"/>
+      </w:pPr>
+      <w:r>
+        <w:t>В «Здоровье» очереди, созревшие исходы, calibrator readiness и семантическая целостность показываются отдельно для futures_grid и directional_trend. Ошибки orphan outcome, неверного root, отсутствующей observability или несовместимого event_type являются блокирующей диагностикой, а не косметическим предупреждением.</w:t>
+      </w:r>
+    </w:p>
+    <w:p>
+      <w:pPr>
+        <w:pStyle w:val="ListBullet"/>
+      </w:pPr>
+      <w:r>
+        <w:t>График истории строится только по сохранённой на момент публикации геометрии. Пропущенный TP, SL, диапазон или защитная граница образуют разрыв линии; интерфейс не имеет права достраивать историю по текущим биржевым metadata. Multi-point история должна строиться без JavaScript-ошибок для обеих стратегий.</w:t>
+      </w:r>
+    </w:p>
+    <w:p>
+      <w:pPr>
+        <w:pStyle w:val="ListBullet"/>
+      </w:pPr>
+      <w:r>
+        <w:t>Сообщения «ошибка сети», «ошибка данных» и «ошибка построения» различаются. Пустой ответ API, повреждённый JSON или исключение renderer должны быть видимы оператору и не маскироваться пустой таблицей.</w:t>
       </w:r>
     </w:p>
     <w:p>
@@ -1863,6 +1927,8 @@
       </w:r>
     </w:p>
     <w:sectPr>
+      <w:headerReference w:type="default" r:id="rId13"/>
+      <w:footerReference w:type="default" r:id="rId14"/>
       <w:pgSz w:w="12240" w:h="15840"/>
       <w:pgMar w:top="1440" w:right="1800" w:bottom="1440" w:left="1800" w:header="720" w:footer="720" w:gutter="0"/>
       <w:cols w:space="720"/>
@@ -1870,6 +1936,26 @@
     </w:sectPr>
   </w:body>
 </w:document>
+</file>
+
+<file path=word/footer1.xml><?xml version="1.0" encoding="utf-8"?>
+<w:ftr xmlns:m="http://schemas.openxmlformats.org/officeDocument/2006/math" xmlns:mc="http://schemas.openxmlformats.org/markup-compatibility/2006" xmlns:mo="http://schemas.microsoft.com/office/mac/office/2008/main" xmlns:mv="urn:schemas-microsoft-com:mac:vml" xmlns:o="urn:schemas-microsoft-com:office:office" xmlns:r="http://schemas.openxmlformats.org/officeDocument/2006/relationships" xmlns:v="urn:schemas-microsoft-com:vml" xmlns:w10="urn:schemas-microsoft-com:office:word" xmlns:w14="http://schemas.microsoft.com/office/word/2010/wordml" xmlns:w="http://schemas.openxmlformats.org/wordprocessingml/2006/main" xmlns:wne="http://schemas.microsoft.com/office/word/2006/wordml" xmlns:wp14="http://schemas.microsoft.com/office/word/2010/wordprocessingDrawing" xmlns:wp="http://schemas.openxmlformats.org/drawingml/2006/wordprocessingDrawing" xmlns:wpc="http://schemas.microsoft.com/office/word/2010/wordprocessingCanvas" xmlns:wpg="http://schemas.microsoft.com/office/word/2010/wordprocessingGroup" xmlns:wpi="http://schemas.microsoft.com/office/word/2010/wordprocessingInk" xmlns:wps="http://schemas.microsoft.com/office/word/2010/wordprocessingShape" mc:Ignorable="w14 wp14">
+  <w:p>
+    <w:pPr>
+      <w:pStyle w:val="Footer"/>
+    </w:pPr>
+  </w:p>
+</w:ftr>
+</file>
+
+<file path=word/header1.xml><?xml version="1.0" encoding="utf-8"?>
+<w:hdr xmlns:m="http://schemas.openxmlformats.org/officeDocument/2006/math" xmlns:mc="http://schemas.openxmlformats.org/markup-compatibility/2006" xmlns:mo="http://schemas.microsoft.com/office/mac/office/2008/main" xmlns:mv="urn:schemas-microsoft-com:mac:vml" xmlns:o="urn:schemas-microsoft-com:office:office" xmlns:r="http://schemas.openxmlformats.org/officeDocument/2006/relationships" xmlns:v="urn:schemas-microsoft-com:vml" xmlns:w10="urn:schemas-microsoft-com:office:word" xmlns:w14="http://schemas.microsoft.com/office/word/2010/wordml" xmlns:w="http://schemas.openxmlformats.org/wordprocessingml/2006/main" xmlns:wne="http://schemas.microsoft.com/office/word/2006/wordml" xmlns:wp14="http://schemas.microsoft.com/office/word/2010/wordprocessingDrawing" xmlns:wp="http://schemas.openxmlformats.org/drawingml/2006/wordprocessingDrawing" xmlns:wpc="http://schemas.microsoft.com/office/word/2010/wordprocessingCanvas" xmlns:wpg="http://schemas.microsoft.com/office/word/2010/wordprocessingGroup" xmlns:wpi="http://schemas.microsoft.com/office/word/2010/wordprocessingInk" xmlns:wps="http://schemas.microsoft.com/office/word/2010/wordprocessingShape" mc:Ignorable="w14 wp14">
+  <w:p>
+    <w:pPr>
+      <w:pStyle w:val="Header"/>
+    </w:pPr>
+  </w:p>
+</w:hdr>
 </file>
 
 <file path=word/numbering.xml><?xml version="1.0" encoding="utf-8"?>

</xml_diff>

<commit_message>
fix(details): isolate grid and trend operator semantics
- interpret neutral direction by strategy family
- prevent grid remediation from leaking into trend candidates
- keep strategy-specific blockers and actions separate in Details
- preserve legacy grid rows without bot_type
- localize and deduplicate concrete operator guards
- update UI regressions, operator docs and iterative prompt
</commit_message>
<xml_diff>
--- a/docs/instrukciya_operatora_bybit_recommender.docx
+++ b/docs/instrukciya_operatora_bybit_recommender.docx
@@ -17,7 +17,7 @@
     <w:p>
       <w:pPr/>
       <w:r>
-        <w:t>Версия документа: 1.4.0 (выбор grid или single-position trend по доказанной risk-adjusted ожидаемой прибыльности; без отправки биржевых ордеров)</w:t>
+        <w:t>Версия документа: 1.4.1 (strategy-native отображение grid/trend; выбор по доказанной risk-adjusted ожидаемой прибыльности; без отправки биржевых ордеров)</w:t>
       </w:r>
     </w:p>
     <w:p>
@@ -28,6 +28,54 @@
     <w:p>
       <w:r>
         <w:t>Граница системы. Репозиторий является recommendation/audit service, not OMS/EMS. Он проверяет план по публичным Bybit metadata, текущей цене, funding и внутренним risk limits, но не выставляет ордера, не знает очередь, реальные partial fills, состояние аккаунта или фактическую доступность маржи. Статус executed означает созданный внутренний audit-instance, а не подтверждённое биржевое исполнение.</w:t>
+      </w:r>
+    </w:p>
+    <w:p>
+      <w:pPr>
+        <w:pStyle w:val="Heading1"/>
+      </w:pPr>
+      <w:r>
+        <w:t>Strategy-native отображение в «Деталях» v1.4.1</w:t>
+      </w:r>
+    </w:p>
+    <w:p>
+      <w:pPr>
+        <w:pStyle w:val="ListBullet"/>
+      </w:pPr>
+      <w:r>
+        <w:t>Сначала определите strategy family. «Фьючерсная сетка» и «Направленный тренд · одна позиция» являются отдельными кандидатами и отображаются отдельными строками даже для одного символа и времени.</w:t>
+      </w:r>
+    </w:p>
+    <w:p>
+      <w:pPr>
+        <w:pStyle w:val="ListBullet"/>
+      </w:pPr>
+      <w:r>
+        <w:t>Значение direction=neutral зависит от стратегии. Для futures_grid это валидная «Нейтральная сетка». Для directional_trend это «Направление не определено»: LONG/SHORT не подтверждён, позицию открывать нельзя.</w:t>
+      </w:r>
+    </w:p>
+    <w:p>
+      <w:pPr>
+        <w:pStyle w:val="ListBullet"/>
+      </w:pPr>
+      <w:r>
+        <w:t>В trend-карточке допустимы только причины и действия про подтверждение LONG/SHORT, entry/TP/SL, single-position contract и first-touch evidence. Советы про диапазон, шаги сетки или запуск сетки относятся только к futures_grid.</w:t>
+      </w:r>
+    </w:p>
+    <w:p>
+      <w:pPr>
+        <w:pStyle w:val="ListBullet"/>
+      </w:pPr>
+      <w:r>
+        <w:t>В grid-карточке не должны появляться DIRECTIONAL_TREND_* причины, TP/SL remediation одной позиции или first-touch action. Если такие элементы видны, сохраните диагностику JSON и не запускайте торговый план.</w:t>
+      </w:r>
+    </w:p>
+    <w:p>
+      <w:pPr>
+        <w:pStyle w:val="ListBullet"/>
+      </w:pPr>
+      <w:r>
+        <w:t>Технический machine code может сохраняться на английском для аудита, но связное объяснение и безопасное следующее действие показываются по-русски. Повтор одного конкретного кода из сохранённой и live-проверки отображается один раз.</w:t>
       </w:r>
     </w:p>
     <w:p>

</xml_diff>

<commit_message>
fix(trend-contract): reject directionless trend evaluations before position lifecycle
- persist candidate_kind for formed strategies and rejected trend evaluations
- collapse neutral trend to TREND_DIRECTION_UNCONFIRMED without TP/SL geometry
- exclude rejected evaluations from outcomes, history, training, routing and execution
- repair legacy neutral trend rows during database bootstrap
- expose fail-closed integrity counters and strategy-native Details semantics
- update operator documentation, infographic and iterative PDF prompt
</commit_message>
<xml_diff>
--- a/docs/instrukciya_operatora_bybit_recommender.docx
+++ b/docs/instrukciya_operatora_bybit_recommender.docx
@@ -16,8 +16,9 @@
     </w:p>
     <w:p>
       <w:pPr/>
+      <w:r/>
       <w:r>
-        <w:t>Версия документа: 1.4.1 (strategy-native отображение grid/trend; выбор по доказанной risk-adjusted ожидаемой прибыльности; без отправки биржевых ордеров)</w:t>
+        <w:t>Версия документа: 1.4.2 (strategy-native отображение grid/trend; выбор по доказанной risk-adjusted ожидаемой прибыльности; без отправки биржевых ордеров)</w:t>
       </w:r>
     </w:p>
     <w:p>
@@ -35,7 +36,56 @@
         <w:pStyle w:val="Heading1"/>
       </w:pPr>
       <w:r>
-        <w:t>Strategy-native отображение в «Деталях» v1.4.1</w:t>
+        <w:t>Отклонённая предварительная проверка тренда v1.4.2</w:t>
+      </w:r>
+    </w:p>
+    <w:p>
+      <w:pPr>
+        <w:pStyle w:val="ListBullet"/>
+      </w:pPr>
+      <w:r>
+        <w:t>Полноценная directional_trend-рекомендация существует только при подтверждённом направлении LONG или SHORT. Результат предварительного анализатора с direction=neutral не является позицией и сохраняется как candidate_kind=trend_evaluation_rejected.</w:t>
+      </w:r>
+    </w:p>
+    <w:p>
+      <w:pPr>
+        <w:pStyle w:val="ListBullet"/>
+      </w:pPr>
+      <w:r>
+        <w:t>Для отклонённой проверки не создаются entry, TP, SL, sizing, trade plan, outcome-root, очередь исхода, ценовая история, обучающий пример или возможность запуска. В окне «Детали» должны быть только одна первичная причина TREND_DIRECTION_UNCONFIRMED и признаки «позиция не сформирована / исход не планируется / обучение исключено».</w:t>
+      </w:r>
+    </w:p>
+    <w:p>
+      <w:pPr>
+        <w:pStyle w:val="ListBullet"/>
+      </w:pPr>
+      <w:r>
+        <w:t>Не трактуйте такую строку как нейтральный тренд, неудачную trend-сделку или нейтральную сетку. Это диагностический результат анализатора. Каскад DIRECTION_INVALID / LEVELS_MISSING / GEOMETRY_INVALID для неё не должен отображаться, поскольку позиционная геометрия вообще не строится.</w:t>
+      </w:r>
+    </w:p>
+    <w:p>
+      <w:pPr>
+        <w:pStyle w:val="ListBullet"/>
+      </w:pPr>
+      <w:r>
+        <w:t>В историю и график попадают только candidate_kind=strategy_recommendation. У trend_evaluation_rejected нет кнопки истории; единственное безопасное действие — дождаться следующего снимка с подтверждённым LONG/SHORT.</w:t>
+      </w:r>
+    </w:p>
+    <w:p>
+      <w:pPr>
+        <w:pStyle w:val="ListBullet"/>
+      </w:pPr>
+      <w:r>
+        <w:t>При обновлении существующей БД init_db() автоматически классифицирует старые neutral trend-строки, снимает с них outcome eligibility и удаляет незавершённые schedule rows без терминального outcome. Ручная SQL-миграция не требуется.</w:t>
+      </w:r>
+    </w:p>
+    <w:p>
+      <w:pPr>
+        <w:pStyle w:val="Heading1"/>
+      </w:pPr>
+      <w:r/>
+      <w:r>
+        <w:t>Strategy-native отображение в «Деталях» v1.4.2</w:t>
       </w:r>
     </w:p>
     <w:p>
@@ -50,8 +100,9 @@
       <w:pPr>
         <w:pStyle w:val="ListBullet"/>
       </w:pPr>
+      <w:r/>
       <w:r>
-        <w:t>Значение direction=neutral зависит от стратегии. Для futures_grid это валидная «Нейтральная сетка». Для directional_trend это «Направление не определено»: LONG/SHORT не подтверждён, позицию открывать нельзя.</w:t>
+        <w:t>Значение direction=neutral зависит от стратегии. Для futures_grid это валидная «Нейтральная сетка». Для directional_trend это «Направление не подтверждено»: LONG/SHORT не подтверждён, позицию открывать нельзя.</w:t>
       </w:r>
     </w:p>
     <w:p>

</xml_diff>

<commit_message>
fix(trading): make generated sizing exchange-executable
- lift generated grid/trend qty only to live exchange minimum
- revalidate full-grid notional, margin and runtime risk caps
- keep explicit/manual qty and leverage rounding fail-closed
- remove duplicate qty blockers from operator details
- exclude post-exit candle extremes from trend MFE/MAE
- add RED-to-GREEN exchange sizing and payoff regressions
- bump release to 1.4.6
</commit_message>
<xml_diff>
--- a/docs/instrukciya_operatora_bybit_recommender.docx
+++ b/docs/instrukciya_operatora_bybit_recommender.docx
@@ -17,7 +17,7 @@
     <w:p>
       <w:pPr/>
       <w:r>
-        <w:t>Версия документа: 1.4.3 (компактные окна наблюдаемости; strategy-native отображение grid/trend; проверенная знаковая и outcome-математика; без отправки биржевых ордеров)</w:t>
+        <w:t>Версия документа: 1.4.6 (минимально исполнимый generated sizing; консервативное leverage alignment; корректная first-touch MFE/MAE; без отправки биржевых ордеров)</w:t>
       </w:r>
     </w:p>
     <w:p>
@@ -28,6 +28,46 @@
     <w:p>
       <w:r>
         <w:t>Граница системы. Репозиторий является recommendation/audit service, not OMS/EMS. Он проверяет план по публичным Bybit metadata, текущей цене, funding и внутренним risk limits, но не выставляет ордера, не знает очередь, реальные partial fills, состояние аккаунта или фактическую доступность маржи. Статус executed означает созданный внутренний audit-instance, а не подтверждённое биржевое исполнение.</w:t>
+      </w:r>
+    </w:p>
+    <w:p>
+      <w:pPr>
+        <w:pStyle w:val="Heading1"/>
+      </w:pPr>
+      <w:r>
+        <w:t>Exchange-executable sizing и exit-path v1.4.6</w:t>
+      </w:r>
+    </w:p>
+    <w:p>
+      <w:pPr>
+        <w:pStyle w:val="ListBullet"/>
+      </w:pPr>
+      <w:r>
+        <w:t>Generated provisional qty может быть поднят только до минимального значения, удовлетворяющего live minOrderQty, qtyStep и minNotional. После этого система полностью пересчитывает commitment, worst-case notional и margin всей сетки и повторно применяет risk limits.</w:t>
+      </w:r>
+    </w:p>
+    <w:p>
+      <w:pPr>
+        <w:pStyle w:val="ListBullet"/>
+      </w:pPr>
+      <w:r>
+        <w:t>Explicit/manual qty автоматически не увеличивается. Если он ниже биржевого минимума, первичная причина - ORDER_QTY_BELOW_MIN. Производный ORDER_QTY_OFF_STEP к нулю и дублирующий generic RISK не должны повторять ту же проблему.</w:t>
+      </w:r>
+    </w:p>
+    <w:p>
+      <w:pPr>
+        <w:pStyle w:val="ListBullet"/>
+      </w:pPr>
+      <w:r>
+        <w:t>Generated leverage выравнивается по leverageStep только вниз. Если минимально исполнимый plan превышает лимит позиции, маржи или дневного риска, решение остаётся НЕ ТОРГОВАТЬ.</w:t>
+      </w:r>
+    </w:p>
+    <w:p>
+      <w:pPr>
+        <w:pStyle w:val="ListBullet"/>
+      </w:pPr>
+      <w:r>
+        <w:t>Для directional first-touch outcome high/low exit-candle после gap/TP/SL не включаются в MFE/MAE. Учитывается только наблюдаемый gap open либо trigger level; same-candle TP+SL остаётся AMBIGUOUS/censored.</w:t>
       </w:r>
     </w:p>
     <w:p>

</xml_diff>

<commit_message>
fix(outcomes): recover funding settlements and journal public trade chronology
- add short funding retries, bounded overlap and durable targeted repair
- add session-bounded publicTrade WebSocket journal with isolated REST fallback
- replay intrabar grid paths only with complete OHLC-consistent coverage
- expose recovery and coverage diagnostics without resetting model lineage
</commit_message>
<xml_diff>
--- a/docs/instrukciya_operatora_bybit_recommender.docx
+++ b/docs/instrukciya_operatora_bybit_recommender.docx
@@ -17,7 +17,7 @@
     <w:p>
       <w:pPr/>
       <w:r>
-        <w:t>Версия документа: 1.4.7 (логарифмически симметричное определение направления; честная временная структура outcome-выборки; карточный журнал решений; минимально исполнимый generated sizing; без отправки биржевых ордеров)</w:t>
+        <w:t>Версия документа: 1.4.8 (восстановление funding settlement; публичный intrabar trade journal; сохранение model/outcome lineage; без отправки биржевых ордеров)</w:t>
       </w:r>
     </w:p>
     <w:p>
@@ -28,6 +28,54 @@
     <w:p>
       <w:r>
         <w:t>Граница системы. Репозиторий является recommendation/audit service, not OMS/EMS. Он проверяет план по публичным Bybit metadata, текущей цене, funding и внутренним risk limits, но не выставляет ордера, не знает очередь, реальные partial fills, состояние аккаунта или фактическую доступность маржи. Статус executed означает созданный внутренний audit-instance, а не подтверждённое биржевое исполнение.</w:t>
+      </w:r>
+    </w:p>
+    <w:p>
+      <w:pPr>
+        <w:pStyle w:val="Heading1"/>
+      </w:pPr>
+      <w:r>
+        <w:t>Funding recovery и intrabar journal v1.4.8</w:t>
+      </w:r>
+    </w:p>
+    <w:p>
+      <w:pPr>
+        <w:pStyle w:val="ListBullet"/>
+      </w:pPr>
+      <w:r>
+        <w:t>Сообщение WAIT_FUNDING_SETTLEMENT означает отсутствие обязательной строки settlement в локальной БД, а не автоматически доказанную ошибку Bybit. Система создаёт durable repair-задание, делает адресный backfill и повторяет outcome после получения фактической ставки. Не удаляйте такую рекомендацию и не считайте WAIT отрицательным исходом.</w:t>
+      </w:r>
+    </w:p>
+    <w:p>
+      <w:pPr>
+        <w:pStyle w:val="ListBullet"/>
+      </w:pPr>
+      <w:r>
+        <w:t>После временной ошибки funding-history повтор выполняется через короткий backoff, а не блокируется на час. Обычный успешный refresh остаётся часовым и повторно проверяет недавний overlap, чтобы закрывать пропуски перед уже сохранённым latest settlement.</w:t>
+      </w:r>
+    </w:p>
+    <w:p>
+      <w:pPr>
+        <w:pStyle w:val="ListBullet"/>
+      </w:pPr>
+      <w:r>
+        <w:t>Public trade journal использует read-only Bybit publicTrade WebSocket как основной источник: каждый сеанс имеет отдельный coverage span, а disconnect/restart фиксирует разрыв и не объединяет неизвестный интервал. REST recent-trade работает как bounded fallback/bootstrap и расширяет только собственный span при overlap trade ID соседних snapshot. В окне «Здоровье системы» контролируйте строки журнала, инструменты и gaps. При gap или противоречии OHLC outcome остаётся fail-closed.</w:t>
+      </w:r>
+    </w:p>
+    <w:p>
+      <w:pPr>
+        <w:pStyle w:val="ListBullet"/>
+      </w:pPr>
+      <w:r>
+        <w:t>Trade journal не доказывает queue priority, actual fill, partial fill или время активации replacement order. Если эти факторы способны изменить grid ledger, исход по-прежнему цензурируется. Статус executed остаётся внутренним audit-state.</w:t>
+      </w:r>
+    </w:p>
+    <w:p>
+      <w:pPr>
+        <w:pStyle w:val="ListBullet"/>
+      </w:pPr>
+      <w:r>
+        <w:t>Обновление до v1.4.8 добавляет таблицы funding_settlement_repair, market_trade и market_trade_coverage. Они создаются автоматически для SQLite/PostgreSQL. Model version и OUTCOME_LABEL_VERSION не меняются; существующие outcomes и calibrators не обнуляются. Перед обновлением сделайте резервную копию БД и остановите старый процесс.</w:t>
       </w:r>
     </w:p>
     <w:p>

</xml_diff>